<commit_message>
rapikan sitasi dan istilah asing proposal
</commit_message>
<xml_diff>
--- a/docs/Proposal Skripsi v2.docx
+++ b/docs/Proposal Skripsi v2.docx
@@ -392,7 +392,6 @@
           <w:b/>
           <w:bCs/>
         </w:rPr>
-        <w:br w:type="page"/>
       </w:r>
     </w:p>
     <w:p>
@@ -400,7 +399,6 @@
         <w:pStyle w:val="Heading1"/>
       </w:pPr>
       <w:r>
-        <w:lastRenderedPageBreak/>
         <w:t>BAB I</w:t>
       </w:r>
       <w:r>
@@ -424,7 +422,17 @@
     </w:p>
     <w:p>
       <w:r>
-        <w:t xml:space="preserve">Perkembangan teknologi informasi yang semakin pesat telah memberikan pengaruh terhadap berbagai bidang usaha, termasuk usaha jasa potong rambut. Pemanfaatan teknologi informasi dapat membantu pelaku usaha dalam melakukan pencatatan transaksi, pengolahan data, dan penyusunan laporan secara lebih terstruktur. Digitalisasi menjadi salah satu solusi untuk mengurangi keterlambatan informasi, kesalahan pencatatan, dan kesulitan dalam melakukan rekapitulasi data. Pada konteks barbershop, beberapa penelitian menunjukkan bahwa aplikasi berbasis </w:t>
+        <w:t xml:space="preserve">Perkembangan teknologi informasi yang semakin pesat telah memberikan pengaruh terhadap berbagai bidang usaha, termasuk usaha jasa potong rambut. Pemanfaatan teknologi informasi dapat membantu pelaku usaha dalam melakukan pencatatan transaksi, pengolahan data, dan penyusunan laporan secara lebih terstruktur. Digitalisasi menjadi salah satu solusi untuk mengurangi keterlambatan informasi, kesalahan pencatatan, dan kesulitan dalam melakukan rekapitulasi data. Pada konteks </w:t>
+      </w:r>
+      <w:r>
+        <w:rPr>
+          <w:i/>
+        </w:rPr>
+        <w:t>barbershop</w:t>
+      </w:r>
+      <w:r>
+        <w:rPr/>
+        <w:t xml:space="preserve">, beberapa penelitian menunjukkan bahwa aplikasi berbasis </w:t>
       </w:r>
       <w:r/>
       <w:r>
@@ -435,7 +443,7 @@
       </w:r>
       <w:r/>
       <w:r>
-        <w:t xml:space="preserve"> dapat digunakan untuk membantu pelayanan, pemesanan, pengelolaan informasi, dan antrean pelanggan [1]-[4].</w:t>
+        <w:t xml:space="preserve"> dapat digunakan untuk membantu pelayanan, pemesanan, pengelolaan informasi, dan antrean pelanggan [1], [2], [3], [4].</w:t>
       </w:r>
     </w:p>
     <w:p>
@@ -539,7 +547,17 @@
       </w:r>
       <w:r/>
       <w:r>
-        <w:t xml:space="preserve"> periode Mei 2026, pencatatan yang berjalan sebelumnya telah memanfaatkan Google Spreadsheet untuk membantu penyusunan laporan. Laporan tersebut mencakup buku kas umum, laporan laba/rugi, pendapatan harian </w:t>
+        <w:t xml:space="preserve"> periode Mei 2026, pencatatan yang berjalan sebelumnya telah memanfaatkan </w:t>
+      </w:r>
+      <w:r>
+        <w:rPr>
+          <w:i/>
+        </w:rPr>
+        <w:t>Google Spreadsheet</w:t>
+      </w:r>
+      <w:r>
+        <w:rPr/>
+        <w:t xml:space="preserve"> untuk membantu penyusunan laporan. Laporan tersebut mencakup buku kas umum, laporan laba/rugi, pendapatan harian </w:t>
       </w:r>
       <w:r/>
       <w:r>
@@ -550,7 +568,17 @@
       </w:r>
       <w:r/>
       <w:r>
-        <w:t>, rekapitulasi customer, serta perhitungan pembagian hasil. Penggunaan spreadsheet pada awalnya dapat membantu proses pencatatan, namun penggunaan tersebut masih memiliki beberapa keterbatasan apabila dijadikan sebagai pusat data aplikasi.</w:t>
+        <w:t xml:space="preserve">, rekapitulasi </w:t>
+      </w:r>
+      <w:r>
+        <w:rPr>
+          <w:i/>
+        </w:rPr>
+        <w:t>customer</w:t>
+      </w:r>
+      <w:r>
+        <w:rPr/>
+        <w:t>, serta perhitungan pembagian hasil. Penggunaan spreadsheet pada awalnya dapat membantu proses pencatatan, namun penggunaan tersebut masih memiliki beberapa keterbatasan apabila dijadikan sebagai pusat data aplikasi.</w:t>
       </w:r>
     </w:p>
     <w:p>
@@ -734,7 +762,17 @@
       </w:r>
       <w:r/>
       <w:r>
-        <w:t xml:space="preserve"> yang dikembangkan menggunakan framework </w:t>
+        <w:t xml:space="preserve"> yang dikembangkan menggunakan </w:t>
+      </w:r>
+      <w:r>
+        <w:rPr>
+          <w:i/>
+        </w:rPr>
+        <w:t>framework</w:t>
+      </w:r>
+      <w:r>
+        <w:rPr/>
+        <w:t xml:space="preserve"> </w:t>
       </w:r>
       <w:r/>
       <w:r>
@@ -912,7 +950,17 @@
       </w:r>
       <w:r/>
       <w:r>
-        <w:t xml:space="preserve">, seperti autentikasi pengguna dan penyimpanan data secara online. Penggunaan </w:t>
+        <w:t xml:space="preserve">, seperti autentikasi pengguna dan penyimpanan data secara </w:t>
+      </w:r>
+      <w:r>
+        <w:rPr>
+          <w:i/>
+        </w:rPr>
+        <w:t>online</w:t>
+      </w:r>
+      <w:r>
+        <w:rPr/>
+        <w:t xml:space="preserve">. Penggunaan </w:t>
       </w:r>
       <w:r/>
       <w:r>
@@ -923,7 +971,17 @@
       </w:r>
       <w:r/>
       <w:r>
-        <w:t xml:space="preserve"> online diperlukan agar data pengguna, </w:t>
+        <w:t xml:space="preserve"> </w:t>
+      </w:r>
+      <w:r>
+        <w:rPr>
+          <w:i/>
+        </w:rPr>
+        <w:t>online</w:t>
+      </w:r>
+      <w:r>
+        <w:rPr/>
+        <w:t xml:space="preserve"> diperlukan agar data pengguna, </w:t>
       </w:r>
       <w:r/>
       <w:r>
@@ -1020,7 +1078,17 @@
       </w:r>
       <w:r/>
       <w:r>
-        <w:t xml:space="preserve"> Pengelolaan Pendapatan dan Pembagian Hasil Capster pada </w:t>
+        <w:t xml:space="preserve"> Pengelolaan Pendapatan dan Pembagian Hasil </w:t>
+      </w:r>
+      <w:r>
+        <w:rPr>
+          <w:i/>
+        </w:rPr>
+        <w:t>Capster</w:t>
+      </w:r>
+      <w:r>
+        <w:rPr/>
+        <w:t xml:space="preserve"> pada </w:t>
       </w:r>
       <w:r/>
       <w:r>
@@ -1216,7 +1284,17 @@
       </w:r>
       <w:r/>
       <w:r>
-        <w:t xml:space="preserve"> digunakan oleh pengguna internal yang terdiri atas Admin/Pengelola, Admin Harian, Capster, dan Pemilik.</w:t>
+        <w:t xml:space="preserve"> digunakan oleh pengguna internal yang terdiri atas Admin/Pengelola, Admin Harian, </w:t>
+      </w:r>
+      <w:r>
+        <w:rPr>
+          <w:i/>
+        </w:rPr>
+        <w:t>Capster</w:t>
+      </w:r>
+      <w:r>
+        <w:rPr/>
+        <w:t>, dan Pemilik.</w:t>
       </w:r>
     </w:p>
     <w:p>
@@ -1344,7 +1422,17 @@
         <w:ind w:left="851" w:hanging="284"/>
       </w:pPr>
       <w:r>
-        <w:t>Sistem tidak membahas pemesanan pelanggan, antrean pelanggan, pembayaran online, sistem kasir penuh, serta pengelolaan stok produk.</w:t>
+        <w:t xml:space="preserve">Sistem tidak membahas pemesanan pelanggan, antrean pelanggan, pembayaran </w:t>
+      </w:r>
+      <w:r>
+        <w:rPr>
+          <w:i/>
+        </w:rPr>
+        <w:t>online</w:t>
+      </w:r>
+      <w:r>
+        <w:rPr/>
+        <w:t>, sistem kasir penuh, serta pengelolaan stok produk.</w:t>
       </w:r>
     </w:p>
     <w:p>
@@ -1586,7 +1674,17 @@
       </w:r>
       <w:r/>
       <w:r>
-        <w:t xml:space="preserve"> menggunakan framework </w:t>
+        <w:t xml:space="preserve"> menggunakan </w:t>
+      </w:r>
+      <w:r>
+        <w:rPr>
+          <w:i/>
+        </w:rPr>
+        <w:t>framework</w:t>
+      </w:r>
+      <w:r>
+        <w:rPr/>
+        <w:t xml:space="preserve"> </w:t>
       </w:r>
       <w:r/>
       <w:r>
@@ -1776,7 +1874,6 @@
         <w:ind w:left="1134" w:hanging="283"/>
       </w:pPr>
       <w:r>
-        <w:lastRenderedPageBreak/>
         <w:t>Mengurangi risiko kesalahan input data dan manipulasi pencatatan pendapatan melalui pembatasan hak akses serta pencatatan identitas penginput.</w:t>
       </w:r>
     </w:p>
@@ -2107,7 +2204,6 @@
           <w:b/>
           <w:bCs/>
         </w:rPr>
-        <w:lastRenderedPageBreak/>
         <w:t>BAB 4 : PEMBAHASAN DAN HASIL</w:t>
       </w:r>
     </w:p>
@@ -2172,7 +2268,6 @@
         <w:pStyle w:val="Heading1"/>
       </w:pPr>
       <w:r>
-        <w:lastRenderedPageBreak/>
         <w:t>BAB II</w:t>
       </w:r>
       <w:r>
@@ -2410,7 +2505,23 @@
               <w:ind w:left="0" w:firstLineChars="14" w:firstLine="34"/>
             </w:pPr>
             <w:r>
-              <w:t>Pengembangan Sistem Aplikasi Barbershop Berbasis Android untuk Meningkatkan Efisiensi dan Efektivitas Pelayanan di Barbershop</w:t>
+              <w:t xml:space="preserve">Pengembangan Sistem Aplikasi </w:t>
+            </w:r>
+            <w:r>
+              <w:rPr>
+                <w:i/>
+              </w:rPr>
+              <w:t>Barbershop</w:t>
+            </w:r>
+            <w:r>
+              <w:rPr/>
+              <w:t xml:space="preserve"> Berbasis Android untuk Meningkatkan Efisiensi dan Efektivitas Pelayanan di </w:t>
+            </w:r>
+            <w:r>
+              <w:rPr>
+                <w:i/>
+              </w:rPr>
+              <w:t>Barbershop</w:t>
             </w:r>
             <w:r>
               <w:rPr>
@@ -2456,7 +2567,17 @@
               <w:ind w:left="0" w:firstLine="0"/>
             </w:pPr>
             <w:r>
-              <w:t>Penelitian menghasilkan aplikasi barbershop berbasis Android yang membantu proses pemesanan layanan, pemilihan barberman, dan pemilihan waktu layanan sehingga pelayanan menjadi lebih efektif dan efisien.</w:t>
+              <w:t xml:space="preserve">Penelitian menghasilkan aplikasi </w:t>
+            </w:r>
+            <w:r>
+              <w:rPr>
+                <w:i/>
+              </w:rPr>
+              <w:t>barbershop</w:t>
+            </w:r>
+            <w:r>
+              <w:rPr/>
+              <w:t xml:space="preserve"> berbasis Android yang membantu proses pemesanan layanan, pemilihan barberman, dan pemilihan waktu layanan sehingga pelayanan menjadi lebih efektif dan efisien.</w:t>
             </w:r>
             <w:r>
               <w:rPr>
@@ -2482,7 +2603,17 @@
               <w:ind w:left="33" w:firstLine="0"/>
             </w:pPr>
             <w:r>
-              <w:t>Penelitian terdahulu berfokus pada pemesanan layanan pelanggan, sedangkan penelitian ini berfokus pada pengelolaan pendapatan harian capster, buku kas umum, operasional, pembagian hasil, dan pembatasan hak akses pengguna.</w:t>
+              <w:t xml:space="preserve">Penelitian terdahulu berfokus pada pemesanan layanan pelanggan, sedangkan penelitian ini berfokus pada pengelolaan pendapatan harian </w:t>
+            </w:r>
+            <w:r>
+              <w:rPr>
+                <w:i/>
+              </w:rPr>
+              <w:t>capster</w:t>
+            </w:r>
+            <w:r>
+              <w:rPr/>
+              <w:t>, buku kas umum, operasional, pembagian hasil, dan pembatasan hak akses pengguna.</w:t>
             </w:r>
             <w:proofErr w:type="spellStart"/>
             <w:r/>
@@ -2551,7 +2682,17 @@
               <w:ind w:left="0" w:firstLineChars="14" w:firstLine="34"/>
             </w:pPr>
             <w:r>
-              <w:t>Aplikasi Pemesanan Online Barbershop Berbasis Android untuk Meningkatkan Layanan</w:t>
+              <w:t xml:space="preserve">Aplikasi Pemesanan Online </w:t>
+            </w:r>
+            <w:r>
+              <w:rPr>
+                <w:i/>
+              </w:rPr>
+              <w:t>Barbershop</w:t>
+            </w:r>
+            <w:r>
+              <w:rPr/>
+              <w:t xml:space="preserve"> Berbasis Android untuk Meningkatkan Layanan</w:t>
             </w:r>
             <w:r>
               <w:rPr>
@@ -2581,7 +2722,22 @@
               <w:ind w:left="0" w:firstLineChars="12" w:firstLine="29"/>
             </w:pPr>
             <w:r>
-              <w:t>Waterfall dan Black Box Testing</w:t>
+              <w:rPr>
+                <w:i/>
+              </w:rPr>
+              <w:t>Waterfall</w:t>
+            </w:r>
+            <w:r>
+              <w:rPr>
+                <w:i/>
+              </w:rPr>
+              <w:t xml:space="preserve"> dan </w:t>
+            </w:r>
+            <w:r>
+              <w:rPr>
+                <w:i/>
+              </w:rPr>
+              <w:t>Black Box Testing</w:t>
             </w:r>
             <w:r>
               <w:rPr>
@@ -2599,7 +2755,27 @@
               <w:ind w:left="0" w:firstLine="0"/>
             </w:pPr>
             <w:r>
-              <w:t>Penelitian menghasilkan aplikasi pemesanan online barbershop berbasis Android yang membantu pelanggan mengatur jadwal layanan dan mengurangi proses pendataan manual.</w:t>
+              <w:t xml:space="preserve">Penelitian menghasilkan aplikasi pemesanan </w:t>
+            </w:r>
+            <w:r>
+              <w:rPr>
+                <w:i/>
+              </w:rPr>
+              <w:t>online</w:t>
+            </w:r>
+            <w:r>
+              <w:rPr/>
+              <w:t xml:space="preserve"> </w:t>
+            </w:r>
+            <w:r>
+              <w:rPr>
+                <w:i/>
+              </w:rPr>
+              <w:t>barbershop</w:t>
+            </w:r>
+            <w:r>
+              <w:rPr/>
+              <w:t xml:space="preserve"> berbasis Android yang membantu pelanggan mengatur jadwal layanan dan mengurangi proses pendataan manual.</w:t>
             </w:r>
             <w:r>
               <w:rPr>
@@ -2624,7 +2800,27 @@
               <w:ind w:left="33" w:firstLine="0"/>
             </w:pPr>
             <w:r>
-              <w:t>Penelitian terdahulu menitikberatkan pada booking dan layanan pelanggan, sedangkan penelitian ini menitikberatkan pada sistem internal untuk pencatatan pendapatan, pengendalian input oleh admin harian, dan laporan pembagian hasil capster.</w:t>
+              <w:t xml:space="preserve">Penelitian terdahulu menitikberatkan pada </w:t>
+            </w:r>
+            <w:r>
+              <w:rPr>
+                <w:i/>
+              </w:rPr>
+              <w:t>booking</w:t>
+            </w:r>
+            <w:r>
+              <w:rPr/>
+              <w:t xml:space="preserve"> dan layanan pelanggan, sedangkan penelitian ini menitikberatkan pada sistem internal untuk pencatatan pendapatan, pengendalian input oleh admin harian, dan laporan pembagian hasil </w:t>
+            </w:r>
+            <w:r>
+              <w:rPr>
+                <w:i/>
+              </w:rPr>
+              <w:t>capster</w:t>
+            </w:r>
+            <w:r>
+              <w:rPr/>
+              <w:t>.</w:t>
             </w:r>
             <w:proofErr w:type="spellStart"/>
             <w:r>
@@ -2683,7 +2879,23 @@
               <w:ind w:left="0" w:firstLineChars="14" w:firstLine="34"/>
             </w:pPr>
             <w:r>
-              <w:t>Pengembangan Sistem Aplikasi Barbershop Berbasis Android Untuk Menumbuh Kembangkan Usaha Barbershop</w:t>
+              <w:t xml:space="preserve">Pengembangan Sistem Aplikasi </w:t>
+            </w:r>
+            <w:r>
+              <w:rPr>
+                <w:i/>
+              </w:rPr>
+              <w:t>Barbershop</w:t>
+            </w:r>
+            <w:r>
+              <w:rPr/>
+              <w:t xml:space="preserve"> Berbasis Android Untuk Menumbuh Kembangkan Usaha </w:t>
+            </w:r>
+            <w:r>
+              <w:rPr>
+                <w:i/>
+              </w:rPr>
+              <w:t>Barbershop</w:t>
             </w:r>
             <w:r>
               <w:rPr>
@@ -2724,7 +2936,43 @@
                 <w:i/>
                 <w:iCs/>
               </w:rPr>
-              <w:t>Penelitian menghasilkan aplikasi barbershop yang memudahkan pengguna memperoleh informasi, memilih layanan, dan melakukan pemesanan jasa barbershop.</w:t>
+              <w:t xml:space="preserve">Penelitian menghasilkan aplikasi </w:t>
+            </w:r>
+            <w:r>
+              <w:rPr>
+                <w:i/>
+              </w:rPr>
+              <w:t>barbershop</w:t>
+            </w:r>
+            <w:r>
+              <w:rPr>
+                <w:i/>
+              </w:rPr>
+              <w:t xml:space="preserve"> yang memudahkan pengguna mempe</w:t>
+            </w:r>
+            <w:r>
+              <w:rPr>
+                <w:i/>
+              </w:rPr>
+              <w:t>role</w:t>
+            </w:r>
+            <w:r>
+              <w:rPr>
+                <w:i/>
+              </w:rPr>
+              <w:t xml:space="preserve">h informasi, memilih layanan, dan melakukan pemesanan jasa </w:t>
+            </w:r>
+            <w:r>
+              <w:rPr>
+                <w:i/>
+              </w:rPr>
+              <w:t>barbershop</w:t>
+            </w:r>
+            <w:r>
+              <w:rPr>
+                <w:i/>
+              </w:rPr>
+              <w:t>.</w:t>
             </w:r>
             <w:r/>
           </w:p>
@@ -2738,7 +2986,17 @@
               <w:ind w:left="33" w:firstLine="0"/>
             </w:pPr>
             <w:r>
-              <w:t>Penelitian terdahulu berorientasi pada informasi dan pemesanan layanan, sedangkan penelitian ini mengembangkan aplikasi pengelolaan keuangan internal dengan perhitungan pendapatan bersih, bagian capster, dan bagian pondok.</w:t>
+              <w:t xml:space="preserve">Penelitian terdahulu berorientasi pada informasi dan pemesanan layanan, sedangkan penelitian ini mengembangkan aplikasi pengelolaan keuangan internal dengan perhitungan pendapatan bersih, bagian </w:t>
+            </w:r>
+            <w:r>
+              <w:rPr>
+                <w:i/>
+              </w:rPr>
+              <w:t>capster</w:t>
+            </w:r>
+            <w:r>
+              <w:rPr/>
+              <w:t>, dan bagian pondok.</w:t>
             </w:r>
             <w:r>
               <w:rPr>
@@ -2798,7 +3056,33 @@
               <w:ind w:left="0" w:firstLineChars="14" w:firstLine="34"/>
             </w:pPr>
             <w:r>
-              <w:t>Aplikasi Client Server Berbasis Android pada Barbershop The Barbega Menggunakan Model Multi Channel - Single Phase</w:t>
+              <w:t xml:space="preserve">Aplikasi </w:t>
+            </w:r>
+            <w:r>
+              <w:rPr>
+                <w:i/>
+              </w:rPr>
+              <w:t>Client Server</w:t>
+            </w:r>
+            <w:r>
+              <w:rPr/>
+              <w:t xml:space="preserve"> Berbasis Android pada </w:t>
+            </w:r>
+            <w:r>
+              <w:rPr>
+                <w:i/>
+              </w:rPr>
+              <w:t>Barbershop</w:t>
+            </w:r>
+            <w:r>
+              <w:rPr/>
+              <w:t xml:space="preserve"> The Barbega Menggunakan Model </w:t>
+            </w:r>
+            <w:r>
+              <w:rPr>
+                <w:i/>
+              </w:rPr>
+              <w:t>Multi Channel - Single Phase</w:t>
             </w:r>
             <w:r>
               <w:rPr>
@@ -2822,7 +3106,13 @@
                 <w:i/>
                 <w:iCs/>
               </w:rPr>
-              <w:t>Client server dan model antrian Multi Channel - Single Phase</w:t>
+              <w:t xml:space="preserve">Client server dan model antrian </w:t>
+            </w:r>
+            <w:r>
+              <w:rPr>
+                <w:i/>
+              </w:rPr>
+              <w:t>Multi Channel - Single Phase</w:t>
             </w:r>
           </w:p>
         </w:tc>
@@ -2835,7 +3125,37 @@
               <w:ind w:left="0" w:firstLine="0"/>
             </w:pPr>
             <w:r>
-              <w:t>Penelitian menghasilkan aplikasi Android berbasis client server untuk membantu pelanggan melihat dan memesan antrean barbershop secara real time.</w:t>
+              <w:t xml:space="preserve">Penelitian menghasilkan aplikasi Android berbasis </w:t>
+            </w:r>
+            <w:r>
+              <w:rPr>
+                <w:i/>
+              </w:rPr>
+              <w:t>client server</w:t>
+            </w:r>
+            <w:r>
+              <w:rPr/>
+              <w:t xml:space="preserve"> untuk membantu pelanggan melihat dan memesan antrean </w:t>
+            </w:r>
+            <w:r>
+              <w:rPr>
+                <w:i/>
+              </w:rPr>
+              <w:t>barbershop</w:t>
+            </w:r>
+            <w:r>
+              <w:rPr/>
+              <w:t xml:space="preserve"> secara </w:t>
+            </w:r>
+            <w:r>
+              <w:rPr>
+                <w:i/>
+              </w:rPr>
+              <w:t>real time</w:t>
+            </w:r>
+            <w:r>
+              <w:rPr/>
+              <w:t>.</w:t>
             </w:r>
           </w:p>
         </w:tc>
@@ -2848,7 +3168,27 @@
               <w:ind w:left="33" w:firstLine="0"/>
             </w:pPr>
             <w:r>
-              <w:t>Penelitian terdahulu berfokus pada manajemen antrean pelanggan, sedangkan penelitian ini berfokus pada pencatatan pendapatan harian, buku kas umum, biaya operasional, role pengguna, dan laporan pembagian hasil capster.</w:t>
+              <w:t xml:space="preserve">Penelitian terdahulu berfokus pada manajemen antrean pelanggan, sedangkan penelitian ini berfokus pada pencatatan pendapatan harian, buku kas umum, biaya operasional, </w:t>
+            </w:r>
+            <w:r>
+              <w:rPr>
+                <w:i/>
+              </w:rPr>
+              <w:t>role</w:t>
+            </w:r>
+            <w:r>
+              <w:rPr/>
+              <w:t xml:space="preserve"> pengguna, dan laporan pembagian hasil </w:t>
+            </w:r>
+            <w:r>
+              <w:rPr>
+                <w:i/>
+              </w:rPr>
+              <w:t>capster</w:t>
+            </w:r>
+            <w:r>
+              <w:rPr/>
+              <w:t>.</w:t>
             </w:r>
             <w:r>
               <w:rPr>
@@ -2872,7 +3212,17 @@
         <w:keepLines/>
       </w:pPr>
       <w:r>
-        <w:t xml:space="preserve">Berdasarkan rujukan penelitian yang telah disajikan, aplikasi barbershop berbasis </w:t>
+        <w:t xml:space="preserve">Berdasarkan rujukan penelitian yang telah disajikan, aplikasi </w:t>
+      </w:r>
+      <w:r>
+        <w:rPr>
+          <w:i/>
+        </w:rPr>
+        <w:t>barbershop</w:t>
+      </w:r>
+      <w:r>
+        <w:rPr/>
+        <w:t xml:space="preserve"> berbasis </w:t>
       </w:r>
       <w:r>
         <w:rPr>
@@ -2966,7 +3316,7 @@
       </w:r>
       <w:r/>
       <w:r>
-        <w:t xml:space="preserve"> telah banyak digunakan untuk membantu pemesanan layanan, penyampaian informasi, pemilihan layanan, dan manajemen antrean pelanggan [1]-[4]. Penelitian sebelumnya menunjukkan bahwa teknologi </w:t>
+        <w:t xml:space="preserve"> telah banyak digunakan untuk membantu pemesanan layanan, penyampaian informasi, pemilihan layanan, dan manajemen antrean pelanggan [1], [2], [3], [4]. Penelitian sebelumnya menunjukkan bahwa teknologi </w:t>
       </w:r>
       <w:r/>
       <w:r>
@@ -2977,7 +3327,17 @@
       </w:r>
       <w:r/>
       <w:r>
-        <w:t xml:space="preserve"> dapat membantu aktivitas barbershop menjadi lebih efektif melalui penyediaan aplikasi yang dapat diakses melalui perangkat </w:t>
+        <w:t xml:space="preserve"> dapat membantu aktivitas </w:t>
+      </w:r>
+      <w:r>
+        <w:rPr>
+          <w:i/>
+        </w:rPr>
+        <w:t>barbershop</w:t>
+      </w:r>
+      <w:r>
+        <w:rPr/>
+        <w:t xml:space="preserve"> menjadi lebih efektif melalui penyediaan aplikasi yang dapat diakses melalui perangkat </w:t>
       </w:r>
       <w:r/>
       <w:r>
@@ -2988,7 +3348,27 @@
       </w:r>
       <w:r/>
       <w:r>
-        <w:t xml:space="preserve">. Namun, penelitian-penelitian tersebut lebih banyak berfokus pada layanan pelanggan, booking, informasi barbershop, dan antrean. Penelitian ini memiliki perbedaan pada fokus pengembangan sistem, yaitu pengelolaan internal </w:t>
+        <w:t xml:space="preserve">. Namun, penelitian-penelitian tersebut lebih banyak berfokus pada layanan pelanggan, </w:t>
+      </w:r>
+      <w:r>
+        <w:rPr>
+          <w:i/>
+        </w:rPr>
+        <w:t>booking</w:t>
+      </w:r>
+      <w:r>
+        <w:rPr/>
+        <w:t xml:space="preserve">, informasi </w:t>
+      </w:r>
+      <w:r>
+        <w:rPr>
+          <w:i/>
+        </w:rPr>
+        <w:t>barbershop</w:t>
+      </w:r>
+      <w:r>
+        <w:rPr/>
+        <w:t xml:space="preserve">, dan antrean. Penelitian ini memiliki perbedaan pada fokus pengembangan sistem, yaitu pengelolaan internal </w:t>
       </w:r>
       <w:r/>
       <w:r>
@@ -3165,7 +3545,17 @@
       </w:r>
       <w:r/>
       <w:r>
-        <w:t>, dan NoSQL Database.</w:t>
+        <w:t xml:space="preserve">, dan </w:t>
+      </w:r>
+      <w:r>
+        <w:rPr>
+          <w:i/>
+        </w:rPr>
+        <w:t>NoSQL Database</w:t>
+      </w:r>
+      <w:r>
+        <w:rPr/>
+        <w:t>.</w:t>
       </w:r>
     </w:p>
     <w:p>
@@ -3183,7 +3573,17 @@
         <w:ind w:firstLine="720"/>
       </w:pPr>
       <w:r>
-        <w:t xml:space="preserve">Rancang bangun merupakan proses merencanakan, merancang, membuat, dan menguji suatu sistem berdasarkan kebutuhan yang telah dianalisis. Pada penelitian aplikasi barbershop berbasis </w:t>
+        <w:t xml:space="preserve">Rancang bangun merupakan proses merencanakan, merancang, membuat, dan menguji suatu sistem berdasarkan kebutuhan yang telah dianalisis. Pada penelitian aplikasi </w:t>
+      </w:r>
+      <w:r>
+        <w:rPr>
+          <w:i/>
+        </w:rPr>
+        <w:t>barbershop</w:t>
+      </w:r>
+      <w:r>
+        <w:rPr/>
+        <w:t xml:space="preserve"> berbasis </w:t>
       </w:r>
       <w:r>
         <w:rPr>
@@ -3215,7 +3615,17 @@
       </w:r>
       <w:r/>
       <w:r>
-        <w:t xml:space="preserve">, proses rancang bangun dilakukan untuk menghasilkan aplikasi yang dapat menjawab kebutuhan layanan dan operasional barbershop [1], [2]. Pada penelitian ini, rancang bangun dilakukan untuk menghasilkan aplikasi </w:t>
+        <w:t xml:space="preserve">, proses rancang bangun dilakukan untuk menghasilkan aplikasi yang dapat menjawab kebutuhan layanan dan operasional </w:t>
+      </w:r>
+      <w:r>
+        <w:rPr>
+          <w:i/>
+        </w:rPr>
+        <w:t>barbershop</w:t>
+      </w:r>
+      <w:r>
+        <w:rPr/>
+        <w:t xml:space="preserve"> [1], [2]. Pada penelitian ini, rancang bangun dilakukan untuk menghasilkan aplikasi </w:t>
       </w:r>
       <w:r/>
       <w:r>
@@ -3259,7 +3669,6 @@
         <w:jc w:val="left"/>
       </w:pPr>
       <w:r>
-        <w:lastRenderedPageBreak/>
         <w:t>2.2.2.  Sistem Informasi</w:t>
       </w:r>
     </w:p>
@@ -3271,7 +3680,17 @@
         <w:ind w:firstLine="720"/>
       </w:pPr>
       <w:r>
-        <w:t xml:space="preserve">Sistem informasi merupakan kumpulan komponen yang saling berhubungan untuk mengumpulkan data, mengolah data, menyimpan data, dan menghasilkan informasi yang bermanfaat bagi proses bisnis. Pada penelitian aplikasi barbershop, sistem berbasis </w:t>
+        <w:t xml:space="preserve">Sistem informasi merupakan kumpulan komponen yang saling berhubungan untuk mengumpulkan data, mengolah data, menyimpan data, dan menghasilkan informasi yang bermanfaat bagi proses bisnis. Pada penelitian aplikasi </w:t>
+      </w:r>
+      <w:r>
+        <w:rPr>
+          <w:i/>
+        </w:rPr>
+        <w:t>barbershop</w:t>
+      </w:r>
+      <w:r>
+        <w:rPr/>
+        <w:t xml:space="preserve">, sistem berbasis </w:t>
       </w:r>
       <w:proofErr w:type="spellStart"/>
       <w:r>
@@ -3291,7 +3710,7 @@
       </w:r>
       <w:r/>
       <w:r>
-        <w:t xml:space="preserve"> digunakan untuk membantu pengelolaan informasi dan aktivitas layanan agar proses yang sebelumnya dilakukan secara manual menjadi lebih terstruktur [1]-[4]. Pada penelitian ini, sistem informasi digunakan untuk mengelola data pendapatan, buku kas umum, biaya operasional, akun pengguna, serta laporan pembagian hasil </w:t>
+        <w:t xml:space="preserve"> digunakan untuk membantu pengelolaan informasi dan aktivitas layanan agar proses yang sebelumnya dilakukan secara manual menjadi lebih terstruktur [1], [2], [3], [4]. Pada penelitian ini, sistem informasi digunakan untuk mengelola data pendapatan, buku kas umum, biaya operasional, akun pengguna, serta laporan pembagian hasil </w:t>
       </w:r>
       <w:r/>
       <w:r>
@@ -3418,7 +3837,17 @@
       </w:r>
       <w:r/>
       <w:r>
-        <w:t xml:space="preserve"> mudah dibawa dan digunakan dalam aktivitas operasional harian. Penelitian terdahulu menunjukkan bahwa aplikasi barbershop berbasis </w:t>
+        <w:t xml:space="preserve"> mudah dibawa dan digunakan dalam aktivitas operasional harian. Penelitian terdahulu menunjukkan bahwa aplikasi </w:t>
+      </w:r>
+      <w:r>
+        <w:rPr>
+          <w:i/>
+        </w:rPr>
+        <w:t>barbershop</w:t>
+      </w:r>
+      <w:r>
+        <w:rPr/>
+        <w:t xml:space="preserve"> berbasis </w:t>
       </w:r>
       <w:r/>
       <w:r>
@@ -3429,7 +3858,17 @@
       </w:r>
       <w:r/>
       <w:r>
-        <w:t xml:space="preserve"> dapat membantu pemesanan layanan, penyampaian informasi, dan pengelolaan antrean pada barbershop [1]-[4].</w:t>
+        <w:t xml:space="preserve"> dapat membantu pemesanan layanan, penyampaian informasi, dan pengelolaan antrean pada </w:t>
+      </w:r>
+      <w:r>
+        <w:rPr>
+          <w:i/>
+        </w:rPr>
+        <w:t>barbershop</w:t>
+      </w:r>
+      <w:r>
+        <w:rPr/>
+        <w:t xml:space="preserve"> [1], [2], [3], [4].</w:t>
       </w:r>
     </w:p>
     <w:p>
@@ -3499,7 +3938,17 @@
       </w:r>
       <w:r/>
       <w:r>
-        <w:t xml:space="preserve">, jenis layanan, jumlah customer, dan total pendapatan harian. Data pendapatan harian tersebut menjadi dasar untuk menghitung pendapatan kotor bulanan setiap </w:t>
+        <w:t xml:space="preserve">, jenis layanan, jumlah </w:t>
+      </w:r>
+      <w:r>
+        <w:rPr>
+          <w:i/>
+        </w:rPr>
+        <w:t>customer</w:t>
+      </w:r>
+      <w:r>
+        <w:rPr/>
+        <w:t xml:space="preserve">, dan total pendapatan harian. Data pendapatan harian tersebut menjadi dasar untuk menghitung pendapatan kotor bulanan setiap </w:t>
       </w:r>
       <w:r/>
       <w:r>
@@ -3510,7 +3959,17 @@
       </w:r>
       <w:r/>
       <w:r>
-        <w:t>. Berbeda dari penelitian aplikasi barbershop terdahulu yang lebih berfokus pada pemesanan dan antrean [1]-[4], penelitian ini menempatkan pengelolaan pendapatan sebagai fokus utama sistem internal.</w:t>
+        <w:t xml:space="preserve">. Berbeda dari penelitian aplikasi </w:t>
+      </w:r>
+      <w:r>
+        <w:rPr>
+          <w:i/>
+        </w:rPr>
+        <w:t>barbershop</w:t>
+      </w:r>
+      <w:r>
+        <w:rPr/>
+        <w:t xml:space="preserve"> terdahulu yang lebih berfokus pada pemesanan dan antrean [1], [2], [3], [4], penelitian ini menempatkan pengelolaan pendapatan sebagai fokus utama sistem internal.</w:t>
       </w:r>
     </w:p>
     <w:p>
@@ -3521,7 +3980,6 @@
         <w:jc w:val="left"/>
       </w:pPr>
       <w:r>
-        <w:lastRenderedPageBreak/>
         <w:t>2.2.5.  Buku Kas Umum</w:t>
       </w:r>
     </w:p>
@@ -3903,7 +4361,6 @@
         <w:jc w:val="left"/>
       </w:pPr>
       <w:r>
-        <w:lastRenderedPageBreak/>
         <w:t>2.2.7.  Pengendalian Akses Pengguna</w:t>
       </w:r>
     </w:p>
@@ -3944,7 +4401,17 @@
       </w:r>
       <w:r/>
       <w:r>
-        <w:t xml:space="preserve"> senior yang dipercaya dapat membantu proses input pendapatan harian. Capster biasa hanya dapat melihat riwayat dan laporan miliknya sendiri, sedangkan Pemilik dapat melihat laporan usaha. Pembagian hak akses tersebut digunakan untuk mengurangi risiko pencatatan yang tidak sesuai dengan transaksi sebenarnya.</w:t>
+        <w:t xml:space="preserve"> senior yang dipercaya dapat membantu proses input pendapatan harian. </w:t>
+      </w:r>
+      <w:r>
+        <w:rPr>
+          <w:i/>
+        </w:rPr>
+        <w:t>Capster</w:t>
+      </w:r>
+      <w:r>
+        <w:rPr/>
+        <w:t xml:space="preserve"> biasa hanya dapat melihat riwayat dan laporan miliknya sendiri, sedangkan Pemilik dapat melihat laporan usaha. Pembagian hak akses tersebut digunakan untuk mengurangi risiko pencatatan yang tidak sesuai dengan transaksi sebenarnya.</w:t>
       </w:r>
     </w:p>
     <w:p>
@@ -4196,7 +4663,17 @@
       </w:r>
       <w:r/>
       <w:r>
-        <w:t xml:space="preserve"> Admin/Pengelola, Admin Harian, Capster, dan Pemilik. Pembagian </w:t>
+        <w:t xml:space="preserve"> Admin/Pengelola, Admin Harian, </w:t>
+      </w:r>
+      <w:r>
+        <w:rPr>
+          <w:i/>
+        </w:rPr>
+        <w:t>Capster</w:t>
+      </w:r>
+      <w:r>
+        <w:rPr/>
+        <w:t xml:space="preserve">, dan Pemilik. Pembagian </w:t>
       </w:r>
       <w:r/>
       <w:r>
@@ -4365,7 +4842,17 @@
       </w:r>
       <w:r/>
       <w:r>
-        <w:t xml:space="preserve"> berbasis Cloud dari </w:t>
+        <w:t xml:space="preserve"> berbasis </w:t>
+      </w:r>
+      <w:r>
+        <w:rPr>
+          <w:i/>
+        </w:rPr>
+        <w:t>Cloud</w:t>
+      </w:r>
+      <w:r>
+        <w:rPr/>
+        <w:t xml:space="preserve"> dari </w:t>
       </w:r>
       <w:r/>
       <w:r>
@@ -4376,7 +4863,17 @@
       </w:r>
       <w:r/>
       <w:r>
-        <w:t xml:space="preserve"> yang dapat digunakan untuk menyimpan data aplikasi secara online. Pada penelitian ini, </w:t>
+        <w:t xml:space="preserve"> yang dapat digunakan untuk menyimpan data aplikasi secara </w:t>
+      </w:r>
+      <w:r>
+        <w:rPr>
+          <w:i/>
+        </w:rPr>
+        <w:t>online</w:t>
+      </w:r>
+      <w:r>
+        <w:rPr/>
+        <w:t xml:space="preserve">. Pada penelitian ini, </w:t>
       </w:r>
       <w:r/>
       <w:r>
@@ -4429,7 +4926,13 @@
         <w:jc w:val="left"/>
       </w:pPr>
       <w:r>
-        <w:t>2.2.11.  NoSQL Database</w:t>
+        <w:t xml:space="preserve">2.2.11.  </w:t>
+      </w:r>
+      <w:r>
+        <w:rPr>
+          <w:i/>
+        </w:rPr>
+        <w:t>NoSQL Database</w:t>
       </w:r>
     </w:p>
     <w:p>
@@ -4441,7 +4944,13 @@
         <w:rPr>
           <w:i/>
         </w:rPr>
-        <w:t xml:space="preserve">NoSQL Database merupakan model basis data yang tidak selalu menggunakan struktur tabel relasional. </w:t>
+        <w:t>NoSQL Database</w:t>
+      </w:r>
+      <w:r>
+        <w:rPr>
+          <w:i/>
+        </w:rPr>
+        <w:t xml:space="preserve"> merupakan model basis data yang tidak selalu menggunakan struktur tabel relasional. </w:t>
       </w:r>
       <w:r/>
       <w:r>
@@ -4592,7 +5101,57 @@
       </w:r>
       <w:r/>
       <w:r>
-        <w:t>, SharedPreferences, Figma, Visual Studio Code, Browser, dan Draw.io.</w:t>
+        <w:t xml:space="preserve">, </w:t>
+      </w:r>
+      <w:r>
+        <w:rPr>
+          <w:i/>
+        </w:rPr>
+        <w:t>SharedPreferences</w:t>
+      </w:r>
+      <w:r>
+        <w:rPr/>
+        <w:t xml:space="preserve">, </w:t>
+      </w:r>
+      <w:r>
+        <w:rPr>
+          <w:i/>
+        </w:rPr>
+        <w:t>Figma</w:t>
+      </w:r>
+      <w:r>
+        <w:rPr/>
+        <w:t xml:space="preserve">, </w:t>
+      </w:r>
+      <w:r>
+        <w:rPr>
+          <w:i/>
+        </w:rPr>
+        <w:t>Visual Studio Code</w:t>
+      </w:r>
+      <w:r>
+        <w:rPr/>
+        <w:t xml:space="preserve">, </w:t>
+      </w:r>
+      <w:r>
+        <w:rPr>
+          <w:i/>
+        </w:rPr>
+        <w:t>Browser</w:t>
+      </w:r>
+      <w:r>
+        <w:rPr/>
+        <w:t xml:space="preserve">, dan </w:t>
+      </w:r>
+      <w:r>
+        <w:rPr>
+          <w:i/>
+        </w:rPr>
+        <w:t>Draw.io</w:t>
+      </w:r>
+      <w:r>
+        <w:rPr/>
+        <w:t>.</w:t>
       </w:r>
     </w:p>
     <w:p>
@@ -4668,7 +5227,17 @@
       <w:r/>
       <w:r/>
       <w:r>
-        <w:t xml:space="preserve"> merupakan framework yang digunakan untuk membangun aplikasi </w:t>
+        <w:t xml:space="preserve"> merupakan </w:t>
+      </w:r>
+      <w:r>
+        <w:rPr>
+          <w:i/>
+        </w:rPr>
+        <w:t>framework</w:t>
+      </w:r>
+      <w:r>
+        <w:rPr/>
+        <w:t xml:space="preserve"> yang digunakan untuk membangun aplikasi </w:t>
       </w:r>
       <w:r/>
       <w:r>
@@ -4679,7 +5248,17 @@
       </w:r>
       <w:r/>
       <w:r>
-        <w:t xml:space="preserve"> dengan tampilan antarmuka yang konsisten dan responsif. Penelitian aplikasi barbershop berbasis </w:t>
+        <w:t xml:space="preserve"> dengan tampilan antarmuka yang konsisten dan responsif. Penelitian aplikasi </w:t>
+      </w:r>
+      <w:r>
+        <w:rPr>
+          <w:i/>
+        </w:rPr>
+        <w:t>barbershop</w:t>
+      </w:r>
+      <w:r>
+        <w:rPr/>
+        <w:t xml:space="preserve"> berbasis </w:t>
       </w:r>
       <w:r/>
       <w:r>
@@ -4701,7 +5280,17 @@
       </w:r>
       <w:r/>
       <w:r>
-        <w:t xml:space="preserve"> dapat digunakan dalam pengembangan aplikasi layanan barbershop [1]. Pada penelitian ini, </w:t>
+        <w:t xml:space="preserve"> dapat digunakan dalam pengembangan aplikasi layanan </w:t>
+      </w:r>
+      <w:r>
+        <w:rPr>
+          <w:i/>
+        </w:rPr>
+        <w:t>barbershop</w:t>
+      </w:r>
+      <w:r>
+        <w:rPr/>
+        <w:t xml:space="preserve"> [1]. Pada penelitian ini, </w:t>
       </w:r>
       <w:r/>
       <w:r>
@@ -4712,7 +5301,17 @@
       </w:r>
       <w:r/>
       <w:r>
-        <w:t xml:space="preserve"> digunakan sebagai framework utama dalam pengembangan aplikasi </w:t>
+        <w:t xml:space="preserve"> digunakan sebagai </w:t>
+      </w:r>
+      <w:r>
+        <w:rPr>
+          <w:i/>
+        </w:rPr>
+        <w:t>framework</w:t>
+      </w:r>
+      <w:r>
+        <w:rPr/>
+        <w:t xml:space="preserve"> utama dalam pengembangan aplikasi </w:t>
       </w:r>
       <w:r/>
       <w:r>
@@ -4775,7 +5374,17 @@
       <w:r/>
       <w:r/>
       <w:r>
-        <w:t xml:space="preserve"> merupakan bahasa pemrograman yang digunakan pada framework </w:t>
+        <w:t xml:space="preserve"> merupakan bahasa pemrograman yang digunakan pada </w:t>
+      </w:r>
+      <w:r>
+        <w:rPr>
+          <w:i/>
+        </w:rPr>
+        <w:t>framework</w:t>
+      </w:r>
+      <w:r>
+        <w:rPr/>
+        <w:t xml:space="preserve"> </w:t>
       </w:r>
       <w:r/>
       <w:r>
@@ -4817,7 +5426,13 @@
         <w:jc w:val="left"/>
       </w:pPr>
       <w:r>
-        <w:t>2.3.3.  SharedPreferences</w:t>
+        <w:t xml:space="preserve">2.3.3.  </w:t>
+      </w:r>
+      <w:r>
+        <w:rPr>
+          <w:i/>
+        </w:rPr>
+        <w:t>SharedPreferences</w:t>
       </w:r>
     </w:p>
     <w:p>
@@ -4829,7 +5444,13 @@
         <w:rPr>
           <w:i/>
         </w:rPr>
-        <w:t xml:space="preserve">SharedPreferences merupakan penyimpanan lokal sederhana yang digunakan untuk menyimpan data ringan pada aplikasi </w:t>
+        <w:t>SharedPreferences</w:t>
+      </w:r>
+      <w:r>
+        <w:rPr>
+          <w:i/>
+        </w:rPr>
+        <w:t xml:space="preserve"> merupakan penyimpanan lokal sederhana yang digunakan untuk menyimpan data ringan pada aplikasi </w:t>
       </w:r>
       <w:r/>
       <w:r>
@@ -4853,7 +5474,17 @@
       </w:r>
       <w:r/>
       <w:r>
-        <w:t>. Pada penelitian ini, SharedPreferences dapat digunakan untuk menyimpan status sesi pengguna secara lokal agar aplikasi dapat mengenali kondisi login pengguna.</w:t>
+        <w:t xml:space="preserve">. Pada penelitian ini, </w:t>
+      </w:r>
+      <w:r>
+        <w:rPr>
+          <w:i/>
+        </w:rPr>
+        <w:t>SharedPreferences</w:t>
+      </w:r>
+      <w:r>
+        <w:rPr/>
+        <w:t xml:space="preserve"> dapat digunakan untuk menyimpan status sesi pengguna secara lokal agar aplikasi dapat mengenali kondisi login pengguna.</w:t>
       </w:r>
     </w:p>
     <w:p>
@@ -4862,7 +5493,13 @@
         <w:jc w:val="left"/>
       </w:pPr>
       <w:r>
-        <w:t>2.3.4.  Figma</w:t>
+        <w:t xml:space="preserve">2.3.4.  </w:t>
+      </w:r>
+      <w:r>
+        <w:rPr>
+          <w:i/>
+        </w:rPr>
+        <w:t>Figma</w:t>
       </w:r>
     </w:p>
     <w:p>
@@ -4874,7 +5511,25 @@
         <w:rPr>
           <w:i/>
         </w:rPr>
-        <w:t xml:space="preserve">Figma merupakan perangkat lunak yang digunakan untuk membuat rancangan antarmuka aplikasi. Dengan Figma, perancangan </w:t>
+        <w:t>Figma</w:t>
+      </w:r>
+      <w:r>
+        <w:rPr>
+          <w:i/>
+        </w:rPr>
+        <w:t xml:space="preserve"> merupakan perangkat lunak yang digunakan untuk membuat rancangan antarmuka aplikasi. Dengan </w:t>
+      </w:r>
+      <w:r>
+        <w:rPr>
+          <w:i/>
+        </w:rPr>
+        <w:t>Figma</w:t>
+      </w:r>
+      <w:r>
+        <w:rPr>
+          <w:i/>
+        </w:rPr>
+        <w:t xml:space="preserve">, perancangan </w:t>
       </w:r>
       <w:r/>
       <w:r>
@@ -4907,7 +5562,13 @@
         <w:jc w:val="left"/>
       </w:pPr>
       <w:r>
-        <w:t>2.3.5.  Visual Studio Code</w:t>
+        <w:t xml:space="preserve">2.3.5.  </w:t>
+      </w:r>
+      <w:r>
+        <w:rPr>
+          <w:i/>
+        </w:rPr>
+        <w:t>Visual Studio Code</w:t>
       </w:r>
     </w:p>
     <w:p>
@@ -4919,7 +5580,25 @@
         <w:rPr>
           <w:i/>
         </w:rPr>
-        <w:t xml:space="preserve">Visual Studio Code merupakan perangkat lunak editor kode yang dapat digunakan untuk menulis, mengelola, dan menjalankan kode program. Dalam penelitian ini, Visual Studio Code digunakan sebagai alat bantu pengembangan aplikasi </w:t>
+        <w:t>Visual Studio Code</w:t>
+      </w:r>
+      <w:r>
+        <w:rPr>
+          <w:i/>
+        </w:rPr>
+        <w:t xml:space="preserve"> merupakan perangkat lunak editor kode yang dapat digunakan untuk menulis, mengelola, dan menjalankan kode program. Dalam penelitian ini, </w:t>
+      </w:r>
+      <w:r>
+        <w:rPr>
+          <w:i/>
+        </w:rPr>
+        <w:t>Visual Studio Code</w:t>
+      </w:r>
+      <w:r>
+        <w:rPr>
+          <w:i/>
+        </w:rPr>
+        <w:t xml:space="preserve"> digunakan sebagai alat bantu pengembangan aplikasi </w:t>
       </w:r>
       <w:r/>
       <w:r>
@@ -4952,7 +5631,13 @@
         <w:jc w:val="left"/>
       </w:pPr>
       <w:r>
-        <w:t>2.3.6.  Browser</w:t>
+        <w:t xml:space="preserve">2.3.6.  </w:t>
+      </w:r>
+      <w:r>
+        <w:rPr>
+          <w:i/>
+        </w:rPr>
+        <w:t>Browser</w:t>
       </w:r>
     </w:p>
     <w:p>
@@ -4964,7 +5649,25 @@
         <w:rPr>
           <w:i/>
         </w:rPr>
-        <w:t xml:space="preserve">Browser merupakan perangkat lunak yang digunakan untuk mengakses layanan berbasis internet. Pada penelitian ini, browser digunakan untuk mengakses </w:t>
+        <w:t>Browser</w:t>
+      </w:r>
+      <w:r>
+        <w:rPr>
+          <w:i/>
+        </w:rPr>
+        <w:t xml:space="preserve"> merupakan perangkat lunak yang digunakan untuk mengakses layanan berbasis internet. Pada penelitian ini, </w:t>
+      </w:r>
+      <w:r>
+        <w:rPr>
+          <w:i/>
+        </w:rPr>
+        <w:t>browser</w:t>
+      </w:r>
+      <w:r>
+        <w:rPr>
+          <w:i/>
+        </w:rPr>
+        <w:t xml:space="preserve"> digunakan untuk mengakses </w:t>
       </w:r>
       <w:r/>
       <w:r>
@@ -5010,8 +5713,13 @@
         <w:jc w:val="left"/>
       </w:pPr>
       <w:r>
-        <w:lastRenderedPageBreak/>
-        <w:t>2.3.7.  Draw.io</w:t>
+        <w:t xml:space="preserve">2.3.7.  </w:t>
+      </w:r>
+      <w:r>
+        <w:rPr>
+          <w:i/>
+        </w:rPr>
+        <w:t>Draw.io</w:t>
       </w:r>
     </w:p>
     <w:p>
@@ -5071,7 +5779,17 @@
         <w:jc w:val="left"/>
       </w:pPr>
       <w:r>
-        <w:t>2.4.1.  UML (Unified Modeling Language)</w:t>
+        <w:t>2.4.1.  UML (</w:t>
+      </w:r>
+      <w:r>
+        <w:rPr>
+          <w:i/>
+        </w:rPr>
+        <w:t>Unified Modeling Language</w:t>
+      </w:r>
+      <w:r>
+        <w:rPr/>
+        <w:t>)</w:t>
       </w:r>
     </w:p>
     <w:p>
@@ -5172,7 +5890,6 @@
         <w:jc w:val="center"/>
       </w:pPr>
       <w:r>
-        <w:lastRenderedPageBreak/>
         <w:t xml:space="preserve">Tabel 2. 2 </w:t>
       </w:r>
       <w:r>
@@ -5321,54 +6038,6 @@
                 <w:noProof/>
                 <w:szCs w:val="28"/>
               </w:rPr>
-              <w:drawing>
-                <wp:inline distT="0" distB="0" distL="0" distR="0" wp14:anchorId="4B1F4A1D" wp14:editId="18B5E0AC">
-                  <wp:extent cx="1174750" cy="889000"/>
-                  <wp:effectExtent l="0" t="0" r="6350" b="6350"/>
-                  <wp:docPr id="1847283418" name="Picture 1"/>
-                  <wp:cNvGraphicFramePr>
-                    <a:graphicFrameLocks xmlns:a="http://schemas.openxmlformats.org/drawingml/2006/main" noChangeAspect="1"/>
-                  </wp:cNvGraphicFramePr>
-                  <a:graphic xmlns:a="http://schemas.openxmlformats.org/drawingml/2006/main">
-                    <a:graphicData uri="http://schemas.openxmlformats.org/drawingml/2006/picture">
-                      <pic:pic xmlns:pic="http://schemas.openxmlformats.org/drawingml/2006/picture">
-                        <pic:nvPicPr>
-                          <pic:cNvPr id="0" name="Picture 2"/>
-                          <pic:cNvPicPr>
-                            <a:picLocks noChangeAspect="1" noChangeArrowheads="1"/>
-                          </pic:cNvPicPr>
-                        </pic:nvPicPr>
-                        <pic:blipFill>
-                          <a:blip r:embed="rId7">
-                            <a:extLst>
-                              <a:ext uri="{28A0092B-C50C-407E-A947-70E740481C1C}">
-                                <a14:useLocalDpi xmlns:a14="http://schemas.microsoft.com/office/drawing/2010/main" val="0"/>
-                              </a:ext>
-                            </a:extLst>
-                          </a:blip>
-                          <a:srcRect l="6281" t="23293" r="7039" b="3633"/>
-                          <a:stretch>
-                            <a:fillRect/>
-                          </a:stretch>
-                        </pic:blipFill>
-                        <pic:spPr bwMode="auto">
-                          <a:xfrm>
-                            <a:off x="0" y="0"/>
-                            <a:ext cx="1174750" cy="889000"/>
-                          </a:xfrm>
-                          <a:prstGeom prst="rect">
-                            <a:avLst/>
-                          </a:prstGeom>
-                          <a:noFill/>
-                          <a:ln>
-                            <a:noFill/>
-                          </a:ln>
-                        </pic:spPr>
-                      </pic:pic>
-                    </a:graphicData>
-                  </a:graphic>
-                </wp:inline>
-              </w:drawing>
             </w:r>
           </w:p>
         </w:tc>
@@ -5449,54 +6118,6 @@
                 <w:noProof/>
                 <w:szCs w:val="28"/>
               </w:rPr>
-              <w:drawing>
-                <wp:inline distT="0" distB="0" distL="0" distR="0" wp14:anchorId="160DD11E" wp14:editId="6C925948">
-                  <wp:extent cx="864235" cy="1065530"/>
-                  <wp:effectExtent l="0" t="0" r="0" b="1270"/>
-                  <wp:docPr id="1996773011" name="Picture 2"/>
-                  <wp:cNvGraphicFramePr>
-                    <a:graphicFrameLocks xmlns:a="http://schemas.openxmlformats.org/drawingml/2006/main" noChangeAspect="1"/>
-                  </wp:cNvGraphicFramePr>
-                  <a:graphic xmlns:a="http://schemas.openxmlformats.org/drawingml/2006/main">
-                    <a:graphicData uri="http://schemas.openxmlformats.org/drawingml/2006/picture">
-                      <pic:pic xmlns:pic="http://schemas.openxmlformats.org/drawingml/2006/picture">
-                        <pic:nvPicPr>
-                          <pic:cNvPr id="0" name="Picture 4"/>
-                          <pic:cNvPicPr>
-                            <a:picLocks noChangeAspect="1" noChangeArrowheads="1"/>
-                          </pic:cNvPicPr>
-                        </pic:nvPicPr>
-                        <pic:blipFill>
-                          <a:blip r:embed="rId8">
-                            <a:extLst>
-                              <a:ext uri="{28A0092B-C50C-407E-A947-70E740481C1C}">
-                                <a14:useLocalDpi xmlns:a14="http://schemas.microsoft.com/office/drawing/2010/main" val="0"/>
-                              </a:ext>
-                            </a:extLst>
-                          </a:blip>
-                          <a:srcRect/>
-                          <a:stretch>
-                            <a:fillRect/>
-                          </a:stretch>
-                        </pic:blipFill>
-                        <pic:spPr bwMode="auto">
-                          <a:xfrm>
-                            <a:off x="0" y="0"/>
-                            <a:ext cx="864235" cy="1065530"/>
-                          </a:xfrm>
-                          <a:prstGeom prst="rect">
-                            <a:avLst/>
-                          </a:prstGeom>
-                          <a:noFill/>
-                          <a:ln>
-                            <a:noFill/>
-                          </a:ln>
-                        </pic:spPr>
-                      </pic:pic>
-                    </a:graphicData>
-                  </a:graphic>
-                </wp:inline>
-              </w:drawing>
             </w:r>
           </w:p>
         </w:tc>
@@ -5595,54 +6216,6 @@
                 <w:noProof/>
                 <w:szCs w:val="28"/>
               </w:rPr>
-              <w:drawing>
-                <wp:inline distT="0" distB="0" distL="0" distR="0" wp14:anchorId="65959986" wp14:editId="3395279F">
-                  <wp:extent cx="813435" cy="922655"/>
-                  <wp:effectExtent l="0" t="0" r="5715" b="0"/>
-                  <wp:docPr id="965147951" name="Picture 3"/>
-                  <wp:cNvGraphicFramePr>
-                    <a:graphicFrameLocks xmlns:a="http://schemas.openxmlformats.org/drawingml/2006/main" noChangeAspect="1"/>
-                  </wp:cNvGraphicFramePr>
-                  <a:graphic xmlns:a="http://schemas.openxmlformats.org/drawingml/2006/main">
-                    <a:graphicData uri="http://schemas.openxmlformats.org/drawingml/2006/picture">
-                      <pic:pic xmlns:pic="http://schemas.openxmlformats.org/drawingml/2006/picture">
-                        <pic:nvPicPr>
-                          <pic:cNvPr id="0" name="Picture 5"/>
-                          <pic:cNvPicPr>
-                            <a:picLocks noChangeAspect="1" noChangeArrowheads="1"/>
-                          </pic:cNvPicPr>
-                        </pic:nvPicPr>
-                        <pic:blipFill>
-                          <a:blip r:embed="rId9">
-                            <a:extLst>
-                              <a:ext uri="{28A0092B-C50C-407E-A947-70E740481C1C}">
-                                <a14:useLocalDpi xmlns:a14="http://schemas.microsoft.com/office/drawing/2010/main" val="0"/>
-                              </a:ext>
-                            </a:extLst>
-                          </a:blip>
-                          <a:srcRect l="21823" t="17680" r="19379" b="4526"/>
-                          <a:stretch>
-                            <a:fillRect/>
-                          </a:stretch>
-                        </pic:blipFill>
-                        <pic:spPr bwMode="auto">
-                          <a:xfrm>
-                            <a:off x="0" y="0"/>
-                            <a:ext cx="813435" cy="922655"/>
-                          </a:xfrm>
-                          <a:prstGeom prst="rect">
-                            <a:avLst/>
-                          </a:prstGeom>
-                          <a:noFill/>
-                          <a:ln>
-                            <a:noFill/>
-                          </a:ln>
-                        </pic:spPr>
-                      </pic:pic>
-                    </a:graphicData>
-                  </a:graphic>
-                </wp:inline>
-              </w:drawing>
             </w:r>
           </w:p>
         </w:tc>
@@ -5715,54 +6288,6 @@
                 <w:noProof/>
                 <w:szCs w:val="28"/>
               </w:rPr>
-              <w:drawing>
-                <wp:inline distT="0" distB="0" distL="0" distR="0" wp14:anchorId="38485ADC" wp14:editId="62DBA74D">
-                  <wp:extent cx="1165860" cy="327025"/>
-                  <wp:effectExtent l="0" t="0" r="0" b="0"/>
-                  <wp:docPr id="317500892" name="Picture 4"/>
-                  <wp:cNvGraphicFramePr>
-                    <a:graphicFrameLocks xmlns:a="http://schemas.openxmlformats.org/drawingml/2006/main" noChangeAspect="1"/>
-                  </wp:cNvGraphicFramePr>
-                  <a:graphic xmlns:a="http://schemas.openxmlformats.org/drawingml/2006/main">
-                    <a:graphicData uri="http://schemas.openxmlformats.org/drawingml/2006/picture">
-                      <pic:pic xmlns:pic="http://schemas.openxmlformats.org/drawingml/2006/picture">
-                        <pic:nvPicPr>
-                          <pic:cNvPr id="0" name="Picture 9"/>
-                          <pic:cNvPicPr>
-                            <a:picLocks noChangeAspect="1" noChangeArrowheads="1"/>
-                          </pic:cNvPicPr>
-                        </pic:nvPicPr>
-                        <pic:blipFill>
-                          <a:blip r:embed="rId10">
-                            <a:extLst>
-                              <a:ext uri="{28A0092B-C50C-407E-A947-70E740481C1C}">
-                                <a14:useLocalDpi xmlns:a14="http://schemas.microsoft.com/office/drawing/2010/main" val="0"/>
-                              </a:ext>
-                            </a:extLst>
-                          </a:blip>
-                          <a:srcRect l="49893" t="91245" r="26901" b="3880"/>
-                          <a:stretch>
-                            <a:fillRect/>
-                          </a:stretch>
-                        </pic:blipFill>
-                        <pic:spPr bwMode="auto">
-                          <a:xfrm>
-                            <a:off x="0" y="0"/>
-                            <a:ext cx="1165860" cy="327025"/>
-                          </a:xfrm>
-                          <a:prstGeom prst="rect">
-                            <a:avLst/>
-                          </a:prstGeom>
-                          <a:noFill/>
-                          <a:ln>
-                            <a:noFill/>
-                          </a:ln>
-                        </pic:spPr>
-                      </pic:pic>
-                    </a:graphicData>
-                  </a:graphic>
-                </wp:inline>
-              </w:drawing>
             </w:r>
           </w:p>
         </w:tc>
@@ -5857,54 +6382,6 @@
                 <w:noProof/>
                 <w:szCs w:val="28"/>
               </w:rPr>
-              <w:drawing>
-                <wp:inline distT="0" distB="0" distL="0" distR="0" wp14:anchorId="1C8DAB20" wp14:editId="490C29B2">
-                  <wp:extent cx="1295400" cy="381000"/>
-                  <wp:effectExtent l="0" t="0" r="0" b="0"/>
-                  <wp:docPr id="1259447020" name="Picture 5"/>
-                  <wp:cNvGraphicFramePr>
-                    <a:graphicFrameLocks xmlns:a="http://schemas.openxmlformats.org/drawingml/2006/main" noChangeAspect="1"/>
-                  </wp:cNvGraphicFramePr>
-                  <a:graphic xmlns:a="http://schemas.openxmlformats.org/drawingml/2006/main">
-                    <a:graphicData uri="http://schemas.openxmlformats.org/drawingml/2006/picture">
-                      <pic:pic xmlns:pic="http://schemas.openxmlformats.org/drawingml/2006/picture">
-                        <pic:nvPicPr>
-                          <pic:cNvPr id="0" name="Picture 10"/>
-                          <pic:cNvPicPr>
-                            <a:picLocks noChangeAspect="1" noChangeArrowheads="1"/>
-                          </pic:cNvPicPr>
-                        </pic:nvPicPr>
-                        <pic:blipFill>
-                          <a:blip r:embed="rId11">
-                            <a:extLst>
-                              <a:ext uri="{28A0092B-C50C-407E-A947-70E740481C1C}">
-                                <a14:useLocalDpi xmlns:a14="http://schemas.microsoft.com/office/drawing/2010/main" val="0"/>
-                              </a:ext>
-                            </a:extLst>
-                          </a:blip>
-                          <a:srcRect l="45094" t="46930" r="22514" b="24911"/>
-                          <a:stretch>
-                            <a:fillRect/>
-                          </a:stretch>
-                        </pic:blipFill>
-                        <pic:spPr bwMode="auto">
-                          <a:xfrm>
-                            <a:off x="0" y="0"/>
-                            <a:ext cx="1295400" cy="381000"/>
-                          </a:xfrm>
-                          <a:prstGeom prst="rect">
-                            <a:avLst/>
-                          </a:prstGeom>
-                          <a:noFill/>
-                          <a:ln>
-                            <a:noFill/>
-                          </a:ln>
-                        </pic:spPr>
-                      </pic:pic>
-                    </a:graphicData>
-                  </a:graphic>
-                </wp:inline>
-              </w:drawing>
             </w:r>
           </w:p>
         </w:tc>
@@ -5968,7 +6445,6 @@
               <w:t xml:space="preserve"> </w:t>
             </w:r>
             <w:r>
-              <w:lastRenderedPageBreak/>
               <w:t>menyertakan fungsionalitas</w:t>
             </w:r>
             <w:r>
@@ -6007,7 +6483,6 @@
               <w:jc w:val="center"/>
             </w:pPr>
             <w:r>
-              <w:lastRenderedPageBreak/>
               <w:t>6</w:t>
             </w:r>
           </w:p>
@@ -6027,54 +6502,6 @@
               <w:rPr>
                 <w:noProof/>
               </w:rPr>
-              <w:drawing>
-                <wp:inline distT="0" distB="0" distL="0" distR="0" wp14:anchorId="2320F422" wp14:editId="494FEDB2">
-                  <wp:extent cx="1291590" cy="394335"/>
-                  <wp:effectExtent l="0" t="0" r="3810" b="5715"/>
-                  <wp:docPr id="1612808766" name="Picture 6"/>
-                  <wp:cNvGraphicFramePr>
-                    <a:graphicFrameLocks xmlns:a="http://schemas.openxmlformats.org/drawingml/2006/main" noChangeAspect="1"/>
-                  </wp:cNvGraphicFramePr>
-                  <a:graphic xmlns:a="http://schemas.openxmlformats.org/drawingml/2006/main">
-                    <a:graphicData uri="http://schemas.openxmlformats.org/drawingml/2006/picture">
-                      <pic:pic xmlns:pic="http://schemas.openxmlformats.org/drawingml/2006/picture">
-                        <pic:nvPicPr>
-                          <pic:cNvPr id="0" name="Picture 11"/>
-                          <pic:cNvPicPr>
-                            <a:picLocks noChangeAspect="1" noChangeArrowheads="1"/>
-                          </pic:cNvPicPr>
-                        </pic:nvPicPr>
-                        <pic:blipFill>
-                          <a:blip r:embed="rId12">
-                            <a:extLst>
-                              <a:ext uri="{28A0092B-C50C-407E-A947-70E740481C1C}">
-                                <a14:useLocalDpi xmlns:a14="http://schemas.microsoft.com/office/drawing/2010/main" val="0"/>
-                              </a:ext>
-                            </a:extLst>
-                          </a:blip>
-                          <a:srcRect l="43849" t="44875" r="22704" b="23872"/>
-                          <a:stretch>
-                            <a:fillRect/>
-                          </a:stretch>
-                        </pic:blipFill>
-                        <pic:spPr bwMode="auto">
-                          <a:xfrm>
-                            <a:off x="0" y="0"/>
-                            <a:ext cx="1291590" cy="394335"/>
-                          </a:xfrm>
-                          <a:prstGeom prst="rect">
-                            <a:avLst/>
-                          </a:prstGeom>
-                          <a:noFill/>
-                          <a:ln>
-                            <a:noFill/>
-                          </a:ln>
-                        </pic:spPr>
-                      </pic:pic>
-                    </a:graphicData>
-                  </a:graphic>
-                </wp:inline>
-              </w:drawing>
             </w:r>
           </w:p>
         </w:tc>
@@ -6204,7 +6631,13 @@
         <w:jc w:val="center"/>
       </w:pPr>
       <w:r>
-        <w:t>Tabel 2. 3 Activity Diagram</w:t>
+        <w:t xml:space="preserve">Tabel 2. 3 </w:t>
+      </w:r>
+      <w:r>
+        <w:rPr>
+          <w:i/>
+        </w:rPr>
+        <w:t>Activity Diagram</w:t>
       </w:r>
     </w:p>
     <w:tbl>
@@ -6341,54 +6774,6 @@
               <w:rPr>
                 <w:noProof/>
               </w:rPr>
-              <w:drawing>
-                <wp:inline distT="0" distB="0" distL="0" distR="0" wp14:anchorId="073AA36D" wp14:editId="51375C58">
-                  <wp:extent cx="609600" cy="609600"/>
-                  <wp:effectExtent l="0" t="0" r="0" b="0"/>
-                  <wp:docPr id="1332312751" name="Picture 7"/>
-                  <wp:cNvGraphicFramePr>
-                    <a:graphicFrameLocks xmlns:a="http://schemas.openxmlformats.org/drawingml/2006/main" noChangeAspect="1"/>
-                  </wp:cNvGraphicFramePr>
-                  <a:graphic xmlns:a="http://schemas.openxmlformats.org/drawingml/2006/main">
-                    <a:graphicData uri="http://schemas.openxmlformats.org/drawingml/2006/picture">
-                      <pic:pic xmlns:pic="http://schemas.openxmlformats.org/drawingml/2006/picture">
-                        <pic:nvPicPr>
-                          <pic:cNvPr id="0" name="Picture 12"/>
-                          <pic:cNvPicPr>
-                            <a:picLocks noChangeAspect="1" noChangeArrowheads="1"/>
-                          </pic:cNvPicPr>
-                        </pic:nvPicPr>
-                        <pic:blipFill>
-                          <a:blip r:embed="rId13">
-                            <a:extLst>
-                              <a:ext uri="{28A0092B-C50C-407E-A947-70E740481C1C}">
-                                <a14:useLocalDpi xmlns:a14="http://schemas.microsoft.com/office/drawing/2010/main" val="0"/>
-                              </a:ext>
-                            </a:extLst>
-                          </a:blip>
-                          <a:srcRect l="21867" t="24574" r="19283" b="24504"/>
-                          <a:stretch>
-                            <a:fillRect/>
-                          </a:stretch>
-                        </pic:blipFill>
-                        <pic:spPr bwMode="auto">
-                          <a:xfrm>
-                            <a:off x="0" y="0"/>
-                            <a:ext cx="609600" cy="609600"/>
-                          </a:xfrm>
-                          <a:prstGeom prst="rect">
-                            <a:avLst/>
-                          </a:prstGeom>
-                          <a:noFill/>
-                          <a:ln>
-                            <a:noFill/>
-                          </a:ln>
-                        </pic:spPr>
-                      </pic:pic>
-                    </a:graphicData>
-                  </a:graphic>
-                </wp:inline>
-              </w:drawing>
             </w:r>
           </w:p>
         </w:tc>
@@ -6468,54 +6853,6 @@
               <w:rPr>
                 <w:noProof/>
               </w:rPr>
-              <w:drawing>
-                <wp:inline distT="0" distB="0" distL="0" distR="0" wp14:anchorId="26A11B76" wp14:editId="2128D7B8">
-                  <wp:extent cx="704850" cy="436245"/>
-                  <wp:effectExtent l="0" t="0" r="0" b="1905"/>
-                  <wp:docPr id="755496447" name="Picture 8"/>
-                  <wp:cNvGraphicFramePr>
-                    <a:graphicFrameLocks xmlns:a="http://schemas.openxmlformats.org/drawingml/2006/main" noChangeAspect="1"/>
-                  </wp:cNvGraphicFramePr>
-                  <a:graphic xmlns:a="http://schemas.openxmlformats.org/drawingml/2006/main">
-                    <a:graphicData uri="http://schemas.openxmlformats.org/drawingml/2006/picture">
-                      <pic:pic xmlns:pic="http://schemas.openxmlformats.org/drawingml/2006/picture">
-                        <pic:nvPicPr>
-                          <pic:cNvPr id="0" name="Picture 13"/>
-                          <pic:cNvPicPr>
-                            <a:picLocks noChangeAspect="1" noChangeArrowheads="1"/>
-                          </pic:cNvPicPr>
-                        </pic:nvPicPr>
-                        <pic:blipFill>
-                          <a:blip r:embed="rId14">
-                            <a:extLst>
-                              <a:ext uri="{28A0092B-C50C-407E-A947-70E740481C1C}">
-                                <a14:useLocalDpi xmlns:a14="http://schemas.microsoft.com/office/drawing/2010/main" val="0"/>
-                              </a:ext>
-                            </a:extLst>
-                          </a:blip>
-                          <a:srcRect l="20020" t="36600" r="8415" b="26707"/>
-                          <a:stretch>
-                            <a:fillRect/>
-                          </a:stretch>
-                        </pic:blipFill>
-                        <pic:spPr bwMode="auto">
-                          <a:xfrm>
-                            <a:off x="0" y="0"/>
-                            <a:ext cx="704850" cy="436245"/>
-                          </a:xfrm>
-                          <a:prstGeom prst="rect">
-                            <a:avLst/>
-                          </a:prstGeom>
-                          <a:noFill/>
-                          <a:ln>
-                            <a:noFill/>
-                          </a:ln>
-                        </pic:spPr>
-                      </pic:pic>
-                    </a:graphicData>
-                  </a:graphic>
-                </wp:inline>
-              </w:drawing>
             </w:r>
           </w:p>
         </w:tc>
@@ -6558,7 +6895,6 @@
               <w:t xml:space="preserve">Elemen ini digunakan untuk menunjukkan </w:t>
             </w:r>
             <w:r>
-              <w:lastRenderedPageBreak/>
               <w:t>akhir dari suatu alur aktivitas.</w:t>
             </w:r>
           </w:p>
@@ -6580,7 +6916,6 @@
               <w:jc w:val="center"/>
             </w:pPr>
             <w:r>
-              <w:lastRenderedPageBreak/>
               <w:t>3</w:t>
             </w:r>
           </w:p>
@@ -6600,54 +6935,6 @@
               <w:rPr>
                 <w:noProof/>
               </w:rPr>
-              <w:drawing>
-                <wp:inline distT="0" distB="0" distL="0" distR="0" wp14:anchorId="221B5A94" wp14:editId="778648AA">
-                  <wp:extent cx="964565" cy="469900"/>
-                  <wp:effectExtent l="0" t="0" r="6985" b="6350"/>
-                  <wp:docPr id="196464836" name="Picture 9"/>
-                  <wp:cNvGraphicFramePr>
-                    <a:graphicFrameLocks xmlns:a="http://schemas.openxmlformats.org/drawingml/2006/main" noChangeAspect="1"/>
-                  </wp:cNvGraphicFramePr>
-                  <a:graphic xmlns:a="http://schemas.openxmlformats.org/drawingml/2006/main">
-                    <a:graphicData uri="http://schemas.openxmlformats.org/drawingml/2006/picture">
-                      <pic:pic xmlns:pic="http://schemas.openxmlformats.org/drawingml/2006/picture">
-                        <pic:nvPicPr>
-                          <pic:cNvPr id="0" name="Picture 27"/>
-                          <pic:cNvPicPr>
-                            <a:picLocks noChangeAspect="1" noChangeArrowheads="1"/>
-                          </pic:cNvPicPr>
-                        </pic:nvPicPr>
-                        <pic:blipFill>
-                          <a:blip r:embed="rId15">
-                            <a:extLst>
-                              <a:ext uri="{28A0092B-C50C-407E-A947-70E740481C1C}">
-                                <a14:useLocalDpi xmlns:a14="http://schemas.microsoft.com/office/drawing/2010/main" val="0"/>
-                              </a:ext>
-                            </a:extLst>
-                          </a:blip>
-                          <a:srcRect l="6062" t="31233" r="4501" b="11115"/>
-                          <a:stretch>
-                            <a:fillRect/>
-                          </a:stretch>
-                        </pic:blipFill>
-                        <pic:spPr bwMode="auto">
-                          <a:xfrm>
-                            <a:off x="0" y="0"/>
-                            <a:ext cx="964565" cy="469900"/>
-                          </a:xfrm>
-                          <a:prstGeom prst="rect">
-                            <a:avLst/>
-                          </a:prstGeom>
-                          <a:noFill/>
-                          <a:ln>
-                            <a:noFill/>
-                          </a:ln>
-                        </pic:spPr>
-                      </pic:pic>
-                    </a:graphicData>
-                  </a:graphic>
-                </wp:inline>
-              </w:drawing>
             </w:r>
           </w:p>
         </w:tc>
@@ -6727,54 +7014,6 @@
               <w:rPr>
                 <w:noProof/>
               </w:rPr>
-              <w:drawing>
-                <wp:inline distT="0" distB="0" distL="0" distR="0" wp14:anchorId="4D11415F" wp14:editId="2E310BFF">
-                  <wp:extent cx="805175" cy="704850"/>
-                  <wp:effectExtent l="0" t="0" r="0" b="0"/>
-                  <wp:docPr id="1616552695" name="Picture 10"/>
-                  <wp:cNvGraphicFramePr>
-                    <a:graphicFrameLocks xmlns:a="http://schemas.openxmlformats.org/drawingml/2006/main" noChangeAspect="1"/>
-                  </wp:cNvGraphicFramePr>
-                  <a:graphic xmlns:a="http://schemas.openxmlformats.org/drawingml/2006/main">
-                    <a:graphicData uri="http://schemas.openxmlformats.org/drawingml/2006/picture">
-                      <pic:pic xmlns:pic="http://schemas.openxmlformats.org/drawingml/2006/picture">
-                        <pic:nvPicPr>
-                          <pic:cNvPr id="0" name="Picture 15"/>
-                          <pic:cNvPicPr>
-                            <a:picLocks noChangeAspect="1" noChangeArrowheads="1"/>
-                          </pic:cNvPicPr>
-                        </pic:nvPicPr>
-                        <pic:blipFill>
-                          <a:blip r:embed="rId16">
-                            <a:extLst>
-                              <a:ext uri="{28A0092B-C50C-407E-A947-70E740481C1C}">
-                                <a14:useLocalDpi xmlns:a14="http://schemas.microsoft.com/office/drawing/2010/main" val="0"/>
-                              </a:ext>
-                            </a:extLst>
-                          </a:blip>
-                          <a:srcRect l="19350" t="30164" r="15822" b="7999"/>
-                          <a:stretch>
-                            <a:fillRect/>
-                          </a:stretch>
-                        </pic:blipFill>
-                        <pic:spPr bwMode="auto">
-                          <a:xfrm>
-                            <a:off x="0" y="0"/>
-                            <a:ext cx="806446" cy="705963"/>
-                          </a:xfrm>
-                          <a:prstGeom prst="rect">
-                            <a:avLst/>
-                          </a:prstGeom>
-                          <a:noFill/>
-                          <a:ln>
-                            <a:noFill/>
-                          </a:ln>
-                        </pic:spPr>
-                      </pic:pic>
-                    </a:graphicData>
-                  </a:graphic>
-                </wp:inline>
-              </w:drawing>
             </w:r>
           </w:p>
         </w:tc>
@@ -6854,54 +7093,6 @@
               <w:rPr>
                 <w:noProof/>
               </w:rPr>
-              <w:drawing>
-                <wp:inline distT="0" distB="0" distL="0" distR="0" wp14:anchorId="6E54BDF7" wp14:editId="7AB78368">
-                  <wp:extent cx="764540" cy="267970"/>
-                  <wp:effectExtent l="0" t="0" r="0" b="0"/>
-                  <wp:docPr id="1666496307" name="Picture 11"/>
-                  <wp:cNvGraphicFramePr>
-                    <a:graphicFrameLocks xmlns:a="http://schemas.openxmlformats.org/drawingml/2006/main" noChangeAspect="1"/>
-                  </wp:cNvGraphicFramePr>
-                  <a:graphic xmlns:a="http://schemas.openxmlformats.org/drawingml/2006/main">
-                    <a:graphicData uri="http://schemas.openxmlformats.org/drawingml/2006/picture">
-                      <pic:pic xmlns:pic="http://schemas.openxmlformats.org/drawingml/2006/picture">
-                        <pic:nvPicPr>
-                          <pic:cNvPr id="0" name="Picture 17"/>
-                          <pic:cNvPicPr>
-                            <a:picLocks noChangeAspect="1" noChangeArrowheads="1"/>
-                          </pic:cNvPicPr>
-                        </pic:nvPicPr>
-                        <pic:blipFill>
-                          <a:blip r:embed="rId17">
-                            <a:extLst>
-                              <a:ext uri="{28A0092B-C50C-407E-A947-70E740481C1C}">
-                                <a14:useLocalDpi xmlns:a14="http://schemas.microsoft.com/office/drawing/2010/main" val="0"/>
-                              </a:ext>
-                            </a:extLst>
-                          </a:blip>
-                          <a:srcRect l="37987" t="43188" r="37067" b="21336"/>
-                          <a:stretch>
-                            <a:fillRect/>
-                          </a:stretch>
-                        </pic:blipFill>
-                        <pic:spPr bwMode="auto">
-                          <a:xfrm>
-                            <a:off x="0" y="0"/>
-                            <a:ext cx="764540" cy="267970"/>
-                          </a:xfrm>
-                          <a:prstGeom prst="rect">
-                            <a:avLst/>
-                          </a:prstGeom>
-                          <a:noFill/>
-                          <a:ln>
-                            <a:noFill/>
-                          </a:ln>
-                        </pic:spPr>
-                      </pic:pic>
-                    </a:graphicData>
-                  </a:graphic>
-                </wp:inline>
-              </w:drawing>
             </w:r>
           </w:p>
         </w:tc>
@@ -6981,54 +7172,6 @@
               <w:rPr>
                 <w:noProof/>
               </w:rPr>
-              <w:drawing>
-                <wp:inline distT="0" distB="0" distL="0" distR="0" wp14:anchorId="16FF4910" wp14:editId="2432DE9E">
-                  <wp:extent cx="998382" cy="755009"/>
-                  <wp:effectExtent l="0" t="0" r="0" b="7620"/>
-                  <wp:docPr id="275422450" name="Picture 12"/>
-                  <wp:cNvGraphicFramePr>
-                    <a:graphicFrameLocks xmlns:a="http://schemas.openxmlformats.org/drawingml/2006/main" noChangeAspect="1"/>
-                  </wp:cNvGraphicFramePr>
-                  <a:graphic xmlns:a="http://schemas.openxmlformats.org/drawingml/2006/main">
-                    <a:graphicData uri="http://schemas.openxmlformats.org/drawingml/2006/picture">
-                      <pic:pic xmlns:pic="http://schemas.openxmlformats.org/drawingml/2006/picture">
-                        <pic:nvPicPr>
-                          <pic:cNvPr id="0" name="Picture 18"/>
-                          <pic:cNvPicPr>
-                            <a:picLocks noChangeAspect="1" noChangeArrowheads="1"/>
-                          </pic:cNvPicPr>
-                        </pic:nvPicPr>
-                        <pic:blipFill>
-                          <a:blip r:embed="rId18">
-                            <a:extLst>
-                              <a:ext uri="{28A0092B-C50C-407E-A947-70E740481C1C}">
-                                <a14:useLocalDpi xmlns:a14="http://schemas.microsoft.com/office/drawing/2010/main" val="0"/>
-                              </a:ext>
-                            </a:extLst>
-                          </a:blip>
-                          <a:srcRect l="4578" t="13710" r="6387" b="27676"/>
-                          <a:stretch>
-                            <a:fillRect/>
-                          </a:stretch>
-                        </pic:blipFill>
-                        <pic:spPr bwMode="auto">
-                          <a:xfrm>
-                            <a:off x="0" y="0"/>
-                            <a:ext cx="1001679" cy="757502"/>
-                          </a:xfrm>
-                          <a:prstGeom prst="rect">
-                            <a:avLst/>
-                          </a:prstGeom>
-                          <a:noFill/>
-                          <a:ln>
-                            <a:noFill/>
-                          </a:ln>
-                        </pic:spPr>
-                      </pic:pic>
-                    </a:graphicData>
-                  </a:graphic>
-                </wp:inline>
-              </w:drawing>
             </w:r>
           </w:p>
         </w:tc>
@@ -7071,7 +7214,6 @@
               <w:t xml:space="preserve">Elemen ini digunakan untuk mengelompokkan aktivitas berdasarkan aktor </w:t>
             </w:r>
             <w:r>
-              <w:lastRenderedPageBreak/>
               <w:t>atau bagian tertentu.</w:t>
             </w:r>
           </w:p>
@@ -7085,7 +7227,6 @@
         <w:ind w:firstLine="0"/>
       </w:pPr>
       <w:r>
-        <w:lastRenderedPageBreak/>
         <w:t xml:space="preserve">c. </w:t>
       </w:r>
       <w:r>
@@ -7124,7 +7265,13 @@
         <w:jc w:val="center"/>
       </w:pPr>
       <w:r>
-        <w:t>Tabel 2. 4 Sequence Diagram</w:t>
+        <w:t xml:space="preserve">Tabel 2. 4 </w:t>
+      </w:r>
+      <w:r>
+        <w:rPr>
+          <w:i/>
+        </w:rPr>
+        <w:t>Sequence Diagram</w:t>
       </w:r>
     </w:p>
     <w:tbl>
@@ -7261,41 +7408,6 @@
               <w:rPr>
                 <w:noProof/>
               </w:rPr>
-              <w:drawing>
-                <wp:inline distT="0" distB="0" distL="0" distR="0" wp14:anchorId="2E5A9EA9" wp14:editId="24986DAF">
-                  <wp:extent cx="1208014" cy="604007"/>
-                  <wp:effectExtent l="0" t="0" r="0" b="5715"/>
-                  <wp:docPr id="1069574690" name="Picture 1069574690"/>
-                  <wp:cNvGraphicFramePr>
-                    <a:graphicFrameLocks xmlns:a="http://schemas.openxmlformats.org/drawingml/2006/main" noChangeAspect="1"/>
-                  </wp:cNvGraphicFramePr>
-                  <a:graphic xmlns:a="http://schemas.openxmlformats.org/drawingml/2006/main">
-                    <a:graphicData uri="http://schemas.openxmlformats.org/drawingml/2006/picture">
-                      <pic:pic xmlns:pic="http://schemas.openxmlformats.org/drawingml/2006/picture">
-                        <pic:nvPicPr>
-                          <pic:cNvPr id="0" name="image.png"/>
-                          <pic:cNvPicPr/>
-                        </pic:nvPicPr>
-                        <pic:blipFill>
-                          <a:blip r:embed="rId19"/>
-                          <a:stretch>
-                            <a:fillRect/>
-                          </a:stretch>
-                        </pic:blipFill>
-                        <pic:spPr>
-                          <a:xfrm>
-                            <a:off x="0" y="0"/>
-                            <a:ext cx="1223449" cy="611725"/>
-                          </a:xfrm>
-                          <a:prstGeom prst="rect">
-                            <a:avLst/>
-                          </a:prstGeom>
-                        </pic:spPr>
-                      </pic:pic>
-                    </a:graphicData>
-                  </a:graphic>
-                </wp:inline>
-              </w:drawing>
             </w:r>
           </w:p>
         </w:tc>
@@ -7367,41 +7479,6 @@
               <w:rPr>
                 <w:noProof/>
               </w:rPr>
-              <w:drawing>
-                <wp:inline distT="0" distB="0" distL="0" distR="0" wp14:anchorId="4F4343EB" wp14:editId="0A57842C">
-                  <wp:extent cx="1241570" cy="620785"/>
-                  <wp:effectExtent l="0" t="0" r="0" b="8255"/>
-                  <wp:docPr id="1069574691" name="Picture 1069574691"/>
-                  <wp:cNvGraphicFramePr>
-                    <a:graphicFrameLocks xmlns:a="http://schemas.openxmlformats.org/drawingml/2006/main" noChangeAspect="1"/>
-                  </wp:cNvGraphicFramePr>
-                  <a:graphic xmlns:a="http://schemas.openxmlformats.org/drawingml/2006/main">
-                    <a:graphicData uri="http://schemas.openxmlformats.org/drawingml/2006/picture">
-                      <pic:pic xmlns:pic="http://schemas.openxmlformats.org/drawingml/2006/picture">
-                        <pic:nvPicPr>
-                          <pic:cNvPr id="0" name="image.png"/>
-                          <pic:cNvPicPr/>
-                        </pic:nvPicPr>
-                        <pic:blipFill>
-                          <a:blip r:embed="rId20"/>
-                          <a:stretch>
-                            <a:fillRect/>
-                          </a:stretch>
-                        </pic:blipFill>
-                        <pic:spPr>
-                          <a:xfrm>
-                            <a:off x="0" y="0"/>
-                            <a:ext cx="1267750" cy="633875"/>
-                          </a:xfrm>
-                          <a:prstGeom prst="rect">
-                            <a:avLst/>
-                          </a:prstGeom>
-                        </pic:spPr>
-                      </pic:pic>
-                    </a:graphicData>
-                  </a:graphic>
-                </wp:inline>
-              </w:drawing>
             </w:r>
           </w:p>
         </w:tc>
@@ -7473,41 +7550,6 @@
               <w:rPr>
                 <w:noProof/>
               </w:rPr>
-              <w:drawing>
-                <wp:inline distT="0" distB="0" distL="0" distR="0" wp14:anchorId="004366B0" wp14:editId="153A43B1">
-                  <wp:extent cx="754806" cy="377403"/>
-                  <wp:effectExtent l="0" t="0" r="7620" b="3810"/>
-                  <wp:docPr id="1069574692" name="Picture 1069574692"/>
-                  <wp:cNvGraphicFramePr>
-                    <a:graphicFrameLocks xmlns:a="http://schemas.openxmlformats.org/drawingml/2006/main" noChangeAspect="1"/>
-                  </wp:cNvGraphicFramePr>
-                  <a:graphic xmlns:a="http://schemas.openxmlformats.org/drawingml/2006/main">
-                    <a:graphicData uri="http://schemas.openxmlformats.org/drawingml/2006/picture">
-                      <pic:pic xmlns:pic="http://schemas.openxmlformats.org/drawingml/2006/picture">
-                        <pic:nvPicPr>
-                          <pic:cNvPr id="0" name="image.png"/>
-                          <pic:cNvPicPr/>
-                        </pic:nvPicPr>
-                        <pic:blipFill>
-                          <a:blip r:embed="rId21"/>
-                          <a:stretch>
-                            <a:fillRect/>
-                          </a:stretch>
-                        </pic:blipFill>
-                        <pic:spPr>
-                          <a:xfrm>
-                            <a:off x="0" y="0"/>
-                            <a:ext cx="759745" cy="379872"/>
-                          </a:xfrm>
-                          <a:prstGeom prst="rect">
-                            <a:avLst/>
-                          </a:prstGeom>
-                        </pic:spPr>
-                      </pic:pic>
-                    </a:graphicData>
-                  </a:graphic>
-                </wp:inline>
-              </w:drawing>
             </w:r>
           </w:p>
         </w:tc>
@@ -7587,41 +7629,6 @@
               <w:rPr>
                 <w:noProof/>
               </w:rPr>
-              <w:drawing>
-                <wp:inline distT="0" distB="0" distL="0" distR="0" wp14:anchorId="57622548" wp14:editId="7E30715D">
-                  <wp:extent cx="1006680" cy="503340"/>
-                  <wp:effectExtent l="0" t="0" r="3175" b="0"/>
-                  <wp:docPr id="1069574693" name="Picture 1069574693"/>
-                  <wp:cNvGraphicFramePr>
-                    <a:graphicFrameLocks xmlns:a="http://schemas.openxmlformats.org/drawingml/2006/main" noChangeAspect="1"/>
-                  </wp:cNvGraphicFramePr>
-                  <a:graphic xmlns:a="http://schemas.openxmlformats.org/drawingml/2006/main">
-                    <a:graphicData uri="http://schemas.openxmlformats.org/drawingml/2006/picture">
-                      <pic:pic xmlns:pic="http://schemas.openxmlformats.org/drawingml/2006/picture">
-                        <pic:nvPicPr>
-                          <pic:cNvPr id="0" name="image.png"/>
-                          <pic:cNvPicPr/>
-                        </pic:nvPicPr>
-                        <pic:blipFill>
-                          <a:blip r:embed="rId22"/>
-                          <a:stretch>
-                            <a:fillRect/>
-                          </a:stretch>
-                        </pic:blipFill>
-                        <pic:spPr>
-                          <a:xfrm>
-                            <a:off x="0" y="0"/>
-                            <a:ext cx="1010071" cy="505035"/>
-                          </a:xfrm>
-                          <a:prstGeom prst="rect">
-                            <a:avLst/>
-                          </a:prstGeom>
-                        </pic:spPr>
-                      </pic:pic>
-                    </a:graphicData>
-                  </a:graphic>
-                </wp:inline>
-              </w:drawing>
             </w:r>
           </w:p>
         </w:tc>
@@ -7664,7 +7671,6 @@
               <w:t xml:space="preserve">Lifeline menunjukkan keberadaan objek </w:t>
             </w:r>
             <w:r>
-              <w:lastRenderedPageBreak/>
               <w:t>selama proses interaksi berlangsung.</w:t>
             </w:r>
           </w:p>
@@ -7686,7 +7692,6 @@
               <w:jc w:val="center"/>
             </w:pPr>
             <w:r>
-              <w:lastRenderedPageBreak/>
               <w:t>5</w:t>
             </w:r>
           </w:p>
@@ -7706,41 +7711,6 @@
               <w:rPr>
                 <w:noProof/>
               </w:rPr>
-              <w:drawing>
-                <wp:inline distT="0" distB="0" distL="0" distR="0" wp14:anchorId="241E6C7F" wp14:editId="1173341A">
-                  <wp:extent cx="1325460" cy="662730"/>
-                  <wp:effectExtent l="0" t="0" r="8255" b="4445"/>
-                  <wp:docPr id="1069574694" name="Picture 1069574694"/>
-                  <wp:cNvGraphicFramePr>
-                    <a:graphicFrameLocks xmlns:a="http://schemas.openxmlformats.org/drawingml/2006/main" noChangeAspect="1"/>
-                  </wp:cNvGraphicFramePr>
-                  <a:graphic xmlns:a="http://schemas.openxmlformats.org/drawingml/2006/main">
-                    <a:graphicData uri="http://schemas.openxmlformats.org/drawingml/2006/picture">
-                      <pic:pic xmlns:pic="http://schemas.openxmlformats.org/drawingml/2006/picture">
-                        <pic:nvPicPr>
-                          <pic:cNvPr id="0" name="image.png"/>
-                          <pic:cNvPicPr/>
-                        </pic:nvPicPr>
-                        <pic:blipFill>
-                          <a:blip r:embed="rId23"/>
-                          <a:stretch>
-                            <a:fillRect/>
-                          </a:stretch>
-                        </pic:blipFill>
-                        <pic:spPr>
-                          <a:xfrm>
-                            <a:off x="0" y="0"/>
-                            <a:ext cx="1334824" cy="667412"/>
-                          </a:xfrm>
-                          <a:prstGeom prst="rect">
-                            <a:avLst/>
-                          </a:prstGeom>
-                        </pic:spPr>
-                      </pic:pic>
-                    </a:graphicData>
-                  </a:graphic>
-                </wp:inline>
-              </w:drawing>
             </w:r>
           </w:p>
         </w:tc>
@@ -7823,7 +7793,13 @@
         <w:jc w:val="center"/>
       </w:pPr>
       <w:r>
-        <w:t>Tabel 2. 5 Class Diagram</w:t>
+        <w:t xml:space="preserve">Tabel 2. 5 </w:t>
+      </w:r>
+      <w:r>
+        <w:rPr>
+          <w:i/>
+        </w:rPr>
+        <w:t>Class Diagram</w:t>
       </w:r>
     </w:p>
     <w:tbl>
@@ -7961,41 +7937,6 @@
               <w:rPr>
                 <w:noProof/>
               </w:rPr>
-              <w:drawing>
-                <wp:inline distT="0" distB="0" distL="0" distR="0" wp14:anchorId="1447EE77" wp14:editId="632099CB">
-                  <wp:extent cx="1124124" cy="562062"/>
-                  <wp:effectExtent l="0" t="0" r="0" b="9525"/>
-                  <wp:docPr id="1069574695" name="Picture 1069574695"/>
-                  <wp:cNvGraphicFramePr>
-                    <a:graphicFrameLocks xmlns:a="http://schemas.openxmlformats.org/drawingml/2006/main" noChangeAspect="1"/>
-                  </wp:cNvGraphicFramePr>
-                  <a:graphic xmlns:a="http://schemas.openxmlformats.org/drawingml/2006/main">
-                    <a:graphicData uri="http://schemas.openxmlformats.org/drawingml/2006/picture">
-                      <pic:pic xmlns:pic="http://schemas.openxmlformats.org/drawingml/2006/picture">
-                        <pic:nvPicPr>
-                          <pic:cNvPr id="0" name="image.png"/>
-                          <pic:cNvPicPr/>
-                        </pic:nvPicPr>
-                        <pic:blipFill>
-                          <a:blip r:embed="rId24"/>
-                          <a:stretch>
-                            <a:fillRect/>
-                          </a:stretch>
-                        </pic:blipFill>
-                        <pic:spPr>
-                          <a:xfrm>
-                            <a:off x="0" y="0"/>
-                            <a:ext cx="1130736" cy="565368"/>
-                          </a:xfrm>
-                          <a:prstGeom prst="rect">
-                            <a:avLst/>
-                          </a:prstGeom>
-                        </pic:spPr>
-                      </pic:pic>
-                    </a:graphicData>
-                  </a:graphic>
-                </wp:inline>
-              </w:drawing>
             </w:r>
           </w:p>
         </w:tc>
@@ -8075,41 +8016,6 @@
               <w:rPr>
                 <w:noProof/>
               </w:rPr>
-              <w:drawing>
-                <wp:inline distT="0" distB="0" distL="0" distR="0" wp14:anchorId="16E9F411" wp14:editId="599800BE">
-                  <wp:extent cx="1006680" cy="503340"/>
-                  <wp:effectExtent l="0" t="0" r="3175" b="0"/>
-                  <wp:docPr id="1069574696" name="Picture 1069574696"/>
-                  <wp:cNvGraphicFramePr>
-                    <a:graphicFrameLocks xmlns:a="http://schemas.openxmlformats.org/drawingml/2006/main" noChangeAspect="1"/>
-                  </wp:cNvGraphicFramePr>
-                  <a:graphic xmlns:a="http://schemas.openxmlformats.org/drawingml/2006/main">
-                    <a:graphicData uri="http://schemas.openxmlformats.org/drawingml/2006/picture">
-                      <pic:pic xmlns:pic="http://schemas.openxmlformats.org/drawingml/2006/picture">
-                        <pic:nvPicPr>
-                          <pic:cNvPr id="0" name="image.png"/>
-                          <pic:cNvPicPr/>
-                        </pic:nvPicPr>
-                        <pic:blipFill>
-                          <a:blip r:embed="rId25"/>
-                          <a:stretch>
-                            <a:fillRect/>
-                          </a:stretch>
-                        </pic:blipFill>
-                        <pic:spPr>
-                          <a:xfrm>
-                            <a:off x="0" y="0"/>
-                            <a:ext cx="1016084" cy="508042"/>
-                          </a:xfrm>
-                          <a:prstGeom prst="rect">
-                            <a:avLst/>
-                          </a:prstGeom>
-                        </pic:spPr>
-                      </pic:pic>
-                    </a:graphicData>
-                  </a:graphic>
-                </wp:inline>
-              </w:drawing>
             </w:r>
           </w:p>
         </w:tc>
@@ -8189,41 +8095,6 @@
               <w:rPr>
                 <w:noProof/>
               </w:rPr>
-              <w:drawing>
-                <wp:inline distT="0" distB="0" distL="0" distR="0" wp14:anchorId="76FDC267" wp14:editId="3ED18ACF">
-                  <wp:extent cx="930846" cy="465423"/>
-                  <wp:effectExtent l="0" t="0" r="3175" b="0"/>
-                  <wp:docPr id="1069574697" name="Picture 1069574697"/>
-                  <wp:cNvGraphicFramePr>
-                    <a:graphicFrameLocks xmlns:a="http://schemas.openxmlformats.org/drawingml/2006/main" noChangeAspect="1"/>
-                  </wp:cNvGraphicFramePr>
-                  <a:graphic xmlns:a="http://schemas.openxmlformats.org/drawingml/2006/main">
-                    <a:graphicData uri="http://schemas.openxmlformats.org/drawingml/2006/picture">
-                      <pic:pic xmlns:pic="http://schemas.openxmlformats.org/drawingml/2006/picture">
-                        <pic:nvPicPr>
-                          <pic:cNvPr id="0" name="image.png"/>
-                          <pic:cNvPicPr/>
-                        </pic:nvPicPr>
-                        <pic:blipFill>
-                          <a:blip r:embed="rId26"/>
-                          <a:stretch>
-                            <a:fillRect/>
-                          </a:stretch>
-                        </pic:blipFill>
-                        <pic:spPr>
-                          <a:xfrm>
-                            <a:off x="0" y="0"/>
-                            <a:ext cx="956882" cy="478441"/>
-                          </a:xfrm>
-                          <a:prstGeom prst="rect">
-                            <a:avLst/>
-                          </a:prstGeom>
-                        </pic:spPr>
-                      </pic:pic>
-                    </a:graphicData>
-                  </a:graphic>
-                </wp:inline>
-              </w:drawing>
             </w:r>
           </w:p>
         </w:tc>
@@ -8284,7 +8155,6 @@
               <w:jc w:val="center"/>
             </w:pPr>
             <w:r>
-              <w:lastRenderedPageBreak/>
               <w:t>4</w:t>
             </w:r>
           </w:p>
@@ -8304,41 +8174,6 @@
               <w:rPr>
                 <w:noProof/>
               </w:rPr>
-              <w:drawing>
-                <wp:inline distT="0" distB="0" distL="0" distR="0" wp14:anchorId="31D47A37" wp14:editId="2C511DDA">
-                  <wp:extent cx="855676" cy="427838"/>
-                  <wp:effectExtent l="0" t="0" r="1905" b="0"/>
-                  <wp:docPr id="1069574698" name="Picture 1069574698"/>
-                  <wp:cNvGraphicFramePr>
-                    <a:graphicFrameLocks xmlns:a="http://schemas.openxmlformats.org/drawingml/2006/main" noChangeAspect="1"/>
-                  </wp:cNvGraphicFramePr>
-                  <a:graphic xmlns:a="http://schemas.openxmlformats.org/drawingml/2006/main">
-                    <a:graphicData uri="http://schemas.openxmlformats.org/drawingml/2006/picture">
-                      <pic:pic xmlns:pic="http://schemas.openxmlformats.org/drawingml/2006/picture">
-                        <pic:nvPicPr>
-                          <pic:cNvPr id="0" name="image.png"/>
-                          <pic:cNvPicPr/>
-                        </pic:nvPicPr>
-                        <pic:blipFill>
-                          <a:blip r:embed="rId27"/>
-                          <a:stretch>
-                            <a:fillRect/>
-                          </a:stretch>
-                        </pic:blipFill>
-                        <pic:spPr>
-                          <a:xfrm>
-                            <a:off x="0" y="0"/>
-                            <a:ext cx="866428" cy="433214"/>
-                          </a:xfrm>
-                          <a:prstGeom prst="rect">
-                            <a:avLst/>
-                          </a:prstGeom>
-                        </pic:spPr>
-                      </pic:pic>
-                    </a:graphicData>
-                  </a:graphic>
-                </wp:inline>
-              </w:drawing>
             </w:r>
           </w:p>
         </w:tc>
@@ -8400,7 +8235,17 @@
         <w:t>Entity Relation Diagram</w:t>
       </w:r>
       <w:r>
-        <w:t xml:space="preserve"> (ERD)</w:t>
+        <w:t xml:space="preserve"> (</w:t>
+      </w:r>
+      <w:r>
+        <w:rPr>
+          <w:i/>
+        </w:rPr>
+        <w:t>ERD</w:t>
+      </w:r>
+      <w:r>
+        <w:rPr/>
+        <w:t>)</w:t>
       </w:r>
     </w:p>
     <w:p>
@@ -8415,7 +8260,17 @@
         <w:t>Entity Relation Diagram</w:t>
       </w:r>
       <w:r>
-        <w:t xml:space="preserve"> (ERD) merupakan diagram yang digunakan untuk menjelaskan hubungan antara berbagai entitas dalam sebuah sistem dan menjadi dasar dalam perancangan basis data. Simbol-simbol yang digunakan dalam </w:t>
+        <w:t xml:space="preserve"> (</w:t>
+      </w:r>
+      <w:r>
+        <w:rPr>
+          <w:i/>
+        </w:rPr>
+        <w:t>ERD</w:t>
+      </w:r>
+      <w:r>
+        <w:rPr/>
+        <w:t xml:space="preserve">) merupakan diagram yang digunakan untuk menjelaskan hubungan antara berbagai entitas dalam sebuah sistem dan menjadi dasar dalam perancangan basis data. Simbol-simbol yang digunakan dalam </w:t>
       </w:r>
       <w:r>
         <w:rPr>
@@ -8432,7 +8287,27 @@
         <w:jc w:val="center"/>
       </w:pPr>
       <w:r>
-        <w:t>Tabel 2. 6 Entity Relation Diagram (ERD)</w:t>
+        <w:t xml:space="preserve">Tabel 2. 6 </w:t>
+      </w:r>
+      <w:r>
+        <w:rPr>
+          <w:i/>
+        </w:rPr>
+        <w:t>Entity Relation Diagram</w:t>
+      </w:r>
+      <w:r>
+        <w:rPr/>
+        <w:t xml:space="preserve"> (</w:t>
+      </w:r>
+      <w:r>
+        <w:rPr>
+          <w:i/>
+        </w:rPr>
+        <w:t>ERD</w:t>
+      </w:r>
+      <w:r>
+        <w:rPr/>
+        <w:t>)</w:t>
       </w:r>
     </w:p>
     <w:tbl>
@@ -8569,41 +8444,6 @@
               <w:rPr>
                 <w:noProof/>
               </w:rPr>
-              <w:drawing>
-                <wp:inline distT="0" distB="0" distL="0" distR="0" wp14:anchorId="150BF4C9" wp14:editId="52B83496">
-                  <wp:extent cx="1073792" cy="536896"/>
-                  <wp:effectExtent l="0" t="0" r="0" b="0"/>
-                  <wp:docPr id="1069574699" name="Picture 1069574699"/>
-                  <wp:cNvGraphicFramePr>
-                    <a:graphicFrameLocks xmlns:a="http://schemas.openxmlformats.org/drawingml/2006/main" noChangeAspect="1"/>
-                  </wp:cNvGraphicFramePr>
-                  <a:graphic xmlns:a="http://schemas.openxmlformats.org/drawingml/2006/main">
-                    <a:graphicData uri="http://schemas.openxmlformats.org/drawingml/2006/picture">
-                      <pic:pic xmlns:pic="http://schemas.openxmlformats.org/drawingml/2006/picture">
-                        <pic:nvPicPr>
-                          <pic:cNvPr id="0" name="image.png"/>
-                          <pic:cNvPicPr/>
-                        </pic:nvPicPr>
-                        <pic:blipFill>
-                          <a:blip r:embed="rId28"/>
-                          <a:stretch>
-                            <a:fillRect/>
-                          </a:stretch>
-                        </pic:blipFill>
-                        <pic:spPr>
-                          <a:xfrm>
-                            <a:off x="0" y="0"/>
-                            <a:ext cx="1082699" cy="541350"/>
-                          </a:xfrm>
-                          <a:prstGeom prst="rect">
-                            <a:avLst/>
-                          </a:prstGeom>
-                        </pic:spPr>
-                      </pic:pic>
-                    </a:graphicData>
-                  </a:graphic>
-                </wp:inline>
-              </w:drawing>
             </w:r>
           </w:p>
         </w:tc>
@@ -8675,41 +8515,6 @@
               <w:rPr>
                 <w:noProof/>
               </w:rPr>
-              <w:drawing>
-                <wp:inline distT="0" distB="0" distL="0" distR="0" wp14:anchorId="3B270EE3" wp14:editId="236FE412">
-                  <wp:extent cx="1107348" cy="553674"/>
-                  <wp:effectExtent l="0" t="0" r="0" b="0"/>
-                  <wp:docPr id="1069574700" name="Picture 1069574700"/>
-                  <wp:cNvGraphicFramePr>
-                    <a:graphicFrameLocks xmlns:a="http://schemas.openxmlformats.org/drawingml/2006/main" noChangeAspect="1"/>
-                  </wp:cNvGraphicFramePr>
-                  <a:graphic xmlns:a="http://schemas.openxmlformats.org/drawingml/2006/main">
-                    <a:graphicData uri="http://schemas.openxmlformats.org/drawingml/2006/picture">
-                      <pic:pic xmlns:pic="http://schemas.openxmlformats.org/drawingml/2006/picture">
-                        <pic:nvPicPr>
-                          <pic:cNvPr id="0" name="image.png"/>
-                          <pic:cNvPicPr/>
-                        </pic:nvPicPr>
-                        <pic:blipFill>
-                          <a:blip r:embed="rId29"/>
-                          <a:stretch>
-                            <a:fillRect/>
-                          </a:stretch>
-                        </pic:blipFill>
-                        <pic:spPr>
-                          <a:xfrm>
-                            <a:off x="0" y="0"/>
-                            <a:ext cx="1111198" cy="555599"/>
-                          </a:xfrm>
-                          <a:prstGeom prst="rect">
-                            <a:avLst/>
-                          </a:prstGeom>
-                        </pic:spPr>
-                      </pic:pic>
-                    </a:graphicData>
-                  </a:graphic>
-                </wp:inline>
-              </w:drawing>
             </w:r>
           </w:p>
         </w:tc>
@@ -8762,7 +8567,6 @@
               <w:jc w:val="center"/>
             </w:pPr>
             <w:r>
-              <w:lastRenderedPageBreak/>
               <w:t>3</w:t>
             </w:r>
           </w:p>
@@ -8782,41 +8586,6 @@
               <w:rPr>
                 <w:noProof/>
               </w:rPr>
-              <w:drawing>
-                <wp:inline distT="0" distB="0" distL="0" distR="0" wp14:anchorId="26A36213" wp14:editId="27782635">
-                  <wp:extent cx="1107348" cy="553674"/>
-                  <wp:effectExtent l="0" t="0" r="0" b="0"/>
-                  <wp:docPr id="1069574701" name="Picture 1069574701"/>
-                  <wp:cNvGraphicFramePr>
-                    <a:graphicFrameLocks xmlns:a="http://schemas.openxmlformats.org/drawingml/2006/main" noChangeAspect="1"/>
-                  </wp:cNvGraphicFramePr>
-                  <a:graphic xmlns:a="http://schemas.openxmlformats.org/drawingml/2006/main">
-                    <a:graphicData uri="http://schemas.openxmlformats.org/drawingml/2006/picture">
-                      <pic:pic xmlns:pic="http://schemas.openxmlformats.org/drawingml/2006/picture">
-                        <pic:nvPicPr>
-                          <pic:cNvPr id="0" name="image.png"/>
-                          <pic:cNvPicPr/>
-                        </pic:nvPicPr>
-                        <pic:blipFill>
-                          <a:blip r:embed="rId30"/>
-                          <a:stretch>
-                            <a:fillRect/>
-                          </a:stretch>
-                        </pic:blipFill>
-                        <pic:spPr>
-                          <a:xfrm>
-                            <a:off x="0" y="0"/>
-                            <a:ext cx="1112890" cy="556445"/>
-                          </a:xfrm>
-                          <a:prstGeom prst="rect">
-                            <a:avLst/>
-                          </a:prstGeom>
-                        </pic:spPr>
-                      </pic:pic>
-                    </a:graphicData>
-                  </a:graphic>
-                </wp:inline>
-              </w:drawing>
             </w:r>
           </w:p>
         </w:tc>
@@ -8888,41 +8657,6 @@
               <w:rPr>
                 <w:noProof/>
               </w:rPr>
-              <w:drawing>
-                <wp:inline distT="0" distB="0" distL="0" distR="0" wp14:anchorId="53E2F51F" wp14:editId="0EA12A19">
-                  <wp:extent cx="1174458" cy="587229"/>
-                  <wp:effectExtent l="0" t="0" r="6985" b="3810"/>
-                  <wp:docPr id="1069574702" name="Picture 1069574702"/>
-                  <wp:cNvGraphicFramePr>
-                    <a:graphicFrameLocks xmlns:a="http://schemas.openxmlformats.org/drawingml/2006/main" noChangeAspect="1"/>
-                  </wp:cNvGraphicFramePr>
-                  <a:graphic xmlns:a="http://schemas.openxmlformats.org/drawingml/2006/main">
-                    <a:graphicData uri="http://schemas.openxmlformats.org/drawingml/2006/picture">
-                      <pic:pic xmlns:pic="http://schemas.openxmlformats.org/drawingml/2006/picture">
-                        <pic:nvPicPr>
-                          <pic:cNvPr id="0" name="image.png"/>
-                          <pic:cNvPicPr/>
-                        </pic:nvPicPr>
-                        <pic:blipFill>
-                          <a:blip r:embed="rId25"/>
-                          <a:stretch>
-                            <a:fillRect/>
-                          </a:stretch>
-                        </pic:blipFill>
-                        <pic:spPr>
-                          <a:xfrm>
-                            <a:off x="0" y="0"/>
-                            <a:ext cx="1180287" cy="590143"/>
-                          </a:xfrm>
-                          <a:prstGeom prst="rect">
-                            <a:avLst/>
-                          </a:prstGeom>
-                        </pic:spPr>
-                      </pic:pic>
-                    </a:graphicData>
-                  </a:graphic>
-                </wp:inline>
-              </w:drawing>
             </w:r>
           </w:p>
         </w:tc>
@@ -8994,41 +8728,6 @@
               <w:rPr>
                 <w:noProof/>
               </w:rPr>
-              <w:drawing>
-                <wp:inline distT="0" distB="0" distL="0" distR="0" wp14:anchorId="4386B285" wp14:editId="277761B9">
-                  <wp:extent cx="1057014" cy="528507"/>
-                  <wp:effectExtent l="0" t="0" r="0" b="5080"/>
-                  <wp:docPr id="1069574703" name="Picture 1069574703"/>
-                  <wp:cNvGraphicFramePr>
-                    <a:graphicFrameLocks xmlns:a="http://schemas.openxmlformats.org/drawingml/2006/main" noChangeAspect="1"/>
-                  </wp:cNvGraphicFramePr>
-                  <a:graphic xmlns:a="http://schemas.openxmlformats.org/drawingml/2006/main">
-                    <a:graphicData uri="http://schemas.openxmlformats.org/drawingml/2006/picture">
-                      <pic:pic xmlns:pic="http://schemas.openxmlformats.org/drawingml/2006/picture">
-                        <pic:nvPicPr>
-                          <pic:cNvPr id="0" name="image.png"/>
-                          <pic:cNvPicPr/>
-                        </pic:nvPicPr>
-                        <pic:blipFill>
-                          <a:blip r:embed="rId31"/>
-                          <a:stretch>
-                            <a:fillRect/>
-                          </a:stretch>
-                        </pic:blipFill>
-                        <pic:spPr>
-                          <a:xfrm>
-                            <a:off x="0" y="0"/>
-                            <a:ext cx="1063140" cy="531570"/>
-                          </a:xfrm>
-                          <a:prstGeom prst="rect">
-                            <a:avLst/>
-                          </a:prstGeom>
-                        </pic:spPr>
-                      </pic:pic>
-                    </a:graphicData>
-                  </a:graphic>
-                </wp:inline>
-              </w:drawing>
             </w:r>
           </w:p>
         </w:tc>
@@ -9126,7 +8825,27 @@
       </w:r>
       <w:r/>
       <w:r>
-        <w:t xml:space="preserve"> merupakan salah satu metode dalam Software Development Life Cycle (SDLC) yang dilakukan secara sistematis dan berurutan. Tahapan </w:t>
+        <w:t xml:space="preserve"> merupakan salah satu metode dalam </w:t>
+      </w:r>
+      <w:r>
+        <w:rPr>
+          <w:i/>
+        </w:rPr>
+        <w:t>Software Development Life Cycle</w:t>
+      </w:r>
+      <w:r>
+        <w:rPr/>
+        <w:t xml:space="preserve"> (</w:t>
+      </w:r>
+      <w:r>
+        <w:rPr>
+          <w:i/>
+        </w:rPr>
+        <w:t>SDLC</w:t>
+      </w:r>
+      <w:r>
+        <w:rPr/>
+        <w:t xml:space="preserve">) yang dilakukan secara sistematis dan berurutan. Tahapan </w:t>
       </w:r>
       <w:r/>
       <w:r>
@@ -9137,7 +8856,27 @@
       </w:r>
       <w:r/>
       <w:r>
-        <w:t xml:space="preserve"> dimulai dari analisis kebutuhan, perancangan sistem, implementasi, pengujian, hingga pemeliharaan. Metode ini dipilih karena penelitian aplikasi pemesanan online barbershop berbasis </w:t>
+        <w:t xml:space="preserve"> dimulai dari analisis kebutuhan, perancangan sistem, implementasi, pengujian, hingga pemeliharaan. Metode ini dipilih karena penelitian aplikasi pemesanan </w:t>
+      </w:r>
+      <w:r>
+        <w:rPr>
+          <w:i/>
+        </w:rPr>
+        <w:t>online</w:t>
+      </w:r>
+      <w:r>
+        <w:rPr/>
+        <w:t xml:space="preserve"> </w:t>
+      </w:r>
+      <w:r>
+        <w:rPr>
+          <w:i/>
+        </w:rPr>
+        <w:t>barbershop</w:t>
+      </w:r>
+      <w:r>
+        <w:rPr/>
+        <w:t xml:space="preserve"> berbasis </w:t>
       </w:r>
       <w:r/>
       <w:r>
@@ -9170,51 +8909,6 @@
         <w:rPr>
           <w:noProof/>
         </w:rPr>
-        <w:lastRenderedPageBreak/>
-        <w:drawing>
-          <wp:inline distT="0" distB="0" distL="0" distR="0" wp14:anchorId="1578B57E" wp14:editId="1AEC45AE">
-            <wp:extent cx="5112101" cy="2621814"/>
-            <wp:effectExtent l="0" t="0" r="0" b="7620"/>
-            <wp:docPr id="1069574704" name="Picture 1069574704"/>
-            <wp:cNvGraphicFramePr>
-              <a:graphicFrameLocks xmlns:a="http://schemas.openxmlformats.org/drawingml/2006/main" noChangeAspect="1"/>
-            </wp:cNvGraphicFramePr>
-            <a:graphic xmlns:a="http://schemas.openxmlformats.org/drawingml/2006/main">
-              <a:graphicData uri="http://schemas.openxmlformats.org/drawingml/2006/picture">
-                <pic:pic xmlns:pic="http://schemas.openxmlformats.org/drawingml/2006/picture">
-                  <pic:nvPicPr>
-                    <pic:cNvPr id="1069574704" name="Picture 1069574704"/>
-                    <pic:cNvPicPr/>
-                  </pic:nvPicPr>
-                  <pic:blipFill rotWithShape="1">
-                    <a:blip r:embed="rId32"/>
-                    <a:srcRect b="23070"/>
-                    <a:stretch>
-                      <a:fillRect/>
-                    </a:stretch>
-                  </pic:blipFill>
-                  <pic:spPr bwMode="auto">
-                    <a:xfrm>
-                      <a:off x="0" y="0"/>
-                      <a:ext cx="5168381" cy="2650678"/>
-                    </a:xfrm>
-                    <a:prstGeom prst="rect">
-                      <a:avLst/>
-                    </a:prstGeom>
-                    <a:ln>
-                      <a:noFill/>
-                    </a:ln>
-                    <a:extLst>
-                      <a:ext uri="{53640926-AAD7-44D8-BBD7-CCE9431645EC}">
-                        <a14:shadowObscured xmlns:a14="http://schemas.microsoft.com/office/drawing/2010/main"/>
-                      </a:ext>
-                    </a:extLst>
-                  </pic:spPr>
-                </pic:pic>
-              </a:graphicData>
-            </a:graphic>
-          </wp:inline>
-        </w:drawing>
       </w:r>
     </w:p>
     <w:p>
@@ -9466,7 +9160,6 @@
         <w:jc w:val="left"/>
       </w:pPr>
       <w:r>
-        <w:lastRenderedPageBreak/>
         <w:t>4. Pengujian Sistem</w:t>
       </w:r>
     </w:p>
@@ -9571,7 +9264,27 @@
       <w:r/>
       <w:r/>
       <w:r>
-        <w:t xml:space="preserve"> merupakan pengujian fungsional yang dilakukan berdasarkan input dan output tanpa melihat kode program. Pengujian ini berfokus pada kesesuaian fungsi sistem terhadap kebutuhan pengguna. Penelitian aplikasi pemesanan online barbershop berbasis </w:t>
+        <w:t xml:space="preserve"> merupakan pengujian fungsional yang dilakukan berdasarkan input dan output tanpa melihat kode program. Pengujian ini berfokus pada kesesuaian fungsi sistem terhadap kebutuhan pengguna. Penelitian aplikasi pemesanan </w:t>
+      </w:r>
+      <w:r>
+        <w:rPr>
+          <w:i/>
+        </w:rPr>
+        <w:t>online</w:t>
+      </w:r>
+      <w:r>
+        <w:rPr/>
+        <w:t xml:space="preserve"> </w:t>
+      </w:r>
+      <w:r>
+        <w:rPr>
+          <w:i/>
+        </w:rPr>
+        <w:t>barbershop</w:t>
+      </w:r>
+      <w:r>
+        <w:rPr/>
+        <w:t xml:space="preserve"> berbasis </w:t>
       </w:r>
       <w:r/>
       <w:r>
@@ -9612,51 +9325,6 @@
         <w:rPr>
           <w:noProof/>
         </w:rPr>
-        <w:lastRenderedPageBreak/>
-        <w:drawing>
-          <wp:inline distT="0" distB="0" distL="0" distR="0" wp14:anchorId="2DD79B99" wp14:editId="586656E3">
-            <wp:extent cx="4962954" cy="1742089"/>
-            <wp:effectExtent l="0" t="0" r="0" b="0"/>
-            <wp:docPr id="1069574705" name="Picture 1069574705"/>
-            <wp:cNvGraphicFramePr>
-              <a:graphicFrameLocks xmlns:a="http://schemas.openxmlformats.org/drawingml/2006/main" noChangeAspect="1"/>
-            </wp:cNvGraphicFramePr>
-            <a:graphic xmlns:a="http://schemas.openxmlformats.org/drawingml/2006/main">
-              <a:graphicData uri="http://schemas.openxmlformats.org/drawingml/2006/picture">
-                <pic:pic xmlns:pic="http://schemas.openxmlformats.org/drawingml/2006/picture">
-                  <pic:nvPicPr>
-                    <pic:cNvPr id="1069574705" name="Picture 1069574705"/>
-                    <pic:cNvPicPr/>
-                  </pic:nvPicPr>
-                  <pic:blipFill rotWithShape="1">
-                    <a:blip r:embed="rId33"/>
-                    <a:srcRect t="18905" b="28443"/>
-                    <a:stretch>
-                      <a:fillRect/>
-                    </a:stretch>
-                  </pic:blipFill>
-                  <pic:spPr bwMode="auto">
-                    <a:xfrm>
-                      <a:off x="0" y="0"/>
-                      <a:ext cx="4999234" cy="1754824"/>
-                    </a:xfrm>
-                    <a:prstGeom prst="rect">
-                      <a:avLst/>
-                    </a:prstGeom>
-                    <a:ln>
-                      <a:noFill/>
-                    </a:ln>
-                    <a:extLst>
-                      <a:ext uri="{53640926-AAD7-44D8-BBD7-CCE9431645EC}">
-                        <a14:shadowObscured xmlns:a14="http://schemas.microsoft.com/office/drawing/2010/main"/>
-                      </a:ext>
-                    </a:extLst>
-                  </pic:spPr>
-                </pic:pic>
-              </a:graphicData>
-            </a:graphic>
-          </wp:inline>
-        </w:drawing>
       </w:r>
     </w:p>
     <w:p>
@@ -9768,7 +9436,17 @@
       </w:r>
       <w:r/>
       <w:r>
-        <w:t xml:space="preserve">, kelola layanan, input pendapatan harian oleh Admin/Pengelola atau Admin Harian, pembatasan akses input bagi Capster biasa, input buku kas umum, input operasional, perhitungan pembagian hasil, pembatasan laporan berdasarkan </w:t>
+        <w:t xml:space="preserve">, kelola layanan, input pendapatan harian oleh Admin/Pengelola atau Admin Harian, pembatasan akses input bagi </w:t>
+      </w:r>
+      <w:r>
+        <w:rPr>
+          <w:i/>
+        </w:rPr>
+        <w:t>Capster</w:t>
+      </w:r>
+      <w:r>
+        <w:rPr/>
+        <w:t xml:space="preserve"> biasa, input buku kas umum, input operasional, perhitungan pembagian hasil, pembatasan laporan berdasarkan </w:t>
       </w:r>
       <w:r/>
       <w:r>
@@ -9815,51 +9493,6 @@
         <w:rPr>
           <w:noProof/>
         </w:rPr>
-        <w:lastRenderedPageBreak/>
-        <w:drawing>
-          <wp:inline distT="0" distB="0" distL="0" distR="0" wp14:anchorId="1760DEC8" wp14:editId="26EA852A">
-            <wp:extent cx="3640822" cy="6415964"/>
-            <wp:effectExtent l="0" t="0" r="0" b="4445"/>
-            <wp:docPr id="1069574706" name="Picture 1069574706"/>
-            <wp:cNvGraphicFramePr>
-              <a:graphicFrameLocks xmlns:a="http://schemas.openxmlformats.org/drawingml/2006/main" noChangeAspect="1"/>
-            </wp:cNvGraphicFramePr>
-            <a:graphic xmlns:a="http://schemas.openxmlformats.org/drawingml/2006/main">
-              <a:graphicData uri="http://schemas.openxmlformats.org/drawingml/2006/picture">
-                <pic:pic xmlns:pic="http://schemas.openxmlformats.org/drawingml/2006/picture">
-                  <pic:nvPicPr>
-                    <pic:cNvPr id="1069574706" name="Picture 1069574706"/>
-                    <pic:cNvPicPr/>
-                  </pic:nvPicPr>
-                  <pic:blipFill rotWithShape="1">
-                    <a:blip r:embed="rId34"/>
-                    <a:srcRect l="14713" t="1625" r="13496" b="8856"/>
-                    <a:stretch>
-                      <a:fillRect/>
-                    </a:stretch>
-                  </pic:blipFill>
-                  <pic:spPr bwMode="auto">
-                    <a:xfrm>
-                      <a:off x="0" y="0"/>
-                      <a:ext cx="3672149" cy="6471170"/>
-                    </a:xfrm>
-                    <a:prstGeom prst="rect">
-                      <a:avLst/>
-                    </a:prstGeom>
-                    <a:ln>
-                      <a:noFill/>
-                    </a:ln>
-                    <a:extLst>
-                      <a:ext uri="{53640926-AAD7-44D8-BBD7-CCE9431645EC}">
-                        <a14:shadowObscured xmlns:a14="http://schemas.microsoft.com/office/drawing/2010/main"/>
-                      </a:ext>
-                    </a:extLst>
-                  </pic:spPr>
-                </pic:pic>
-              </a:graphicData>
-            </a:graphic>
-          </wp:inline>
-        </w:drawing>
       </w:r>
     </w:p>
     <w:p>
@@ -10030,7 +9663,17 @@
       </w:r>
       <w:r/>
       <w:r>
-        <w:t xml:space="preserve"> senior dapat membantu input pendapatan, Capster biasa hanya dapat melihat laporan miliknya sendiri, dan Pemilik dapat memantau laporan usaha. Sistem yang dikembangkan diharapkan dapat membantu pencatatan pendapatan, pengelolaan buku kas umum, penghitungan pembagian hasil, serta penyajian laporan secara lebih terstruktur.</w:t>
+        <w:t xml:space="preserve"> senior dapat membantu input pendapatan, </w:t>
+      </w:r>
+      <w:r>
+        <w:rPr>
+          <w:i/>
+        </w:rPr>
+        <w:t>Capster</w:t>
+      </w:r>
+      <w:r>
+        <w:rPr/>
+        <w:t xml:space="preserve"> biasa hanya dapat melihat laporan miliknya sendiri, dan Pemilik dapat memantau laporan usaha. Sistem yang dikembangkan diharapkan dapat membantu pencatatan pendapatan, pengelolaan buku kas umum, penghitungan pembagian hasil, serta penyajian laporan secara lebih terstruktur.</w:t>
       </w:r>
     </w:p>
     <w:p>
@@ -10048,7 +9691,6 @@
         <w:pStyle w:val="Heading1"/>
       </w:pPr>
       <w:r>
-        <w:lastRenderedPageBreak/>
         <w:t>BAB III</w:t>
       </w:r>
       <w:r>
@@ -10084,50 +9726,6 @@
         <w:rPr>
           <w:noProof/>
         </w:rPr>
-        <w:drawing>
-          <wp:inline distT="0" distB="0" distL="0" distR="0" wp14:anchorId="1ED1A3AD" wp14:editId="1B8CEA83">
-            <wp:extent cx="4686300" cy="5249917"/>
-            <wp:effectExtent l="0" t="0" r="0" b="8255"/>
-            <wp:docPr id="1069574676" name="Picture 1069574676"/>
-            <wp:cNvGraphicFramePr>
-              <a:graphicFrameLocks xmlns:a="http://schemas.openxmlformats.org/drawingml/2006/main" noChangeAspect="1"/>
-            </wp:cNvGraphicFramePr>
-            <a:graphic xmlns:a="http://schemas.openxmlformats.org/drawingml/2006/main">
-              <a:graphicData uri="http://schemas.openxmlformats.org/drawingml/2006/picture">
-                <pic:pic xmlns:pic="http://schemas.openxmlformats.org/drawingml/2006/picture">
-                  <pic:nvPicPr>
-                    <pic:cNvPr id="1069574676" name="Picture 1069574676"/>
-                    <pic:cNvPicPr/>
-                  </pic:nvPicPr>
-                  <pic:blipFill rotWithShape="1">
-                    <a:blip r:embed="rId35"/>
-                    <a:srcRect b="16173"/>
-                    <a:stretch>
-                      <a:fillRect/>
-                    </a:stretch>
-                  </pic:blipFill>
-                  <pic:spPr bwMode="auto">
-                    <a:xfrm>
-                      <a:off x="0" y="0"/>
-                      <a:ext cx="4690839" cy="5255002"/>
-                    </a:xfrm>
-                    <a:prstGeom prst="rect">
-                      <a:avLst/>
-                    </a:prstGeom>
-                    <a:ln>
-                      <a:noFill/>
-                    </a:ln>
-                    <a:extLst>
-                      <a:ext uri="{53640926-AAD7-44D8-BBD7-CCE9431645EC}">
-                        <a14:shadowObscured xmlns:a14="http://schemas.microsoft.com/office/drawing/2010/main"/>
-                      </a:ext>
-                    </a:extLst>
-                  </pic:spPr>
-                </pic:pic>
-              </a:graphicData>
-            </a:graphic>
-          </wp:inline>
-        </w:drawing>
       </w:r>
     </w:p>
     <w:p>
@@ -10140,7 +9738,6 @@
     </w:p>
     <w:p>
       <w:r>
-        <w:lastRenderedPageBreak/>
         <w:t>Berdasarkan diagram alur penelitian yang telah disajikan, berikut merupakan penjelasan dari setiap tahapan dalam penelitian ini:</w:t>
       </w:r>
     </w:p>
@@ -10717,7 +10314,17 @@
       </w:r>
       <w:r/>
       <w:r>
-        <w:t xml:space="preserve">, framework </w:t>
+        <w:t xml:space="preserve">, </w:t>
+      </w:r>
+      <w:r>
+        <w:rPr>
+          <w:i/>
+        </w:rPr>
+        <w:t>framework</w:t>
+      </w:r>
+      <w:r>
+        <w:rPr/>
+        <w:t xml:space="preserve"> </w:t>
       </w:r>
       <w:r/>
       <w:r>
@@ -10761,7 +10368,17 @@
       </w:r>
       <w:r/>
       <w:r>
-        <w:t xml:space="preserve">, pengelolaan pendapatan, buku kas umum, Unified Modeling Language, metode </w:t>
+        <w:t xml:space="preserve">, pengelolaan pendapatan, buku kas umum, </w:t>
+      </w:r>
+      <w:r>
+        <w:rPr>
+          <w:i/>
+        </w:rPr>
+        <w:t>Unified Modeling Language</w:t>
+      </w:r>
+      <w:r>
+        <w:rPr/>
+        <w:t xml:space="preserve">, metode </w:t>
       </w:r>
       <w:r/>
       <w:r>
@@ -10805,7 +10422,17 @@
         <w:pStyle w:val="NoSpacing"/>
       </w:pPr>
       <w:r>
-        <w:t xml:space="preserve">Dokumentasi dilakukan dengan mempelajari contoh laporan Google Spreadsheet </w:t>
+        <w:t xml:space="preserve">Dokumentasi dilakukan dengan mempelajari contoh laporan </w:t>
+      </w:r>
+      <w:r>
+        <w:rPr>
+          <w:i/>
+        </w:rPr>
+        <w:t>Google Spreadsheet</w:t>
+      </w:r>
+      <w:r>
+        <w:rPr/>
+        <w:t xml:space="preserve"> </w:t>
       </w:r>
       <w:r>
         <w:rPr>
@@ -10904,7 +10531,27 @@
       </w:r>
       <w:r/>
       <w:r>
-        <w:t xml:space="preserve"> merupakan salah satu metode dalam Software Development Life Cycle (SDLC) yang dilakukan secara sistematis dan berurutan. Tahapan </w:t>
+        <w:t xml:space="preserve"> merupakan salah satu metode dalam </w:t>
+      </w:r>
+      <w:r>
+        <w:rPr>
+          <w:i/>
+        </w:rPr>
+        <w:t>Software Development Life Cycle</w:t>
+      </w:r>
+      <w:r>
+        <w:rPr/>
+        <w:t xml:space="preserve"> (</w:t>
+      </w:r>
+      <w:r>
+        <w:rPr>
+          <w:i/>
+        </w:rPr>
+        <w:t>SDLC</w:t>
+      </w:r>
+      <w:r>
+        <w:rPr/>
+        <w:t xml:space="preserve">) yang dilakukan secara sistematis dan berurutan. Tahapan </w:t>
       </w:r>
       <w:r/>
       <w:r>
@@ -10915,7 +10562,27 @@
       </w:r>
       <w:r/>
       <w:r>
-        <w:t xml:space="preserve"> dimulai dari analisis kebutuhan, perancangan sistem, implementasi, pengujian, hingga pemeliharaan. Metode ini dipilih karena penelitian aplikasi pemesanan online barbershop berbasis </w:t>
+        <w:t xml:space="preserve"> dimulai dari analisis kebutuhan, perancangan sistem, implementasi, pengujian, hingga pemeliharaan. Metode ini dipilih karena penelitian aplikasi pemesanan </w:t>
+      </w:r>
+      <w:r>
+        <w:rPr>
+          <w:i/>
+        </w:rPr>
+        <w:t>online</w:t>
+      </w:r>
+      <w:r>
+        <w:rPr/>
+        <w:t xml:space="preserve"> </w:t>
+      </w:r>
+      <w:r>
+        <w:rPr>
+          <w:i/>
+        </w:rPr>
+        <w:t>barbershop</w:t>
+      </w:r>
+      <w:r>
+        <w:rPr/>
+        <w:t xml:space="preserve"> berbasis </w:t>
       </w:r>
       <w:r/>
       <w:r>
@@ -11351,7 +11018,6 @@
         <w:jc w:val="center"/>
       </w:pPr>
       <w:r>
-        <w:lastRenderedPageBreak/>
         <w:t>Tabel 3. 1 Perangkat Keras</w:t>
       </w:r>
     </w:p>
@@ -11494,7 +11160,16 @@
               <w:ind w:left="41" w:firstLine="0"/>
             </w:pPr>
             <w:r>
-              <w:t xml:space="preserve">Smartphone </w:t>
+              <w:rPr>
+                <w:i/>
+              </w:rPr>
+              <w:t>Smartphone</w:t>
+            </w:r>
+            <w:r>
+              <w:rPr>
+                <w:i/>
+              </w:rPr>
+              <w:t xml:space="preserve"> </w:t>
             </w:r>
             <w:r>
               <w:rPr>
@@ -11660,7 +11335,19 @@
                 <w:i/>
                 <w:iCs/>
               </w:rPr>
-              <w:t>Flutter dan Dart</w:t>
+              <w:t>Flutter</w:t>
+            </w:r>
+            <w:r>
+              <w:rPr>
+                <w:i/>
+              </w:rPr>
+              <w:t xml:space="preserve"> dan </w:t>
+            </w:r>
+            <w:r>
+              <w:rPr>
+                <w:i/>
+              </w:rPr>
+              <w:t>Dart</w:t>
             </w:r>
           </w:p>
         </w:tc>
@@ -12012,6 +11699,9 @@
               <w:ind w:left="17" w:firstLineChars="7" w:firstLine="17"/>
             </w:pPr>
             <w:r>
+              <w:rPr>
+                <w:i/>
+              </w:rPr>
               <w:t>Figma</w:t>
             </w:r>
           </w:p>
@@ -12067,6 +11757,9 @@
               <w:ind w:left="17" w:firstLineChars="7" w:firstLine="17"/>
             </w:pPr>
             <w:r>
+              <w:rPr>
+                <w:i/>
+              </w:rPr>
               <w:t>Browser</w:t>
             </w:r>
           </w:p>
@@ -12101,7 +11794,6 @@
         <w:pStyle w:val="Heading3"/>
       </w:pPr>
       <w:r>
-        <w:lastRenderedPageBreak/>
         <w:t xml:space="preserve">3.4.3. </w:t>
       </w:r>
       <w:r>
@@ -12142,7 +11834,17 @@
       </w:r>
       <w:r/>
       <w:r>
-        <w:t xml:space="preserve">, data layanan, data akun pengguna, data pendapatan harian, data buku kas umum, data biaya operasional, data laporan pembagian hasil, dan contoh laporan Google Spreadsheet </w:t>
+        <w:t xml:space="preserve">, data layanan, data akun pengguna, data pendapatan harian, data buku kas umum, data biaya operasional, data laporan pembagian hasil, dan contoh laporan </w:t>
+      </w:r>
+      <w:r>
+        <w:rPr>
+          <w:i/>
+        </w:rPr>
+        <w:t>Google Spreadsheet</w:t>
+      </w:r>
+      <w:r>
+        <w:rPr/>
+        <w:t xml:space="preserve"> </w:t>
       </w:r>
       <w:r/>
       <w:r>
@@ -12249,7 +11951,17 @@
       </w:r>
       <w:r/>
       <w:r>
-        <w:t xml:space="preserve"> online. Waktu penelitian direncanakan berlangsung selama beberapa bulan, mulai dari tahap identifikasi masalah sampai penyusunan laporan skripsi.</w:t>
+        <w:t xml:space="preserve"> </w:t>
+      </w:r>
+      <w:r>
+        <w:rPr>
+          <w:i/>
+        </w:rPr>
+        <w:t>online</w:t>
+      </w:r>
+      <w:r>
+        <w:rPr/>
+        <w:t>. Waktu penelitian direncanakan berlangsung selama beberapa bulan, mulai dari tahap identifikasi masalah sampai penyusunan laporan skripsi.</w:t>
       </w:r>
     </w:p>
     <w:p>
@@ -13037,7 +12749,6 @@
               <w:jc w:val="center"/>
             </w:pPr>
             <w:r>
-              <w:lastRenderedPageBreak/>
               <w:t>7</w:t>
             </w:r>
           </w:p>
@@ -13542,7 +13253,17 @@
       </w:r>
       <w:r/>
       <w:r>
-        <w:t xml:space="preserve"> senior yang dipercaya dan diberi akun dengan hak akses pencatatan. Capster biasa direncanakan hanya dapat melihat laporan miliknya sendiri berdasarkan akun yang dikaitkan dengan data </w:t>
+        <w:t xml:space="preserve"> senior yang dipercaya dan diberi akun dengan hak akses pencatatan. </w:t>
+      </w:r>
+      <w:r>
+        <w:rPr>
+          <w:i/>
+        </w:rPr>
+        <w:t>Capster</w:t>
+      </w:r>
+      <w:r>
+        <w:rPr/>
+        <w:t xml:space="preserve"> biasa direncanakan hanya dapat melihat laporan miliknya sendiri berdasarkan akun yang dikaitkan dengan data </w:t>
       </w:r>
       <w:r/>
       <w:r>
@@ -13561,7 +13282,17 @@
         <w:jc w:val="center"/>
       </w:pPr>
       <w:r>
-        <w:t>Admin/Pengelola, Admin Harian, Capster, Pemilik</w:t>
+        <w:t xml:space="preserve">Admin/Pengelola, Admin Harian, </w:t>
+      </w:r>
+      <w:r>
+        <w:rPr>
+          <w:i/>
+        </w:rPr>
+        <w:t>Capster</w:t>
+      </w:r>
+      <w:r>
+        <w:rPr/>
+        <w:t>, Pemilik</w:t>
         <w:br/>
         <w:t>↓</w:t>
         <w:br/>
@@ -13658,50 +13389,6 @@
         <w:rPr>
           <w:noProof/>
         </w:rPr>
-        <w:drawing>
-          <wp:inline distT="0" distB="0" distL="0" distR="0" wp14:anchorId="4D2F8A84" wp14:editId="31C0D170">
-            <wp:extent cx="5018214" cy="3297740"/>
-            <wp:effectExtent l="0" t="0" r="0" b="0"/>
-            <wp:docPr id="1069574677" name="Picture 1069574677"/>
-            <wp:cNvGraphicFramePr>
-              <a:graphicFrameLocks xmlns:a="http://schemas.openxmlformats.org/drawingml/2006/main" noChangeAspect="1"/>
-            </wp:cNvGraphicFramePr>
-            <a:graphic xmlns:a="http://schemas.openxmlformats.org/drawingml/2006/main">
-              <a:graphicData uri="http://schemas.openxmlformats.org/drawingml/2006/picture">
-                <pic:pic xmlns:pic="http://schemas.openxmlformats.org/drawingml/2006/picture">
-                  <pic:nvPicPr>
-                    <pic:cNvPr id="1069574677" name="Picture 1069574677"/>
-                    <pic:cNvPicPr/>
-                  </pic:nvPicPr>
-                  <pic:blipFill rotWithShape="1">
-                    <a:blip r:embed="rId36"/>
-                    <a:srcRect l="3490" t="3142" r="3543" b="5217"/>
-                    <a:stretch>
-                      <a:fillRect/>
-                    </a:stretch>
-                  </pic:blipFill>
-                  <pic:spPr bwMode="auto">
-                    <a:xfrm>
-                      <a:off x="0" y="0"/>
-                      <a:ext cx="5045343" cy="3315568"/>
-                    </a:xfrm>
-                    <a:prstGeom prst="rect">
-                      <a:avLst/>
-                    </a:prstGeom>
-                    <a:ln>
-                      <a:noFill/>
-                    </a:ln>
-                    <a:extLst>
-                      <a:ext uri="{53640926-AAD7-44D8-BBD7-CCE9431645EC}">
-                        <a14:shadowObscured xmlns:a14="http://schemas.microsoft.com/office/drawing/2010/main"/>
-                      </a:ext>
-                    </a:extLst>
-                  </pic:spPr>
-                </pic:pic>
-              </a:graphicData>
-            </a:graphic>
-          </wp:inline>
-        </w:drawing>
       </w:r>
     </w:p>
     <w:p>

</xml_diff>

<commit_message>
jelaskan waterfall menurut sommerville
</commit_message>
<xml_diff>
--- a/docs/Proposal Skripsi v2.docx
+++ b/docs/Proposal Skripsi v2.docx
@@ -8781,51 +8781,32 @@
       <w:r>
         <w:rPr>
           <w:i/>
-          <w:iCs/>
-        </w:rPr>
-      </w:r>
-      <w:r/>
-      <w:r>
-        <w:rPr>
-          <w:i/>
-          <w:iCs/>
-        </w:rPr>
-      </w:r>
-      <w:r/>
-      <w:r>
-        <w:rPr>
-          <w:i/>
-          <w:iCs/>
-        </w:rPr>
-      </w:r>
-      <w:r/>
-      <w:r>
-        <w:rPr>
-          <w:i/>
-        </w:rPr>
-      </w:r>
-      <w:r/>
-      <w:r/>
-      <w:r>
-        <w:rPr>
-          <w:i/>
         </w:rPr>
         <w:t>Waterfall</w:t>
       </w:r>
-      <w:r/>
-      <w:r>
-        <w:t xml:space="preserve">. Metode </w:t>
-      </w:r>
-      <w:r/>
+      <w:r>
+        <w:rPr/>
+        <w:t xml:space="preserve"> menurut </w:t>
+      </w:r>
+      <w:r>
+        <w:rPr>
+          <w:i/>
+        </w:rPr>
+        <w:t>Sommerville</w:t>
+      </w:r>
+      <w:r>
+        <w:rPr/>
+        <w:t xml:space="preserve">. Model </w:t>
+      </w:r>
       <w:r>
         <w:rPr>
           <w:i/>
         </w:rPr>
         <w:t>Waterfall</w:t>
       </w:r>
-      <w:r/>
-      <w:r>
-        <w:t xml:space="preserve"> merupakan salah satu metode dalam </w:t>
+      <w:r>
+        <w:rPr/>
+        <w:t xml:space="preserve"> merupakan salah satu model dalam </w:t>
       </w:r>
       <w:r>
         <w:rPr>
@@ -8847,16 +8828,35 @@
         <w:rPr/>
         <w:t xml:space="preserve">) yang dilakukan secara sistematis dan berurutan. Tahapan </w:t>
       </w:r>
-      <w:r/>
       <w:r>
         <w:rPr>
           <w:i/>
         </w:rPr>
         <w:t>Waterfall</w:t>
       </w:r>
-      <w:r/>
-      <w:r>
-        <w:t xml:space="preserve"> dimulai dari analisis kebutuhan, perancangan sistem, implementasi, pengujian, hingga pemeliharaan. Metode ini dipilih karena penelitian aplikasi pemesanan </w:t>
+      <w:r>
+        <w:rPr/>
+        <w:t xml:space="preserve"> menurut </w:t>
+      </w:r>
+      <w:r>
+        <w:rPr>
+          <w:i/>
+        </w:rPr>
+        <w:t>Sommerville</w:t>
+      </w:r>
+      <w:r>
+        <w:rPr/>
+        <w:t xml:space="preserve"> meliputi analisis kebutuhan, perancangan sistem, implementasi, pengujian, serta pemeliharaan atau pengoperasian sistem [5]. Metode ini dipilih karena kebutuhan aplikasi </w:t>
+      </w:r>
+      <w:r>
+        <w:rPr>
+          <w:i/>
+        </w:rPr>
+        <w:t>Garden Barbershop Finance</w:t>
+      </w:r>
+      <w:r>
+        <w:rPr/>
+        <w:t xml:space="preserve"> dapat diidentifikasi sejak awal berdasarkan observasi, wawancara, dan dokumentasi proses bisnis. Selain itu, penelitian aplikasi pemesanan </w:t>
       </w:r>
       <w:r>
         <w:rPr>
@@ -8878,28 +8878,125 @@
         <w:rPr/>
         <w:t xml:space="preserve"> berbasis </w:t>
       </w:r>
-      <w:r/>
       <w:r>
         <w:rPr>
           <w:i/>
         </w:rPr>
         <w:t>Android</w:t>
       </w:r>
-      <w:r/>
-      <w:r>
+      <w:r>
+        <w:rPr/>
         <w:t xml:space="preserve"> juga menggunakan tahapan </w:t>
       </w:r>
-      <w:r/>
       <w:r>
         <w:rPr>
           <w:i/>
         </w:rPr>
         <w:t>Waterfall</w:t>
       </w:r>
-      <w:r/>
-      <w:r>
+      <w:r>
+        <w:rPr/>
         <w:t xml:space="preserve"> sebagai acuan pengembangan sistem [2].</w:t>
       </w:r>
+      <w:r>
+        <w:rPr>
+          <w:i/>
+          <w:iCs/>
+        </w:rPr>
+      </w:r>
+      <w:r/>
+      <w:r>
+        <w:rPr>
+          <w:i/>
+          <w:iCs/>
+        </w:rPr>
+      </w:r>
+      <w:r/>
+      <w:r>
+        <w:rPr>
+          <w:i/>
+          <w:iCs/>
+        </w:rPr>
+      </w:r>
+      <w:r/>
+      <w:r>
+        <w:rPr>
+          <w:i/>
+        </w:rPr>
+      </w:r>
+      <w:r/>
+      <w:r/>
+      <w:r>
+        <w:rPr>
+          <w:i/>
+        </w:rPr>
+      </w:r>
+      <w:r/>
+      <w:r/>
+      <w:r/>
+      <w:r>
+        <w:rPr>
+          <w:i/>
+        </w:rPr>
+      </w:r>
+      <w:r/>
+      <w:r/>
+      <w:r>
+        <w:rPr>
+          <w:i/>
+        </w:rPr>
+      </w:r>
+      <w:r>
+        <w:rPr/>
+      </w:r>
+      <w:r>
+        <w:rPr>
+          <w:i/>
+        </w:rPr>
+      </w:r>
+      <w:r>
+        <w:rPr/>
+      </w:r>
+      <w:r/>
+      <w:r>
+        <w:rPr>
+          <w:i/>
+        </w:rPr>
+      </w:r>
+      <w:r/>
+      <w:r/>
+      <w:r>
+        <w:rPr>
+          <w:i/>
+        </w:rPr>
+      </w:r>
+      <w:r>
+        <w:rPr/>
+      </w:r>
+      <w:r>
+        <w:rPr>
+          <w:i/>
+        </w:rPr>
+      </w:r>
+      <w:r>
+        <w:rPr/>
+      </w:r>
+      <w:r/>
+      <w:r>
+        <w:rPr>
+          <w:i/>
+        </w:rPr>
+      </w:r>
+      <w:r/>
+      <w:r/>
+      <w:r/>
+      <w:r>
+        <w:rPr>
+          <w:i/>
+        </w:rPr>
+      </w:r>
+      <w:r/>
+      <w:r/>
     </w:p>
     <w:p>
       <w:pPr>
@@ -8939,6 +9036,26 @@
       <w:r>
         <w:rPr>
           <w:i/>
+        </w:rPr>
+        <w:t>Waterfall</w:t>
+      </w:r>
+      <w:r>
+        <w:rPr/>
+        <w:t xml:space="preserve"> menurut </w:t>
+      </w:r>
+      <w:r>
+        <w:rPr>
+          <w:i/>
+        </w:rPr>
+        <w:t>Sommerville</w:t>
+      </w:r>
+      <w:r>
+        <w:rPr/>
+        <w:t xml:space="preserve"> yang digunakan pada penelitian ini adalah sebagai berikut:</w:t>
+      </w:r>
+      <w:r>
+        <w:rPr>
+          <w:i/>
           <w:iCs/>
         </w:rPr>
       </w:r>
@@ -8948,12 +9065,9 @@
         <w:rPr>
           <w:i/>
         </w:rPr>
-        <w:t>Waterfall</w:t>
-      </w:r>
-      <w:r/>
-      <w:r>
-        <w:t xml:space="preserve"> yang digunakan pada penelitian ini adalah sebagai berikut:</w:t>
-      </w:r>
+      </w:r>
+      <w:r/>
+      <w:r/>
     </w:p>
     <w:p>
       <w:pPr>
@@ -10493,6 +10607,66 @@
       <w:r>
         <w:rPr>
           <w:i/>
+        </w:rPr>
+        <w:t>Waterfall</w:t>
+      </w:r>
+      <w:r>
+        <w:rPr/>
+        <w:t xml:space="preserve"> menurut </w:t>
+      </w:r>
+      <w:r>
+        <w:rPr>
+          <w:i/>
+        </w:rPr>
+        <w:t>Sommerville</w:t>
+      </w:r>
+      <w:r>
+        <w:rPr/>
+        <w:t xml:space="preserve">. Model </w:t>
+      </w:r>
+      <w:r>
+        <w:rPr>
+          <w:i/>
+        </w:rPr>
+        <w:t>Waterfall</w:t>
+      </w:r>
+      <w:r>
+        <w:rPr/>
+        <w:t xml:space="preserve"> dipilih karena memiliki tahapan yang berurutan sehingga sesuai untuk penelitian yang kebutuhan sistemnya dapat dirumuskan sejak awal. Tahapan yang digunakan dalam penelitian ini meliputi analisis kebutuhan, perancangan sistem, implementasi, pengujian, dan pemeliharaan [5]. Penerapan metode tersebut disesuaikan dengan kebutuhan pengembangan aplikasi </w:t>
+      </w:r>
+      <w:r>
+        <w:rPr>
+          <w:i/>
+        </w:rPr>
+        <w:t>Garden Barbershop Finance</w:t>
+      </w:r>
+      <w:r>
+        <w:rPr/>
+        <w:t xml:space="preserve">, yaitu aplikasi </w:t>
+      </w:r>
+      <w:r>
+        <w:rPr>
+          <w:i/>
+        </w:rPr>
+        <w:t>Android</w:t>
+      </w:r>
+      <w:r>
+        <w:rPr/>
+        <w:t xml:space="preserve"> untuk pengelolaan pendapatan, buku kas umum, biaya operasional, dan laporan pembagian hasil </w:t>
+      </w:r>
+      <w:r>
+        <w:rPr>
+          <w:i/>
+        </w:rPr>
+        <w:t>capster</w:t>
+      </w:r>
+      <w:r>
+        <w:rPr/>
+        <w:t>.</w:t>
+      </w:r>
+      <w:r>
+        <w:rPr>
+          <w:i/>
           <w:iCs/>
         </w:rPr>
       </w:r>
@@ -10516,96 +10690,73 @@
         <w:rPr>
           <w:i/>
         </w:rPr>
-        <w:t>Waterfall</w:t>
-      </w:r>
-      <w:r/>
-      <w:r>
-        <w:t xml:space="preserve">. Metode </w:t>
-      </w:r>
-      <w:r/>
-      <w:r>
-        <w:rPr>
-          <w:i/>
-        </w:rPr>
-        <w:t>Waterfall</w:t>
-      </w:r>
-      <w:r/>
-      <w:r>
-        <w:t xml:space="preserve"> merupakan salah satu metode dalam </w:t>
-      </w:r>
-      <w:r>
-        <w:rPr>
-          <w:i/>
-        </w:rPr>
-        <w:t>Software Development Life Cycle</w:t>
+      </w:r>
+      <w:r/>
+      <w:r/>
+      <w:r/>
+      <w:r>
+        <w:rPr>
+          <w:i/>
+        </w:rPr>
+      </w:r>
+      <w:r/>
+      <w:r/>
+      <w:r>
+        <w:rPr>
+          <w:i/>
+        </w:rPr>
       </w:r>
       <w:r>
         <w:rPr/>
-        <w:t xml:space="preserve"> (</w:t>
-      </w:r>
-      <w:r>
-        <w:rPr>
-          <w:i/>
-        </w:rPr>
-        <w:t>SDLC</w:t>
+      </w:r>
+      <w:r>
+        <w:rPr>
+          <w:i/>
+        </w:rPr>
       </w:r>
       <w:r>
         <w:rPr/>
-        <w:t xml:space="preserve">) yang dilakukan secara sistematis dan berurutan. Tahapan </w:t>
-      </w:r>
-      <w:r/>
-      <w:r>
-        <w:rPr>
-          <w:i/>
-        </w:rPr>
-        <w:t>Waterfall</w:t>
-      </w:r>
-      <w:r/>
-      <w:r>
-        <w:t xml:space="preserve"> dimulai dari analisis kebutuhan, perancangan sistem, implementasi, pengujian, hingga pemeliharaan. Metode ini dipilih karena penelitian aplikasi pemesanan </w:t>
-      </w:r>
-      <w:r>
-        <w:rPr>
-          <w:i/>
-        </w:rPr>
-        <w:t>online</w:t>
+      </w:r>
+      <w:r/>
+      <w:r>
+        <w:rPr>
+          <w:i/>
+        </w:rPr>
+      </w:r>
+      <w:r/>
+      <w:r/>
+      <w:r>
+        <w:rPr>
+          <w:i/>
+        </w:rPr>
       </w:r>
       <w:r>
         <w:rPr/>
-        <w:t xml:space="preserve"> </w:t>
-      </w:r>
-      <w:r>
-        <w:rPr>
-          <w:i/>
-        </w:rPr>
-        <w:t>barbershop</w:t>
+      </w:r>
+      <w:r>
+        <w:rPr>
+          <w:i/>
+        </w:rPr>
       </w:r>
       <w:r>
         <w:rPr/>
-        <w:t xml:space="preserve"> berbasis </w:t>
-      </w:r>
-      <w:r/>
-      <w:r>
-        <w:rPr>
-          <w:i/>
-        </w:rPr>
-        <w:t>Android</w:t>
-      </w:r>
-      <w:r/>
-      <w:r>
-        <w:t xml:space="preserve"> juga menggunakan tahapan </w:t>
-      </w:r>
-      <w:r/>
-      <w:r>
-        <w:rPr>
-          <w:i/>
-        </w:rPr>
-        <w:t>Waterfall</w:t>
-      </w:r>
-      <w:r/>
-      <w:r>
-        <w:t xml:space="preserve"> sebagai acuan pengembangan sistem [2].</w:t>
-      </w:r>
+      </w:r>
+      <w:r/>
+      <w:r>
+        <w:rPr>
+          <w:i/>
+        </w:rPr>
+      </w:r>
+      <w:r/>
+      <w:r/>
+      <w:r/>
+      <w:r>
+        <w:rPr>
+          <w:i/>
+        </w:rPr>
+      </w:r>
+      <w:r/>
+      <w:r/>
     </w:p>
     <w:p>
       <w:pPr>
@@ -13565,6 +13716,13 @@
         </w:rPr>
       </w:r>
       <w:r/>
+    </w:p>
+    <w:p>
+      <w:pPr/>
+      <w:r>
+        <w:rPr/>
+        <w:t>[5] I. Sommerville, Software Engineering, 9th ed. Boston: Addison-Wesley, 2011.</w:t>
+      </w:r>
     </w:p>
     <w:sectPr>
       <w:pgSz w:w="12240" w:h="15840"/>

</xml_diff>

<commit_message>
sinkronkan sitasi dengan jurnal referensi
</commit_message>
<xml_diff>
--- a/docs/Proposal Skripsi v2.docx
+++ b/docs/Proposal Skripsi v2.docx
@@ -422,7 +422,7 @@
     </w:p>
     <w:p>
       <w:r>
-        <w:t xml:space="preserve">Perkembangan teknologi informasi yang semakin pesat telah memberikan pengaruh terhadap berbagai bidang usaha, termasuk usaha jasa potong rambut. Pemanfaatan teknologi informasi dapat membantu pelaku usaha dalam melakukan pencatatan transaksi, pengolahan data, dan penyusunan laporan secara lebih terstruktur. Digitalisasi menjadi salah satu solusi untuk mengurangi keterlambatan informasi, kesalahan pencatatan, dan kesulitan dalam melakukan rekapitulasi data. Pada konteks </w:t>
+        <w:t xml:space="preserve">Perkembangan teknologi informasi yang semakin pesat telah memberikan pengaruh terhadap berbagai bidang usaha, termasuk usaha jasa potong rambut. Pemanfaatan teknologi informasi dapat membantu pelaku usaha dalam melakukan pencatatan transaksi, pengolahan data, dan penyusunan laporan secara lebih terstruktur. Pada konteks </w:t>
       </w:r>
       <w:r>
         <w:rPr>
@@ -432,19 +432,114 @@
       </w:r>
       <w:r>
         <w:rPr/>
-        <w:t xml:space="preserve">, beberapa penelitian menunjukkan bahwa aplikasi berbasis </w:t>
-      </w:r>
-      <w:r/>
+        <w:t xml:space="preserve">, penelitian Refwahajan dan Waluyo mengembangkan aplikasi </w:t>
+      </w:r>
       <w:r>
         <w:rPr>
           <w:i/>
         </w:rPr>
         <w:t>Android</w:t>
       </w:r>
-      <w:r/>
-      <w:r>
-        <w:t xml:space="preserve"> dapat digunakan untuk membantu pelayanan, pemesanan, pengelolaan informasi, dan antrean pelanggan [1], [2], [3], [4].</w:t>
-      </w:r>
+      <w:r>
+        <w:rPr/>
+        <w:t xml:space="preserve"> untuk membantu pemesanan layanan, pemilihan </w:t>
+      </w:r>
+      <w:r>
+        <w:rPr>
+          <w:i/>
+        </w:rPr>
+        <w:t>barberman</w:t>
+      </w:r>
+      <w:r>
+        <w:rPr/>
+        <w:t xml:space="preserve">, dan pemilihan waktu layanan [1]. Rohmat dkk. juga mengembangkan aplikasi pemesanan </w:t>
+      </w:r>
+      <w:r>
+        <w:rPr>
+          <w:i/>
+        </w:rPr>
+        <w:t>online</w:t>
+      </w:r>
+      <w:r>
+        <w:rPr/>
+        <w:t xml:space="preserve"> </w:t>
+      </w:r>
+      <w:r>
+        <w:rPr>
+          <w:i/>
+        </w:rPr>
+        <w:t>barbershop</w:t>
+      </w:r>
+      <w:r>
+        <w:rPr/>
+        <w:t xml:space="preserve"> berbasis </w:t>
+      </w:r>
+      <w:r>
+        <w:rPr>
+          <w:i/>
+        </w:rPr>
+        <w:t>Android</w:t>
+      </w:r>
+      <w:r>
+        <w:rPr/>
+        <w:t xml:space="preserve"> untuk membantu pelanggan mengatur jadwal serta mengurangi proses pendataan manual [2]. Selain itu, penelitian Bahtiar dkk. menunjukkan bahwa aplikasi </w:t>
+      </w:r>
+      <w:r>
+        <w:rPr>
+          <w:i/>
+        </w:rPr>
+        <w:t>barbershop</w:t>
+      </w:r>
+      <w:r>
+        <w:rPr/>
+        <w:t xml:space="preserve"> dapat membantu penyampaian informasi layanan dan pemesanan jasa [3], sedangkan penelitian Yurindra dkk. berfokus pada layanan antrean </w:t>
+      </w:r>
+      <w:r>
+        <w:rPr>
+          <w:i/>
+        </w:rPr>
+        <w:t>barbershop</w:t>
+      </w:r>
+      <w:r>
+        <w:rPr/>
+        <w:t xml:space="preserve"> berbasis </w:t>
+      </w:r>
+      <w:r>
+        <w:rPr>
+          <w:i/>
+        </w:rPr>
+        <w:t>Android</w:t>
+      </w:r>
+      <w:r>
+        <w:rPr/>
+        <w:t xml:space="preserve"> secara </w:t>
+      </w:r>
+      <w:r>
+        <w:rPr>
+          <w:i/>
+        </w:rPr>
+        <w:t>real time</w:t>
+      </w:r>
+      <w:r>
+        <w:rPr/>
+        <w:t xml:space="preserve"> [4].</w:t>
+      </w:r>
+      <w:r>
+        <w:rPr>
+          <w:i/>
+        </w:rPr>
+      </w:r>
+      <w:r>
+        <w:rPr/>
+      </w:r>
+      <w:r/>
+      <w:r>
+        <w:rPr>
+          <w:i/>
+        </w:rPr>
+      </w:r>
+      <w:r/>
+      <w:r/>
     </w:p>
     <w:p>
       <w:r>
@@ -2515,13 +2610,36 @@
             </w:r>
             <w:r>
               <w:rPr/>
-              <w:t xml:space="preserve"> Berbasis Android untuk Meningkatkan Efisiensi dan Efektivitas Pelayanan di </w:t>
+              <w:t xml:space="preserve"> Berbasis </w:t>
+            </w:r>
+            <w:r>
+              <w:rPr>
+                <w:i/>
+              </w:rPr>
+              <w:t>Android</w:t>
+            </w:r>
+            <w:r>
+              <w:rPr/>
+              <w:t xml:space="preserve"> untuk Meningkatkan Efisiensi dan Efektivitas Pelayanan di </w:t>
             </w:r>
             <w:r>
               <w:rPr>
                 <w:i/>
               </w:rPr>
               <w:t>Barbershop</w:t>
+            </w:r>
+            <w:r>
+              <w:rPr>
+                <w:i/>
+              </w:rPr>
+            </w:r>
+            <w:r>
+              <w:rPr/>
+            </w:r>
+            <w:r>
+              <w:rPr>
+                <w:i/>
+              </w:rPr>
             </w:r>
             <w:r>
               <w:rPr>
@@ -2554,7 +2672,61 @@
                 <w:i/>
                 <w:iCs/>
               </w:rPr>
-              <w:t>Pengembangan aplikasi Android</w:t>
+              <w:t xml:space="preserve">Pengembangan aplikasi </w:t>
+            </w:r>
+            <w:r>
+              <w:rPr>
+                <w:i/>
+              </w:rPr>
+              <w:t>Android</w:t>
+            </w:r>
+            <w:r>
+              <w:rPr>
+                <w:i/>
+              </w:rPr>
+              <w:t xml:space="preserve"> menggunakan </w:t>
+            </w:r>
+            <w:r>
+              <w:rPr>
+                <w:i/>
+              </w:rPr>
+              <w:t>Flutter</w:t>
+            </w:r>
+            <w:r>
+              <w:rPr>
+                <w:i/>
+              </w:rPr>
+              <w:t xml:space="preserve">, </w:t>
+            </w:r>
+            <w:r>
+              <w:rPr>
+                <w:i/>
+              </w:rPr>
+              <w:t>PHP</w:t>
+            </w:r>
+            <w:r>
+              <w:rPr>
+                <w:i/>
+              </w:rPr>
+              <w:t xml:space="preserve">, </w:t>
+            </w:r>
+            <w:r>
+              <w:rPr>
+                <w:i/>
+              </w:rPr>
+              <w:t>Laravel</w:t>
+            </w:r>
+            <w:r>
+              <w:rPr>
+                <w:i/>
+              </w:rPr>
+              <w:t xml:space="preserve">, dan </w:t>
+            </w:r>
+            <w:r>
+              <w:rPr>
+                <w:i/>
+              </w:rPr>
+              <w:t>MySQL</w:t>
             </w:r>
           </w:p>
         </w:tc>
@@ -2577,7 +2749,45 @@
             </w:r>
             <w:r>
               <w:rPr/>
-              <w:t xml:space="preserve"> berbasis Android yang membantu proses pemesanan layanan, pemilihan barberman, dan pemilihan waktu layanan sehingga pelayanan menjadi lebih efektif dan efisien.</w:t>
+              <w:t xml:space="preserve"> yang menyediakan fitur </w:t>
+            </w:r>
+            <w:r>
+              <w:rPr>
+                <w:i/>
+              </w:rPr>
+              <w:t>booking</w:t>
+            </w:r>
+            <w:r>
+              <w:rPr/>
+              <w:t xml:space="preserve"> layanan, pemilihan </w:t>
+            </w:r>
+            <w:r>
+              <w:rPr>
+                <w:i/>
+              </w:rPr>
+              <w:t>barberman</w:t>
+            </w:r>
+            <w:r>
+              <w:rPr/>
+              <w:t xml:space="preserve">, dan pemilihan waktu layanan sehingga pelayanan </w:t>
+            </w:r>
+            <w:r>
+              <w:rPr>
+                <w:i/>
+              </w:rPr>
+              <w:t>barbershop</w:t>
+            </w:r>
+            <w:r>
+              <w:rPr/>
+              <w:t xml:space="preserve"> menjadi lebih efektif dan efisien.</w:t>
+            </w:r>
+            <w:r>
+              <w:rPr>
+                <w:i/>
+              </w:rPr>
+            </w:r>
+            <w:r>
+              <w:rPr/>
             </w:r>
             <w:r>
               <w:rPr>
@@ -2603,7 +2813,17 @@
               <w:ind w:left="33" w:firstLine="0"/>
             </w:pPr>
             <w:r>
-              <w:t xml:space="preserve">Penelitian terdahulu berfokus pada pemesanan layanan pelanggan, sedangkan penelitian ini berfokus pada pengelolaan pendapatan harian </w:t>
+              <w:t xml:space="preserve">Penelitian terdahulu berfokus pada </w:t>
+            </w:r>
+            <w:r>
+              <w:rPr>
+                <w:i/>
+              </w:rPr>
+              <w:t>booking</w:t>
+            </w:r>
+            <w:r>
+              <w:rPr/>
+              <w:t xml:space="preserve"> layanan pelanggan, sedangkan penelitian ini berfokus pada pengelolaan pendapatan harian </w:t>
             </w:r>
             <w:r>
               <w:rPr>
@@ -2614,6 +2834,14 @@
             <w:r>
               <w:rPr/>
               <w:t>, buku kas umum, operasional, pembagian hasil, dan pembatasan hak akses pengguna.</w:t>
+            </w:r>
+            <w:r>
+              <w:rPr>
+                <w:i/>
+              </w:rPr>
+            </w:r>
+            <w:r>
+              <w:rPr/>
             </w:r>
             <w:proofErr w:type="spellStart"/>
             <w:r/>
@@ -2692,7 +2920,25 @@
             </w:r>
             <w:r>
               <w:rPr/>
-              <w:t xml:space="preserve"> Berbasis Android untuk Meningkatkan Layanan</w:t>
+              <w:t xml:space="preserve"> Berbasis </w:t>
+            </w:r>
+            <w:r>
+              <w:rPr>
+                <w:i/>
+              </w:rPr>
+              <w:t>Android</w:t>
+            </w:r>
+            <w:r>
+              <w:rPr/>
+              <w:t xml:space="preserve"> untuk Meningkatkan Layanan</w:t>
+            </w:r>
+            <w:r>
+              <w:rPr>
+                <w:i/>
+              </w:rPr>
+            </w:r>
+            <w:r>
+              <w:rPr/>
             </w:r>
             <w:r>
               <w:rPr>
@@ -2731,13 +2977,35 @@
               <w:rPr>
                 <w:i/>
               </w:rPr>
-              <w:t xml:space="preserve"> dan </w:t>
+              <w:t xml:space="preserve">, </w:t>
+            </w:r>
+            <w:r>
+              <w:rPr>
+                <w:i/>
+              </w:rPr>
+              <w:t>White Box Testing</w:t>
+            </w:r>
+            <w:r>
+              <w:rPr>
+                <w:i/>
+              </w:rPr>
+              <w:t xml:space="preserve">, dan </w:t>
             </w:r>
             <w:r>
               <w:rPr>
                 <w:i/>
               </w:rPr>
               <w:t>Black Box Testing</w:t>
+            </w:r>
+            <w:r>
+              <w:rPr>
+                <w:i/>
+              </w:rPr>
+            </w:r>
+            <w:r>
+              <w:rPr>
+                <w:i/>
+              </w:rPr>
             </w:r>
             <w:r>
               <w:rPr>
@@ -2775,7 +3043,43 @@
             </w:r>
             <w:r>
               <w:rPr/>
-              <w:t xml:space="preserve"> berbasis Android yang membantu pelanggan mengatur jadwal layanan dan mengurangi proses pendataan manual.</w:t>
+              <w:t xml:space="preserve"> berbasis </w:t>
+            </w:r>
+            <w:r>
+              <w:rPr>
+                <w:i/>
+              </w:rPr>
+              <w:t>Android</w:t>
+            </w:r>
+            <w:r>
+              <w:rPr/>
+              <w:t xml:space="preserve"> yang membantu pelanggan mengatur jadwal layanan, mengurangi antrean, dan mengurangi pendataan manual oleh pihak </w:t>
+            </w:r>
+            <w:r>
+              <w:rPr>
+                <w:i/>
+              </w:rPr>
+              <w:t>barbershop</w:t>
+            </w:r>
+            <w:r>
+              <w:rPr/>
+              <w:t>.</w:t>
+            </w:r>
+            <w:r>
+              <w:rPr>
+                <w:i/>
+              </w:rPr>
+            </w:r>
+            <w:r>
+              <w:rPr/>
+            </w:r>
+            <w:r>
+              <w:rPr>
+                <w:i/>
+              </w:rPr>
+            </w:r>
+            <w:r>
+              <w:rPr/>
             </w:r>
             <w:r>
               <w:rPr>
@@ -2800,17 +3104,17 @@
               <w:ind w:left="33" w:firstLine="0"/>
             </w:pPr>
             <w:r>
-              <w:t xml:space="preserve">Penelitian terdahulu menitikberatkan pada </w:t>
+              <w:t xml:space="preserve">Penelitian terdahulu menitikberatkan pada pemesanan </w:t>
             </w:r>
             <w:r>
               <w:rPr>
                 <w:i/>
               </w:rPr>
-              <w:t>booking</w:t>
+              <w:t>online</w:t>
             </w:r>
             <w:r>
               <w:rPr/>
-              <w:t xml:space="preserve"> dan layanan pelanggan, sedangkan penelitian ini menitikberatkan pada sistem internal untuk pencatatan pendapatan, pengendalian input oleh admin harian, dan laporan pembagian hasil </w:t>
+              <w:t xml:space="preserve"> pelanggan, sedangkan penelitian ini menitikberatkan pada sistem internal untuk pencatatan pendapatan, pengendalian input oleh admin harian, dan laporan pembagian hasil </w:t>
             </w:r>
             <w:r>
               <w:rPr>
@@ -2821,6 +3125,22 @@
             <w:r>
               <w:rPr/>
               <w:t>.</w:t>
+            </w:r>
+            <w:r>
+              <w:rPr>
+                <w:i/>
+              </w:rPr>
+            </w:r>
+            <w:r>
+              <w:rPr/>
+            </w:r>
+            <w:r>
+              <w:rPr>
+                <w:i/>
+              </w:rPr>
+            </w:r>
+            <w:r>
+              <w:rPr/>
             </w:r>
             <w:proofErr w:type="spellStart"/>
             <w:r>
@@ -2889,13 +3209,36 @@
             </w:r>
             <w:r>
               <w:rPr/>
-              <w:t xml:space="preserve"> Berbasis Android Untuk Menumbuh Kembangkan Usaha </w:t>
+              <w:t xml:space="preserve"> Berbasis </w:t>
+            </w:r>
+            <w:r>
+              <w:rPr>
+                <w:i/>
+              </w:rPr>
+              <w:t>Android</w:t>
+            </w:r>
+            <w:r>
+              <w:rPr/>
+              <w:t xml:space="preserve"> Untuk Menumbuh Kembangkan Usaha </w:t>
             </w:r>
             <w:r>
               <w:rPr>
                 <w:i/>
               </w:rPr>
               <w:t>Barbershop</w:t>
+            </w:r>
+            <w:r>
+              <w:rPr>
+                <w:i/>
+              </w:rPr>
+            </w:r>
+            <w:r>
+              <w:rPr/>
+            </w:r>
+            <w:r>
+              <w:rPr>
+                <w:i/>
+              </w:rPr>
             </w:r>
             <w:r>
               <w:rPr>
@@ -2919,7 +3262,13 @@
                 <w:i/>
                 <w:iCs/>
               </w:rPr>
-              <w:t>Pengembangan aplikasi Android</w:t>
+              <w:t xml:space="preserve">Pengembangan aplikasi </w:t>
+            </w:r>
+            <w:r>
+              <w:rPr>
+                <w:i/>
+              </w:rPr>
+              <w:t>Android</w:t>
             </w:r>
           </w:p>
         </w:tc>
@@ -2948,7 +3297,7 @@
               <w:rPr>
                 <w:i/>
               </w:rPr>
-              <w:t xml:space="preserve"> yang memudahkan pengguna mempe</w:t>
+              <w:t xml:space="preserve"> yang membantu pengguna mempe</w:t>
             </w:r>
             <w:r>
               <w:rPr>
@@ -2960,7 +3309,7 @@
               <w:rPr>
                 <w:i/>
               </w:rPr>
-              <w:t xml:space="preserve">h informasi, memilih layanan, dan melakukan pemesanan jasa </w:t>
+              <w:t xml:space="preserve">h informasi, memilih layanan atau gaya rambut, menentukan lokasi </w:t>
             </w:r>
             <w:r>
               <w:rPr>
@@ -2972,7 +3321,49 @@
               <w:rPr>
                 <w:i/>
               </w:rPr>
+              <w:t xml:space="preserve">, dan melakukan pemesanan jasa </w:t>
+            </w:r>
+            <w:r>
+              <w:rPr>
+                <w:i/>
+              </w:rPr>
+              <w:t>barbershop</w:t>
+            </w:r>
+            <w:r>
+              <w:rPr>
+                <w:i/>
+              </w:rPr>
               <w:t>.</w:t>
+            </w:r>
+            <w:r>
+              <w:rPr>
+                <w:i/>
+              </w:rPr>
+            </w:r>
+            <w:r>
+              <w:rPr>
+                <w:i/>
+              </w:rPr>
+            </w:r>
+            <w:r>
+              <w:rPr>
+                <w:i/>
+              </w:rPr>
+            </w:r>
+            <w:r>
+              <w:rPr>
+                <w:i/>
+              </w:rPr>
+            </w:r>
+            <w:r>
+              <w:rPr>
+                <w:i/>
+              </w:rPr>
+            </w:r>
+            <w:r>
+              <w:rPr>
+                <w:i/>
+              </w:rPr>
             </w:r>
             <w:r/>
           </w:p>
@@ -2997,6 +3388,14 @@
             <w:r>
               <w:rPr/>
               <w:t>, dan bagian pondok.</w:t>
+            </w:r>
+            <w:r>
+              <w:rPr>
+                <w:i/>
+              </w:rPr>
+            </w:r>
+            <w:r>
+              <w:rPr/>
             </w:r>
             <w:r>
               <w:rPr>
@@ -3066,7 +3465,17 @@
             </w:r>
             <w:r>
               <w:rPr/>
-              <w:t xml:space="preserve"> Berbasis Android pada </w:t>
+              <w:t xml:space="preserve"> Berbasis </w:t>
+            </w:r>
+            <w:r>
+              <w:rPr>
+                <w:i/>
+              </w:rPr>
+              <w:t>Android</w:t>
+            </w:r>
+            <w:r>
+              <w:rPr/>
+              <w:t xml:space="preserve"> pada </w:t>
             </w:r>
             <w:r>
               <w:rPr>
@@ -3076,13 +3485,28 @@
             </w:r>
             <w:r>
               <w:rPr/>
-              <w:t xml:space="preserve"> The Barbega Menggunakan Model </w:t>
+              <w:t xml:space="preserve"> The Barbega Menggunakan Model Multi Channel - Single Phase</w:t>
             </w:r>
             <w:r>
               <w:rPr>
                 <w:i/>
               </w:rPr>
-              <w:t>Multi Channel - Single Phase</w:t>
+            </w:r>
+            <w:r>
+              <w:rPr/>
+            </w:r>
+            <w:r>
+              <w:rPr>
+                <w:i/>
+              </w:rPr>
+            </w:r>
+            <w:r>
+              <w:rPr/>
+            </w:r>
+            <w:r>
+              <w:rPr>
+                <w:i/>
+              </w:rPr>
             </w:r>
             <w:r>
               <w:rPr>
@@ -3106,13 +3530,12 @@
                 <w:i/>
                 <w:iCs/>
               </w:rPr>
-              <w:t xml:space="preserve">Client server dan model antrian </w:t>
+              <w:t>Client server dan model antrian Multi Channel - Single Phase</w:t>
             </w:r>
             <w:r>
               <w:rPr>
                 <w:i/>
               </w:rPr>
-              <w:t>Multi Channel - Single Phase</w:t>
             </w:r>
           </w:p>
         </w:tc>
@@ -3125,7 +3548,17 @@
               <w:ind w:left="0" w:firstLine="0"/>
             </w:pPr>
             <w:r>
-              <w:t xml:space="preserve">Penelitian menghasilkan aplikasi Android berbasis </w:t>
+              <w:t xml:space="preserve">Penelitian menghasilkan aplikasi </w:t>
+            </w:r>
+            <w:r>
+              <w:rPr>
+                <w:i/>
+              </w:rPr>
+              <w:t>Android</w:t>
+            </w:r>
+            <w:r>
+              <w:rPr/>
+              <w:t xml:space="preserve"> berbasis </w:t>
             </w:r>
             <w:r>
               <w:rPr>
@@ -3156,6 +3589,30 @@
             <w:r>
               <w:rPr/>
               <w:t>.</w:t>
+            </w:r>
+            <w:r>
+              <w:rPr>
+                <w:i/>
+              </w:rPr>
+            </w:r>
+            <w:r>
+              <w:rPr/>
+            </w:r>
+            <w:r>
+              <w:rPr>
+                <w:i/>
+              </w:rPr>
+            </w:r>
+            <w:r>
+              <w:rPr/>
+            </w:r>
+            <w:r>
+              <w:rPr>
+                <w:i/>
+              </w:rPr>
+            </w:r>
+            <w:r>
+              <w:rPr/>
             </w:r>
           </w:p>
         </w:tc>
@@ -3193,6 +3650,22 @@
             <w:r>
               <w:rPr>
                 <w:i/>
+              </w:rPr>
+            </w:r>
+            <w:r>
+              <w:rPr/>
+            </w:r>
+            <w:r>
+              <w:rPr>
+                <w:i/>
+              </w:rPr>
+            </w:r>
+            <w:r>
+              <w:rPr/>
+            </w:r>
+            <w:r>
+              <w:rPr>
+                <w:i/>
                 <w:iCs/>
               </w:rPr>
             </w:r>
@@ -3228,6 +3701,194 @@
         <w:rPr>
           <w:i/>
         </w:rPr>
+        <w:t>Android</w:t>
+      </w:r>
+      <w:r>
+        <w:rPr/>
+        <w:t xml:space="preserve"> telah digunakan pada beberapa kebutuhan yang berbeda. Refwahajan dan Waluyo menekankan aplikasi untuk pemesanan layanan, pemilihan </w:t>
+      </w:r>
+      <w:r>
+        <w:rPr>
+          <w:i/>
+        </w:rPr>
+        <w:t>barberman</w:t>
+      </w:r>
+      <w:r>
+        <w:rPr/>
+        <w:t xml:space="preserve">, dan pemilihan waktu layanan [1]. Rohmat dkk. meneliti aplikasi pemesanan </w:t>
+      </w:r>
+      <w:r>
+        <w:rPr>
+          <w:i/>
+        </w:rPr>
+        <w:t>online</w:t>
+      </w:r>
+      <w:r>
+        <w:rPr/>
+        <w:t xml:space="preserve"> </w:t>
+      </w:r>
+      <w:r>
+        <w:rPr>
+          <w:i/>
+        </w:rPr>
+        <w:t>barbershop</w:t>
+      </w:r>
+      <w:r>
+        <w:rPr/>
+        <w:t xml:space="preserve"> dengan metode </w:t>
+      </w:r>
+      <w:r>
+        <w:rPr>
+          <w:i/>
+        </w:rPr>
+        <w:t>Waterfall</w:t>
+      </w:r>
+      <w:r>
+        <w:rPr/>
+        <w:t xml:space="preserve"> dan pengujian </w:t>
+      </w:r>
+      <w:r>
+        <w:rPr>
+          <w:i/>
+        </w:rPr>
+        <w:t>Black Box Testing</w:t>
+      </w:r>
+      <w:r>
+        <w:rPr/>
+        <w:t xml:space="preserve"> [2]. Bahtiar dkk. membahas aplikasi </w:t>
+      </w:r>
+      <w:r>
+        <w:rPr>
+          <w:i/>
+        </w:rPr>
+        <w:t>barbershop</w:t>
+      </w:r>
+      <w:r>
+        <w:rPr/>
+        <w:t xml:space="preserve"> untuk membantu pengguna mempe</w:t>
+      </w:r>
+      <w:r>
+        <w:rPr>
+          <w:i/>
+        </w:rPr>
+        <w:t>role</w:t>
+      </w:r>
+      <w:r>
+        <w:rPr/>
+        <w:t xml:space="preserve">h informasi, memilih layanan, serta melakukan pemesanan jasa </w:t>
+      </w:r>
+      <w:r>
+        <w:rPr>
+          <w:i/>
+        </w:rPr>
+        <w:t>barbershop</w:t>
+      </w:r>
+      <w:r>
+        <w:rPr/>
+        <w:t xml:space="preserve"> [3]. Yurindra dkk. mengembangkan aplikasi </w:t>
+      </w:r>
+      <w:r>
+        <w:rPr>
+          <w:i/>
+        </w:rPr>
+        <w:t>Android</w:t>
+      </w:r>
+      <w:r>
+        <w:rPr/>
+        <w:t xml:space="preserve"> berbasis </w:t>
+      </w:r>
+      <w:r>
+        <w:rPr>
+          <w:i/>
+        </w:rPr>
+        <w:t>client server</w:t>
+      </w:r>
+      <w:r>
+        <w:rPr/>
+        <w:t xml:space="preserve"> untuk membantu pelanggan melihat dan memesan antrean </w:t>
+      </w:r>
+      <w:r>
+        <w:rPr>
+          <w:i/>
+        </w:rPr>
+        <w:t>barbershop</w:t>
+      </w:r>
+      <w:r>
+        <w:rPr/>
+        <w:t xml:space="preserve"> secara </w:t>
+      </w:r>
+      <w:r>
+        <w:rPr>
+          <w:i/>
+        </w:rPr>
+        <w:t>real time</w:t>
+      </w:r>
+      <w:r>
+        <w:rPr/>
+        <w:t xml:space="preserve"> [4]. Berdasarkan perbandingan tersebut, penelitian ini memiliki perbedaan karena tidak berfokus pada </w:t>
+      </w:r>
+      <w:r>
+        <w:rPr>
+          <w:i/>
+        </w:rPr>
+        <w:t>booking</w:t>
+      </w:r>
+      <w:r>
+        <w:rPr/>
+        <w:t xml:space="preserve"> pelanggan atau antrean, melainkan pada pengelolaan internal </w:t>
+      </w:r>
+      <w:r>
+        <w:rPr>
+          <w:i/>
+        </w:rPr>
+        <w:t>Garden Barbershop</w:t>
+      </w:r>
+      <w:r>
+        <w:rPr/>
+        <w:t xml:space="preserve"> yang meliputi pencatatan pendapatan harian </w:t>
+      </w:r>
+      <w:r>
+        <w:rPr>
+          <w:i/>
+        </w:rPr>
+        <w:t>capster</w:t>
+      </w:r>
+      <w:r>
+        <w:rPr/>
+        <w:t xml:space="preserve">, buku kas umum, biaya operasional, pembagian hasil, </w:t>
+      </w:r>
+      <w:r>
+        <w:rPr>
+          <w:i/>
+        </w:rPr>
+        <w:t>role</w:t>
+      </w:r>
+      <w:r>
+        <w:rPr/>
+        <w:t xml:space="preserve"> pengguna, dan pembatasan akses agar </w:t>
+      </w:r>
+      <w:r>
+        <w:rPr>
+          <w:i/>
+        </w:rPr>
+        <w:t>capster</w:t>
+      </w:r>
+      <w:r>
+        <w:rPr/>
+        <w:t xml:space="preserve"> biasa hanya dapat melihat laporan miliknya sendiri.</w:t>
+      </w:r>
+      <w:r>
+        <w:rPr>
+          <w:i/>
+        </w:rPr>
+      </w:r>
+      <w:r>
+        <w:rPr/>
+      </w:r>
+      <w:r>
+        <w:rPr>
+          <w:i/>
+        </w:rPr>
       </w:r>
       <w:r/>
       <w:r>
@@ -3312,108 +3973,81 @@
         <w:rPr>
           <w:i/>
         </w:rPr>
-        <w:t>Android</w:t>
-      </w:r>
-      <w:r/>
-      <w:r>
-        <w:t xml:space="preserve"> telah banyak digunakan untuk membantu pemesanan layanan, penyampaian informasi, pemilihan layanan, dan manajemen antrean pelanggan [1], [2], [3], [4]. Penelitian sebelumnya menunjukkan bahwa teknologi </w:t>
-      </w:r>
-      <w:r/>
-      <w:r>
-        <w:rPr>
-          <w:i/>
-        </w:rPr>
-        <w:t>Android</w:t>
-      </w:r>
-      <w:r/>
-      <w:r>
-        <w:t xml:space="preserve"> dapat membantu aktivitas </w:t>
-      </w:r>
-      <w:r>
-        <w:rPr>
-          <w:i/>
-        </w:rPr>
-        <w:t>barbershop</w:t>
+      </w:r>
+      <w:r/>
+      <w:r/>
+      <w:r/>
+      <w:r>
+        <w:rPr>
+          <w:i/>
+        </w:rPr>
+      </w:r>
+      <w:r/>
+      <w:r/>
+      <w:r>
+        <w:rPr>
+          <w:i/>
+        </w:rPr>
       </w:r>
       <w:r>
         <w:rPr/>
-        <w:t xml:space="preserve"> menjadi lebih efektif melalui penyediaan aplikasi yang dapat diakses melalui perangkat </w:t>
-      </w:r>
-      <w:r/>
-      <w:r>
-        <w:rPr>
-          <w:i/>
-        </w:rPr>
-        <w:t>mobile</w:t>
-      </w:r>
-      <w:r/>
-      <w:r>
-        <w:t xml:space="preserve">. Namun, penelitian-penelitian tersebut lebih banyak berfokus pada layanan pelanggan, </w:t>
-      </w:r>
-      <w:r>
-        <w:rPr>
-          <w:i/>
-        </w:rPr>
-        <w:t>booking</w:t>
+      </w:r>
+      <w:r/>
+      <w:r>
+        <w:rPr>
+          <w:i/>
+        </w:rPr>
+      </w:r>
+      <w:r/>
+      <w:r/>
+      <w:r>
+        <w:rPr>
+          <w:i/>
+        </w:rPr>
       </w:r>
       <w:r>
         <w:rPr/>
-        <w:t xml:space="preserve">, informasi </w:t>
-      </w:r>
-      <w:r>
-        <w:rPr>
-          <w:i/>
-        </w:rPr>
-        <w:t>barbershop</w:t>
+      </w:r>
+      <w:r>
+        <w:rPr>
+          <w:i/>
+        </w:rPr>
       </w:r>
       <w:r>
         <w:rPr/>
-        <w:t xml:space="preserve">, dan antrean. Penelitian ini memiliki perbedaan pada fokus pengembangan sistem, yaitu pengelolaan internal </w:t>
-      </w:r>
-      <w:r/>
-      <w:r>
-        <w:rPr>
-          <w:i/>
-        </w:rPr>
-        <w:t>Garden Barbershop</w:t>
-      </w:r>
-      <w:r/>
-      <w:r>
-        <w:t xml:space="preserve"> yang meliputi pencatatan pendapatan harian </w:t>
-      </w:r>
-      <w:r/>
-      <w:r>
-        <w:rPr>
-          <w:i/>
-        </w:rPr>
-        <w:t>capster</w:t>
-      </w:r>
-      <w:r/>
-      <w:r>
-        <w:t xml:space="preserve">, buku kas umum, biaya operasional, pembagian hasil, </w:t>
-      </w:r>
-      <w:r/>
-      <w:r>
-        <w:rPr>
-          <w:i/>
-        </w:rPr>
-        <w:t>role</w:t>
-      </w:r>
-      <w:r/>
-      <w:r>
-        <w:t xml:space="preserve"> pengguna, dan pembatasan akses agar </w:t>
-      </w:r>
-      <w:r/>
-      <w:r>
-        <w:rPr>
-          <w:i/>
-        </w:rPr>
-        <w:t>capster</w:t>
-      </w:r>
-      <w:r/>
-      <w:r>
-        <w:t xml:space="preserve"> biasa hanya dapat melihat laporan miliknya sendiri.</w:t>
-      </w:r>
+      </w:r>
+      <w:r/>
+      <w:r>
+        <w:rPr>
+          <w:i/>
+        </w:rPr>
+      </w:r>
+      <w:r/>
+      <w:r/>
+      <w:r/>
+      <w:r>
+        <w:rPr>
+          <w:i/>
+        </w:rPr>
+      </w:r>
+      <w:r/>
+      <w:r/>
+      <w:r/>
+      <w:r>
+        <w:rPr>
+          <w:i/>
+        </w:rPr>
+      </w:r>
+      <w:r/>
+      <w:r/>
+      <w:r/>
+      <w:r>
+        <w:rPr>
+          <w:i/>
+        </w:rPr>
+      </w:r>
+      <w:r/>
+      <w:r/>
     </w:p>
     <w:p>
       <w:pPr>
@@ -3583,12 +4217,90 @@
       </w:r>
       <w:r>
         <w:rPr/>
+        <w:t xml:space="preserve">, proses rancang bangun digunakan untuk menghasilkan aplikasi yang sesuai dengan kebutuhan objek penelitian, seperti pemesanan layanan [1], pemesanan </w:t>
+      </w:r>
+      <w:r>
+        <w:rPr>
+          <w:i/>
+        </w:rPr>
+        <w:t>online</w:t>
+      </w:r>
+      <w:r>
+        <w:rPr/>
         <w:t xml:space="preserve"> berbasis </w:t>
       </w:r>
       <w:r>
         <w:rPr>
           <w:i/>
         </w:rPr>
+        <w:t>Android</w:t>
+      </w:r>
+      <w:r>
+        <w:rPr/>
+        <w:t xml:space="preserve"> [2], penyampaian informasi dan pemesanan jasa </w:t>
+      </w:r>
+      <w:r>
+        <w:rPr>
+          <w:i/>
+        </w:rPr>
+        <w:t>barbershop</w:t>
+      </w:r>
+      <w:r>
+        <w:rPr/>
+        <w:t xml:space="preserve"> [3], serta layanan antrean berbasis </w:t>
+      </w:r>
+      <w:r>
+        <w:rPr>
+          <w:i/>
+        </w:rPr>
+        <w:t>client server</w:t>
+      </w:r>
+      <w:r>
+        <w:rPr/>
+        <w:t xml:space="preserve"> [4]. Pada penelitian ini, rancang bangun dilakukan untuk menghasilkan aplikasi </w:t>
+      </w:r>
+      <w:r>
+        <w:rPr>
+          <w:i/>
+        </w:rPr>
+        <w:t>Garden Barbershop Finance</w:t>
+      </w:r>
+      <w:r>
+        <w:rPr/>
+        <w:t xml:space="preserve"> berbasis </w:t>
+      </w:r>
+      <w:r>
+        <w:rPr>
+          <w:i/>
+        </w:rPr>
+        <w:t>Android</w:t>
+      </w:r>
+      <w:r>
+        <w:rPr/>
+        <w:t xml:space="preserve"> yang digunakan dalam pengelolaan pendapatan, buku kas umum, operasional, dan laporan pembagian hasil </w:t>
+      </w:r>
+      <w:r>
+        <w:rPr>
+          <w:i/>
+        </w:rPr>
+        <w:t>capster</w:t>
+      </w:r>
+      <w:r>
+        <w:rPr/>
+        <w:t>.</w:t>
+      </w:r>
+      <w:r>
+        <w:rPr>
+          <w:i/>
+        </w:rPr>
+      </w:r>
+      <w:r>
+        <w:rPr/>
+      </w:r>
+      <w:r>
+        <w:rPr>
+          <w:i/>
+        </w:rPr>
       </w:r>
       <w:r/>
       <w:r>
@@ -3611,55 +4323,41 @@
         <w:rPr>
           <w:i/>
         </w:rPr>
-        <w:t>Android</w:t>
-      </w:r>
-      <w:r/>
-      <w:r>
-        <w:t xml:space="preserve">, proses rancang bangun dilakukan untuk menghasilkan aplikasi yang dapat menjawab kebutuhan layanan dan operasional </w:t>
-      </w:r>
-      <w:r>
-        <w:rPr>
-          <w:i/>
-        </w:rPr>
-        <w:t>barbershop</w:t>
+      </w:r>
+      <w:r/>
+      <w:r/>
+      <w:r>
+        <w:rPr>
+          <w:i/>
+        </w:rPr>
       </w:r>
       <w:r>
         <w:rPr/>
-        <w:t xml:space="preserve"> [1], [2]. Pada penelitian ini, rancang bangun dilakukan untuk menghasilkan aplikasi </w:t>
-      </w:r>
-      <w:r/>
-      <w:r>
-        <w:rPr>
-          <w:i/>
-        </w:rPr>
-        <w:t>Garden Barbershop Finance</w:t>
-      </w:r>
-      <w:r/>
-      <w:r>
-        <w:t xml:space="preserve"> berbasis </w:t>
-      </w:r>
-      <w:r/>
-      <w:r>
-        <w:rPr>
-          <w:i/>
-        </w:rPr>
-        <w:t>Android</w:t>
-      </w:r>
-      <w:r/>
-      <w:r>
-        <w:t xml:space="preserve"> yang digunakan dalam pengelolaan pendapatan, buku kas umum, operasional, dan laporan pembagian hasil </w:t>
-      </w:r>
-      <w:r/>
-      <w:r>
-        <w:rPr>
-          <w:i/>
-        </w:rPr>
-        <w:t>capster</w:t>
-      </w:r>
-      <w:r/>
-      <w:r>
-        <w:t>.</w:t>
-      </w:r>
+      </w:r>
+      <w:r/>
+      <w:r>
+        <w:rPr>
+          <w:i/>
+        </w:rPr>
+      </w:r>
+      <w:r/>
+      <w:r/>
+      <w:r/>
+      <w:r>
+        <w:rPr>
+          <w:i/>
+        </w:rPr>
+      </w:r>
+      <w:r/>
+      <w:r/>
+      <w:r/>
+      <w:r>
+        <w:rPr>
+          <w:i/>
+        </w:rPr>
+      </w:r>
+      <w:r/>
+      <w:r/>
     </w:p>
     <w:p>
       <w:pPr>
@@ -3680,7 +4378,7 @@
         <w:ind w:firstLine="720"/>
       </w:pPr>
       <w:r>
-        <w:t xml:space="preserve">Sistem informasi merupakan kumpulan komponen yang saling berhubungan untuk mengumpulkan data, mengolah data, menyimpan data, dan menghasilkan informasi yang bermanfaat bagi proses bisnis. Pada penelitian aplikasi </w:t>
+        <w:t xml:space="preserve">Sistem informasi merupakan kumpulan komponen yang saling berhubungan untuk mengumpulkan data, mengolah data, menyimpan data, dan menghasilkan informasi yang bermanfaat bagi proses bisnis. Dalam penelitian terdahulu pada bidang </w:t>
       </w:r>
       <w:r>
         <w:rPr>
@@ -3692,6 +4390,64 @@
         <w:rPr/>
         <w:t xml:space="preserve">, sistem berbasis </w:t>
       </w:r>
+      <w:r>
+        <w:rPr>
+          <w:i/>
+        </w:rPr>
+        <w:t>Android</w:t>
+      </w:r>
+      <w:r>
+        <w:rPr/>
+        <w:t xml:space="preserve"> digunakan untuk membantu proses layanan dan pengelolaan informasi, seperti pemesanan layanan [1], pemesanan </w:t>
+      </w:r>
+      <w:r>
+        <w:rPr>
+          <w:i/>
+        </w:rPr>
+        <w:t>online</w:t>
+      </w:r>
+      <w:r>
+        <w:rPr/>
+        <w:t xml:space="preserve"> [2], informasi layanan </w:t>
+      </w:r>
+      <w:r>
+        <w:rPr>
+          <w:i/>
+        </w:rPr>
+        <w:t>barbershop</w:t>
+      </w:r>
+      <w:r>
+        <w:rPr/>
+        <w:t xml:space="preserve"> [3], dan informasi antrean secara </w:t>
+      </w:r>
+      <w:r>
+        <w:rPr>
+          <w:i/>
+        </w:rPr>
+        <w:t>real time</w:t>
+      </w:r>
+      <w:r>
+        <w:rPr/>
+        <w:t xml:space="preserve"> [4]. Pada penelitian ini, sistem informasi digunakan untuk mengelola data pendapatan, buku kas umum, biaya operasional, akun pengguna, serta laporan pembagian hasil </w:t>
+      </w:r>
+      <w:r>
+        <w:rPr>
+          <w:i/>
+        </w:rPr>
+        <w:t>capster</w:t>
+      </w:r>
+      <w:r>
+        <w:rPr/>
+        <w:t>.</w:t>
+      </w:r>
+      <w:r>
+        <w:rPr>
+          <w:i/>
+        </w:rPr>
+      </w:r>
+      <w:r>
+        <w:rPr/>
+      </w:r>
       <w:proofErr w:type="spellStart"/>
       <w:r>
         <w:rPr>
@@ -3706,23 +4462,17 @@
         <w:rPr>
           <w:i/>
         </w:rPr>
-        <w:t>Android</w:t>
-      </w:r>
-      <w:r/>
-      <w:r>
-        <w:t xml:space="preserve"> digunakan untuk membantu pengelolaan informasi dan aktivitas layanan agar proses yang sebelumnya dilakukan secara manual menjadi lebih terstruktur [1], [2], [3], [4]. Pada penelitian ini, sistem informasi digunakan untuk mengelola data pendapatan, buku kas umum, biaya operasional, akun pengguna, serta laporan pembagian hasil </w:t>
-      </w:r>
-      <w:r/>
-      <w:r>
-        <w:rPr>
-          <w:i/>
-        </w:rPr>
-        <w:t>capster</w:t>
-      </w:r>
-      <w:r/>
-      <w:r>
-        <w:t>.</w:t>
-      </w:r>
+      </w:r>
+      <w:r/>
+      <w:r/>
+      <w:r/>
+      <w:r>
+        <w:rPr>
+          <w:i/>
+        </w:rPr>
+      </w:r>
+      <w:r/>
+      <w:r/>
     </w:p>
     <w:p>
       <w:pPr>
@@ -3752,92 +4502,61 @@
         <w:rPr>
           <w:i/>
         </w:rPr>
-      </w:r>
-      <w:r/>
-      <w:r>
-        <w:rPr>
-          <w:i/>
-        </w:rPr>
-      </w:r>
-      <w:r/>
-      <w:r>
-        <w:rPr>
-          <w:i/>
-        </w:rPr>
-      </w:r>
-      <w:r/>
-      <w:r>
-        <w:rPr>
-          <w:i/>
-        </w:rPr>
-      </w:r>
-      <w:r/>
-      <w:r>
-        <w:rPr>
-          <w:i/>
-        </w:rPr>
-      </w:r>
-      <w:r/>
-      <w:r>
-        <w:rPr>
-          <w:i/>
-        </w:rPr>
-      </w:r>
-      <w:r/>
-      <w:r/>
-      <w:r>
-        <w:rPr>
-          <w:i/>
-        </w:rPr>
         <w:t>Android</w:t>
       </w:r>
-      <w:r/>
-      <w:r>
+      <w:r>
+        <w:rPr/>
         <w:t xml:space="preserve"> merupakan perangkat lunak yang berjalan pada perangkat </w:t>
       </w:r>
-      <w:r/>
       <w:r>
         <w:rPr>
           <w:i/>
         </w:rPr>
         <w:t>mobile</w:t>
       </w:r>
-      <w:r/>
-      <w:r>
+      <w:r>
+        <w:rPr/>
         <w:t xml:space="preserve"> berbasis sistem operasi </w:t>
       </w:r>
-      <w:r/>
       <w:r>
         <w:rPr>
           <w:i/>
         </w:rPr>
         <w:t>Android</w:t>
       </w:r>
-      <w:r/>
-      <w:r>
+      <w:r>
+        <w:rPr/>
         <w:t xml:space="preserve">. Aplikasi </w:t>
       </w:r>
-      <w:r/>
       <w:r>
         <w:rPr>
           <w:i/>
         </w:rPr>
         <w:t>Android</w:t>
       </w:r>
-      <w:r/>
-      <w:r>
+      <w:r>
+        <w:rPr/>
         <w:t xml:space="preserve"> dapat digunakan sebagai media input data dan akses sistem karena perangkat </w:t>
       </w:r>
-      <w:r/>
       <w:r>
         <w:rPr>
           <w:i/>
         </w:rPr>
         <w:t>mobile</w:t>
       </w:r>
-      <w:r/>
-      <w:r>
-        <w:t xml:space="preserve"> mudah dibawa dan digunakan dalam aktivitas operasional harian. Penelitian terdahulu menunjukkan bahwa aplikasi </w:t>
+      <w:r>
+        <w:rPr/>
+        <w:t xml:space="preserve"> mudah dibawa dan digunakan dalam aktivitas operasional harian. Pada penelitian terdahulu, aplikasi </w:t>
+      </w:r>
+      <w:r>
+        <w:rPr>
+          <w:i/>
+        </w:rPr>
+        <w:t>Android</w:t>
+      </w:r>
+      <w:r>
+        <w:rPr/>
+        <w:t xml:space="preserve"> digunakan untuk membantu pemesanan layanan </w:t>
       </w:r>
       <w:r>
         <w:rPr>
@@ -3847,18 +4566,17 @@
       </w:r>
       <w:r>
         <w:rPr/>
-        <w:t xml:space="preserve"> berbasis </w:t>
-      </w:r>
-      <w:r/>
-      <w:r>
-        <w:rPr>
-          <w:i/>
-        </w:rPr>
-        <w:t>Android</w:t>
-      </w:r>
-      <w:r/>
-      <w:r>
-        <w:t xml:space="preserve"> dapat membantu pemesanan layanan, penyampaian informasi, dan pengelolaan antrean pada </w:t>
+        <w:t xml:space="preserve"> [1], pemesanan </w:t>
+      </w:r>
+      <w:r>
+        <w:rPr>
+          <w:i/>
+        </w:rPr>
+        <w:t>online</w:t>
+      </w:r>
+      <w:r>
+        <w:rPr/>
+        <w:t xml:space="preserve"> untuk mengurangi antrean dan pendataan manual [2], penyampaian informasi serta pemesanan jasa </w:t>
       </w:r>
       <w:r>
         <w:rPr>
@@ -3868,7 +4586,117 @@
       </w:r>
       <w:r>
         <w:rPr/>
-        <w:t xml:space="preserve"> [1], [2], [3], [4].</w:t>
+        <w:t xml:space="preserve"> [3], dan layanan antrean berbasis </w:t>
+      </w:r>
+      <w:r>
+        <w:rPr>
+          <w:i/>
+        </w:rPr>
+        <w:t>client server</w:t>
+      </w:r>
+      <w:r>
+        <w:rPr/>
+        <w:t xml:space="preserve"> [4].</w:t>
+      </w:r>
+      <w:r>
+        <w:rPr>
+          <w:i/>
+        </w:rPr>
+      </w:r>
+      <w:r/>
+      <w:r>
+        <w:rPr>
+          <w:i/>
+        </w:rPr>
+      </w:r>
+      <w:r/>
+      <w:r>
+        <w:rPr>
+          <w:i/>
+        </w:rPr>
+      </w:r>
+      <w:r/>
+      <w:r>
+        <w:rPr>
+          <w:i/>
+        </w:rPr>
+      </w:r>
+      <w:r/>
+      <w:r>
+        <w:rPr>
+          <w:i/>
+        </w:rPr>
+      </w:r>
+      <w:r/>
+      <w:r>
+        <w:rPr>
+          <w:i/>
+        </w:rPr>
+      </w:r>
+      <w:r/>
+      <w:r/>
+      <w:r>
+        <w:rPr>
+          <w:i/>
+        </w:rPr>
+      </w:r>
+      <w:r/>
+      <w:r/>
+      <w:r/>
+      <w:r>
+        <w:rPr>
+          <w:i/>
+        </w:rPr>
+      </w:r>
+      <w:r/>
+      <w:r/>
+      <w:r/>
+      <w:r>
+        <w:rPr>
+          <w:i/>
+        </w:rPr>
+      </w:r>
+      <w:r/>
+      <w:r/>
+      <w:r/>
+      <w:r>
+        <w:rPr>
+          <w:i/>
+        </w:rPr>
+      </w:r>
+      <w:r/>
+      <w:r/>
+      <w:r/>
+      <w:r>
+        <w:rPr>
+          <w:i/>
+        </w:rPr>
+      </w:r>
+      <w:r/>
+      <w:r/>
+      <w:r>
+        <w:rPr>
+          <w:i/>
+        </w:rPr>
+      </w:r>
+      <w:r>
+        <w:rPr/>
+      </w:r>
+      <w:r/>
+      <w:r>
+        <w:rPr>
+          <w:i/>
+        </w:rPr>
+      </w:r>
+      <w:r/>
+      <w:r/>
+      <w:r>
+        <w:rPr>
+          <w:i/>
+        </w:rPr>
+      </w:r>
+      <w:r>
+        <w:rPr/>
       </w:r>
     </w:p>
     <w:p>
@@ -3892,52 +4720,20 @@
         <w:rPr>
           <w:i/>
         </w:rPr>
-      </w:r>
-      <w:r/>
-      <w:proofErr w:type="spellStart"/>
-      <w:r>
-        <w:rPr>
-          <w:i/>
-          <w:iCs/>
-        </w:rPr>
-      </w:r>
-      <w:proofErr w:type="spellEnd"/>
-      <w:r/>
-      <w:proofErr w:type="spellStart"/>
-      <w:r>
-        <w:rPr>
-          <w:i/>
-          <w:iCs/>
-        </w:rPr>
-      </w:r>
-      <w:proofErr w:type="spellEnd"/>
-      <w:r/>
-      <w:r>
-        <w:rPr>
-          <w:i/>
-        </w:rPr>
-      </w:r>
-      <w:r/>
-      <w:r/>
-      <w:r>
-        <w:rPr>
-          <w:i/>
-        </w:rPr>
         <w:t>Garden Barbershop</w:t>
       </w:r>
-      <w:r/>
-      <w:r>
+      <w:r>
+        <w:rPr/>
         <w:t xml:space="preserve">, pendapatan dicatat berdasarkan </w:t>
       </w:r>
-      <w:r/>
       <w:r>
         <w:rPr>
           <w:i/>
         </w:rPr>
         <w:t>capster</w:t>
       </w:r>
-      <w:r/>
-      <w:r>
+      <w:r>
+        <w:rPr/>
         <w:t xml:space="preserve">, jenis layanan, jumlah </w:t>
       </w:r>
       <w:r>
@@ -3950,15 +4746,14 @@
         <w:rPr/>
         <w:t xml:space="preserve">, dan total pendapatan harian. Data pendapatan harian tersebut menjadi dasar untuk menghitung pendapatan kotor bulanan setiap </w:t>
       </w:r>
-      <w:r/>
       <w:r>
         <w:rPr>
           <w:i/>
         </w:rPr>
         <w:t>capster</w:t>
       </w:r>
-      <w:r/>
-      <w:r>
+      <w:r>
+        <w:rPr/>
         <w:t xml:space="preserve">. Berbeda dari penelitian aplikasi </w:t>
       </w:r>
       <w:r>
@@ -3969,7 +4764,87 @@
       </w:r>
       <w:r>
         <w:rPr/>
-        <w:t xml:space="preserve"> terdahulu yang lebih berfokus pada pemesanan dan antrean [1], [2], [3], [4], penelitian ini menempatkan pengelolaan pendapatan sebagai fokus utama sistem internal.</w:t>
+        <w:t xml:space="preserve"> terdahulu yang lebih banyak membahas pemesanan layanan [1], [2], informasi dan pemesanan jasa [3], serta antrean pelanggan [4], penelitian ini menempatkan pengelolaan pendapatan dan pembagian hasil </w:t>
+      </w:r>
+      <w:r>
+        <w:rPr>
+          <w:i/>
+        </w:rPr>
+        <w:t>capster</w:t>
+      </w:r>
+      <w:r>
+        <w:rPr/>
+        <w:t xml:space="preserve"> sebagai fokus utama sistem internal.</w:t>
+      </w:r>
+      <w:r>
+        <w:rPr>
+          <w:i/>
+        </w:rPr>
+      </w:r>
+      <w:r/>
+      <w:proofErr w:type="spellStart"/>
+      <w:r>
+        <w:rPr>
+          <w:i/>
+          <w:iCs/>
+        </w:rPr>
+      </w:r>
+      <w:proofErr w:type="spellEnd"/>
+      <w:r/>
+      <w:proofErr w:type="spellStart"/>
+      <w:r>
+        <w:rPr>
+          <w:i/>
+          <w:iCs/>
+        </w:rPr>
+      </w:r>
+      <w:proofErr w:type="spellEnd"/>
+      <w:r/>
+      <w:r>
+        <w:rPr>
+          <w:i/>
+        </w:rPr>
+      </w:r>
+      <w:r/>
+      <w:r/>
+      <w:r>
+        <w:rPr>
+          <w:i/>
+        </w:rPr>
+      </w:r>
+      <w:r/>
+      <w:r/>
+      <w:r/>
+      <w:r>
+        <w:rPr>
+          <w:i/>
+        </w:rPr>
+      </w:r>
+      <w:r/>
+      <w:r/>
+      <w:r>
+        <w:rPr>
+          <w:i/>
+        </w:rPr>
+      </w:r>
+      <w:r>
+        <w:rPr/>
+      </w:r>
+      <w:r/>
+      <w:r>
+        <w:rPr>
+          <w:i/>
+        </w:rPr>
+      </w:r>
+      <w:r/>
+      <w:r/>
+      <w:r>
+        <w:rPr>
+          <w:i/>
+        </w:rPr>
+      </w:r>
+      <w:r>
+        <w:rPr/>
       </w:r>
     </w:p>
     <w:p>
@@ -5181,52 +6056,10 @@
         </w:rPr>
         <w:t>Flutter</w:t>
       </w:r>
-      <w:r/>
-      <w:r>
-        <w:rPr>
-          <w:i/>
-        </w:rPr>
-      </w:r>
-      <w:r/>
-      <w:r>
-        <w:rPr>
-          <w:i/>
-        </w:rPr>
-      </w:r>
-      <w:r/>
-      <w:r>
-        <w:rPr>
-          <w:i/>
-        </w:rPr>
-      </w:r>
-      <w:r/>
-      <w:r>
-        <w:rPr>
-          <w:i/>
-        </w:rPr>
-      </w:r>
-      <w:r/>
-      <w:r>
-        <w:rPr>
-          <w:i/>
-        </w:rPr>
-      </w:r>
-      <w:r/>
-      <w:r>
-        <w:rPr>
-          <w:i/>
-        </w:rPr>
-      </w:r>
-      <w:r/>
-      <w:r/>
-      <w:r>
-        <w:rPr>
-          <w:i/>
-        </w:rPr>
-      </w:r>
-      <w:r/>
-      <w:r/>
-      <w:r>
+      <w:r>
+        <w:rPr>
+          <w:i/>
+        </w:rPr>
         <w:t xml:space="preserve"> merupakan </w:t>
       </w:r>
       <w:r>
@@ -5236,94 +6069,249 @@
         <w:t>framework</w:t>
       </w:r>
       <w:r>
+        <w:rPr>
+          <w:i/>
+        </w:rPr>
+        <w:t xml:space="preserve"> yang digunakan untuk membangun aplikasi </w:t>
+      </w:r>
+      <w:r>
+        <w:rPr>
+          <w:i/>
+        </w:rPr>
+        <w:t>mobile</w:t>
+      </w:r>
+      <w:r>
+        <w:rPr>
+          <w:i/>
+        </w:rPr>
+        <w:t xml:space="preserve"> dengan tampilan antarmuka yang konsisten dan responsif. Rujukan penelitian Refwahajan dan Waluyo menunjukkan bahwa </w:t>
+      </w:r>
+      <w:r>
+        <w:rPr>
+          <w:i/>
+        </w:rPr>
+        <w:t>Flutter</w:t>
+      </w:r>
+      <w:r>
+        <w:rPr>
+          <w:i/>
+        </w:rPr>
+        <w:t xml:space="preserve"> digunakan dalam pengembangan aplikasi </w:t>
+      </w:r>
+      <w:r>
+        <w:rPr>
+          <w:i/>
+        </w:rPr>
+        <w:t>barbershop</w:t>
+      </w:r>
+      <w:r>
+        <w:rPr>
+          <w:i/>
+        </w:rPr>
+        <w:t xml:space="preserve"> berbasis </w:t>
+      </w:r>
+      <w:r>
+        <w:rPr>
+          <w:i/>
+        </w:rPr>
+        <w:t>Android</w:t>
+      </w:r>
+      <w:r>
+        <w:rPr>
+          <w:i/>
+        </w:rPr>
+        <w:t xml:space="preserve"> bersama teknologi pendukung lain seperti </w:t>
+      </w:r>
+      <w:r>
+        <w:rPr>
+          <w:i/>
+        </w:rPr>
+        <w:t>PHP</w:t>
+      </w:r>
+      <w:r>
+        <w:rPr>
+          <w:i/>
+        </w:rPr>
+        <w:t xml:space="preserve">, </w:t>
+      </w:r>
+      <w:r>
+        <w:rPr>
+          <w:i/>
+        </w:rPr>
+        <w:t>Laravel</w:t>
+      </w:r>
+      <w:r>
+        <w:rPr>
+          <w:i/>
+        </w:rPr>
+        <w:t xml:space="preserve">, dan </w:t>
+      </w:r>
+      <w:r>
+        <w:rPr>
+          <w:i/>
+        </w:rPr>
+        <w:t>MySQL</w:t>
+      </w:r>
+      <w:r>
+        <w:rPr>
+          <w:i/>
+        </w:rPr>
+        <w:t xml:space="preserve"> [1]. Pada penelitian ini, </w:t>
+      </w:r>
+      <w:r>
+        <w:rPr>
+          <w:i/>
+        </w:rPr>
+        <w:t>Flutter</w:t>
+      </w:r>
+      <w:r>
+        <w:rPr>
+          <w:i/>
+        </w:rPr>
+        <w:t xml:space="preserve"> digunakan sebagai </w:t>
+      </w:r>
+      <w:r>
+        <w:rPr>
+          <w:i/>
+        </w:rPr>
+        <w:t>framework</w:t>
+      </w:r>
+      <w:r>
+        <w:rPr>
+          <w:i/>
+        </w:rPr>
+        <w:t xml:space="preserve"> utama dalam pengembangan aplikasi </w:t>
+      </w:r>
+      <w:r>
+        <w:rPr>
+          <w:i/>
+        </w:rPr>
+        <w:t>Garden Barbershop Finance</w:t>
+      </w:r>
+      <w:r>
+        <w:rPr>
+          <w:i/>
+        </w:rPr>
+        <w:t>.</w:t>
+      </w:r>
+      <w:r/>
+      <w:r>
+        <w:rPr>
+          <w:i/>
+        </w:rPr>
+      </w:r>
+      <w:r/>
+      <w:r>
+        <w:rPr>
+          <w:i/>
+        </w:rPr>
+      </w:r>
+      <w:r/>
+      <w:r>
+        <w:rPr>
+          <w:i/>
+        </w:rPr>
+      </w:r>
+      <w:r/>
+      <w:r>
+        <w:rPr>
+          <w:i/>
+        </w:rPr>
+      </w:r>
+      <w:r/>
+      <w:r>
+        <w:rPr>
+          <w:i/>
+        </w:rPr>
+      </w:r>
+      <w:r/>
+      <w:r>
+        <w:rPr>
+          <w:i/>
+        </w:rPr>
+      </w:r>
+      <w:r/>
+      <w:r/>
+      <w:r>
+        <w:rPr>
+          <w:i/>
+        </w:rPr>
+      </w:r>
+      <w:r/>
+      <w:r/>
+      <w:r/>
+      <w:r>
+        <w:rPr>
+          <w:i/>
+        </w:rPr>
+      </w:r>
+      <w:r>
         <w:rPr/>
-        <w:t xml:space="preserve"> yang digunakan untuk membangun aplikasi </w:t>
-      </w:r>
-      <w:r/>
-      <w:r>
-        <w:rPr>
-          <w:i/>
-        </w:rPr>
-        <w:t>mobile</w:t>
-      </w:r>
-      <w:r/>
-      <w:r>
-        <w:t xml:space="preserve"> dengan tampilan antarmuka yang konsisten dan responsif. Penelitian aplikasi </w:t>
-      </w:r>
-      <w:r>
-        <w:rPr>
-          <w:i/>
-        </w:rPr>
-        <w:t>barbershop</w:t>
+      </w:r>
+      <w:r/>
+      <w:r>
+        <w:rPr>
+          <w:i/>
+        </w:rPr>
+      </w:r>
+      <w:r/>
+      <w:r/>
+      <w:r>
+        <w:rPr>
+          <w:i/>
+        </w:rPr>
       </w:r>
       <w:r>
         <w:rPr/>
-        <w:t xml:space="preserve"> berbasis </w:t>
-      </w:r>
-      <w:r/>
-      <w:r>
-        <w:rPr>
-          <w:i/>
-        </w:rPr>
-        <w:t>Android</w:t>
-      </w:r>
-      <w:r/>
-      <w:r>
-        <w:t xml:space="preserve"> menunjukkan bahwa </w:t>
-      </w:r>
-      <w:r/>
-      <w:r>
-        <w:rPr>
-          <w:i/>
-        </w:rPr>
-        <w:t>Flutter</w:t>
-      </w:r>
-      <w:r/>
-      <w:r>
-        <w:t xml:space="preserve"> dapat digunakan dalam pengembangan aplikasi layanan </w:t>
-      </w:r>
-      <w:r>
-        <w:rPr>
-          <w:i/>
-        </w:rPr>
-        <w:t>barbershop</w:t>
+      </w:r>
+      <w:r/>
+      <w:r>
+        <w:rPr>
+          <w:i/>
+        </w:rPr>
+      </w:r>
+      <w:r/>
+      <w:r/>
+      <w:r/>
+      <w:r>
+        <w:rPr>
+          <w:i/>
+        </w:rPr>
+      </w:r>
+      <w:r/>
+      <w:r/>
+      <w:r>
+        <w:rPr>
+          <w:i/>
+        </w:rPr>
       </w:r>
       <w:r>
         <w:rPr/>
-        <w:t xml:space="preserve"> [1]. Pada penelitian ini, </w:t>
-      </w:r>
-      <w:r/>
-      <w:r>
-        <w:rPr>
-          <w:i/>
-        </w:rPr>
-        <w:t>Flutter</w:t>
-      </w:r>
-      <w:r/>
-      <w:r>
-        <w:t xml:space="preserve"> digunakan sebagai </w:t>
-      </w:r>
-      <w:r>
-        <w:rPr>
-          <w:i/>
-        </w:rPr>
-        <w:t>framework</w:t>
+      </w:r>
+      <w:r/>
+      <w:r>
+        <w:rPr>
+          <w:i/>
+        </w:rPr>
+      </w:r>
+      <w:r/>
+      <w:r/>
+      <w:r>
+        <w:rPr>
+          <w:i/>
+        </w:rPr>
       </w:r>
       <w:r>
         <w:rPr/>
-        <w:t xml:space="preserve"> utama dalam pengembangan aplikasi </w:t>
-      </w:r>
-      <w:r/>
-      <w:r>
-        <w:rPr>
-          <w:i/>
-        </w:rPr>
-        <w:t>Garden Barbershop Finance</w:t>
-      </w:r>
-      <w:r/>
-      <w:r>
-        <w:t>.</w:t>
-      </w:r>
+      </w:r>
+      <w:r/>
+      <w:r>
+        <w:rPr>
+          <w:i/>
+        </w:rPr>
+      </w:r>
+      <w:r/>
+      <w:r/>
     </w:p>
     <w:p>
       <w:pPr>
@@ -8856,7 +9844,37 @@
       </w:r>
       <w:r>
         <w:rPr/>
-        <w:t xml:space="preserve"> dapat diidentifikasi sejak awal berdasarkan observasi, wawancara, dan dokumentasi proses bisnis. Selain itu, penelitian aplikasi pemesanan </w:t>
+        <w:t xml:space="preserve"> dapat diidentifikasi sejak awal berdasarkan observasi, wawancara, dan dokumentasi proses bisnis. Kesesuaian </w:t>
+      </w:r>
+      <w:r>
+        <w:rPr>
+          <w:i/>
+        </w:rPr>
+        <w:t>Waterfall</w:t>
+      </w:r>
+      <w:r>
+        <w:rPr/>
+        <w:t xml:space="preserve"> dengan penelitian aplikasi </w:t>
+      </w:r>
+      <w:r>
+        <w:rPr>
+          <w:i/>
+        </w:rPr>
+        <w:t>barbershop</w:t>
+      </w:r>
+      <w:r>
+        <w:rPr/>
+        <w:t xml:space="preserve"> juga terlihat pada penelitian Rohmat dkk. yang menggunakan tahapan </w:t>
+      </w:r>
+      <w:r>
+        <w:rPr>
+          <w:i/>
+        </w:rPr>
+        <w:t>Waterfall</w:t>
+      </w:r>
+      <w:r>
+        <w:rPr/>
+        <w:t xml:space="preserve"> dalam pengembangan aplikasi pemesanan </w:t>
       </w:r>
       <w:r>
         <w:rPr>
@@ -8886,17 +9904,103 @@
       </w:r>
       <w:r>
         <w:rPr/>
-        <w:t xml:space="preserve"> juga menggunakan tahapan </w:t>
-      </w:r>
-      <w:r>
-        <w:rPr>
-          <w:i/>
-        </w:rPr>
-        <w:t>Waterfall</w:t>
+        <w:t xml:space="preserve"> [2].</w:t>
+      </w:r>
+      <w:r>
+        <w:rPr>
+          <w:i/>
+        </w:rPr>
       </w:r>
       <w:r>
         <w:rPr/>
-        <w:t xml:space="preserve"> sebagai acuan pengembangan sistem [2].</w:t>
+      </w:r>
+      <w:r>
+        <w:rPr>
+          <w:i/>
+        </w:rPr>
+      </w:r>
+      <w:r>
+        <w:rPr/>
+      </w:r>
+      <w:r>
+        <w:rPr>
+          <w:i/>
+        </w:rPr>
+      </w:r>
+      <w:r>
+        <w:rPr/>
+      </w:r>
+      <w:r>
+        <w:rPr>
+          <w:i/>
+        </w:rPr>
+      </w:r>
+      <w:r>
+        <w:rPr/>
+      </w:r>
+      <w:r>
+        <w:rPr>
+          <w:i/>
+        </w:rPr>
+      </w:r>
+      <w:r>
+        <w:rPr/>
+      </w:r>
+      <w:r>
+        <w:rPr>
+          <w:i/>
+        </w:rPr>
+      </w:r>
+      <w:r>
+        <w:rPr/>
+      </w:r>
+      <w:r>
+        <w:rPr>
+          <w:i/>
+        </w:rPr>
+      </w:r>
+      <w:r>
+        <w:rPr/>
+      </w:r>
+      <w:r>
+        <w:rPr>
+          <w:i/>
+        </w:rPr>
+      </w:r>
+      <w:r>
+        <w:rPr/>
+      </w:r>
+      <w:r>
+        <w:rPr>
+          <w:i/>
+        </w:rPr>
+      </w:r>
+      <w:r>
+        <w:rPr/>
+      </w:r>
+      <w:r>
+        <w:rPr>
+          <w:i/>
+        </w:rPr>
+      </w:r>
+      <w:r>
+        <w:rPr/>
+      </w:r>
+      <w:r>
+        <w:rPr>
+          <w:i/>
+        </w:rPr>
+      </w:r>
+      <w:r>
+        <w:rPr/>
+      </w:r>
+      <w:r>
+        <w:rPr>
+          <w:i/>
+        </w:rPr>
+      </w:r>
+      <w:r>
+        <w:rPr/>
       </w:r>
       <w:r>
         <w:rPr>
@@ -9368,6 +10472,72 @@
         </w:rPr>
         <w:t>Black Box Testing</w:t>
       </w:r>
+      <w:r>
+        <w:rPr>
+          <w:i/>
+        </w:rPr>
+        <w:t xml:space="preserve"> merupakan pengujian fungsional yang dilakukan berdasarkan input dan output tanpa melihat kode program. Pengujian ini berfokus pada kesesuaian fungsi sistem terhadap kebutuhan pengguna. Pada rujukan penelitian </w:t>
+      </w:r>
+      <w:r>
+        <w:rPr>
+          <w:i/>
+        </w:rPr>
+        <w:t>barbershop</w:t>
+      </w:r>
+      <w:r>
+        <w:rPr>
+          <w:i/>
+        </w:rPr>
+        <w:t xml:space="preserve">, Rohmat dkk. menerapkan </w:t>
+      </w:r>
+      <w:r>
+        <w:rPr>
+          <w:i/>
+        </w:rPr>
+        <w:t>Black Box Testing</w:t>
+      </w:r>
+      <w:r>
+        <w:rPr>
+          <w:i/>
+        </w:rPr>
+        <w:t xml:space="preserve"> untuk memastikan komponen aplikasi pemesanan </w:t>
+      </w:r>
+      <w:r>
+        <w:rPr>
+          <w:i/>
+        </w:rPr>
+        <w:t>online</w:t>
+      </w:r>
+      <w:r>
+        <w:rPr>
+          <w:i/>
+        </w:rPr>
+        <w:t xml:space="preserve"> </w:t>
+      </w:r>
+      <w:r>
+        <w:rPr>
+          <w:i/>
+        </w:rPr>
+        <w:t>barbershop</w:t>
+      </w:r>
+      <w:r>
+        <w:rPr>
+          <w:i/>
+        </w:rPr>
+        <w:t xml:space="preserve"> berjalan sesuai dengan hasil yang diharapkan [2]. Konsep pengujian </w:t>
+      </w:r>
+      <w:r>
+        <w:rPr>
+          <w:i/>
+        </w:rPr>
+        <w:t>Black Box Testing</w:t>
+      </w:r>
+      <w:r>
+        <w:rPr>
+          <w:i/>
+        </w:rPr>
+        <w:t xml:space="preserve"> dapat dilihat pada Gambar 2.2 berikut:</w:t>
+      </w:r>
       <w:r/>
       <w:r>
         <w:rPr>
@@ -9377,62 +10547,47 @@
       </w:r>
       <w:r/>
       <w:r/>
-      <w:r>
-        <w:t xml:space="preserve"> merupakan pengujian fungsional yang dilakukan berdasarkan input dan output tanpa melihat kode program. Pengujian ini berfokus pada kesesuaian fungsi sistem terhadap kebutuhan pengguna. Penelitian aplikasi pemesanan </w:t>
-      </w:r>
-      <w:r>
-        <w:rPr>
-          <w:i/>
-        </w:rPr>
-        <w:t>online</w:t>
+      <w:r/>
+      <w:r>
+        <w:rPr>
+          <w:i/>
+        </w:rPr>
       </w:r>
       <w:r>
         <w:rPr/>
-        <w:t xml:space="preserve"> </w:t>
-      </w:r>
-      <w:r>
-        <w:rPr>
-          <w:i/>
-        </w:rPr>
-        <w:t>barbershop</w:t>
+      </w:r>
+      <w:r>
+        <w:rPr>
+          <w:i/>
+        </w:rPr>
       </w:r>
       <w:r>
         <w:rPr/>
-        <w:t xml:space="preserve"> berbasis </w:t>
-      </w:r>
-      <w:r/>
-      <w:r>
-        <w:rPr>
-          <w:i/>
-        </w:rPr>
-        <w:t>Android</w:t>
-      </w:r>
-      <w:r/>
-      <w:r>
-        <w:t xml:space="preserve"> telah menerapkan pengujian </w:t>
-      </w:r>
-      <w:r/>
-      <w:r>
-        <w:rPr>
-          <w:i/>
-        </w:rPr>
-        <w:t>Black Box Testing</w:t>
-      </w:r>
-      <w:r/>
-      <w:r>
-        <w:t xml:space="preserve"> untuk memastikan komponen aplikasi berjalan sesuai harapan [2]. Konsep pengujian </w:t>
-      </w:r>
-      <w:r/>
-      <w:r>
-        <w:rPr>
-          <w:i/>
-        </w:rPr>
-        <w:t>Black Box Testing</w:t>
-      </w:r>
-      <w:r/>
-      <w:r>
-        <w:t xml:space="preserve"> dapat dilihat pada Gambar 2.2 berikut:</w:t>
-      </w:r>
+      </w:r>
+      <w:r/>
+      <w:r>
+        <w:rPr>
+          <w:i/>
+        </w:rPr>
+      </w:r>
+      <w:r/>
+      <w:r/>
+      <w:r/>
+      <w:r>
+        <w:rPr>
+          <w:i/>
+        </w:rPr>
+      </w:r>
+      <w:r/>
+      <w:r/>
+      <w:r/>
+      <w:r>
+        <w:rPr>
+          <w:i/>
+        </w:rPr>
+      </w:r>
+      <w:r/>
+      <w:r/>
     </w:p>
     <w:p>
       <w:r>
@@ -10632,7 +11787,57 @@
       </w:r>
       <w:r>
         <w:rPr/>
-        <w:t xml:space="preserve"> dipilih karena memiliki tahapan yang berurutan sehingga sesuai untuk penelitian yang kebutuhan sistemnya dapat dirumuskan sejak awal. Tahapan yang digunakan dalam penelitian ini meliputi analisis kebutuhan, perancangan sistem, implementasi, pengujian, dan pemeliharaan [5]. Penerapan metode tersebut disesuaikan dengan kebutuhan pengembangan aplikasi </w:t>
+        <w:t xml:space="preserve"> dipilih karena memiliki tahapan yang berurutan sehingga sesuai untuk penelitian yang kebutuhan sistemnya dapat dirumuskan sejak awal. Tahapan yang digunakan dalam penelitian ini meliputi analisis kebutuhan, perancangan sistem, implementasi, pengujian, dan pemeliharaan [5]. Penggunaan </w:t>
+      </w:r>
+      <w:r>
+        <w:rPr>
+          <w:i/>
+        </w:rPr>
+        <w:t>Waterfall</w:t>
+      </w:r>
+      <w:r>
+        <w:rPr/>
+        <w:t xml:space="preserve"> pada penelitian ini juga didukung oleh penelitian Rohmat dkk. yang menerapkan </w:t>
+      </w:r>
+      <w:r>
+        <w:rPr>
+          <w:i/>
+        </w:rPr>
+        <w:t>Waterfall</w:t>
+      </w:r>
+      <w:r>
+        <w:rPr/>
+        <w:t xml:space="preserve"> dalam pengembangan aplikasi pemesanan </w:t>
+      </w:r>
+      <w:r>
+        <w:rPr>
+          <w:i/>
+        </w:rPr>
+        <w:t>online</w:t>
+      </w:r>
+      <w:r>
+        <w:rPr/>
+        <w:t xml:space="preserve"> </w:t>
+      </w:r>
+      <w:r>
+        <w:rPr>
+          <w:i/>
+        </w:rPr>
+        <w:t>barbershop</w:t>
+      </w:r>
+      <w:r>
+        <w:rPr/>
+        <w:t xml:space="preserve"> berbasis </w:t>
+      </w:r>
+      <w:r>
+        <w:rPr>
+          <w:i/>
+        </w:rPr>
+        <w:t>Android</w:t>
+      </w:r>
+      <w:r>
+        <w:rPr/>
+        <w:t xml:space="preserve"> [2]. Penerapan metode tersebut disesuaikan dengan kebutuhan pengembangan aplikasi </w:t>
       </w:r>
       <w:r>
         <w:rPr>
@@ -10663,6 +11868,54 @@
       <w:r>
         <w:rPr/>
         <w:t>.</w:t>
+      </w:r>
+      <w:r>
+        <w:rPr>
+          <w:i/>
+        </w:rPr>
+      </w:r>
+      <w:r>
+        <w:rPr/>
+      </w:r>
+      <w:r>
+        <w:rPr>
+          <w:i/>
+        </w:rPr>
+      </w:r>
+      <w:r>
+        <w:rPr/>
+      </w:r>
+      <w:r>
+        <w:rPr>
+          <w:i/>
+        </w:rPr>
+      </w:r>
+      <w:r>
+        <w:rPr/>
+      </w:r>
+      <w:r>
+        <w:rPr>
+          <w:i/>
+        </w:rPr>
+      </w:r>
+      <w:r>
+        <w:rPr/>
+      </w:r>
+      <w:r>
+        <w:rPr>
+          <w:i/>
+        </w:rPr>
+      </w:r>
+      <w:r>
+        <w:rPr/>
+      </w:r>
+      <w:r>
+        <w:rPr>
+          <w:i/>
+        </w:rPr>
+      </w:r>
+      <w:r>
+        <w:rPr/>
       </w:r>
       <w:r>
         <w:rPr>

</xml_diff>

<commit_message>
rapikan format miring istilah asing
</commit_message>
<xml_diff>
--- a/docs/Proposal Skripsi v2.docx
+++ b/docs/Proposal Skripsi v2.docx
@@ -46,7 +46,6 @@
         <w:rPr>
           <w:b/>
           <w:bCs/>
-          <w:i/>
         </w:rPr>
         <w:t>ANDROID</w:t>
       </w:r>
@@ -61,8 +60,6 @@
         <w:rPr>
           <w:b/>
           <w:bCs/>
-          <w:i/>
-          <w:iCs/>
         </w:rPr>
         <w:t>CAPSTER</w:t>
       </w:r>
@@ -77,7 +74,6 @@
         <w:rPr>
           <w:b/>
           <w:bCs/>
-          <w:i/>
         </w:rPr>
         <w:t>GARDEN BARBERSHOP</w:t>
       </w:r>
@@ -92,8 +88,6 @@
         <w:rPr>
           <w:b/>
           <w:bCs/>
-          <w:i/>
-          <w:iCs/>
         </w:rPr>
         <w:t>FIREBASE</w:t>
       </w:r>
@@ -425,9 +419,7 @@
         <w:t xml:space="preserve">Perkembangan teknologi informasi yang semakin pesat telah memberikan pengaruh terhadap berbagai bidang usaha, termasuk usaha jasa potong rambut. Pemanfaatan teknologi informasi dapat membantu pelaku usaha dalam melakukan pencatatan transaksi, pengolahan data, dan penyusunan laporan secara lebih terstruktur. Pada konteks </w:t>
       </w:r>
       <w:r>
-        <w:rPr>
-          <w:i/>
-        </w:rPr>
+        <w:rPr/>
         <w:t>barbershop</w:t>
       </w:r>
       <w:r>
@@ -465,9 +457,7 @@
         <w:t xml:space="preserve"> </w:t>
       </w:r>
       <w:r>
-        <w:rPr>
-          <w:i/>
-        </w:rPr>
+        <w:rPr/>
         <w:t>barbershop</w:t>
       </w:r>
       <w:r>
@@ -485,9 +475,7 @@
         <w:t xml:space="preserve"> untuk membantu pelanggan mengatur jadwal serta mengurangi proses pendataan manual [2]. Selain itu, penelitian Bahtiar dkk. menunjukkan bahwa aplikasi </w:t>
       </w:r>
       <w:r>
-        <w:rPr>
-          <w:i/>
-        </w:rPr>
+        <w:rPr/>
         <w:t>barbershop</w:t>
       </w:r>
       <w:r>
@@ -495,9 +483,7 @@
         <w:t xml:space="preserve"> dapat membantu penyampaian informasi layanan dan pemesanan jasa [3], sedangkan penelitian Yurindra dkk. berfokus pada layanan antrean </w:t>
       </w:r>
       <w:r>
-        <w:rPr>
-          <w:i/>
-        </w:rPr>
+        <w:rPr/>
         <w:t>barbershop</w:t>
       </w:r>
       <w:r>
@@ -543,9 +529,7 @@
     </w:p>
     <w:p>
       <w:r>
-        <w:rPr>
-          <w:i/>
-        </w:rPr>
+        <w:rPr/>
         <w:t>Garden Barbershop</w:t>
       </w:r>
       <w:r/>
@@ -582,9 +566,7 @@
       </w:r>
       <w:r/>
       <w:r>
-        <w:rPr>
-          <w:i/>
-        </w:rPr>
+        <w:rPr/>
         <w:t>capster</w:t>
       </w:r>
       <w:r/>
@@ -593,9 +575,7 @@
       </w:r>
       <w:r/>
       <w:r>
-        <w:rPr>
-          <w:i/>
-        </w:rPr>
+        <w:rPr/>
         <w:t>capster</w:t>
       </w:r>
       <w:r/>
@@ -604,9 +584,7 @@
       </w:r>
       <w:r/>
       <w:r>
-        <w:rPr>
-          <w:i/>
-        </w:rPr>
+        <w:rPr/>
         <w:t>capster</w:t>
       </w:r>
       <w:r/>
@@ -635,9 +613,7 @@
       <w:r/>
       <w:r/>
       <w:r>
-        <w:rPr>
-          <w:i/>
-        </w:rPr>
+        <w:rPr/>
         <w:t>Garden Barbershop</w:t>
       </w:r>
       <w:r/>
@@ -656,9 +632,7 @@
       </w:r>
       <w:r/>
       <w:r>
-        <w:rPr>
-          <w:i/>
-        </w:rPr>
+        <w:rPr/>
         <w:t>capster</w:t>
       </w:r>
       <w:r/>
@@ -689,9 +663,7 @@
       <w:r/>
       <w:r/>
       <w:r>
-        <w:rPr>
-          <w:i/>
-        </w:rPr>
+        <w:rPr/>
         <w:t>Garden Barbershop</w:t>
       </w:r>
       <w:r/>
@@ -741,9 +713,7 @@
       <w:r/>
       <w:r/>
       <w:r>
-        <w:rPr>
-          <w:i/>
-        </w:rPr>
+        <w:rPr/>
         <w:t>Garden Barbershop</w:t>
       </w:r>
       <w:r/>
@@ -752,9 +722,7 @@
       </w:r>
       <w:r/>
       <w:r>
-        <w:rPr>
-          <w:i/>
-        </w:rPr>
+        <w:rPr/>
         <w:t>capster</w:t>
       </w:r>
       <w:r/>
@@ -763,9 +731,7 @@
       </w:r>
       <w:r/>
       <w:r>
-        <w:rPr>
-          <w:i/>
-        </w:rPr>
+        <w:rPr/>
         <w:t>capster</w:t>
       </w:r>
       <w:r/>
@@ -850,9 +816,7 @@
       </w:r>
       <w:r/>
       <w:r>
-        <w:rPr>
-          <w:i/>
-        </w:rPr>
+        <w:rPr/>
         <w:t>Garden Barbershop Finance</w:t>
       </w:r>
       <w:r/>
@@ -893,9 +857,7 @@
       </w:r>
       <w:r/>
       <w:r>
-        <w:rPr>
-          <w:i/>
-        </w:rPr>
+        <w:rPr/>
         <w:t>capster</w:t>
       </w:r>
       <w:r/>
@@ -904,9 +866,7 @@
       </w:r>
       <w:r/>
       <w:r>
-        <w:rPr>
-          <w:i/>
-        </w:rPr>
+        <w:rPr/>
         <w:t>capster</w:t>
       </w:r>
       <w:r/>
@@ -1080,9 +1040,7 @@
       </w:r>
       <w:r/>
       <w:r>
-        <w:rPr>
-          <w:i/>
-        </w:rPr>
+        <w:rPr/>
         <w:t>capster</w:t>
       </w:r>
       <w:r/>
@@ -1176,9 +1134,7 @@
         <w:t xml:space="preserve"> Pengelolaan Pendapatan dan Pembagian Hasil </w:t>
       </w:r>
       <w:r>
-        <w:rPr>
-          <w:i/>
-        </w:rPr>
+        <w:rPr/>
         <w:t>Capster</w:t>
       </w:r>
       <w:r>
@@ -1187,9 +1143,7 @@
       </w:r>
       <w:r/>
       <w:r>
-        <w:rPr>
-          <w:i/>
-        </w:rPr>
+        <w:rPr/>
         <w:t>Garden Barbershop</w:t>
       </w:r>
       <w:r/>
@@ -1209,9 +1163,7 @@
       </w:r>
       <w:r/>
       <w:r>
-        <w:rPr>
-          <w:i/>
-        </w:rPr>
+        <w:rPr/>
         <w:t>capster</w:t>
       </w:r>
       <w:r/>
@@ -1287,9 +1239,7 @@
       </w:r>
       <w:r/>
       <w:r>
-        <w:rPr>
-          <w:i/>
-        </w:rPr>
+        <w:rPr/>
         <w:t>capster</w:t>
       </w:r>
       <w:r/>
@@ -1298,9 +1248,7 @@
       </w:r>
       <w:r/>
       <w:r>
-        <w:rPr>
-          <w:i/>
-        </w:rPr>
+        <w:rPr/>
         <w:t>Garden Barbershop</w:t>
       </w:r>
       <w:r/>
@@ -1320,9 +1268,7 @@
       </w:r>
       <w:r/>
       <w:r>
-        <w:rPr>
-          <w:i/>
-        </w:rPr>
+        <w:rPr/>
         <w:t>capster</w:t>
       </w:r>
       <w:r/>
@@ -1382,9 +1328,7 @@
         <w:t xml:space="preserve"> digunakan oleh pengguna internal yang terdiri atas Admin/Pengelola, Admin Harian, </w:t>
       </w:r>
       <w:r>
-        <w:rPr>
-          <w:i/>
-        </w:rPr>
+        <w:rPr/>
         <w:t>Capster</w:t>
       </w:r>
       <w:r>
@@ -1415,9 +1359,7 @@
       <w:r/>
       <w:r/>
       <w:r>
-        <w:rPr>
-          <w:i/>
-        </w:rPr>
+        <w:rPr/>
         <w:t>capster</w:t>
       </w:r>
       <w:r/>
@@ -1436,10 +1378,7 @@
       </w:pPr>
       <w:proofErr w:type="spellStart"/>
       <w:r>
-        <w:rPr>
-          <w:i/>
-          <w:iCs/>
-        </w:rPr>
+        <w:rPr/>
         <w:t>Capster</w:t>
       </w:r>
       <w:proofErr w:type="spellEnd"/>
@@ -1649,9 +1588,7 @@
       </w:r>
       <w:r/>
       <w:r>
-        <w:rPr>
-          <w:i/>
-        </w:rPr>
+        <w:rPr/>
         <w:t>capster</w:t>
       </w:r>
       <w:r/>
@@ -1660,9 +1597,7 @@
       </w:r>
       <w:r/>
       <w:r>
-        <w:rPr>
-          <w:i/>
-        </w:rPr>
+        <w:rPr/>
         <w:t>Garden Barbershop</w:t>
       </w:r>
       <w:r/>
@@ -1693,9 +1628,7 @@
       </w:r>
       <w:r/>
       <w:r>
-        <w:rPr>
-          <w:i/>
-        </w:rPr>
+        <w:rPr/>
         <w:t>capster</w:t>
       </w:r>
       <w:r/>
@@ -1907,9 +1840,7 @@
       </w:r>
       <w:r/>
       <w:r>
-        <w:rPr>
-          <w:i/>
-        </w:rPr>
+        <w:rPr/>
         <w:t>Garden Barbershop</w:t>
       </w:r>
     </w:p>
@@ -1949,9 +1880,7 @@
       </w:r>
       <w:r/>
       <w:r>
-        <w:rPr>
-          <w:i/>
-        </w:rPr>
+        <w:rPr/>
         <w:t>capster</w:t>
       </w:r>
       <w:r/>
@@ -1995,9 +1924,7 @@
       <w:r/>
       <w:r/>
       <w:r>
-        <w:rPr>
-          <w:i/>
-        </w:rPr>
+        <w:rPr/>
         <w:t>capster</w:t>
       </w:r>
       <w:r/>
@@ -2028,9 +1955,7 @@
       <w:r/>
       <w:r/>
       <w:r>
-        <w:rPr>
-          <w:i/>
-        </w:rPr>
+        <w:rPr/>
         <w:t>capster</w:t>
       </w:r>
       <w:r/>
@@ -2317,9 +2242,7 @@
       <w:r/>
       <w:r/>
       <w:r>
-        <w:rPr>
-          <w:i/>
-        </w:rPr>
+        <w:rPr/>
         <w:t>role</w:t>
       </w:r>
       <w:r/>
@@ -2603,9 +2526,7 @@
               <w:t xml:space="preserve">Pengembangan Sistem Aplikasi </w:t>
             </w:r>
             <w:r>
-              <w:rPr>
-                <w:i/>
-              </w:rPr>
+              <w:rPr/>
               <w:t>Barbershop</w:t>
             </w:r>
             <w:r>
@@ -2623,9 +2544,7 @@
               <w:t xml:space="preserve"> untuk Meningkatkan Efisiensi dan Efektivitas Pelayanan di </w:t>
             </w:r>
             <w:r>
-              <w:rPr>
-                <w:i/>
-              </w:rPr>
+              <w:rPr/>
               <w:t>Barbershop</w:t>
             </w:r>
             <w:r>
@@ -2668,132 +2587,117 @@
               <w:ind w:left="0" w:firstLineChars="12" w:firstLine="29"/>
             </w:pPr>
             <w:r>
+              <w:rPr/>
+              <w:t xml:space="preserve">Pengembangan aplikasi </w:t>
+            </w:r>
+            <w:r>
+              <w:rPr>
+                <w:i/>
+              </w:rPr>
+              <w:t>Android</w:t>
+            </w:r>
+            <w:r>
+              <w:rPr/>
+              <w:t xml:space="preserve"> menggunakan </w:t>
+            </w:r>
+            <w:r>
+              <w:rPr>
+                <w:i/>
+              </w:rPr>
+              <w:t>Flutter</w:t>
+            </w:r>
+            <w:r>
+              <w:rPr/>
+              <w:t xml:space="preserve">, </w:t>
+            </w:r>
+            <w:r>
+              <w:rPr>
+                <w:i/>
+              </w:rPr>
+              <w:t>PHP</w:t>
+            </w:r>
+            <w:r>
+              <w:rPr/>
+              <w:t xml:space="preserve">, </w:t>
+            </w:r>
+            <w:r>
+              <w:rPr>
+                <w:i/>
+              </w:rPr>
+              <w:t>Laravel</w:t>
+            </w:r>
+            <w:r>
+              <w:rPr/>
+              <w:t xml:space="preserve">, dan </w:t>
+            </w:r>
+            <w:r>
+              <w:rPr>
+                <w:i/>
+              </w:rPr>
+              <w:t>MySQL</w:t>
+            </w:r>
+          </w:p>
+        </w:tc>
+        <w:tc>
+          <w:tcPr>
+            <w:tcW w:w="1569" w:type="dxa"/>
+          </w:tcPr>
+          <w:p>
+            <w:pPr>
+              <w:ind w:left="0" w:firstLine="0"/>
+            </w:pPr>
+            <w:r>
+              <w:t xml:space="preserve">Penelitian menghasilkan aplikasi </w:t>
+            </w:r>
+            <w:r>
+              <w:rPr/>
+              <w:t>barbershop</w:t>
+            </w:r>
+            <w:r>
+              <w:rPr/>
+              <w:t xml:space="preserve"> yang menyediakan fitur </w:t>
+            </w:r>
+            <w:r>
+              <w:rPr>
+                <w:i/>
+              </w:rPr>
+              <w:t>booking</w:t>
+            </w:r>
+            <w:r>
+              <w:rPr/>
+              <w:t xml:space="preserve"> layanan, pemilihan </w:t>
+            </w:r>
+            <w:r>
+              <w:rPr>
+                <w:i/>
+              </w:rPr>
+              <w:t>barberman</w:t>
+            </w:r>
+            <w:r>
+              <w:rPr/>
+              <w:t xml:space="preserve">, dan pemilihan waktu layanan sehingga pelayanan </w:t>
+            </w:r>
+            <w:r>
+              <w:rPr/>
+              <w:t>barbershop</w:t>
+            </w:r>
+            <w:r>
+              <w:rPr/>
+              <w:t xml:space="preserve"> menjadi lebih efektif dan efisien.</w:t>
+            </w:r>
+            <w:r>
+              <w:rPr>
+                <w:i/>
+              </w:rPr>
+            </w:r>
+            <w:r>
+              <w:rPr/>
+            </w:r>
+            <w:r>
               <w:rPr>
                 <w:i/>
                 <w:iCs/>
               </w:rPr>
-              <w:t xml:space="preserve">Pengembangan aplikasi </w:t>
-            </w:r>
-            <w:r>
-              <w:rPr>
-                <w:i/>
-              </w:rPr>
-              <w:t>Android</w:t>
-            </w:r>
-            <w:r>
-              <w:rPr>
-                <w:i/>
-              </w:rPr>
-              <w:t xml:space="preserve"> menggunakan </w:t>
-            </w:r>
-            <w:r>
-              <w:rPr>
-                <w:i/>
-              </w:rPr>
-              <w:t>Flutter</w:t>
-            </w:r>
-            <w:r>
-              <w:rPr>
-                <w:i/>
-              </w:rPr>
-              <w:t xml:space="preserve">, </w:t>
-            </w:r>
-            <w:r>
-              <w:rPr>
-                <w:i/>
-              </w:rPr>
-              <w:t>PHP</w:t>
-            </w:r>
-            <w:r>
-              <w:rPr>
-                <w:i/>
-              </w:rPr>
-              <w:t xml:space="preserve">, </w:t>
-            </w:r>
-            <w:r>
-              <w:rPr>
-                <w:i/>
-              </w:rPr>
-              <w:t>Laravel</w:t>
-            </w:r>
-            <w:r>
-              <w:rPr>
-                <w:i/>
-              </w:rPr>
-              <w:t xml:space="preserve">, dan </w:t>
-            </w:r>
-            <w:r>
-              <w:rPr>
-                <w:i/>
-              </w:rPr>
-              <w:t>MySQL</w:t>
-            </w:r>
-          </w:p>
-        </w:tc>
-        <w:tc>
-          <w:tcPr>
-            <w:tcW w:w="1569" w:type="dxa"/>
-          </w:tcPr>
-          <w:p>
-            <w:pPr>
-              <w:ind w:left="0" w:firstLine="0"/>
-            </w:pPr>
-            <w:r>
-              <w:t xml:space="preserve">Penelitian menghasilkan aplikasi </w:t>
-            </w:r>
-            <w:r>
-              <w:rPr>
-                <w:i/>
-              </w:rPr>
-              <w:t>barbershop</w:t>
-            </w:r>
-            <w:r>
-              <w:rPr/>
-              <w:t xml:space="preserve"> yang menyediakan fitur </w:t>
-            </w:r>
-            <w:r>
-              <w:rPr>
-                <w:i/>
-              </w:rPr>
-              <w:t>booking</w:t>
-            </w:r>
-            <w:r>
-              <w:rPr/>
-              <w:t xml:space="preserve"> layanan, pemilihan </w:t>
-            </w:r>
-            <w:r>
-              <w:rPr>
-                <w:i/>
-              </w:rPr>
-              <w:t>barberman</w:t>
-            </w:r>
-            <w:r>
-              <w:rPr/>
-              <w:t xml:space="preserve">, dan pemilihan waktu layanan sehingga pelayanan </w:t>
-            </w:r>
-            <w:r>
-              <w:rPr>
-                <w:i/>
-              </w:rPr>
-              <w:t>barbershop</w:t>
-            </w:r>
-            <w:r>
-              <w:rPr/>
-              <w:t xml:space="preserve"> menjadi lebih efektif dan efisien.</w:t>
-            </w:r>
-            <w:r>
-              <w:rPr>
-                <w:i/>
-              </w:rPr>
-            </w:r>
-            <w:r>
-              <w:rPr/>
-            </w:r>
-            <w:r>
-              <w:rPr>
-                <w:i/>
-                <w:iCs/>
-              </w:rPr>
             </w:r>
             <w:r/>
             <w:r>
@@ -2826,9 +2730,7 @@
               <w:t xml:space="preserve"> layanan pelanggan, sedangkan penelitian ini berfokus pada pengelolaan pendapatan harian </w:t>
             </w:r>
             <w:r>
-              <w:rPr>
-                <w:i/>
-              </w:rPr>
+              <w:rPr/>
               <w:t>capster</w:t>
             </w:r>
             <w:r>
@@ -2913,9 +2815,7 @@
               <w:t xml:space="preserve">Aplikasi Pemesanan Online </w:t>
             </w:r>
             <w:r>
-              <w:rPr>
-                <w:i/>
-              </w:rPr>
+              <w:rPr/>
               <w:t>Barbershop</w:t>
             </w:r>
             <w:r>
@@ -2974,21 +2874,17 @@
               <w:t>Waterfall</w:t>
             </w:r>
             <w:r>
+              <w:rPr/>
+              <w:t xml:space="preserve">, </w:t>
+            </w:r>
+            <w:r>
               <w:rPr>
                 <w:i/>
               </w:rPr>
-              <w:t xml:space="preserve">, </w:t>
-            </w:r>
-            <w:r>
-              <w:rPr>
-                <w:i/>
-              </w:rPr>
               <w:t>White Box Testing</w:t>
             </w:r>
             <w:r>
-              <w:rPr>
-                <w:i/>
-              </w:rPr>
+              <w:rPr/>
               <w:t xml:space="preserve">, dan </w:t>
             </w:r>
             <w:r>
@@ -3036,9 +2932,7 @@
               <w:t xml:space="preserve"> </w:t>
             </w:r>
             <w:r>
-              <w:rPr>
-                <w:i/>
-              </w:rPr>
+              <w:rPr/>
               <w:t>barbershop</w:t>
             </w:r>
             <w:r>
@@ -3056,9 +2950,7 @@
               <w:t xml:space="preserve"> yang membantu pelanggan mengatur jadwal layanan, mengurangi antrean, dan mengurangi pendataan manual oleh pihak </w:t>
             </w:r>
             <w:r>
-              <w:rPr>
-                <w:i/>
-              </w:rPr>
+              <w:rPr/>
               <w:t>barbershop</w:t>
             </w:r>
             <w:r>
@@ -3117,9 +3009,7 @@
               <w:t xml:space="preserve"> pelanggan, sedangkan penelitian ini menitikberatkan pada sistem internal untuk pencatatan pendapatan, pengendalian input oleh admin harian, dan laporan pembagian hasil </w:t>
             </w:r>
             <w:r>
-              <w:rPr>
-                <w:i/>
-              </w:rPr>
+              <w:rPr/>
               <w:t>capster</w:t>
             </w:r>
             <w:r>
@@ -3202,9 +3092,7 @@
               <w:t xml:space="preserve">Pengembangan Sistem Aplikasi </w:t>
             </w:r>
             <w:r>
-              <w:rPr>
-                <w:i/>
-              </w:rPr>
+              <w:rPr/>
               <w:t>Barbershop</w:t>
             </w:r>
             <w:r>
@@ -3222,9 +3110,7 @@
               <w:t xml:space="preserve"> Untuk Menumbuh Kembangkan Usaha </w:t>
             </w:r>
             <w:r>
-              <w:rPr>
-                <w:i/>
-              </w:rPr>
+              <w:rPr/>
               <w:t>Barbershop</w:t>
             </w:r>
             <w:r>
@@ -3258,112 +3144,90 @@
               <w:ind w:left="0" w:firstLineChars="12" w:firstLine="29"/>
             </w:pPr>
             <w:r>
+              <w:rPr/>
+              <w:t xml:space="preserve">Pengembangan aplikasi </w:t>
+            </w:r>
+            <w:r>
               <w:rPr>
                 <w:i/>
-                <w:iCs/>
-              </w:rPr>
-              <w:t xml:space="preserve">Pengembangan aplikasi </w:t>
+              </w:rPr>
+              <w:t>Android</w:t>
+            </w:r>
+          </w:p>
+        </w:tc>
+        <w:tc>
+          <w:tcPr>
+            <w:tcW w:w="1569" w:type="dxa"/>
+          </w:tcPr>
+          <w:p>
+            <w:pPr>
+              <w:ind w:left="0" w:firstLine="0"/>
+            </w:pPr>
+            <w:r>
+              <w:rPr/>
+              <w:t xml:space="preserve">Penelitian menghasilkan aplikasi </w:t>
+            </w:r>
+            <w:r>
+              <w:rPr/>
+              <w:t>barbershop</w:t>
+            </w:r>
+            <w:r>
+              <w:rPr/>
+              <w:t xml:space="preserve"> yang membantu pengguna mempe</w:t>
+            </w:r>
+            <w:r>
+              <w:rPr/>
+              <w:t>role</w:t>
+            </w:r>
+            <w:r>
+              <w:rPr/>
+              <w:t xml:space="preserve">h informasi, memilih layanan atau gaya rambut, menentukan lokasi </w:t>
+            </w:r>
+            <w:r>
+              <w:rPr/>
+              <w:t>barbershop</w:t>
+            </w:r>
+            <w:r>
+              <w:rPr/>
+              <w:t xml:space="preserve">, dan melakukan pemesanan jasa </w:t>
+            </w:r>
+            <w:r>
+              <w:rPr/>
+              <w:t>barbershop</w:t>
+            </w:r>
+            <w:r>
+              <w:rPr/>
+              <w:t>.</w:t>
             </w:r>
             <w:r>
               <w:rPr>
                 <w:i/>
               </w:rPr>
-              <w:t>Android</w:t>
-            </w:r>
-          </w:p>
-        </w:tc>
-        <w:tc>
-          <w:tcPr>
-            <w:tcW w:w="1569" w:type="dxa"/>
-          </w:tcPr>
-          <w:p>
-            <w:pPr>
-              <w:ind w:left="0" w:firstLine="0"/>
-            </w:pPr>
+            </w:r>
             <w:r>
               <w:rPr>
                 <w:i/>
-                <w:iCs/>
-              </w:rPr>
-              <w:t xml:space="preserve">Penelitian menghasilkan aplikasi </w:t>
+              </w:rPr>
             </w:r>
             <w:r>
               <w:rPr>
                 <w:i/>
               </w:rPr>
-              <w:t>barbershop</w:t>
             </w:r>
             <w:r>
               <w:rPr>
                 <w:i/>
               </w:rPr>
-              <w:t xml:space="preserve"> yang membantu pengguna mempe</w:t>
             </w:r>
             <w:r>
               <w:rPr>
                 <w:i/>
               </w:rPr>
-              <w:t>role</w:t>
             </w:r>
             <w:r>
               <w:rPr>
                 <w:i/>
               </w:rPr>
-              <w:t xml:space="preserve">h informasi, memilih layanan atau gaya rambut, menentukan lokasi </w:t>
-            </w:r>
-            <w:r>
-              <w:rPr>
-                <w:i/>
-              </w:rPr>
-              <w:t>barbershop</w:t>
-            </w:r>
-            <w:r>
-              <w:rPr>
-                <w:i/>
-              </w:rPr>
-              <w:t xml:space="preserve">, dan melakukan pemesanan jasa </w:t>
-            </w:r>
-            <w:r>
-              <w:rPr>
-                <w:i/>
-              </w:rPr>
-              <w:t>barbershop</w:t>
-            </w:r>
-            <w:r>
-              <w:rPr>
-                <w:i/>
-              </w:rPr>
-              <w:t>.</w:t>
-            </w:r>
-            <w:r>
-              <w:rPr>
-                <w:i/>
-              </w:rPr>
-            </w:r>
-            <w:r>
-              <w:rPr>
-                <w:i/>
-              </w:rPr>
-            </w:r>
-            <w:r>
-              <w:rPr>
-                <w:i/>
-              </w:rPr>
-            </w:r>
-            <w:r>
-              <w:rPr>
-                <w:i/>
-              </w:rPr>
-            </w:r>
-            <w:r>
-              <w:rPr>
-                <w:i/>
-              </w:rPr>
-            </w:r>
-            <w:r>
-              <w:rPr>
-                <w:i/>
-              </w:rPr>
             </w:r>
             <w:r/>
           </w:p>
@@ -3380,9 +3244,7 @@
               <w:t xml:space="preserve">Penelitian terdahulu berorientasi pada informasi dan pemesanan layanan, sedangkan penelitian ini mengembangkan aplikasi pengelolaan keuangan internal dengan perhitungan pendapatan bersih, bagian </w:t>
             </w:r>
             <w:r>
-              <w:rPr>
-                <w:i/>
-              </w:rPr>
+              <w:rPr/>
               <w:t>capster</w:t>
             </w:r>
             <w:r>
@@ -3478,9 +3340,7 @@
               <w:t xml:space="preserve"> pada </w:t>
             </w:r>
             <w:r>
-              <w:rPr>
-                <w:i/>
-              </w:rPr>
+              <w:rPr/>
               <w:t>Barbershop</w:t>
             </w:r>
             <w:r>
@@ -3526,10 +3386,7 @@
               <w:ind w:left="0" w:firstLineChars="12" w:firstLine="29"/>
             </w:pPr>
             <w:r>
-              <w:rPr>
-                <w:i/>
-                <w:iCs/>
-              </w:rPr>
+              <w:rPr/>
               <w:t>Client server dan model antrian Multi Channel - Single Phase</w:t>
             </w:r>
             <w:r>
@@ -3571,9 +3428,7 @@
               <w:t xml:space="preserve"> untuk membantu pelanggan melihat dan memesan antrean </w:t>
             </w:r>
             <w:r>
-              <w:rPr>
-                <w:i/>
-              </w:rPr>
+              <w:rPr/>
               <w:t>barbershop</w:t>
             </w:r>
             <w:r>
@@ -3628,9 +3483,7 @@
               <w:t xml:space="preserve">Penelitian terdahulu berfokus pada manajemen antrean pelanggan, sedangkan penelitian ini berfokus pada pencatatan pendapatan harian, buku kas umum, biaya operasional, </w:t>
             </w:r>
             <w:r>
-              <w:rPr>
-                <w:i/>
-              </w:rPr>
+              <w:rPr/>
               <w:t>role</w:t>
             </w:r>
             <w:r>
@@ -3638,9 +3491,7 @@
               <w:t xml:space="preserve"> pengguna, dan laporan pembagian hasil </w:t>
             </w:r>
             <w:r>
-              <w:rPr>
-                <w:i/>
-              </w:rPr>
+              <w:rPr/>
               <w:t>capster</w:t>
             </w:r>
             <w:r>
@@ -3688,9 +3539,7 @@
         <w:t xml:space="preserve">Berdasarkan rujukan penelitian yang telah disajikan, aplikasi </w:t>
       </w:r>
       <w:r>
-        <w:rPr>
-          <w:i/>
-        </w:rPr>
+        <w:rPr/>
         <w:t>barbershop</w:t>
       </w:r>
       <w:r>
@@ -3728,9 +3577,7 @@
         <w:t xml:space="preserve"> </w:t>
       </w:r>
       <w:r>
-        <w:rPr>
-          <w:i/>
-        </w:rPr>
+        <w:rPr/>
         <w:t>barbershop</w:t>
       </w:r>
       <w:r>
@@ -3758,9 +3605,7 @@
         <w:t xml:space="preserve"> [2]. Bahtiar dkk. membahas aplikasi </w:t>
       </w:r>
       <w:r>
-        <w:rPr>
-          <w:i/>
-        </w:rPr>
+        <w:rPr/>
         <w:t>barbershop</w:t>
       </w:r>
       <w:r>
@@ -3768,9 +3613,7 @@
         <w:t xml:space="preserve"> untuk membantu pengguna mempe</w:t>
       </w:r>
       <w:r>
-        <w:rPr>
-          <w:i/>
-        </w:rPr>
+        <w:rPr/>
         <w:t>role</w:t>
       </w:r>
       <w:r>
@@ -3778,9 +3621,7 @@
         <w:t xml:space="preserve">h informasi, memilih layanan, serta melakukan pemesanan jasa </w:t>
       </w:r>
       <w:r>
-        <w:rPr>
-          <w:i/>
-        </w:rPr>
+        <w:rPr/>
         <w:t>barbershop</w:t>
       </w:r>
       <w:r>
@@ -3808,9 +3649,7 @@
         <w:t xml:space="preserve"> untuk membantu pelanggan melihat dan memesan antrean </w:t>
       </w:r>
       <w:r>
-        <w:rPr>
-          <w:i/>
-        </w:rPr>
+        <w:rPr/>
         <w:t>barbershop</w:t>
       </w:r>
       <w:r>
@@ -3838,9 +3677,7 @@
         <w:t xml:space="preserve"> pelanggan atau antrean, melainkan pada pengelolaan internal </w:t>
       </w:r>
       <w:r>
-        <w:rPr>
-          <w:i/>
-        </w:rPr>
+        <w:rPr/>
         <w:t>Garden Barbershop</w:t>
       </w:r>
       <w:r>
@@ -3848,9 +3685,7 @@
         <w:t xml:space="preserve"> yang meliputi pencatatan pendapatan harian </w:t>
       </w:r>
       <w:r>
-        <w:rPr>
-          <w:i/>
-        </w:rPr>
+        <w:rPr/>
         <w:t>capster</w:t>
       </w:r>
       <w:r>
@@ -3858,9 +3693,7 @@
         <w:t xml:space="preserve">, buku kas umum, biaya operasional, pembagian hasil, </w:t>
       </w:r>
       <w:r>
-        <w:rPr>
-          <w:i/>
-        </w:rPr>
+        <w:rPr/>
         <w:t>role</w:t>
       </w:r>
       <w:r>
@@ -3868,9 +3701,7 @@
         <w:t xml:space="preserve"> pengguna, dan pembatasan akses agar </w:t>
       </w:r>
       <w:r>
-        <w:rPr>
-          <w:i/>
-        </w:rPr>
+        <w:rPr/>
         <w:t>capster</w:t>
       </w:r>
       <w:r>
@@ -4139,9 +3970,7 @@
       </w:r>
       <w:r/>
       <w:r>
-        <w:rPr>
-          <w:i/>
-        </w:rPr>
+        <w:rPr/>
         <w:t>capster</w:t>
       </w:r>
       <w:r/>
@@ -4210,9 +4039,7 @@
         <w:t xml:space="preserve">Rancang bangun merupakan proses merencanakan, merancang, membuat, dan menguji suatu sistem berdasarkan kebutuhan yang telah dianalisis. Pada penelitian aplikasi </w:t>
       </w:r>
       <w:r>
-        <w:rPr>
-          <w:i/>
-        </w:rPr>
+        <w:rPr/>
         <w:t>barbershop</w:t>
       </w:r>
       <w:r>
@@ -4240,9 +4067,7 @@
         <w:t xml:space="preserve"> [2], penyampaian informasi dan pemesanan jasa </w:t>
       </w:r>
       <w:r>
-        <w:rPr>
-          <w:i/>
-        </w:rPr>
+        <w:rPr/>
         <w:t>barbershop</w:t>
       </w:r>
       <w:r>
@@ -4260,9 +4085,7 @@
         <w:t xml:space="preserve"> [4]. Pada penelitian ini, rancang bangun dilakukan untuk menghasilkan aplikasi </w:t>
       </w:r>
       <w:r>
-        <w:rPr>
-          <w:i/>
-        </w:rPr>
+        <w:rPr/>
         <w:t>Garden Barbershop Finance</w:t>
       </w:r>
       <w:r>
@@ -4280,9 +4103,7 @@
         <w:t xml:space="preserve"> yang digunakan dalam pengelolaan pendapatan, buku kas umum, operasional, dan laporan pembagian hasil </w:t>
       </w:r>
       <w:r>
-        <w:rPr>
-          <w:i/>
-        </w:rPr>
+        <w:rPr/>
         <w:t>capster</w:t>
       </w:r>
       <w:r>
@@ -4381,9 +4202,7 @@
         <w:t xml:space="preserve">Sistem informasi merupakan kumpulan komponen yang saling berhubungan untuk mengumpulkan data, mengolah data, menyimpan data, dan menghasilkan informasi yang bermanfaat bagi proses bisnis. Dalam penelitian terdahulu pada bidang </w:t>
       </w:r>
       <w:r>
-        <w:rPr>
-          <w:i/>
-        </w:rPr>
+        <w:rPr/>
         <w:t>barbershop</w:t>
       </w:r>
       <w:r>
@@ -4411,9 +4230,7 @@
         <w:t xml:space="preserve"> [2], informasi layanan </w:t>
       </w:r>
       <w:r>
-        <w:rPr>
-          <w:i/>
-        </w:rPr>
+        <w:rPr/>
         <w:t>barbershop</w:t>
       </w:r>
       <w:r>
@@ -4431,9 +4248,7 @@
         <w:t xml:space="preserve"> [4]. Pada penelitian ini, sistem informasi digunakan untuk mengelola data pendapatan, buku kas umum, biaya operasional, akun pengguna, serta laporan pembagian hasil </w:t>
       </w:r>
       <w:r>
-        <w:rPr>
-          <w:i/>
-        </w:rPr>
+        <w:rPr/>
         <w:t>capster</w:t>
       </w:r>
       <w:r>
@@ -4559,9 +4374,7 @@
         <w:t xml:space="preserve"> digunakan untuk membantu pemesanan layanan </w:t>
       </w:r>
       <w:r>
-        <w:rPr>
-          <w:i/>
-        </w:rPr>
+        <w:rPr/>
         <w:t>barbershop</w:t>
       </w:r>
       <w:r>
@@ -4579,9 +4392,7 @@
         <w:t xml:space="preserve"> untuk mengurangi antrean dan pendataan manual [2], penyampaian informasi serta pemesanan jasa </w:t>
       </w:r>
       <w:r>
-        <w:rPr>
-          <w:i/>
-        </w:rPr>
+        <w:rPr/>
         <w:t>barbershop</w:t>
       </w:r>
       <w:r>
@@ -4717,9 +4528,7 @@
         <w:t xml:space="preserve">Pengelolaan pendapatan pada usaha jasa merupakan proses pencatatan penerimaan dari layanan yang diberikan kepada pelanggan. Pada </w:t>
       </w:r>
       <w:r>
-        <w:rPr>
-          <w:i/>
-        </w:rPr>
+        <w:rPr/>
         <w:t>Garden Barbershop</w:t>
       </w:r>
       <w:r>
@@ -4727,9 +4536,7 @@
         <w:t xml:space="preserve">, pendapatan dicatat berdasarkan </w:t>
       </w:r>
       <w:r>
-        <w:rPr>
-          <w:i/>
-        </w:rPr>
+        <w:rPr/>
         <w:t>capster</w:t>
       </w:r>
       <w:r>
@@ -4747,9 +4554,7 @@
         <w:t xml:space="preserve">, dan total pendapatan harian. Data pendapatan harian tersebut menjadi dasar untuk menghitung pendapatan kotor bulanan setiap </w:t>
       </w:r>
       <w:r>
-        <w:rPr>
-          <w:i/>
-        </w:rPr>
+        <w:rPr/>
         <w:t>capster</w:t>
       </w:r>
       <w:r>
@@ -4757,9 +4562,7 @@
         <w:t xml:space="preserve">. Berbeda dari penelitian aplikasi </w:t>
       </w:r>
       <w:r>
-        <w:rPr>
-          <w:i/>
-        </w:rPr>
+        <w:rPr/>
         <w:t>barbershop</w:t>
       </w:r>
       <w:r>
@@ -4767,9 +4570,7 @@
         <w:t xml:space="preserve"> terdahulu yang lebih banyak membahas pemesanan layanan [1], [2], informasi dan pemesanan jasa [3], serta antrean pelanggan [4], penelitian ini menempatkan pengelolaan pendapatan dan pembagian hasil </w:t>
       </w:r>
       <w:r>
-        <w:rPr>
-          <w:i/>
-        </w:rPr>
+        <w:rPr/>
         <w:t>capster</w:t>
       </w:r>
       <w:r>
@@ -4876,9 +4677,7 @@
       <w:r/>
       <w:r/>
       <w:r>
-        <w:rPr>
-          <w:i/>
-        </w:rPr>
+        <w:rPr/>
         <w:t>Garden Barbershop</w:t>
       </w:r>
       <w:r/>
@@ -4896,10 +4695,7 @@
       </w:r>
       <w:proofErr w:type="spellStart"/>
       <w:r>
-        <w:rPr>
-          <w:i/>
-          <w:iCs/>
-        </w:rPr>
+        <w:rPr/>
         <w:t>Capster</w:t>
       </w:r>
       <w:proofErr w:type="spellEnd"/>
@@ -4983,9 +4779,7 @@
       <w:r/>
       <w:r/>
       <w:r>
-        <w:rPr>
-          <w:i/>
-        </w:rPr>
+        <w:rPr/>
         <w:t>capster</w:t>
       </w:r>
       <w:r/>
@@ -4994,9 +4788,7 @@
       </w:r>
       <w:r/>
       <w:r>
-        <w:rPr>
-          <w:i/>
-        </w:rPr>
+        <w:rPr/>
         <w:t>capster</w:t>
       </w:r>
       <w:r/>
@@ -5005,9 +4797,7 @@
       </w:r>
       <w:r/>
       <w:r>
-        <w:rPr>
-          <w:i/>
-        </w:rPr>
+        <w:rPr/>
         <w:t>Garden Barbershop</w:t>
       </w:r>
       <w:r/>
@@ -5016,9 +4806,7 @@
       </w:r>
       <w:r/>
       <w:r>
-        <w:rPr>
-          <w:i/>
-        </w:rPr>
+        <w:rPr/>
         <w:t>capster</w:t>
       </w:r>
       <w:r/>
@@ -5027,9 +4815,7 @@
       </w:r>
       <w:r/>
       <w:r>
-        <w:rPr>
-          <w:i/>
-        </w:rPr>
+        <w:rPr/>
         <w:t>capster</w:t>
       </w:r>
       <w:r/>
@@ -5038,9 +4824,7 @@
       </w:r>
       <w:r/>
       <w:r>
-        <w:rPr>
-          <w:i/>
-        </w:rPr>
+        <w:rPr/>
         <w:t>capster</w:t>
       </w:r>
       <w:r/>
@@ -5049,9 +4833,7 @@
       </w:r>
       <w:r/>
       <w:r>
-        <w:rPr>
-          <w:i/>
-        </w:rPr>
+        <w:rPr/>
         <w:t>capster</w:t>
       </w:r>
       <w:r/>
@@ -5060,9 +4842,7 @@
       </w:r>
       <w:r/>
       <w:r>
-        <w:rPr>
-          <w:i/>
-        </w:rPr>
+        <w:rPr/>
         <w:t>capster</w:t>
       </w:r>
       <w:r/>
@@ -5080,10 +4860,7 @@
       </w:r>
       <w:proofErr w:type="spellStart"/>
       <w:r>
-        <w:rPr>
-          <w:i/>
-          <w:iCs/>
-        </w:rPr>
+        <w:rPr/>
         <w:t>Capster</w:t>
       </w:r>
       <w:proofErr w:type="spellEnd"/>
@@ -5092,10 +4869,7 @@
       </w:r>
       <w:proofErr w:type="spellStart"/>
       <w:r>
-        <w:rPr>
-          <w:i/>
-          <w:iCs/>
-        </w:rPr>
+        <w:rPr/>
         <w:t>Capster</w:t>
       </w:r>
       <w:proofErr w:type="spellEnd"/>
@@ -5113,10 +4887,7 @@
       </w:r>
       <w:proofErr w:type="spellStart"/>
       <w:r>
-        <w:rPr>
-          <w:i/>
-          <w:iCs/>
-        </w:rPr>
+        <w:rPr/>
         <w:t>Capster</w:t>
       </w:r>
       <w:proofErr w:type="spellEnd"/>
@@ -5125,10 +4896,7 @@
       </w:r>
       <w:proofErr w:type="spellStart"/>
       <w:r>
-        <w:rPr>
-          <w:i/>
-          <w:iCs/>
-        </w:rPr>
+        <w:rPr/>
         <w:t>Capster</w:t>
       </w:r>
       <w:proofErr w:type="spellEnd"/>
@@ -5137,10 +4905,7 @@
       </w:r>
       <w:proofErr w:type="spellStart"/>
       <w:r>
-        <w:rPr>
-          <w:i/>
-          <w:iCs/>
-        </w:rPr>
+        <w:rPr/>
         <w:t>Capster</w:t>
       </w:r>
       <w:proofErr w:type="spellEnd"/>
@@ -5155,10 +4920,7 @@
       </w:r>
       <w:proofErr w:type="spellStart"/>
       <w:r>
-        <w:rPr>
-          <w:i/>
-          <w:iCs/>
-        </w:rPr>
+        <w:rPr/>
         <w:t>Capster</w:t>
       </w:r>
       <w:proofErr w:type="spellEnd"/>
@@ -5167,10 +4929,7 @@
       </w:r>
       <w:proofErr w:type="spellStart"/>
       <w:r>
-        <w:rPr>
-          <w:i/>
-          <w:iCs/>
-        </w:rPr>
+        <w:rPr/>
         <w:t>Capster</w:t>
       </w:r>
       <w:proofErr w:type="spellEnd"/>
@@ -5188,10 +4947,7 @@
       </w:r>
       <w:proofErr w:type="spellStart"/>
       <w:r>
-        <w:rPr>
-          <w:i/>
-          <w:iCs/>
-        </w:rPr>
+        <w:rPr/>
         <w:t>Capster</w:t>
       </w:r>
       <w:proofErr w:type="spellEnd"/>
@@ -5218,9 +4974,7 @@
       <w:r/>
       <w:r/>
       <w:r>
-        <w:rPr>
-          <w:i/>
-        </w:rPr>
+        <w:rPr/>
         <w:t>capster</w:t>
       </w:r>
       <w:r/>
@@ -5269,9 +5023,7 @@
       <w:r/>
       <w:r/>
       <w:r>
-        <w:rPr>
-          <w:i/>
-        </w:rPr>
+        <w:rPr/>
         <w:t>capster</w:t>
       </w:r>
       <w:r/>
@@ -5279,9 +5031,7 @@
         <w:t xml:space="preserve"> senior yang dipercaya dapat membantu proses input pendapatan harian. </w:t>
       </w:r>
       <w:r>
-        <w:rPr>
-          <w:i/>
-        </w:rPr>
+        <w:rPr/>
         <w:t>Capster</w:t>
       </w:r>
       <w:r>
@@ -5406,9 +5156,7 @@
       </w:r>
       <w:r/>
       <w:r>
-        <w:rPr>
-          <w:i/>
-        </w:rPr>
+        <w:rPr/>
         <w:t>Garden Barbershop Finance</w:t>
       </w:r>
       <w:r/>
@@ -5531,9 +5279,7 @@
       </w:r>
       <w:r/>
       <w:r>
-        <w:rPr>
-          <w:i/>
-        </w:rPr>
+        <w:rPr/>
         <w:t>role</w:t>
       </w:r>
       <w:r/>
@@ -5541,9 +5287,7 @@
         <w:t xml:space="preserve"> Admin/Pengelola, Admin Harian, </w:t>
       </w:r>
       <w:r>
-        <w:rPr>
-          <w:i/>
-        </w:rPr>
+        <w:rPr/>
         <w:t>Capster</w:t>
       </w:r>
       <w:r>
@@ -5552,9 +5296,7 @@
       </w:r>
       <w:r/>
       <w:r>
-        <w:rPr>
-          <w:i/>
-        </w:rPr>
+        <w:rPr/>
         <w:t>role</w:t>
       </w:r>
       <w:r/>
@@ -5720,9 +5462,7 @@
         <w:t xml:space="preserve"> berbasis </w:t>
       </w:r>
       <w:r>
-        <w:rPr>
-          <w:i/>
-        </w:rPr>
+        <w:rPr/>
         <w:t>Cloud</w:t>
       </w:r>
       <w:r>
@@ -5763,9 +5503,7 @@
       </w:r>
       <w:r/>
       <w:r>
-        <w:rPr>
-          <w:i/>
-        </w:rPr>
+        <w:rPr/>
         <w:t>capster</w:t>
       </w:r>
       <w:r/>
@@ -5822,9 +5560,7 @@
         <w:t>NoSQL Database</w:t>
       </w:r>
       <w:r>
-        <w:rPr>
-          <w:i/>
-        </w:rPr>
+        <w:rPr/>
         <w:t xml:space="preserve"> merupakan model basis data yang tidak selalu menggunakan struktur tabel relasional. </w:t>
       </w:r>
       <w:r/>
@@ -5876,9 +5612,7 @@
       </w:r>
       <w:r/>
       <w:r>
-        <w:rPr>
-          <w:i/>
-        </w:rPr>
+        <w:rPr/>
         <w:t>Garden Barbershop</w:t>
       </w:r>
       <w:r/>
@@ -5887,9 +5621,7 @@
       </w:r>
       <w:r/>
       <w:r>
-        <w:rPr>
-          <w:i/>
-        </w:rPr>
+        <w:rPr/>
         <w:t>capster</w:t>
       </w:r>
       <w:r/>
@@ -6057,9 +5789,7 @@
         <w:t>Flutter</w:t>
       </w:r>
       <w:r>
-        <w:rPr>
-          <w:i/>
-        </w:rPr>
+        <w:rPr/>
         <w:t xml:space="preserve"> merupakan </w:t>
       </w:r>
       <w:r>
@@ -6069,9 +5799,7 @@
         <w:t>framework</w:t>
       </w:r>
       <w:r>
-        <w:rPr>
-          <w:i/>
-        </w:rPr>
+        <w:rPr/>
         <w:t xml:space="preserve"> yang digunakan untuk membangun aplikasi </w:t>
       </w:r>
       <w:r>
@@ -6081,9 +5809,7 @@
         <w:t>mobile</w:t>
       </w:r>
       <w:r>
-        <w:rPr>
-          <w:i/>
-        </w:rPr>
+        <w:rPr/>
         <w:t xml:space="preserve"> dengan tampilan antarmuka yang konsisten dan responsif. Rujukan penelitian Refwahajan dan Waluyo menunjukkan bahwa </w:t>
       </w:r>
       <w:r>
@@ -6093,21 +5819,15 @@
         <w:t>Flutter</w:t>
       </w:r>
       <w:r>
-        <w:rPr>
-          <w:i/>
-        </w:rPr>
+        <w:rPr/>
         <w:t xml:space="preserve"> digunakan dalam pengembangan aplikasi </w:t>
       </w:r>
       <w:r>
-        <w:rPr>
-          <w:i/>
-        </w:rPr>
+        <w:rPr/>
         <w:t>barbershop</w:t>
       </w:r>
       <w:r>
-        <w:rPr>
-          <w:i/>
-        </w:rPr>
+        <w:rPr/>
         <w:t xml:space="preserve"> berbasis </w:t>
       </w:r>
       <w:r>
@@ -6117,9 +5837,7 @@
         <w:t>Android</w:t>
       </w:r>
       <w:r>
-        <w:rPr>
-          <w:i/>
-        </w:rPr>
+        <w:rPr/>
         <w:t xml:space="preserve"> bersama teknologi pendukung lain seperti </w:t>
       </w:r>
       <w:r>
@@ -6129,9 +5847,7 @@
         <w:t>PHP</w:t>
       </w:r>
       <w:r>
-        <w:rPr>
-          <w:i/>
-        </w:rPr>
+        <w:rPr/>
         <w:t xml:space="preserve">, </w:t>
       </w:r>
       <w:r>
@@ -6141,9 +5857,7 @@
         <w:t>Laravel</w:t>
       </w:r>
       <w:r>
-        <w:rPr>
-          <w:i/>
-        </w:rPr>
+        <w:rPr/>
         <w:t xml:space="preserve">, dan </w:t>
       </w:r>
       <w:r>
@@ -6153,9 +5867,7 @@
         <w:t>MySQL</w:t>
       </w:r>
       <w:r>
-        <w:rPr>
-          <w:i/>
-        </w:rPr>
+        <w:rPr/>
         <w:t xml:space="preserve"> [1]. Pada penelitian ini, </w:t>
       </w:r>
       <w:r>
@@ -6165,9 +5877,7 @@
         <w:t>Flutter</w:t>
       </w:r>
       <w:r>
-        <w:rPr>
-          <w:i/>
-        </w:rPr>
+        <w:rPr/>
         <w:t xml:space="preserve"> digunakan sebagai </w:t>
       </w:r>
       <w:r>
@@ -6177,21 +5887,15 @@
         <w:t>framework</w:t>
       </w:r>
       <w:r>
-        <w:rPr>
-          <w:i/>
-        </w:rPr>
+        <w:rPr/>
         <w:t xml:space="preserve"> utama dalam pengembangan aplikasi </w:t>
       </w:r>
       <w:r>
-        <w:rPr>
-          <w:i/>
-        </w:rPr>
+        <w:rPr/>
         <w:t>Garden Barbershop Finance</w:t>
       </w:r>
       <w:r>
-        <w:rPr>
-          <w:i/>
-        </w:rPr>
+        <w:rPr/>
         <w:t>.</w:t>
       </w:r>
       <w:r/>
@@ -6435,9 +6139,7 @@
         <w:t>SharedPreferences</w:t>
       </w:r>
       <w:r>
-        <w:rPr>
-          <w:i/>
-        </w:rPr>
+        <w:rPr/>
         <w:t xml:space="preserve"> merupakan penyimpanan lokal sederhana yang digunakan untuk menyimpan data ringan pada aplikasi </w:t>
       </w:r>
       <w:r/>
@@ -6502,9 +6204,7 @@
         <w:t>Figma</w:t>
       </w:r>
       <w:r>
-        <w:rPr>
-          <w:i/>
-        </w:rPr>
+        <w:rPr/>
         <w:t xml:space="preserve"> merupakan perangkat lunak yang digunakan untuk membuat rancangan antarmuka aplikasi. Dengan </w:t>
       </w:r>
       <w:r>
@@ -6514,9 +6214,7 @@
         <w:t>Figma</w:t>
       </w:r>
       <w:r>
-        <w:rPr>
-          <w:i/>
-        </w:rPr>
+        <w:rPr/>
         <w:t xml:space="preserve">, perancangan </w:t>
       </w:r>
       <w:r/>
@@ -6571,9 +6269,7 @@
         <w:t>Visual Studio Code</w:t>
       </w:r>
       <w:r>
-        <w:rPr>
-          <w:i/>
-        </w:rPr>
+        <w:rPr/>
         <w:t xml:space="preserve"> merupakan perangkat lunak editor kode yang dapat digunakan untuk menulis, mengelola, dan menjalankan kode program. Dalam penelitian ini, </w:t>
       </w:r>
       <w:r>
@@ -6583,9 +6279,7 @@
         <w:t>Visual Studio Code</w:t>
       </w:r>
       <w:r>
-        <w:rPr>
-          <w:i/>
-        </w:rPr>
+        <w:rPr/>
         <w:t xml:space="preserve"> digunakan sebagai alat bantu pengembangan aplikasi </w:t>
       </w:r>
       <w:r/>
@@ -6640,21 +6334,15 @@
         <w:t>Browser</w:t>
       </w:r>
       <w:r>
-        <w:rPr>
-          <w:i/>
-        </w:rPr>
+        <w:rPr/>
         <w:t xml:space="preserve"> merupakan perangkat lunak yang digunakan untuk mengakses layanan berbasis internet. Pada penelitian ini, </w:t>
       </w:r>
       <w:r>
-        <w:rPr>
-          <w:i/>
-        </w:rPr>
+        <w:rPr/>
         <w:t>browser</w:t>
       </w:r>
       <w:r>
-        <w:rPr>
-          <w:i/>
-        </w:rPr>
+        <w:rPr/>
         <w:t xml:space="preserve"> digunakan untuk mengakses </w:t>
       </w:r>
       <w:r/>
@@ -6823,9 +6511,7 @@
         <w:t>Use Case</w:t>
       </w:r>
       <w:r>
-        <w:rPr>
-          <w:i/>
-        </w:rPr>
+        <w:rPr/>
         <w:t xml:space="preserve"> Diagram</w:t>
       </w:r>
     </w:p>
@@ -6842,9 +6528,7 @@
         <w:t>Use Case</w:t>
       </w:r>
       <w:r>
-        <w:rPr>
-          <w:i/>
-        </w:rPr>
+        <w:rPr/>
         <w:t xml:space="preserve"> Diagram</w:t>
       </w:r>
       <w:r>
@@ -6858,9 +6542,7 @@
         <w:t>Use Case</w:t>
       </w:r>
       <w:r>
-        <w:rPr>
-          <w:i/>
-        </w:rPr>
+        <w:rPr/>
         <w:t xml:space="preserve"> Diagram</w:t>
       </w:r>
       <w:r>
@@ -7148,10 +6830,7 @@
               <w:t xml:space="preserve">Elemen </w:t>
             </w:r>
             <w:r>
-              <w:rPr>
-                <w:i/>
-                <w:iCs/>
-              </w:rPr>
+              <w:rPr/>
               <w:t xml:space="preserve">boundary </w:t>
             </w:r>
             <w:r>
@@ -7325,10 +7004,7 @@
               <w:t>Use Case</w:t>
             </w:r>
             <w:r>
-              <w:rPr>
-                <w:i/>
-                <w:iCs/>
-              </w:rPr>
+              <w:rPr/>
               <w:t>.</w:t>
             </w:r>
           </w:p>
@@ -9102,10 +8778,7 @@
               </w:rPr>
             </w:pPr>
             <w:r>
-              <w:rPr>
-                <w:i/>
-                <w:iCs/>
-              </w:rPr>
+              <w:rPr/>
               <w:t>Generalisasi</w:t>
             </w:r>
           </w:p>
@@ -9837,9 +9510,7 @@
         <w:t xml:space="preserve"> meliputi analisis kebutuhan, perancangan sistem, implementasi, pengujian, serta pemeliharaan atau pengoperasian sistem [5]. Metode ini dipilih karena kebutuhan aplikasi </w:t>
       </w:r>
       <w:r>
-        <w:rPr>
-          <w:i/>
-        </w:rPr>
+        <w:rPr/>
         <w:t>Garden Barbershop Finance</w:t>
       </w:r>
       <w:r>
@@ -9857,9 +9528,7 @@
         <w:t xml:space="preserve"> dengan penelitian aplikasi </w:t>
       </w:r>
       <w:r>
-        <w:rPr>
-          <w:i/>
-        </w:rPr>
+        <w:rPr/>
         <w:t>barbershop</w:t>
       </w:r>
       <w:r>
@@ -9887,9 +9556,7 @@
         <w:t xml:space="preserve"> </w:t>
       </w:r>
       <w:r>
-        <w:rPr>
-          <w:i/>
-        </w:rPr>
+        <w:rPr/>
         <w:t>barbershop</w:t>
       </w:r>
       <w:r>
@@ -10207,9 +9874,7 @@
       <w:r/>
       <w:r/>
       <w:r>
-        <w:rPr>
-          <w:i/>
-        </w:rPr>
+        <w:rPr/>
         <w:t>capster</w:t>
       </w:r>
       <w:r/>
@@ -10218,9 +9883,7 @@
       </w:r>
       <w:r/>
       <w:r>
-        <w:rPr>
-          <w:i/>
-        </w:rPr>
+        <w:rPr/>
         <w:t>Garden Barbershop</w:t>
       </w:r>
       <w:r/>
@@ -10415,9 +10078,7 @@
       <w:r/>
       <w:r/>
       <w:r>
-        <w:rPr>
-          <w:i/>
-        </w:rPr>
+        <w:rPr/>
         <w:t>Garden Barbershop</w:t>
       </w:r>
       <w:r/>
@@ -10473,21 +10134,15 @@
         <w:t>Black Box Testing</w:t>
       </w:r>
       <w:r>
-        <w:rPr>
-          <w:i/>
-        </w:rPr>
+        <w:rPr/>
         <w:t xml:space="preserve"> merupakan pengujian fungsional yang dilakukan berdasarkan input dan output tanpa melihat kode program. Pengujian ini berfokus pada kesesuaian fungsi sistem terhadap kebutuhan pengguna. Pada rujukan penelitian </w:t>
       </w:r>
       <w:r>
-        <w:rPr>
-          <w:i/>
-        </w:rPr>
+        <w:rPr/>
         <w:t>barbershop</w:t>
       </w:r>
       <w:r>
-        <w:rPr>
-          <w:i/>
-        </w:rPr>
+        <w:rPr/>
         <w:t xml:space="preserve">, Rohmat dkk. menerapkan </w:t>
       </w:r>
       <w:r>
@@ -10497,9 +10152,7 @@
         <w:t>Black Box Testing</w:t>
       </w:r>
       <w:r>
-        <w:rPr>
-          <w:i/>
-        </w:rPr>
+        <w:rPr/>
         <w:t xml:space="preserve"> untuk memastikan komponen aplikasi pemesanan </w:t>
       </w:r>
       <w:r>
@@ -10515,15 +10168,11 @@
         <w:t xml:space="preserve"> </w:t>
       </w:r>
       <w:r>
-        <w:rPr>
-          <w:i/>
-        </w:rPr>
+        <w:rPr/>
         <w:t>barbershop</w:t>
       </w:r>
       <w:r>
-        <w:rPr>
-          <w:i/>
-        </w:rPr>
+        <w:rPr/>
         <w:t xml:space="preserve"> berjalan sesuai dengan hasil yang diharapkan [2]. Konsep pengujian </w:t>
       </w:r>
       <w:r>
@@ -10533,9 +10182,7 @@
         <w:t>Black Box Testing</w:t>
       </w:r>
       <w:r>
-        <w:rPr>
-          <w:i/>
-        </w:rPr>
+        <w:rPr/>
         <w:t xml:space="preserve"> dapat dilihat pada Gambar 2.2 berikut:</w:t>
       </w:r>
       <w:r/>
@@ -10698,9 +10345,7 @@
       </w:r>
       <w:r/>
       <w:r>
-        <w:rPr>
-          <w:i/>
-        </w:rPr>
+        <w:rPr/>
         <w:t>capster</w:t>
       </w:r>
       <w:r/>
@@ -10708,9 +10353,7 @@
         <w:t xml:space="preserve">, kelola layanan, input pendapatan harian oleh Admin/Pengelola atau Admin Harian, pembatasan akses input bagi </w:t>
       </w:r>
       <w:r>
-        <w:rPr>
-          <w:i/>
-        </w:rPr>
+        <w:rPr/>
         <w:t>Capster</w:t>
       </w:r>
       <w:r>
@@ -10719,9 +10362,7 @@
       </w:r>
       <w:r/>
       <w:r>
-        <w:rPr>
-          <w:i/>
-        </w:rPr>
+        <w:rPr/>
         <w:t>role</w:t>
       </w:r>
       <w:r/>
@@ -10794,9 +10435,7 @@
       <w:r/>
       <w:r/>
       <w:r>
-        <w:rPr>
-          <w:i/>
-        </w:rPr>
+        <w:rPr/>
         <w:t>capster</w:t>
       </w:r>
       <w:r/>
@@ -10805,9 +10444,7 @@
       </w:r>
       <w:r/>
       <w:r>
-        <w:rPr>
-          <w:i/>
-        </w:rPr>
+        <w:rPr/>
         <w:t>Garden Barbershop</w:t>
       </w:r>
       <w:r/>
@@ -10870,9 +10507,7 @@
       <w:r/>
       <w:r/>
       <w:r>
-        <w:rPr>
-          <w:i/>
-        </w:rPr>
+        <w:rPr/>
         <w:t>Garden Barbershop Finance</w:t>
       </w:r>
       <w:r/>
@@ -10914,9 +10549,7 @@
       </w:r>
       <w:r/>
       <w:r>
-        <w:rPr>
-          <w:i/>
-        </w:rPr>
+        <w:rPr/>
         <w:t>role</w:t>
       </w:r>
       <w:r/>
@@ -10925,9 +10558,7 @@
       </w:r>
       <w:r/>
       <w:r>
-        <w:rPr>
-          <w:i/>
-        </w:rPr>
+        <w:rPr/>
         <w:t>capster</w:t>
       </w:r>
       <w:r/>
@@ -10935,9 +10566,7 @@
         <w:t xml:space="preserve"> senior dapat membantu input pendapatan, </w:t>
       </w:r>
       <w:r>
-        <w:rPr>
-          <w:i/>
-        </w:rPr>
+        <w:rPr/>
         <w:t>Capster</w:t>
       </w:r>
       <w:r>
@@ -11100,7 +10729,6 @@
         <w:rPr>
           <w:rFonts w:ascii="Times New Roman" w:hAnsi="Times New Roman"/>
           <w:b w:val="0"/>
-          <w:i/>
           <w:sz w:val="24"/>
         </w:rPr>
         <w:t>Garden Barbershop</w:t>
@@ -11117,7 +10745,6 @@
         <w:rPr>
           <w:rFonts w:ascii="Times New Roman" w:hAnsi="Times New Roman"/>
           <w:b w:val="0"/>
-          <w:i/>
           <w:sz w:val="24"/>
         </w:rPr>
         <w:t>capster</w:t>
@@ -11134,7 +10761,6 @@
         <w:rPr>
           <w:rFonts w:ascii="Times New Roman" w:hAnsi="Times New Roman"/>
           <w:b w:val="0"/>
-          <w:i/>
           <w:sz w:val="24"/>
         </w:rPr>
         <w:t>capster</w:t>
@@ -11211,7 +10837,6 @@
         <w:rPr>
           <w:rFonts w:ascii="Times New Roman" w:hAnsi="Times New Roman"/>
           <w:b w:val="0"/>
-          <w:i/>
           <w:sz w:val="24"/>
         </w:rPr>
         <w:t>Garden Barbershop</w:t>
@@ -11228,7 +10853,6 @@
         <w:rPr>
           <w:rFonts w:ascii="Times New Roman" w:hAnsi="Times New Roman"/>
           <w:b w:val="0"/>
-          <w:i/>
           <w:sz w:val="24"/>
         </w:rPr>
         <w:t>role</w:t>
@@ -11245,7 +10869,6 @@
         <w:rPr>
           <w:rFonts w:ascii="Times New Roman" w:hAnsi="Times New Roman"/>
           <w:b w:val="0"/>
-          <w:i/>
           <w:sz w:val="24"/>
         </w:rPr>
         <w:t>capster</w:t>
@@ -11292,7 +10915,6 @@
         <w:rPr>
           <w:rFonts w:ascii="Times New Roman" w:hAnsi="Times New Roman"/>
           <w:b w:val="0"/>
-          <w:i/>
           <w:sz w:val="24"/>
         </w:rPr>
         <w:t>Garden Barbershop</w:t>
@@ -11454,7 +11076,6 @@
         <w:rPr>
           <w:rFonts w:ascii="Times New Roman" w:hAnsi="Times New Roman"/>
           <w:b w:val="0"/>
-          <w:i/>
           <w:sz w:val="24"/>
         </w:rPr>
         <w:t>Garden Barbershop</w:t>
@@ -11471,7 +11092,6 @@
         <w:rPr>
           <w:rFonts w:ascii="Times New Roman" w:hAnsi="Times New Roman"/>
           <w:b w:val="0"/>
-          <w:i/>
           <w:sz w:val="24"/>
         </w:rPr>
         <w:t>capster</w:t>
@@ -11518,7 +11138,6 @@
         <w:rPr>
           <w:rFonts w:ascii="Times New Roman" w:hAnsi="Times New Roman"/>
           <w:b w:val="0"/>
-          <w:i/>
           <w:sz w:val="24"/>
         </w:rPr>
         <w:t>capster</w:t>
@@ -11535,7 +11154,6 @@
         <w:rPr>
           <w:rFonts w:ascii="Times New Roman" w:hAnsi="Times New Roman"/>
           <w:b w:val="0"/>
-          <w:i/>
           <w:sz w:val="24"/>
         </w:rPr>
         <w:t>capster</w:t>
@@ -11552,7 +11170,6 @@
         <w:rPr>
           <w:rFonts w:ascii="Times New Roman" w:hAnsi="Times New Roman"/>
           <w:b w:val="0"/>
-          <w:i/>
           <w:sz w:val="24"/>
         </w:rPr>
         <w:t>Garden Barbershop</w:t>
@@ -11799,7 +11416,6 @@
         <w:rPr>
           <w:rFonts w:ascii="Times New Roman" w:hAnsi="Times New Roman"/>
           <w:b w:val="0"/>
-          <w:i/>
           <w:sz w:val="24"/>
         </w:rPr>
         <w:t>capster</w:t>
@@ -11970,7 +11586,6 @@
         <w:rPr>
           <w:rFonts w:ascii="Times New Roman" w:hAnsi="Times New Roman"/>
           <w:b w:val="0"/>
-          <w:i/>
           <w:sz w:val="24"/>
         </w:rPr>
         <w:t>Garden Barbershop</w:t>
@@ -12017,7 +11632,6 @@
         <w:rPr>
           <w:rFonts w:ascii="Times New Roman" w:hAnsi="Times New Roman"/>
           <w:b w:val="0"/>
-          <w:i/>
           <w:sz w:val="24"/>
         </w:rPr>
         <w:t>capster</w:t>
@@ -12064,7 +11678,6 @@
         <w:rPr>
           <w:rFonts w:ascii="Times New Roman" w:hAnsi="Times New Roman"/>
           <w:b w:val="0"/>
-          <w:i/>
           <w:sz w:val="24"/>
         </w:rPr>
         <w:t>role</w:t>
@@ -12109,7 +11722,6 @@
         <w:rPr>
           <w:rFonts w:ascii="Times New Roman" w:hAnsi="Times New Roman"/>
           <w:b w:val="0"/>
-          <w:i/>
           <w:sz w:val="24"/>
         </w:rPr>
         <w:t>Garden Barbershop Finance</w:t>
@@ -12220,7 +11832,6 @@
         <w:rPr>
           <w:rFonts w:ascii="Times New Roman" w:hAnsi="Times New Roman"/>
           <w:b w:val="0"/>
-          <w:i/>
           <w:sz w:val="24"/>
         </w:rPr>
         <w:t>Garden Barbershop Finance</w:t>
@@ -12285,7 +11896,6 @@
         <w:rPr>
           <w:rFonts w:ascii="Times New Roman" w:hAnsi="Times New Roman"/>
           <w:b w:val="0"/>
-          <w:i/>
           <w:sz w:val="24"/>
         </w:rPr>
         <w:t xml:space="preserve"> yang digunakan dalam merancang dan membangun aplikasi </w:t>
@@ -12294,7 +11904,6 @@
         <w:rPr>
           <w:rFonts w:ascii="Times New Roman" w:hAnsi="Times New Roman"/>
           <w:b w:val="0"/>
-          <w:i/>
           <w:sz w:val="24"/>
         </w:rPr>
         <w:t>Garden Barbershop Finance</w:t>
@@ -12303,7 +11912,6 @@
         <w:rPr>
           <w:rFonts w:ascii="Times New Roman" w:hAnsi="Times New Roman"/>
           <w:b w:val="0"/>
-          <w:i/>
           <w:sz w:val="24"/>
         </w:rPr>
         <w:t xml:space="preserve"> meliputi:</w:t>
@@ -12592,7 +12200,6 @@
         <w:rPr>
           <w:rFonts w:ascii="Times New Roman" w:hAnsi="Times New Roman"/>
           <w:b w:val="0"/>
-          <w:i/>
           <w:sz w:val="24"/>
         </w:rPr>
         <w:t>capster</w:t>
@@ -12626,7 +12233,6 @@
         <w:rPr>
           <w:rFonts w:ascii="Times New Roman" w:hAnsi="Times New Roman"/>
           <w:b w:val="0"/>
-          <w:i/>
           <w:sz w:val="24"/>
         </w:rPr>
         <w:t>Garden Barbershop</w:t>
@@ -12699,7 +12305,6 @@
         <w:rPr>
           <w:rFonts w:ascii="Times New Roman" w:hAnsi="Times New Roman"/>
           <w:b w:val="0"/>
-          <w:i/>
           <w:sz w:val="24"/>
         </w:rPr>
         <w:t>role</w:t>
@@ -12716,7 +12321,6 @@
         <w:rPr>
           <w:rFonts w:ascii="Times New Roman" w:hAnsi="Times New Roman"/>
           <w:b w:val="0"/>
-          <w:i/>
           <w:sz w:val="24"/>
         </w:rPr>
         <w:t>Garden Barbershop</w:t>
@@ -16239,7 +15843,6 @@
         <w:rPr>
           <w:rFonts w:ascii="Times New Roman" w:hAnsi="Times New Roman"/>
           <w:b w:val="0"/>
-          <w:i/>
           <w:sz w:val="24"/>
         </w:rPr>
         <w:t>Garden Barbershop Finance</w:t>

</xml_diff>

<commit_message>
tambahkan prompt figma rancangan antarmuka
</commit_message>
<xml_diff>
--- a/docs/Proposal Skripsi v2.docx
+++ b/docs/Proposal Skripsi v2.docx
@@ -15858,41 +15858,22 @@
     </w:p>
     <w:p>
       <w:pPr>
-        <w:jc w:val="center"/>
-      </w:pPr>
-      <w:r>
-        <w:drawing>
-          <wp:inline xmlns:a="http://schemas.openxmlformats.org/drawingml/2006/main" xmlns:pic="http://schemas.openxmlformats.org/drawingml/2006/picture">
-            <wp:extent cx="2743200" cy="4114800"/>
-            <wp:docPr id="1069574678" name="Picture 1069574678"/>
-            <wp:cNvGraphicFramePr>
-              <a:graphicFrameLocks noChangeAspect="1"/>
-            </wp:cNvGraphicFramePr>
-            <a:graphic>
-              <a:graphicData uri="http://schemas.openxmlformats.org/drawingml/2006/picture">
-                <pic:pic>
-                  <pic:nvPicPr>
-                    <pic:cNvPr id="0" name="gambar_3_3_login.png"/>
-                    <pic:cNvPicPr/>
-                  </pic:nvPicPr>
-                  <pic:blipFill>
-                    <a:blip r:embed="rId41"/>
-                    <a:stretch>
-                      <a:fillRect/>
-                    </a:stretch>
-                  </pic:blipFill>
-                  <pic:spPr>
-                    <a:xfrm>
-                      <a:off x="0" y="0"/>
-                      <a:ext cx="2743200" cy="4114800"/>
-                    </a:xfrm>
-                    <a:prstGeom prst="rect"/>
-                  </pic:spPr>
-                </pic:pic>
-              </a:graphicData>
-            </a:graphic>
-          </wp:inline>
-        </w:drawing>
+        <w:jc w:val="both"/>
+      </w:pPr>
+      <w:r>
+        <w:rPr>
+          <w:rFonts w:ascii="Times New Roman" w:hAnsi="Times New Roman"/>
+          <w:color w:val="FF0000"/>
+          <w:sz w:val="24"/>
+        </w:rPr>
+      </w:r>
+      <w:r>
+        <w:rPr>
+          <w:rFonts w:ascii="Times New Roman" w:hAnsi="Times New Roman"/>
+          <w:color w:val="FF0000"/>
+          <w:sz w:val="24"/>
+        </w:rPr>
+        <w:t>Prompt Figma: Buat rancangan halaman login aplikasi mobile Garden Barbershop Finance dengan gaya profesional, compact, dan mudah digunakan. Gunakan frame Android 360 x 800 px, warna utama hijau tua dengan aksen emas, latar belakang terang, ikon gunting atau barbershop secara sederhana, field Username, field Password, tombol Masuk, serta tampilan bersih tanpa teks penjelasan berlebihan.</w:t>
       </w:r>
     </w:p>
     <w:p>
@@ -15911,41 +15892,22 @@
     </w:p>
     <w:p>
       <w:pPr>
-        <w:jc w:val="center"/>
-      </w:pPr>
-      <w:r>
-        <w:drawing>
-          <wp:inline xmlns:a="http://schemas.openxmlformats.org/drawingml/2006/main" xmlns:pic="http://schemas.openxmlformats.org/drawingml/2006/picture">
-            <wp:extent cx="2743200" cy="4114800"/>
-            <wp:docPr id="1069574679" name="Picture 1069574679"/>
-            <wp:cNvGraphicFramePr>
-              <a:graphicFrameLocks noChangeAspect="1"/>
-            </wp:cNvGraphicFramePr>
-            <a:graphic>
-              <a:graphicData uri="http://schemas.openxmlformats.org/drawingml/2006/picture">
-                <pic:pic>
-                  <pic:nvPicPr>
-                    <pic:cNvPr id="0" name="gambar_3_4_dashboard.png"/>
-                    <pic:cNvPicPr/>
-                  </pic:nvPicPr>
-                  <pic:blipFill>
-                    <a:blip r:embed="rId42"/>
-                    <a:stretch>
-                      <a:fillRect/>
-                    </a:stretch>
-                  </pic:blipFill>
-                  <pic:spPr>
-                    <a:xfrm>
-                      <a:off x="0" y="0"/>
-                      <a:ext cx="2743200" cy="4114800"/>
-                    </a:xfrm>
-                    <a:prstGeom prst="rect"/>
-                  </pic:spPr>
-                </pic:pic>
-              </a:graphicData>
-            </a:graphic>
-          </wp:inline>
-        </w:drawing>
+        <w:jc w:val="both"/>
+      </w:pPr>
+      <w:r>
+        <w:rPr>
+          <w:rFonts w:ascii="Times New Roman" w:hAnsi="Times New Roman"/>
+          <w:color w:val="FF0000"/>
+          <w:sz w:val="24"/>
+        </w:rPr>
+      </w:r>
+      <w:r>
+        <w:rPr>
+          <w:rFonts w:ascii="Times New Roman" w:hAnsi="Times New Roman"/>
+          <w:color w:val="FF0000"/>
+          <w:sz w:val="24"/>
+        </w:rPr>
+        <w:t>Prompt Figma: Buat rancangan dashboard admin aplikasi Garden Barbershop Finance pada frame Android 360 x 800 px. Tampilkan ringkasan Total Pendapatan Bulan Ini, Total Operasional, Jumlah Capster Aktif, Bagian Capster, dan Bagian Pondok dalam kartu metrik yang compact. Tambahkan menu utama Data Capster, Data Layanan, Pendapatan Harian, Buku Kas Umum, Operasional, Laporan, dan Sinkronisasi dengan ikon yang jelas.</w:t>
       </w:r>
     </w:p>
     <w:p>
@@ -15964,41 +15926,22 @@
     </w:p>
     <w:p>
       <w:pPr>
-        <w:jc w:val="center"/>
-      </w:pPr>
-      <w:r>
-        <w:drawing>
-          <wp:inline xmlns:a="http://schemas.openxmlformats.org/drawingml/2006/main" xmlns:pic="http://schemas.openxmlformats.org/drawingml/2006/picture">
-            <wp:extent cx="2743200" cy="4114800"/>
-            <wp:docPr id="1069574680" name="Picture 1069574680"/>
-            <wp:cNvGraphicFramePr>
-              <a:graphicFrameLocks noChangeAspect="1"/>
-            </wp:cNvGraphicFramePr>
-            <a:graphic>
-              <a:graphicData uri="http://schemas.openxmlformats.org/drawingml/2006/picture">
-                <pic:pic>
-                  <pic:nvPicPr>
-                    <pic:cNvPr id="0" name="gambar_3_5_pendapatan.png"/>
-                    <pic:cNvPicPr/>
-                  </pic:nvPicPr>
-                  <pic:blipFill>
-                    <a:blip r:embed="rId43"/>
-                    <a:stretch>
-                      <a:fillRect/>
-                    </a:stretch>
-                  </pic:blipFill>
-                  <pic:spPr>
-                    <a:xfrm>
-                      <a:off x="0" y="0"/>
-                      <a:ext cx="2743200" cy="4114800"/>
-                    </a:xfrm>
-                    <a:prstGeom prst="rect"/>
-                  </pic:spPr>
-                </pic:pic>
-              </a:graphicData>
-            </a:graphic>
-          </wp:inline>
-        </w:drawing>
+        <w:jc w:val="both"/>
+      </w:pPr>
+      <w:r>
+        <w:rPr>
+          <w:rFonts w:ascii="Times New Roman" w:hAnsi="Times New Roman"/>
+          <w:color w:val="FF0000"/>
+          <w:sz w:val="24"/>
+        </w:rPr>
+      </w:r>
+      <w:r>
+        <w:rPr>
+          <w:rFonts w:ascii="Times New Roman" w:hAnsi="Times New Roman"/>
+          <w:color w:val="FF0000"/>
+          <w:sz w:val="24"/>
+        </w:rPr>
+        <w:t>Prompt Figma: Buat rancangan halaman input pendapatan harian untuk admin atau capster senior. Gunakan layout mobile yang rapi dan mudah diisi, terdapat pilihan tanggal, pilihan nama capster, daftar layanan dengan nama lengkap seperti Santri, Reguler Haircut, Premium Cut, Garden Cut, Cukur Jenggot/Kumis, Keramas, Coloring Hair, Home Service, Perming, dan Kartu Member. Tambahkan ringkasan otomatis total customer santri, customer umum, total customer, total pendapatan, dan tombol Simpan.</w:t>
       </w:r>
     </w:p>
     <w:p>
@@ -16017,41 +15960,22 @@
     </w:p>
     <w:p>
       <w:pPr>
-        <w:jc w:val="center"/>
-      </w:pPr>
-      <w:r>
-        <w:drawing>
-          <wp:inline xmlns:a="http://schemas.openxmlformats.org/drawingml/2006/main" xmlns:pic="http://schemas.openxmlformats.org/drawingml/2006/picture">
-            <wp:extent cx="2743200" cy="4114800"/>
-            <wp:docPr id="1069574681" name="Picture 1069574681"/>
-            <wp:cNvGraphicFramePr>
-              <a:graphicFrameLocks noChangeAspect="1"/>
-            </wp:cNvGraphicFramePr>
-            <a:graphic>
-              <a:graphicData uri="http://schemas.openxmlformats.org/drawingml/2006/picture">
-                <pic:pic>
-                  <pic:nvPicPr>
-                    <pic:cNvPr id="0" name="gambar_3_6_buku_kas.png"/>
-                    <pic:cNvPicPr/>
-                  </pic:nvPicPr>
-                  <pic:blipFill>
-                    <a:blip r:embed="rId44"/>
-                    <a:stretch>
-                      <a:fillRect/>
-                    </a:stretch>
-                  </pic:blipFill>
-                  <pic:spPr>
-                    <a:xfrm>
-                      <a:off x="0" y="0"/>
-                      <a:ext cx="2743200" cy="4114800"/>
-                    </a:xfrm>
-                    <a:prstGeom prst="rect"/>
-                  </pic:spPr>
-                </pic:pic>
-              </a:graphicData>
-            </a:graphic>
-          </wp:inline>
-        </w:drawing>
+        <w:jc w:val="both"/>
+      </w:pPr>
+      <w:r>
+        <w:rPr>
+          <w:rFonts w:ascii="Times New Roman" w:hAnsi="Times New Roman"/>
+          <w:color w:val="FF0000"/>
+          <w:sz w:val="24"/>
+        </w:rPr>
+      </w:r>
+      <w:r>
+        <w:rPr>
+          <w:rFonts w:ascii="Times New Roman" w:hAnsi="Times New Roman"/>
+          <w:color w:val="FF0000"/>
+          <w:sz w:val="24"/>
+        </w:rPr>
+        <w:t>Prompt Figma: Buat rancangan halaman Buku Kas Umum aplikasi Garden Barbershop Finance dengan gaya modern dan compact. Tampilkan form tanggal, uraian, pilihan akun, penerimaan, pengeluaran, saldo otomatis, keterangan, dan tombol Simpan. Sertakan daftar riwayat transaksi kas dalam kartu kecil dengan pembeda warna untuk penerimaan dan pengeluaran.</w:t>
       </w:r>
     </w:p>
     <w:p>
@@ -16070,41 +15994,22 @@
     </w:p>
     <w:p>
       <w:pPr>
-        <w:jc w:val="center"/>
-      </w:pPr>
-      <w:r>
-        <w:drawing>
-          <wp:inline xmlns:a="http://schemas.openxmlformats.org/drawingml/2006/main" xmlns:pic="http://schemas.openxmlformats.org/drawingml/2006/picture">
-            <wp:extent cx="2743200" cy="4114800"/>
-            <wp:docPr id="1069574682" name="Picture 1069574682"/>
-            <wp:cNvGraphicFramePr>
-              <a:graphicFrameLocks noChangeAspect="1"/>
-            </wp:cNvGraphicFramePr>
-            <a:graphic>
-              <a:graphicData uri="http://schemas.openxmlformats.org/drawingml/2006/picture">
-                <pic:pic>
-                  <pic:nvPicPr>
-                    <pic:cNvPr id="0" name="gambar_3_7_operasional.png"/>
-                    <pic:cNvPicPr/>
-                  </pic:nvPicPr>
-                  <pic:blipFill>
-                    <a:blip r:embed="rId45"/>
-                    <a:stretch>
-                      <a:fillRect/>
-                    </a:stretch>
-                  </pic:blipFill>
-                  <pic:spPr>
-                    <a:xfrm>
-                      <a:off x="0" y="0"/>
-                      <a:ext cx="2743200" cy="4114800"/>
-                    </a:xfrm>
-                    <a:prstGeom prst="rect"/>
-                  </pic:spPr>
-                </pic:pic>
-              </a:graphicData>
-            </a:graphic>
-          </wp:inline>
-        </w:drawing>
+        <w:jc w:val="both"/>
+      </w:pPr>
+      <w:r>
+        <w:rPr>
+          <w:rFonts w:ascii="Times New Roman" w:hAnsi="Times New Roman"/>
+          <w:color w:val="FF0000"/>
+          <w:sz w:val="24"/>
+        </w:rPr>
+      </w:r>
+      <w:r>
+        <w:rPr>
+          <w:rFonts w:ascii="Times New Roman" w:hAnsi="Times New Roman"/>
+          <w:color w:val="FF0000"/>
+          <w:sz w:val="24"/>
+        </w:rPr>
+        <w:t>Prompt Figma: Buat rancangan halaman input biaya operasional bulanan pada frame Android 360 x 800 px. Tampilkan pilihan bulan, nama biaya, pilihan akun seperti Listrik, Wifi, Kebersihan, Air, Sewa Toko, dan Harga Pokok Penjualan, field nominal rupiah, keterangan, total operasional bulan terpilih, tombol Simpan, serta daftar biaya yang sudah dicatat.</w:t>
       </w:r>
     </w:p>
     <w:p>
@@ -16123,41 +16028,22 @@
     </w:p>
     <w:p>
       <w:pPr>
-        <w:jc w:val="center"/>
-      </w:pPr>
-      <w:r>
-        <w:drawing>
-          <wp:inline xmlns:a="http://schemas.openxmlformats.org/drawingml/2006/main" xmlns:pic="http://schemas.openxmlformats.org/drawingml/2006/picture">
-            <wp:extent cx="2743200" cy="4114800"/>
-            <wp:docPr id="1069574683" name="Picture 1069574683"/>
-            <wp:cNvGraphicFramePr>
-              <a:graphicFrameLocks noChangeAspect="1"/>
-            </wp:cNvGraphicFramePr>
-            <a:graphic>
-              <a:graphicData uri="http://schemas.openxmlformats.org/drawingml/2006/picture">
-                <pic:pic>
-                  <pic:nvPicPr>
-                    <pic:cNvPr id="0" name="gambar_3_8_laporan.png"/>
-                    <pic:cNvPicPr/>
-                  </pic:nvPicPr>
-                  <pic:blipFill>
-                    <a:blip r:embed="rId46"/>
-                    <a:stretch>
-                      <a:fillRect/>
-                    </a:stretch>
-                  </pic:blipFill>
-                  <pic:spPr>
-                    <a:xfrm>
-                      <a:off x="0" y="0"/>
-                      <a:ext cx="2743200" cy="4114800"/>
-                    </a:xfrm>
-                    <a:prstGeom prst="rect"/>
-                  </pic:spPr>
-                </pic:pic>
-              </a:graphicData>
-            </a:graphic>
-          </wp:inline>
-        </w:drawing>
+        <w:jc w:val="both"/>
+      </w:pPr>
+      <w:r>
+        <w:rPr>
+          <w:rFonts w:ascii="Times New Roman" w:hAnsi="Times New Roman"/>
+          <w:color w:val="FF0000"/>
+          <w:sz w:val="24"/>
+        </w:rPr>
+      </w:r>
+      <w:r>
+        <w:rPr>
+          <w:rFonts w:ascii="Times New Roman" w:hAnsi="Times New Roman"/>
+          <w:color w:val="FF0000"/>
+          <w:sz w:val="24"/>
+        </w:rPr>
+        <w:t>Prompt Figma: Buat rancangan halaman laporan pembagian hasil capster dengan tampilan mobile profesional. Tampilkan filter bulan, tombol Hitung Laporan, tombol Simpan Laporan, tabel atau daftar laporan berisi Nama Capster, Pendapatan Kotor, Operasional per Capster, Pendapatan Bersih, Bagian Capster, dan Bagian Pondok. Tambahkan kartu ringkasan Total Pendapatan, Total Bagian Capster, dan Total Bagian Pondok.</w:t>
       </w:r>
     </w:p>
     <w:p>
@@ -16176,41 +16062,22 @@
     </w:p>
     <w:p>
       <w:pPr>
-        <w:jc w:val="center"/>
-      </w:pPr>
-      <w:r>
-        <w:drawing>
-          <wp:inline xmlns:a="http://schemas.openxmlformats.org/drawingml/2006/main" xmlns:pic="http://schemas.openxmlformats.org/drawingml/2006/picture">
-            <wp:extent cx="2743200" cy="4114800"/>
-            <wp:docPr id="1069574684" name="Picture 1069574684"/>
-            <wp:cNvGraphicFramePr>
-              <a:graphicFrameLocks noChangeAspect="1"/>
-            </wp:cNvGraphicFramePr>
-            <a:graphic>
-              <a:graphicData uri="http://schemas.openxmlformats.org/drawingml/2006/picture">
-                <pic:pic>
-                  <pic:nvPicPr>
-                    <pic:cNvPr id="0" name="gambar_3_9_akun.png"/>
-                    <pic:cNvPicPr/>
-                  </pic:nvPicPr>
-                  <pic:blipFill>
-                    <a:blip r:embed="rId47"/>
-                    <a:stretch>
-                      <a:fillRect/>
-                    </a:stretch>
-                  </pic:blipFill>
-                  <pic:spPr>
-                    <a:xfrm>
-                      <a:off x="0" y="0"/>
-                      <a:ext cx="2743200" cy="4114800"/>
-                    </a:xfrm>
-                    <a:prstGeom prst="rect"/>
-                  </pic:spPr>
-                </pic:pic>
-              </a:graphicData>
-            </a:graphic>
-          </wp:inline>
-        </w:drawing>
+        <w:jc w:val="both"/>
+      </w:pPr>
+      <w:r>
+        <w:rPr>
+          <w:rFonts w:ascii="Times New Roman" w:hAnsi="Times New Roman"/>
+          <w:color w:val="FF0000"/>
+          <w:sz w:val="24"/>
+        </w:rPr>
+      </w:r>
+      <w:r>
+        <w:rPr>
+          <w:rFonts w:ascii="Times New Roman" w:hAnsi="Times New Roman"/>
+          <w:color w:val="FF0000"/>
+          <w:sz w:val="24"/>
+        </w:rPr>
+        <w:t>Prompt Figma: Buat rancangan halaman kelola akun pengguna untuk admin. Tampilkan daftar akun dengan informasi nama, username, role admin, capster, capster senior, atau pemilik, status aktif, dan tombol aksi ubah password atau nonaktifkan akun. Tambahkan tombol tambah akun dan form ringkas untuk membuat akun baru yang dapat dikaitkan dengan data capster.</w:t>
       </w:r>
     </w:p>
     <w:p>

</xml_diff>

<commit_message>
kembalikan prompt figma antarmuka
</commit_message>
<xml_diff>
--- a/docs/Proposal Skripsi v2.docx
+++ b/docs/Proposal Skripsi v2.docx
@@ -15948,41 +15948,16 @@
     </w:p>
     <w:p>
       <w:pPr>
-        <w:jc w:val="center"/>
-      </w:pPr>
-      <w:r>
-        <w:drawing>
-          <wp:inline xmlns:a="http://schemas.openxmlformats.org/drawingml/2006/main" xmlns:pic="http://schemas.openxmlformats.org/drawingml/2006/picture">
-            <wp:extent cx="2743200" cy="4866968"/>
-            <wp:docPr id="1069574691" name="Picture 1069574691"/>
-            <wp:cNvGraphicFramePr>
-              <a:graphicFrameLocks noChangeAspect="1"/>
-            </wp:cNvGraphicFramePr>
-            <a:graphic>
-              <a:graphicData uri="http://schemas.openxmlformats.org/drawingml/2006/picture">
-                <pic:pic>
-                  <pic:nvPicPr>
-                    <pic:cNvPr id="0" name="gambar_3_3_login.png"/>
-                    <pic:cNvPicPr/>
-                  </pic:nvPicPr>
-                  <pic:blipFill>
-                    <a:blip r:embed="rId54"/>
-                    <a:stretch>
-                      <a:fillRect/>
-                    </a:stretch>
-                  </pic:blipFill>
-                  <pic:spPr>
-                    <a:xfrm>
-                      <a:off x="0" y="0"/>
-                      <a:ext cx="2743200" cy="4866968"/>
-                    </a:xfrm>
-                    <a:prstGeom prst="rect"/>
-                  </pic:spPr>
-                </pic:pic>
-              </a:graphicData>
-            </a:graphic>
-          </wp:inline>
-        </w:drawing>
+        <w:jc w:val="both"/>
+      </w:pPr>
+      <w:r/>
+      <w:r>
+        <w:rPr>
+          <w:rFonts w:ascii="Times New Roman" w:hAnsi="Times New Roman"/>
+          <w:color w:val="FF0000"/>
+          <w:sz w:val="24"/>
+        </w:rPr>
+        <w:t>Prompt Figma: Buat rancangan halaman login aplikasi mobile Garden Barbershop Finance dengan gaya profesional, compact, dan mudah digunakan. Gunakan frame Android 360 x 800 px, warna utama hijau tua dengan aksen emas, latar belakang terang, ikon gunting atau barbershop secara sederhana, field Username, field Password, tombol Masuk, serta tampilan bersih tanpa teks penjelasan berlebihan.</w:t>
       </w:r>
     </w:p>
     <w:p>
@@ -16001,41 +15976,16 @@
     </w:p>
     <w:p>
       <w:pPr>
-        <w:jc w:val="center"/>
-      </w:pPr>
-      <w:r>
-        <w:drawing>
-          <wp:inline xmlns:a="http://schemas.openxmlformats.org/drawingml/2006/main" xmlns:pic="http://schemas.openxmlformats.org/drawingml/2006/picture">
-            <wp:extent cx="2743200" cy="4866968"/>
-            <wp:docPr id="1069574692" name="Picture 1069574692"/>
-            <wp:cNvGraphicFramePr>
-              <a:graphicFrameLocks noChangeAspect="1"/>
-            </wp:cNvGraphicFramePr>
-            <a:graphic>
-              <a:graphicData uri="http://schemas.openxmlformats.org/drawingml/2006/picture">
-                <pic:pic>
-                  <pic:nvPicPr>
-                    <pic:cNvPr id="0" name="gambar_3_4_dashboard.png"/>
-                    <pic:cNvPicPr/>
-                  </pic:nvPicPr>
-                  <pic:blipFill>
-                    <a:blip r:embed="rId55"/>
-                    <a:stretch>
-                      <a:fillRect/>
-                    </a:stretch>
-                  </pic:blipFill>
-                  <pic:spPr>
-                    <a:xfrm>
-                      <a:off x="0" y="0"/>
-                      <a:ext cx="2743200" cy="4866968"/>
-                    </a:xfrm>
-                    <a:prstGeom prst="rect"/>
-                  </pic:spPr>
-                </pic:pic>
-              </a:graphicData>
-            </a:graphic>
-          </wp:inline>
-        </w:drawing>
+        <w:jc w:val="both"/>
+      </w:pPr>
+      <w:r/>
+      <w:r>
+        <w:rPr>
+          <w:rFonts w:ascii="Times New Roman" w:hAnsi="Times New Roman"/>
+          <w:color w:val="FF0000"/>
+          <w:sz w:val="24"/>
+        </w:rPr>
+        <w:t>Prompt Figma: Buat rancangan dashboard admin aplikasi Garden Barbershop Finance pada frame Android 360 x 800 px. Tampilkan ringkasan Total Pendapatan Bulan Ini, Total Operasional, Jumlah Capster Aktif, Bagian Capster, dan Bagian Pondok dalam kartu metrik yang compact. Tambahkan menu utama Data Capster, Data Layanan, Pendapatan Harian, Buku Kas Umum, Operasional, Laporan, dan Kelola Akun Pengguna dengan ikon yang jelas.</w:t>
       </w:r>
     </w:p>
     <w:p>
@@ -16054,41 +16004,16 @@
     </w:p>
     <w:p>
       <w:pPr>
-        <w:jc w:val="center"/>
-      </w:pPr>
-      <w:r>
-        <w:drawing>
-          <wp:inline xmlns:a="http://schemas.openxmlformats.org/drawingml/2006/main" xmlns:pic="http://schemas.openxmlformats.org/drawingml/2006/picture">
-            <wp:extent cx="2743200" cy="4866968"/>
-            <wp:docPr id="1069574693" name="Picture 1069574693"/>
-            <wp:cNvGraphicFramePr>
-              <a:graphicFrameLocks noChangeAspect="1"/>
-            </wp:cNvGraphicFramePr>
-            <a:graphic>
-              <a:graphicData uri="http://schemas.openxmlformats.org/drawingml/2006/picture">
-                <pic:pic>
-                  <pic:nvPicPr>
-                    <pic:cNvPr id="0" name="gambar_3_5_pendapatan.png"/>
-                    <pic:cNvPicPr/>
-                  </pic:nvPicPr>
-                  <pic:blipFill>
-                    <a:blip r:embed="rId56"/>
-                    <a:stretch>
-                      <a:fillRect/>
-                    </a:stretch>
-                  </pic:blipFill>
-                  <pic:spPr>
-                    <a:xfrm>
-                      <a:off x="0" y="0"/>
-                      <a:ext cx="2743200" cy="4866968"/>
-                    </a:xfrm>
-                    <a:prstGeom prst="rect"/>
-                  </pic:spPr>
-                </pic:pic>
-              </a:graphicData>
-            </a:graphic>
-          </wp:inline>
-        </w:drawing>
+        <w:jc w:val="both"/>
+      </w:pPr>
+      <w:r/>
+      <w:r>
+        <w:rPr>
+          <w:rFonts w:ascii="Times New Roman" w:hAnsi="Times New Roman"/>
+          <w:color w:val="FF0000"/>
+          <w:sz w:val="24"/>
+        </w:rPr>
+        <w:t>Prompt Figma: Buat rancangan halaman input pendapatan harian untuk admin atau capster senior. Gunakan layout mobile yang rapi dan mudah diisi, terdapat pilihan tanggal, pilihan nama capster, daftar layanan dengan nama lengkap seperti Santri, Reguler Haircut, Premium Cut, Garden Cut, Cukur Jenggot/Kumis, Keramas, Coloring Hair, Home Service, Perming, dan Kartu Member. Tambahkan ringkasan otomatis total customer santri, customer umum, total customer, total pendapatan, dan tombol Simpan.</w:t>
       </w:r>
     </w:p>
     <w:p>
@@ -16107,41 +16032,16 @@
     </w:p>
     <w:p>
       <w:pPr>
-        <w:jc w:val="center"/>
-      </w:pPr>
-      <w:r>
-        <w:drawing>
-          <wp:inline xmlns:a="http://schemas.openxmlformats.org/drawingml/2006/main" xmlns:pic="http://schemas.openxmlformats.org/drawingml/2006/picture">
-            <wp:extent cx="2743200" cy="4866968"/>
-            <wp:docPr id="1069574694" name="Picture 1069574694"/>
-            <wp:cNvGraphicFramePr>
-              <a:graphicFrameLocks noChangeAspect="1"/>
-            </wp:cNvGraphicFramePr>
-            <a:graphic>
-              <a:graphicData uri="http://schemas.openxmlformats.org/drawingml/2006/picture">
-                <pic:pic>
-                  <pic:nvPicPr>
-                    <pic:cNvPr id="0" name="gambar_3_6_kas.png"/>
-                    <pic:cNvPicPr/>
-                  </pic:nvPicPr>
-                  <pic:blipFill>
-                    <a:blip r:embed="rId57"/>
-                    <a:stretch>
-                      <a:fillRect/>
-                    </a:stretch>
-                  </pic:blipFill>
-                  <pic:spPr>
-                    <a:xfrm>
-                      <a:off x="0" y="0"/>
-                      <a:ext cx="2743200" cy="4866968"/>
-                    </a:xfrm>
-                    <a:prstGeom prst="rect"/>
-                  </pic:spPr>
-                </pic:pic>
-              </a:graphicData>
-            </a:graphic>
-          </wp:inline>
-        </w:drawing>
+        <w:jc w:val="both"/>
+      </w:pPr>
+      <w:r/>
+      <w:r>
+        <w:rPr>
+          <w:rFonts w:ascii="Times New Roman" w:hAnsi="Times New Roman"/>
+          <w:color w:val="FF0000"/>
+          <w:sz w:val="24"/>
+        </w:rPr>
+        <w:t>Prompt Figma: Buat rancangan halaman Buku Kas Umum aplikasi Garden Barbershop Finance dengan gaya modern dan compact. Tampilkan form tanggal, uraian, pilihan akun, penerimaan, pengeluaran, saldo otomatis, keterangan, dan tombol Simpan. Sertakan daftar riwayat transaksi kas dalam kartu kecil dengan pembeda warna untuk penerimaan dan pengeluaran.</w:t>
       </w:r>
     </w:p>
     <w:p>
@@ -16160,41 +16060,16 @@
     </w:p>
     <w:p>
       <w:pPr>
-        <w:jc w:val="center"/>
-      </w:pPr>
-      <w:r>
-        <w:drawing>
-          <wp:inline xmlns:a="http://schemas.openxmlformats.org/drawingml/2006/main" xmlns:pic="http://schemas.openxmlformats.org/drawingml/2006/picture">
-            <wp:extent cx="2743200" cy="4866968"/>
-            <wp:docPr id="1069574695" name="Picture 1069574695"/>
-            <wp:cNvGraphicFramePr>
-              <a:graphicFrameLocks noChangeAspect="1"/>
-            </wp:cNvGraphicFramePr>
-            <a:graphic>
-              <a:graphicData uri="http://schemas.openxmlformats.org/drawingml/2006/picture">
-                <pic:pic>
-                  <pic:nvPicPr>
-                    <pic:cNvPr id="0" name="gambar_3_7_operasional.png"/>
-                    <pic:cNvPicPr/>
-                  </pic:nvPicPr>
-                  <pic:blipFill>
-                    <a:blip r:embed="rId58"/>
-                    <a:stretch>
-                      <a:fillRect/>
-                    </a:stretch>
-                  </pic:blipFill>
-                  <pic:spPr>
-                    <a:xfrm>
-                      <a:off x="0" y="0"/>
-                      <a:ext cx="2743200" cy="4866968"/>
-                    </a:xfrm>
-                    <a:prstGeom prst="rect"/>
-                  </pic:spPr>
-                </pic:pic>
-              </a:graphicData>
-            </a:graphic>
-          </wp:inline>
-        </w:drawing>
+        <w:jc w:val="both"/>
+      </w:pPr>
+      <w:r/>
+      <w:r>
+        <w:rPr>
+          <w:rFonts w:ascii="Times New Roman" w:hAnsi="Times New Roman"/>
+          <w:color w:val="FF0000"/>
+          <w:sz w:val="24"/>
+        </w:rPr>
+        <w:t>Prompt Figma: Buat rancangan halaman input biaya operasional bulanan pada frame Android 360 x 800 px. Tampilkan pilihan bulan, nama biaya, pilihan akun seperti Listrik, Wifi, Kebersihan, Air, Sewa Toko, dan Harga Pokok Penjualan, field nominal rupiah, keterangan, total operasional bulan terpilih, tombol Simpan, serta daftar biaya yang sudah dicatat.</w:t>
       </w:r>
     </w:p>
     <w:p>
@@ -16213,41 +16088,16 @@
     </w:p>
     <w:p>
       <w:pPr>
-        <w:jc w:val="center"/>
-      </w:pPr>
-      <w:r>
-        <w:drawing>
-          <wp:inline xmlns:a="http://schemas.openxmlformats.org/drawingml/2006/main" xmlns:pic="http://schemas.openxmlformats.org/drawingml/2006/picture">
-            <wp:extent cx="2743200" cy="4866968"/>
-            <wp:docPr id="1069574696" name="Picture 1069574696"/>
-            <wp:cNvGraphicFramePr>
-              <a:graphicFrameLocks noChangeAspect="1"/>
-            </wp:cNvGraphicFramePr>
-            <a:graphic>
-              <a:graphicData uri="http://schemas.openxmlformats.org/drawingml/2006/picture">
-                <pic:pic>
-                  <pic:nvPicPr>
-                    <pic:cNvPr id="0" name="gambar_3_8_laporan.png"/>
-                    <pic:cNvPicPr/>
-                  </pic:nvPicPr>
-                  <pic:blipFill>
-                    <a:blip r:embed="rId59"/>
-                    <a:stretch>
-                      <a:fillRect/>
-                    </a:stretch>
-                  </pic:blipFill>
-                  <pic:spPr>
-                    <a:xfrm>
-                      <a:off x="0" y="0"/>
-                      <a:ext cx="2743200" cy="4866968"/>
-                    </a:xfrm>
-                    <a:prstGeom prst="rect"/>
-                  </pic:spPr>
-                </pic:pic>
-              </a:graphicData>
-            </a:graphic>
-          </wp:inline>
-        </w:drawing>
+        <w:jc w:val="both"/>
+      </w:pPr>
+      <w:r/>
+      <w:r>
+        <w:rPr>
+          <w:rFonts w:ascii="Times New Roman" w:hAnsi="Times New Roman"/>
+          <w:color w:val="FF0000"/>
+          <w:sz w:val="24"/>
+        </w:rPr>
+        <w:t>Prompt Figma: Buat rancangan halaman laporan pembagian hasil capster dengan tampilan mobile profesional. Tampilkan filter bulan, tombol Hitung Laporan, tombol Simpan Laporan, tabel atau daftar laporan berisi Nama Capster, Pendapatan Kotor, Operasional per Capster, Pendapatan Bersih, Bagian Capster, dan Bagian Pondok. Tambahkan kartu ringkasan Total Pendapatan, Total Bagian Capster, dan Total Bagian Pondok.</w:t>
       </w:r>
     </w:p>
     <w:p>
@@ -16266,41 +16116,16 @@
     </w:p>
     <w:p>
       <w:pPr>
-        <w:jc w:val="center"/>
-      </w:pPr>
-      <w:r>
-        <w:drawing>
-          <wp:inline xmlns:a="http://schemas.openxmlformats.org/drawingml/2006/main" xmlns:pic="http://schemas.openxmlformats.org/drawingml/2006/picture">
-            <wp:extent cx="2743200" cy="4866968"/>
-            <wp:docPr id="1069574697" name="Picture 1069574697"/>
-            <wp:cNvGraphicFramePr>
-              <a:graphicFrameLocks noChangeAspect="1"/>
-            </wp:cNvGraphicFramePr>
-            <a:graphic>
-              <a:graphicData uri="http://schemas.openxmlformats.org/drawingml/2006/picture">
-                <pic:pic>
-                  <pic:nvPicPr>
-                    <pic:cNvPr id="0" name="gambar_3_9_akun.png"/>
-                    <pic:cNvPicPr/>
-                  </pic:nvPicPr>
-                  <pic:blipFill>
-                    <a:blip r:embed="rId60"/>
-                    <a:stretch>
-                      <a:fillRect/>
-                    </a:stretch>
-                  </pic:blipFill>
-                  <pic:spPr>
-                    <a:xfrm>
-                      <a:off x="0" y="0"/>
-                      <a:ext cx="2743200" cy="4866968"/>
-                    </a:xfrm>
-                    <a:prstGeom prst="rect"/>
-                  </pic:spPr>
-                </pic:pic>
-              </a:graphicData>
-            </a:graphic>
-          </wp:inline>
-        </w:drawing>
+        <w:jc w:val="both"/>
+      </w:pPr>
+      <w:r/>
+      <w:r>
+        <w:rPr>
+          <w:rFonts w:ascii="Times New Roman" w:hAnsi="Times New Roman"/>
+          <w:color w:val="FF0000"/>
+          <w:sz w:val="24"/>
+        </w:rPr>
+        <w:t>Prompt Figma: Buat rancangan halaman kelola akun pengguna untuk admin. Tampilkan daftar akun dengan informasi nama, username, role admin, capster, capster senior, atau pemilik, status aktif, dan tombol aksi ubah password atau nonaktifkan akun. Tambahkan tombol tambah akun dan form ringkas untuk membuat akun baru yang dapat dikaitkan dengan data capster.</w:t>
       </w:r>
     </w:p>
     <w:p>

</xml_diff>

<commit_message>
atur jadwal penelitian landscape
</commit_message>
<xml_diff>
--- a/docs/Proposal Skripsi v2.docx
+++ b/docs/Proposal Skripsi v2.docx
@@ -12507,7 +12507,18 @@
     </w:p>
     <w:p>
       <w:pPr>
-        <w:spacing w:line="360" w:lineRule="auto" w:after="0"/>
+        <w:sectPr>
+          <w:type w:val="nextPage"/>
+          <w:pgSz w:w="12240" w:h="15840"/>
+          <w:pgMar w:top="2268" w:right="1701" w:bottom="1701" w:left="2268" w:header="720" w:footer="720" w:gutter="0"/>
+          <w:cols w:space="720"/>
+          <w:docGrid w:linePitch="360"/>
+        </w:sectPr>
+      </w:pPr>
+    </w:p>
+    <w:p>
+      <w:pPr>
+        <w:spacing w:line="360" w:lineRule="auto" w:after="120" w:before="0"/>
       </w:pPr>
       <w:r>
         <w:rPr>
@@ -12520,7 +12531,7 @@
     </w:p>
     <w:p>
       <w:pPr>
-        <w:spacing w:line="360" w:lineRule="auto" w:after="0"/>
+        <w:spacing w:line="360" w:lineRule="auto" w:after="60" w:before="0"/>
         <w:ind w:firstLine="504"/>
         <w:jc w:val="both"/>
       </w:pPr>
@@ -12535,7 +12546,7 @@
     </w:p>
     <w:p>
       <w:pPr>
-        <w:spacing w:line="360" w:lineRule="auto" w:after="0"/>
+        <w:spacing w:line="360" w:lineRule="auto" w:after="60" w:before="0"/>
         <w:jc w:val="center"/>
       </w:pPr>
       <w:r>
@@ -12550,9 +12561,16 @@
     <w:tbl>
       <w:tblPr>
         <w:tblStyle w:val="TableGrid"/>
-        <w:tblW w:type="auto" w:w="0"/>
+        <w:tblW w:type="dxa" w:w="11880"/>
         <w:jc w:val="center"/>
+        <w:tblLayout w:type="fixed"/>
         <w:tblLook w:firstColumn="1" w:firstRow="1" w:lastColumn="0" w:lastRow="0" w:noHBand="0" w:noVBand="1" w:val="04A0"/>
+        <w:tblCellMar>
+          <w:top w:w="35" w:type="dxa"/>
+          <w:start w:w="35" w:type="dxa"/>
+          <w:bottom w:w="35" w:type="dxa"/>
+          <w:end w:w="35" w:type="dxa"/>
+        </w:tblCellMar>
       </w:tblPr>
       <w:tblGrid>
         <w:gridCol w:w="459"/>
@@ -12575,22 +12593,25 @@
         <w:gridCol w:w="459"/>
       </w:tblGrid>
       <w:tr>
-        <w:tc>
-          <w:tcPr>
-            <w:tcW w:type="dxa" w:w="459"/>
+        <w:trPr>
+          <w:cantSplit/>
+        </w:trPr>
+        <w:tc>
+          <w:tcPr>
+            <w:tcW w:type="dxa" w:w="520"/>
             <w:vMerge w:val="restart"/>
             <w:vAlign w:val="center"/>
           </w:tcPr>
           <w:p>
             <w:pPr>
-              <w:spacing w:after="0" w:line="240" w:lineRule="auto"/>
+              <w:spacing w:after="0" w:line="240" w:lineRule="auto" w:before="0"/>
               <w:jc w:val="center"/>
             </w:pPr>
             <w:r>
               <w:rPr>
                 <w:rFonts w:ascii="Times New Roman" w:hAnsi="Times New Roman"/>
                 <w:b/>
-                <w:sz w:val="16"/>
+                <w:sz w:val="14"/>
               </w:rPr>
               <w:t>NO</w:t>
             </w:r>
@@ -12598,20 +12619,20 @@
         </w:tc>
         <w:tc>
           <w:tcPr>
-            <w:tcW w:type="dxa" w:w="459"/>
+            <w:tcW w:type="dxa" w:w="1850"/>
             <w:vMerge w:val="restart"/>
             <w:vAlign w:val="center"/>
           </w:tcPr>
           <w:p>
             <w:pPr>
-              <w:spacing w:after="0" w:line="240" w:lineRule="auto"/>
+              <w:spacing w:after="0" w:line="240" w:lineRule="auto" w:before="0"/>
               <w:jc w:val="center"/>
             </w:pPr>
             <w:r>
               <w:rPr>
                 <w:rFonts w:ascii="Times New Roman" w:hAnsi="Times New Roman"/>
                 <w:b/>
-                <w:sz w:val="16"/>
+                <w:sz w:val="14"/>
               </w:rPr>
               <w:t>JENIS KEGIATAN</w:t>
             </w:r>
@@ -12619,20 +12640,20 @@
         </w:tc>
         <w:tc>
           <w:tcPr>
-            <w:tcW w:type="dxa" w:w="7344"/>
+            <w:tcW w:type="dxa" w:w="595"/>
             <w:gridSpan w:val="16"/>
             <w:vAlign w:val="center"/>
           </w:tcPr>
           <w:p>
             <w:pPr>
-              <w:spacing w:after="0" w:line="240" w:lineRule="auto"/>
+              <w:spacing w:after="0" w:line="240" w:lineRule="auto" w:before="0"/>
               <w:jc w:val="center"/>
             </w:pPr>
             <w:r>
               <w:rPr>
                 <w:rFonts w:ascii="Times New Roman" w:hAnsi="Times New Roman"/>
                 <w:b/>
-                <w:sz w:val="16"/>
+                <w:sz w:val="14"/>
               </w:rPr>
               <w:t>2026</w:t>
             </w:r>
@@ -12640,6 +12661,9 @@
         </w:tc>
       </w:tr>
       <w:tr>
+        <w:trPr>
+          <w:cantSplit/>
+        </w:trPr>
         <w:tc>
           <w:tcPr>
             <w:tcW w:type="dxa" w:w="459"/>
@@ -12656,20 +12680,20 @@
         </w:tc>
         <w:tc>
           <w:tcPr>
-            <w:tcW w:type="dxa" w:w="1836"/>
+            <w:tcW w:type="dxa" w:w="595"/>
             <w:gridSpan w:val="4"/>
             <w:vAlign w:val="center"/>
           </w:tcPr>
           <w:p>
             <w:pPr>
-              <w:spacing w:after="0" w:line="240" w:lineRule="auto"/>
+              <w:spacing w:after="0" w:line="240" w:lineRule="auto" w:before="0"/>
               <w:jc w:val="center"/>
             </w:pPr>
             <w:r>
               <w:rPr>
                 <w:rFonts w:ascii="Times New Roman" w:hAnsi="Times New Roman"/>
                 <w:b/>
-                <w:sz w:val="16"/>
+                <w:sz w:val="14"/>
               </w:rPr>
               <w:t>APRIL</w:t>
             </w:r>
@@ -12677,20 +12701,20 @@
         </w:tc>
         <w:tc>
           <w:tcPr>
-            <w:tcW w:type="dxa" w:w="1836"/>
+            <w:tcW w:type="dxa" w:w="595"/>
             <w:gridSpan w:val="4"/>
             <w:vAlign w:val="center"/>
           </w:tcPr>
           <w:p>
             <w:pPr>
-              <w:spacing w:after="0" w:line="240" w:lineRule="auto"/>
+              <w:spacing w:after="0" w:line="240" w:lineRule="auto" w:before="0"/>
               <w:jc w:val="center"/>
             </w:pPr>
             <w:r>
               <w:rPr>
                 <w:rFonts w:ascii="Times New Roman" w:hAnsi="Times New Roman"/>
                 <w:b/>
-                <w:sz w:val="16"/>
+                <w:sz w:val="14"/>
               </w:rPr>
               <w:t>MEI</w:t>
             </w:r>
@@ -12698,20 +12722,20 @@
         </w:tc>
         <w:tc>
           <w:tcPr>
-            <w:tcW w:type="dxa" w:w="1836"/>
+            <w:tcW w:type="dxa" w:w="595"/>
             <w:gridSpan w:val="4"/>
             <w:vAlign w:val="center"/>
           </w:tcPr>
           <w:p>
             <w:pPr>
-              <w:spacing w:after="0" w:line="240" w:lineRule="auto"/>
+              <w:spacing w:after="0" w:line="240" w:lineRule="auto" w:before="0"/>
               <w:jc w:val="center"/>
             </w:pPr>
             <w:r>
               <w:rPr>
                 <w:rFonts w:ascii="Times New Roman" w:hAnsi="Times New Roman"/>
                 <w:b/>
-                <w:sz w:val="16"/>
+                <w:sz w:val="14"/>
               </w:rPr>
               <w:t>JUNI</w:t>
             </w:r>
@@ -12719,20 +12743,20 @@
         </w:tc>
         <w:tc>
           <w:tcPr>
-            <w:tcW w:type="dxa" w:w="1836"/>
+            <w:tcW w:type="dxa" w:w="595"/>
             <w:gridSpan w:val="4"/>
             <w:vAlign w:val="center"/>
           </w:tcPr>
           <w:p>
             <w:pPr>
-              <w:spacing w:after="0" w:line="240" w:lineRule="auto"/>
+              <w:spacing w:after="0" w:line="240" w:lineRule="auto" w:before="0"/>
               <w:jc w:val="center"/>
             </w:pPr>
             <w:r>
               <w:rPr>
                 <w:rFonts w:ascii="Times New Roman" w:hAnsi="Times New Roman"/>
                 <w:b/>
-                <w:sz w:val="16"/>
+                <w:sz w:val="14"/>
               </w:rPr>
               <w:t>JULI</w:t>
             </w:r>
@@ -12740,59 +12764,62 @@
         </w:tc>
       </w:tr>
       <w:tr>
-        <w:tc>
-          <w:tcPr>
-            <w:tcW w:type="dxa" w:w="459"/>
+        <w:trPr>
+          <w:cantSplit/>
+        </w:trPr>
+        <w:tc>
+          <w:tcPr>
+            <w:tcW w:type="dxa" w:w="520"/>
             <w:vAlign w:val="center"/>
           </w:tcPr>
           <w:p>
             <w:pPr>
-              <w:spacing w:after="0" w:line="240" w:lineRule="auto"/>
+              <w:spacing w:after="0" w:line="240" w:lineRule="auto" w:before="0"/>
               <w:jc w:val="center"/>
             </w:pPr>
             <w:r>
               <w:rPr>
                 <w:rFonts w:ascii="Times New Roman" w:hAnsi="Times New Roman"/>
                 <w:b/>
-                <w:sz w:val="16"/>
-              </w:rPr>
-            </w:r>
-          </w:p>
-        </w:tc>
-        <w:tc>
-          <w:tcPr>
-            <w:tcW w:type="dxa" w:w="459"/>
+                <w:sz w:val="14"/>
+              </w:rPr>
+            </w:r>
+          </w:p>
+        </w:tc>
+        <w:tc>
+          <w:tcPr>
+            <w:tcW w:type="dxa" w:w="1850"/>
             <w:vAlign w:val="center"/>
           </w:tcPr>
           <w:p>
             <w:pPr>
-              <w:spacing w:after="0" w:line="240" w:lineRule="auto"/>
+              <w:spacing w:after="0" w:line="240" w:lineRule="auto" w:before="0"/>
               <w:jc w:val="center"/>
             </w:pPr>
             <w:r>
               <w:rPr>
                 <w:rFonts w:ascii="Times New Roman" w:hAnsi="Times New Roman"/>
                 <w:b/>
-                <w:sz w:val="16"/>
-              </w:rPr>
-            </w:r>
-          </w:p>
-        </w:tc>
-        <w:tc>
-          <w:tcPr>
-            <w:tcW w:type="dxa" w:w="459"/>
+                <w:sz w:val="14"/>
+              </w:rPr>
+            </w:r>
+          </w:p>
+        </w:tc>
+        <w:tc>
+          <w:tcPr>
+            <w:tcW w:type="dxa" w:w="595"/>
             <w:vAlign w:val="center"/>
           </w:tcPr>
           <w:p>
             <w:pPr>
-              <w:spacing w:after="0" w:line="240" w:lineRule="auto"/>
+              <w:spacing w:after="0" w:line="240" w:lineRule="auto" w:before="0"/>
               <w:jc w:val="center"/>
             </w:pPr>
             <w:r>
               <w:rPr>
                 <w:rFonts w:ascii="Times New Roman" w:hAnsi="Times New Roman"/>
                 <w:b/>
-                <w:sz w:val="16"/>
+                <w:sz w:val="14"/>
               </w:rPr>
               <w:t>1</w:t>
             </w:r>
@@ -12800,19 +12827,19 @@
         </w:tc>
         <w:tc>
           <w:tcPr>
-            <w:tcW w:type="dxa" w:w="459"/>
+            <w:tcW w:type="dxa" w:w="595"/>
             <w:vAlign w:val="center"/>
           </w:tcPr>
           <w:p>
             <w:pPr>
-              <w:spacing w:after="0" w:line="240" w:lineRule="auto"/>
+              <w:spacing w:after="0" w:line="240" w:lineRule="auto" w:before="0"/>
               <w:jc w:val="center"/>
             </w:pPr>
             <w:r>
               <w:rPr>
                 <w:rFonts w:ascii="Times New Roman" w:hAnsi="Times New Roman"/>
                 <w:b/>
-                <w:sz w:val="16"/>
+                <w:sz w:val="14"/>
               </w:rPr>
               <w:t>2</w:t>
             </w:r>
@@ -12820,19 +12847,19 @@
         </w:tc>
         <w:tc>
           <w:tcPr>
-            <w:tcW w:type="dxa" w:w="459"/>
+            <w:tcW w:type="dxa" w:w="595"/>
             <w:vAlign w:val="center"/>
           </w:tcPr>
           <w:p>
             <w:pPr>
-              <w:spacing w:after="0" w:line="240" w:lineRule="auto"/>
+              <w:spacing w:after="0" w:line="240" w:lineRule="auto" w:before="0"/>
               <w:jc w:val="center"/>
             </w:pPr>
             <w:r>
               <w:rPr>
                 <w:rFonts w:ascii="Times New Roman" w:hAnsi="Times New Roman"/>
                 <w:b/>
-                <w:sz w:val="16"/>
+                <w:sz w:val="14"/>
               </w:rPr>
               <w:t>3</w:t>
             </w:r>
@@ -12840,19 +12867,19 @@
         </w:tc>
         <w:tc>
           <w:tcPr>
-            <w:tcW w:type="dxa" w:w="459"/>
+            <w:tcW w:type="dxa" w:w="595"/>
             <w:vAlign w:val="center"/>
           </w:tcPr>
           <w:p>
             <w:pPr>
-              <w:spacing w:after="0" w:line="240" w:lineRule="auto"/>
+              <w:spacing w:after="0" w:line="240" w:lineRule="auto" w:before="0"/>
               <w:jc w:val="center"/>
             </w:pPr>
             <w:r>
               <w:rPr>
                 <w:rFonts w:ascii="Times New Roman" w:hAnsi="Times New Roman"/>
                 <w:b/>
-                <w:sz w:val="16"/>
+                <w:sz w:val="14"/>
               </w:rPr>
               <w:t>4</w:t>
             </w:r>
@@ -12860,19 +12887,19 @@
         </w:tc>
         <w:tc>
           <w:tcPr>
-            <w:tcW w:type="dxa" w:w="459"/>
+            <w:tcW w:type="dxa" w:w="595"/>
             <w:vAlign w:val="center"/>
           </w:tcPr>
           <w:p>
             <w:pPr>
-              <w:spacing w:after="0" w:line="240" w:lineRule="auto"/>
+              <w:spacing w:after="0" w:line="240" w:lineRule="auto" w:before="0"/>
               <w:jc w:val="center"/>
             </w:pPr>
             <w:r>
               <w:rPr>
                 <w:rFonts w:ascii="Times New Roman" w:hAnsi="Times New Roman"/>
                 <w:b/>
-                <w:sz w:val="16"/>
+                <w:sz w:val="14"/>
               </w:rPr>
               <w:t>1</w:t>
             </w:r>
@@ -12880,19 +12907,19 @@
         </w:tc>
         <w:tc>
           <w:tcPr>
-            <w:tcW w:type="dxa" w:w="459"/>
+            <w:tcW w:type="dxa" w:w="595"/>
             <w:vAlign w:val="center"/>
           </w:tcPr>
           <w:p>
             <w:pPr>
-              <w:spacing w:after="0" w:line="240" w:lineRule="auto"/>
+              <w:spacing w:after="0" w:line="240" w:lineRule="auto" w:before="0"/>
               <w:jc w:val="center"/>
             </w:pPr>
             <w:r>
               <w:rPr>
                 <w:rFonts w:ascii="Times New Roman" w:hAnsi="Times New Roman"/>
                 <w:b/>
-                <w:sz w:val="16"/>
+                <w:sz w:val="14"/>
               </w:rPr>
               <w:t>2</w:t>
             </w:r>
@@ -12900,19 +12927,19 @@
         </w:tc>
         <w:tc>
           <w:tcPr>
-            <w:tcW w:type="dxa" w:w="459"/>
+            <w:tcW w:type="dxa" w:w="595"/>
             <w:vAlign w:val="center"/>
           </w:tcPr>
           <w:p>
             <w:pPr>
-              <w:spacing w:after="0" w:line="240" w:lineRule="auto"/>
+              <w:spacing w:after="0" w:line="240" w:lineRule="auto" w:before="0"/>
               <w:jc w:val="center"/>
             </w:pPr>
             <w:r>
               <w:rPr>
                 <w:rFonts w:ascii="Times New Roman" w:hAnsi="Times New Roman"/>
                 <w:b/>
-                <w:sz w:val="16"/>
+                <w:sz w:val="14"/>
               </w:rPr>
               <w:t>3</w:t>
             </w:r>
@@ -12920,19 +12947,19 @@
         </w:tc>
         <w:tc>
           <w:tcPr>
-            <w:tcW w:type="dxa" w:w="459"/>
+            <w:tcW w:type="dxa" w:w="595"/>
             <w:vAlign w:val="center"/>
           </w:tcPr>
           <w:p>
             <w:pPr>
-              <w:spacing w:after="0" w:line="240" w:lineRule="auto"/>
+              <w:spacing w:after="0" w:line="240" w:lineRule="auto" w:before="0"/>
               <w:jc w:val="center"/>
             </w:pPr>
             <w:r>
               <w:rPr>
                 <w:rFonts w:ascii="Times New Roman" w:hAnsi="Times New Roman"/>
                 <w:b/>
-                <w:sz w:val="16"/>
+                <w:sz w:val="14"/>
               </w:rPr>
               <w:t>4</w:t>
             </w:r>
@@ -12940,19 +12967,19 @@
         </w:tc>
         <w:tc>
           <w:tcPr>
-            <w:tcW w:type="dxa" w:w="459"/>
+            <w:tcW w:type="dxa" w:w="595"/>
             <w:vAlign w:val="center"/>
           </w:tcPr>
           <w:p>
             <w:pPr>
-              <w:spacing w:after="0" w:line="240" w:lineRule="auto"/>
+              <w:spacing w:after="0" w:line="240" w:lineRule="auto" w:before="0"/>
               <w:jc w:val="center"/>
             </w:pPr>
             <w:r>
               <w:rPr>
                 <w:rFonts w:ascii="Times New Roman" w:hAnsi="Times New Roman"/>
                 <w:b/>
-                <w:sz w:val="16"/>
+                <w:sz w:val="14"/>
               </w:rPr>
               <w:t>1</w:t>
             </w:r>
@@ -12960,19 +12987,19 @@
         </w:tc>
         <w:tc>
           <w:tcPr>
-            <w:tcW w:type="dxa" w:w="459"/>
+            <w:tcW w:type="dxa" w:w="595"/>
             <w:vAlign w:val="center"/>
           </w:tcPr>
           <w:p>
             <w:pPr>
-              <w:spacing w:after="0" w:line="240" w:lineRule="auto"/>
+              <w:spacing w:after="0" w:line="240" w:lineRule="auto" w:before="0"/>
               <w:jc w:val="center"/>
             </w:pPr>
             <w:r>
               <w:rPr>
                 <w:rFonts w:ascii="Times New Roman" w:hAnsi="Times New Roman"/>
                 <w:b/>
-                <w:sz w:val="16"/>
+                <w:sz w:val="14"/>
               </w:rPr>
               <w:t>2</w:t>
             </w:r>
@@ -12980,19 +13007,19 @@
         </w:tc>
         <w:tc>
           <w:tcPr>
-            <w:tcW w:type="dxa" w:w="459"/>
+            <w:tcW w:type="dxa" w:w="595"/>
             <w:vAlign w:val="center"/>
           </w:tcPr>
           <w:p>
             <w:pPr>
-              <w:spacing w:after="0" w:line="240" w:lineRule="auto"/>
+              <w:spacing w:after="0" w:line="240" w:lineRule="auto" w:before="0"/>
               <w:jc w:val="center"/>
             </w:pPr>
             <w:r>
               <w:rPr>
                 <w:rFonts w:ascii="Times New Roman" w:hAnsi="Times New Roman"/>
                 <w:b/>
-                <w:sz w:val="16"/>
+                <w:sz w:val="14"/>
               </w:rPr>
               <w:t>3</w:t>
             </w:r>
@@ -13000,19 +13027,19 @@
         </w:tc>
         <w:tc>
           <w:tcPr>
-            <w:tcW w:type="dxa" w:w="459"/>
+            <w:tcW w:type="dxa" w:w="595"/>
             <w:vAlign w:val="center"/>
           </w:tcPr>
           <w:p>
             <w:pPr>
-              <w:spacing w:after="0" w:line="240" w:lineRule="auto"/>
+              <w:spacing w:after="0" w:line="240" w:lineRule="auto" w:before="0"/>
               <w:jc w:val="center"/>
             </w:pPr>
             <w:r>
               <w:rPr>
                 <w:rFonts w:ascii="Times New Roman" w:hAnsi="Times New Roman"/>
                 <w:b/>
-                <w:sz w:val="16"/>
+                <w:sz w:val="14"/>
               </w:rPr>
               <w:t>4</w:t>
             </w:r>
@@ -13020,19 +13047,19 @@
         </w:tc>
         <w:tc>
           <w:tcPr>
-            <w:tcW w:type="dxa" w:w="459"/>
+            <w:tcW w:type="dxa" w:w="595"/>
             <w:vAlign w:val="center"/>
           </w:tcPr>
           <w:p>
             <w:pPr>
-              <w:spacing w:after="0" w:line="240" w:lineRule="auto"/>
+              <w:spacing w:after="0" w:line="240" w:lineRule="auto" w:before="0"/>
               <w:jc w:val="center"/>
             </w:pPr>
             <w:r>
               <w:rPr>
                 <w:rFonts w:ascii="Times New Roman" w:hAnsi="Times New Roman"/>
                 <w:b/>
-                <w:sz w:val="16"/>
+                <w:sz w:val="14"/>
               </w:rPr>
               <w:t>1</w:t>
             </w:r>
@@ -13040,19 +13067,19 @@
         </w:tc>
         <w:tc>
           <w:tcPr>
-            <w:tcW w:type="dxa" w:w="459"/>
+            <w:tcW w:type="dxa" w:w="595"/>
             <w:vAlign w:val="center"/>
           </w:tcPr>
           <w:p>
             <w:pPr>
-              <w:spacing w:after="0" w:line="240" w:lineRule="auto"/>
+              <w:spacing w:after="0" w:line="240" w:lineRule="auto" w:before="0"/>
               <w:jc w:val="center"/>
             </w:pPr>
             <w:r>
               <w:rPr>
                 <w:rFonts w:ascii="Times New Roman" w:hAnsi="Times New Roman"/>
                 <w:b/>
-                <w:sz w:val="16"/>
+                <w:sz w:val="14"/>
               </w:rPr>
               <w:t>2</w:t>
             </w:r>
@@ -13060,19 +13087,19 @@
         </w:tc>
         <w:tc>
           <w:tcPr>
-            <w:tcW w:type="dxa" w:w="459"/>
+            <w:tcW w:type="dxa" w:w="595"/>
             <w:vAlign w:val="center"/>
           </w:tcPr>
           <w:p>
             <w:pPr>
-              <w:spacing w:after="0" w:line="240" w:lineRule="auto"/>
+              <w:spacing w:after="0" w:line="240" w:lineRule="auto" w:before="0"/>
               <w:jc w:val="center"/>
             </w:pPr>
             <w:r>
               <w:rPr>
                 <w:rFonts w:ascii="Times New Roman" w:hAnsi="Times New Roman"/>
                 <w:b/>
-                <w:sz w:val="16"/>
+                <w:sz w:val="14"/>
               </w:rPr>
               <w:t>3</w:t>
             </w:r>
@@ -13080,19 +13107,19 @@
         </w:tc>
         <w:tc>
           <w:tcPr>
-            <w:tcW w:type="dxa" w:w="459"/>
+            <w:tcW w:type="dxa" w:w="595"/>
             <w:vAlign w:val="center"/>
           </w:tcPr>
           <w:p>
             <w:pPr>
-              <w:spacing w:after="0" w:line="240" w:lineRule="auto"/>
+              <w:spacing w:after="0" w:line="240" w:lineRule="auto" w:before="0"/>
               <w:jc w:val="center"/>
             </w:pPr>
             <w:r>
               <w:rPr>
                 <w:rFonts w:ascii="Times New Roman" w:hAnsi="Times New Roman"/>
                 <w:b/>
-                <w:sz w:val="16"/>
+                <w:sz w:val="14"/>
               </w:rPr>
               <w:t>4</w:t>
             </w:r>
@@ -13100,21 +13127,24 @@
         </w:tc>
       </w:tr>
       <w:tr>
-        <w:tc>
-          <w:tcPr>
-            <w:tcW w:type="dxa" w:w="459"/>
+        <w:trPr>
+          <w:cantSplit/>
+        </w:trPr>
+        <w:tc>
+          <w:tcPr>
+            <w:tcW w:type="dxa" w:w="520"/>
             <w:vAlign w:val="center"/>
           </w:tcPr>
           <w:p>
             <w:pPr>
-              <w:spacing w:after="0" w:line="240" w:lineRule="auto"/>
+              <w:spacing w:after="0" w:line="240" w:lineRule="auto" w:before="0"/>
               <w:jc w:val="center"/>
             </w:pPr>
             <w:r>
               <w:rPr>
                 <w:rFonts w:ascii="Times New Roman" w:hAnsi="Times New Roman"/>
                 <w:b w:val="0"/>
-                <w:sz w:val="16"/>
+                <w:sz w:val="14"/>
               </w:rPr>
               <w:t>1.</w:t>
             </w:r>
@@ -13122,19 +13152,19 @@
         </w:tc>
         <w:tc>
           <w:tcPr>
-            <w:tcW w:type="dxa" w:w="459"/>
+            <w:tcW w:type="dxa" w:w="1850"/>
             <w:vAlign w:val="center"/>
           </w:tcPr>
           <w:p>
             <w:pPr>
-              <w:spacing w:after="0" w:line="240" w:lineRule="auto"/>
-              <w:jc w:val="left"/>
+              <w:spacing w:after="0" w:line="240" w:lineRule="auto" w:before="0"/>
+              <w:jc w:val="center"/>
             </w:pPr>
             <w:r>
               <w:rPr>
                 <w:rFonts w:ascii="Times New Roman" w:hAnsi="Times New Roman"/>
                 <w:b w:val="0"/>
-                <w:sz w:val="16"/>
+                <w:sz w:val="14"/>
               </w:rPr>
               <w:t>Studi Literatur</w:t>
             </w:r>
@@ -13142,19 +13172,19 @@
         </w:tc>
         <w:tc>
           <w:tcPr>
-            <w:tcW w:type="dxa" w:w="459"/>
+            <w:tcW w:type="dxa" w:w="595"/>
             <w:vAlign w:val="center"/>
           </w:tcPr>
           <w:p>
             <w:pPr>
-              <w:spacing w:after="0" w:line="240" w:lineRule="auto"/>
+              <w:spacing w:after="0" w:line="240" w:lineRule="auto" w:before="0"/>
               <w:jc w:val="center"/>
             </w:pPr>
             <w:r>
               <w:rPr>
                 <w:rFonts w:ascii="Times New Roman" w:hAnsi="Times New Roman"/>
                 <w:b w:val="0"/>
-                <w:sz w:val="16"/>
+                <w:sz w:val="14"/>
               </w:rPr>
               <w:t>√</w:t>
             </w:r>
@@ -13162,19 +13192,19 @@
         </w:tc>
         <w:tc>
           <w:tcPr>
-            <w:tcW w:type="dxa" w:w="459"/>
+            <w:tcW w:type="dxa" w:w="595"/>
             <w:vAlign w:val="center"/>
           </w:tcPr>
           <w:p>
             <w:pPr>
-              <w:spacing w:after="0" w:line="240" w:lineRule="auto"/>
+              <w:spacing w:after="0" w:line="240" w:lineRule="auto" w:before="0"/>
               <w:jc w:val="center"/>
             </w:pPr>
             <w:r>
               <w:rPr>
                 <w:rFonts w:ascii="Times New Roman" w:hAnsi="Times New Roman"/>
                 <w:b w:val="0"/>
-                <w:sz w:val="16"/>
+                <w:sz w:val="14"/>
               </w:rPr>
               <w:t>√</w:t>
             </w:r>
@@ -13182,19 +13212,19 @@
         </w:tc>
         <w:tc>
           <w:tcPr>
-            <w:tcW w:type="dxa" w:w="459"/>
+            <w:tcW w:type="dxa" w:w="595"/>
             <w:vAlign w:val="center"/>
           </w:tcPr>
           <w:p>
             <w:pPr>
-              <w:spacing w:after="0" w:line="240" w:lineRule="auto"/>
+              <w:spacing w:after="0" w:line="240" w:lineRule="auto" w:before="0"/>
               <w:jc w:val="center"/>
             </w:pPr>
             <w:r>
               <w:rPr>
                 <w:rFonts w:ascii="Times New Roman" w:hAnsi="Times New Roman"/>
                 <w:b w:val="0"/>
-                <w:sz w:val="16"/>
+                <w:sz w:val="14"/>
               </w:rPr>
               <w:t>√</w:t>
             </w:r>
@@ -13202,19 +13232,19 @@
         </w:tc>
         <w:tc>
           <w:tcPr>
-            <w:tcW w:type="dxa" w:w="459"/>
+            <w:tcW w:type="dxa" w:w="595"/>
             <w:vAlign w:val="center"/>
           </w:tcPr>
           <w:p>
             <w:pPr>
-              <w:spacing w:after="0" w:line="240" w:lineRule="auto"/>
+              <w:spacing w:after="0" w:line="240" w:lineRule="auto" w:before="0"/>
               <w:jc w:val="center"/>
             </w:pPr>
             <w:r>
               <w:rPr>
                 <w:rFonts w:ascii="Times New Roman" w:hAnsi="Times New Roman"/>
                 <w:b w:val="0"/>
-                <w:sz w:val="16"/>
+                <w:sz w:val="14"/>
               </w:rPr>
               <w:t>√</w:t>
             </w:r>
@@ -13222,249 +13252,252 @@
         </w:tc>
         <w:tc>
           <w:tcPr>
-            <w:tcW w:type="dxa" w:w="459"/>
+            <w:tcW w:type="dxa" w:w="595"/>
             <w:vAlign w:val="center"/>
           </w:tcPr>
           <w:p>
             <w:pPr>
-              <w:spacing w:after="0" w:line="240" w:lineRule="auto"/>
+              <w:spacing w:after="0" w:line="240" w:lineRule="auto" w:before="0"/>
               <w:jc w:val="center"/>
             </w:pPr>
             <w:r>
               <w:rPr>
                 <w:rFonts w:ascii="Times New Roman" w:hAnsi="Times New Roman"/>
                 <w:b w:val="0"/>
-                <w:sz w:val="16"/>
-              </w:rPr>
-            </w:r>
-          </w:p>
-        </w:tc>
-        <w:tc>
-          <w:tcPr>
-            <w:tcW w:type="dxa" w:w="459"/>
+                <w:sz w:val="14"/>
+              </w:rPr>
+            </w:r>
+          </w:p>
+        </w:tc>
+        <w:tc>
+          <w:tcPr>
+            <w:tcW w:type="dxa" w:w="595"/>
             <w:vAlign w:val="center"/>
           </w:tcPr>
           <w:p>
             <w:pPr>
-              <w:spacing w:after="0" w:line="240" w:lineRule="auto"/>
+              <w:spacing w:after="0" w:line="240" w:lineRule="auto" w:before="0"/>
               <w:jc w:val="center"/>
             </w:pPr>
             <w:r>
               <w:rPr>
                 <w:rFonts w:ascii="Times New Roman" w:hAnsi="Times New Roman"/>
                 <w:b w:val="0"/>
-                <w:sz w:val="16"/>
-              </w:rPr>
-            </w:r>
-          </w:p>
-        </w:tc>
-        <w:tc>
-          <w:tcPr>
-            <w:tcW w:type="dxa" w:w="459"/>
+                <w:sz w:val="14"/>
+              </w:rPr>
+            </w:r>
+          </w:p>
+        </w:tc>
+        <w:tc>
+          <w:tcPr>
+            <w:tcW w:type="dxa" w:w="595"/>
             <w:vAlign w:val="center"/>
           </w:tcPr>
           <w:p>
             <w:pPr>
-              <w:spacing w:after="0" w:line="240" w:lineRule="auto"/>
+              <w:spacing w:after="0" w:line="240" w:lineRule="auto" w:before="0"/>
               <w:jc w:val="center"/>
             </w:pPr>
             <w:r>
               <w:rPr>
                 <w:rFonts w:ascii="Times New Roman" w:hAnsi="Times New Roman"/>
                 <w:b w:val="0"/>
-                <w:sz w:val="16"/>
-              </w:rPr>
-            </w:r>
-          </w:p>
-        </w:tc>
-        <w:tc>
-          <w:tcPr>
-            <w:tcW w:type="dxa" w:w="459"/>
+                <w:sz w:val="14"/>
+              </w:rPr>
+            </w:r>
+          </w:p>
+        </w:tc>
+        <w:tc>
+          <w:tcPr>
+            <w:tcW w:type="dxa" w:w="595"/>
             <w:vAlign w:val="center"/>
           </w:tcPr>
           <w:p>
             <w:pPr>
-              <w:spacing w:after="0" w:line="240" w:lineRule="auto"/>
+              <w:spacing w:after="0" w:line="240" w:lineRule="auto" w:before="0"/>
               <w:jc w:val="center"/>
             </w:pPr>
             <w:r>
               <w:rPr>
                 <w:rFonts w:ascii="Times New Roman" w:hAnsi="Times New Roman"/>
                 <w:b w:val="0"/>
-                <w:sz w:val="16"/>
-              </w:rPr>
-            </w:r>
-          </w:p>
-        </w:tc>
-        <w:tc>
-          <w:tcPr>
-            <w:tcW w:type="dxa" w:w="459"/>
+                <w:sz w:val="14"/>
+              </w:rPr>
+            </w:r>
+          </w:p>
+        </w:tc>
+        <w:tc>
+          <w:tcPr>
+            <w:tcW w:type="dxa" w:w="595"/>
             <w:vAlign w:val="center"/>
           </w:tcPr>
           <w:p>
             <w:pPr>
-              <w:spacing w:after="0" w:line="240" w:lineRule="auto"/>
+              <w:spacing w:after="0" w:line="240" w:lineRule="auto" w:before="0"/>
               <w:jc w:val="center"/>
             </w:pPr>
             <w:r>
               <w:rPr>
                 <w:rFonts w:ascii="Times New Roman" w:hAnsi="Times New Roman"/>
                 <w:b w:val="0"/>
-                <w:sz w:val="16"/>
-              </w:rPr>
-            </w:r>
-          </w:p>
-        </w:tc>
-        <w:tc>
-          <w:tcPr>
-            <w:tcW w:type="dxa" w:w="459"/>
+                <w:sz w:val="14"/>
+              </w:rPr>
+            </w:r>
+          </w:p>
+        </w:tc>
+        <w:tc>
+          <w:tcPr>
+            <w:tcW w:type="dxa" w:w="595"/>
             <w:vAlign w:val="center"/>
           </w:tcPr>
           <w:p>
             <w:pPr>
-              <w:spacing w:after="0" w:line="240" w:lineRule="auto"/>
+              <w:spacing w:after="0" w:line="240" w:lineRule="auto" w:before="0"/>
               <w:jc w:val="center"/>
             </w:pPr>
             <w:r>
               <w:rPr>
                 <w:rFonts w:ascii="Times New Roman" w:hAnsi="Times New Roman"/>
                 <w:b w:val="0"/>
-                <w:sz w:val="16"/>
-              </w:rPr>
-            </w:r>
-          </w:p>
-        </w:tc>
-        <w:tc>
-          <w:tcPr>
-            <w:tcW w:type="dxa" w:w="459"/>
+                <w:sz w:val="14"/>
+              </w:rPr>
+            </w:r>
+          </w:p>
+        </w:tc>
+        <w:tc>
+          <w:tcPr>
+            <w:tcW w:type="dxa" w:w="595"/>
             <w:vAlign w:val="center"/>
           </w:tcPr>
           <w:p>
             <w:pPr>
-              <w:spacing w:after="0" w:line="240" w:lineRule="auto"/>
+              <w:spacing w:after="0" w:line="240" w:lineRule="auto" w:before="0"/>
               <w:jc w:val="center"/>
             </w:pPr>
             <w:r>
               <w:rPr>
                 <w:rFonts w:ascii="Times New Roman" w:hAnsi="Times New Roman"/>
                 <w:b w:val="0"/>
-                <w:sz w:val="16"/>
-              </w:rPr>
-            </w:r>
-          </w:p>
-        </w:tc>
-        <w:tc>
-          <w:tcPr>
-            <w:tcW w:type="dxa" w:w="459"/>
+                <w:sz w:val="14"/>
+              </w:rPr>
+            </w:r>
+          </w:p>
+        </w:tc>
+        <w:tc>
+          <w:tcPr>
+            <w:tcW w:type="dxa" w:w="595"/>
             <w:vAlign w:val="center"/>
           </w:tcPr>
           <w:p>
             <w:pPr>
-              <w:spacing w:after="0" w:line="240" w:lineRule="auto"/>
+              <w:spacing w:after="0" w:line="240" w:lineRule="auto" w:before="0"/>
               <w:jc w:val="center"/>
             </w:pPr>
             <w:r>
               <w:rPr>
                 <w:rFonts w:ascii="Times New Roman" w:hAnsi="Times New Roman"/>
                 <w:b w:val="0"/>
-                <w:sz w:val="16"/>
-              </w:rPr>
-            </w:r>
-          </w:p>
-        </w:tc>
-        <w:tc>
-          <w:tcPr>
-            <w:tcW w:type="dxa" w:w="459"/>
+                <w:sz w:val="14"/>
+              </w:rPr>
+            </w:r>
+          </w:p>
+        </w:tc>
+        <w:tc>
+          <w:tcPr>
+            <w:tcW w:type="dxa" w:w="595"/>
             <w:vAlign w:val="center"/>
           </w:tcPr>
           <w:p>
             <w:pPr>
-              <w:spacing w:after="0" w:line="240" w:lineRule="auto"/>
+              <w:spacing w:after="0" w:line="240" w:lineRule="auto" w:before="0"/>
               <w:jc w:val="center"/>
             </w:pPr>
             <w:r>
               <w:rPr>
                 <w:rFonts w:ascii="Times New Roman" w:hAnsi="Times New Roman"/>
                 <w:b w:val="0"/>
-                <w:sz w:val="16"/>
-              </w:rPr>
-            </w:r>
-          </w:p>
-        </w:tc>
-        <w:tc>
-          <w:tcPr>
-            <w:tcW w:type="dxa" w:w="459"/>
+                <w:sz w:val="14"/>
+              </w:rPr>
+            </w:r>
+          </w:p>
+        </w:tc>
+        <w:tc>
+          <w:tcPr>
+            <w:tcW w:type="dxa" w:w="595"/>
             <w:vAlign w:val="center"/>
           </w:tcPr>
           <w:p>
             <w:pPr>
-              <w:spacing w:after="0" w:line="240" w:lineRule="auto"/>
+              <w:spacing w:after="0" w:line="240" w:lineRule="auto" w:before="0"/>
               <w:jc w:val="center"/>
             </w:pPr>
             <w:r>
               <w:rPr>
                 <w:rFonts w:ascii="Times New Roman" w:hAnsi="Times New Roman"/>
                 <w:b w:val="0"/>
-                <w:sz w:val="16"/>
-              </w:rPr>
-            </w:r>
-          </w:p>
-        </w:tc>
-        <w:tc>
-          <w:tcPr>
-            <w:tcW w:type="dxa" w:w="459"/>
+                <w:sz w:val="14"/>
+              </w:rPr>
+            </w:r>
+          </w:p>
+        </w:tc>
+        <w:tc>
+          <w:tcPr>
+            <w:tcW w:type="dxa" w:w="595"/>
             <w:vAlign w:val="center"/>
           </w:tcPr>
           <w:p>
             <w:pPr>
-              <w:spacing w:after="0" w:line="240" w:lineRule="auto"/>
+              <w:spacing w:after="0" w:line="240" w:lineRule="auto" w:before="0"/>
               <w:jc w:val="center"/>
             </w:pPr>
             <w:r>
               <w:rPr>
                 <w:rFonts w:ascii="Times New Roman" w:hAnsi="Times New Roman"/>
                 <w:b w:val="0"/>
-                <w:sz w:val="16"/>
-              </w:rPr>
-            </w:r>
-          </w:p>
-        </w:tc>
-        <w:tc>
-          <w:tcPr>
-            <w:tcW w:type="dxa" w:w="459"/>
+                <w:sz w:val="14"/>
+              </w:rPr>
+            </w:r>
+          </w:p>
+        </w:tc>
+        <w:tc>
+          <w:tcPr>
+            <w:tcW w:type="dxa" w:w="595"/>
             <w:vAlign w:val="center"/>
           </w:tcPr>
           <w:p>
             <w:pPr>
-              <w:spacing w:after="0" w:line="240" w:lineRule="auto"/>
+              <w:spacing w:after="0" w:line="240" w:lineRule="auto" w:before="0"/>
               <w:jc w:val="center"/>
             </w:pPr>
             <w:r>
               <w:rPr>
                 <w:rFonts w:ascii="Times New Roman" w:hAnsi="Times New Roman"/>
                 <w:b w:val="0"/>
-                <w:sz w:val="16"/>
+                <w:sz w:val="14"/>
               </w:rPr>
             </w:r>
           </w:p>
         </w:tc>
       </w:tr>
       <w:tr>
-        <w:tc>
-          <w:tcPr>
-            <w:tcW w:type="dxa" w:w="459"/>
+        <w:trPr>
+          <w:cantSplit/>
+        </w:trPr>
+        <w:tc>
+          <w:tcPr>
+            <w:tcW w:type="dxa" w:w="520"/>
             <w:vAlign w:val="center"/>
           </w:tcPr>
           <w:p>
             <w:pPr>
-              <w:spacing w:after="0" w:line="240" w:lineRule="auto"/>
+              <w:spacing w:after="0" w:line="240" w:lineRule="auto" w:before="0"/>
               <w:jc w:val="center"/>
             </w:pPr>
             <w:r>
               <w:rPr>
                 <w:rFonts w:ascii="Times New Roman" w:hAnsi="Times New Roman"/>
                 <w:b w:val="0"/>
-                <w:sz w:val="16"/>
+                <w:sz w:val="14"/>
               </w:rPr>
               <w:t>2.</w:t>
             </w:r>
@@ -13472,19 +13505,19 @@
         </w:tc>
         <w:tc>
           <w:tcPr>
-            <w:tcW w:type="dxa" w:w="459"/>
+            <w:tcW w:type="dxa" w:w="1850"/>
             <w:vAlign w:val="center"/>
           </w:tcPr>
           <w:p>
             <w:pPr>
-              <w:spacing w:after="0" w:line="240" w:lineRule="auto"/>
-              <w:jc w:val="left"/>
+              <w:spacing w:after="0" w:line="240" w:lineRule="auto" w:before="0"/>
+              <w:jc w:val="center"/>
             </w:pPr>
             <w:r>
               <w:rPr>
                 <w:rFonts w:ascii="Times New Roman" w:hAnsi="Times New Roman"/>
                 <w:b w:val="0"/>
-                <w:sz w:val="16"/>
+                <w:sz w:val="14"/>
               </w:rPr>
               <w:t>Pengumpulan Data</w:t>
             </w:r>
@@ -13492,57 +13525,57 @@
         </w:tc>
         <w:tc>
           <w:tcPr>
-            <w:tcW w:type="dxa" w:w="459"/>
+            <w:tcW w:type="dxa" w:w="595"/>
             <w:vAlign w:val="center"/>
           </w:tcPr>
           <w:p>
             <w:pPr>
-              <w:spacing w:after="0" w:line="240" w:lineRule="auto"/>
+              <w:spacing w:after="0" w:line="240" w:lineRule="auto" w:before="0"/>
               <w:jc w:val="center"/>
             </w:pPr>
             <w:r>
               <w:rPr>
                 <w:rFonts w:ascii="Times New Roman" w:hAnsi="Times New Roman"/>
                 <w:b w:val="0"/>
-                <w:sz w:val="16"/>
-              </w:rPr>
-            </w:r>
-          </w:p>
-        </w:tc>
-        <w:tc>
-          <w:tcPr>
-            <w:tcW w:type="dxa" w:w="459"/>
+                <w:sz w:val="14"/>
+              </w:rPr>
+            </w:r>
+          </w:p>
+        </w:tc>
+        <w:tc>
+          <w:tcPr>
+            <w:tcW w:type="dxa" w:w="595"/>
             <w:vAlign w:val="center"/>
           </w:tcPr>
           <w:p>
             <w:pPr>
-              <w:spacing w:after="0" w:line="240" w:lineRule="auto"/>
+              <w:spacing w:after="0" w:line="240" w:lineRule="auto" w:before="0"/>
               <w:jc w:val="center"/>
             </w:pPr>
             <w:r>
               <w:rPr>
                 <w:rFonts w:ascii="Times New Roman" w:hAnsi="Times New Roman"/>
                 <w:b w:val="0"/>
-                <w:sz w:val="16"/>
-              </w:rPr>
-            </w:r>
-          </w:p>
-        </w:tc>
-        <w:tc>
-          <w:tcPr>
-            <w:tcW w:type="dxa" w:w="459"/>
+                <w:sz w:val="14"/>
+              </w:rPr>
+            </w:r>
+          </w:p>
+        </w:tc>
+        <w:tc>
+          <w:tcPr>
+            <w:tcW w:type="dxa" w:w="595"/>
             <w:vAlign w:val="center"/>
           </w:tcPr>
           <w:p>
             <w:pPr>
-              <w:spacing w:after="0" w:line="240" w:lineRule="auto"/>
+              <w:spacing w:after="0" w:line="240" w:lineRule="auto" w:before="0"/>
               <w:jc w:val="center"/>
             </w:pPr>
             <w:r>
               <w:rPr>
                 <w:rFonts w:ascii="Times New Roman" w:hAnsi="Times New Roman"/>
                 <w:b w:val="0"/>
-                <w:sz w:val="16"/>
+                <w:sz w:val="14"/>
               </w:rPr>
               <w:t>√</w:t>
             </w:r>
@@ -13550,19 +13583,19 @@
         </w:tc>
         <w:tc>
           <w:tcPr>
-            <w:tcW w:type="dxa" w:w="459"/>
+            <w:tcW w:type="dxa" w:w="595"/>
             <w:vAlign w:val="center"/>
           </w:tcPr>
           <w:p>
             <w:pPr>
-              <w:spacing w:after="0" w:line="240" w:lineRule="auto"/>
+              <w:spacing w:after="0" w:line="240" w:lineRule="auto" w:before="0"/>
               <w:jc w:val="center"/>
             </w:pPr>
             <w:r>
               <w:rPr>
                 <w:rFonts w:ascii="Times New Roman" w:hAnsi="Times New Roman"/>
                 <w:b w:val="0"/>
-                <w:sz w:val="16"/>
+                <w:sz w:val="14"/>
               </w:rPr>
               <w:t>√</w:t>
             </w:r>
@@ -13570,19 +13603,19 @@
         </w:tc>
         <w:tc>
           <w:tcPr>
-            <w:tcW w:type="dxa" w:w="459"/>
+            <w:tcW w:type="dxa" w:w="595"/>
             <w:vAlign w:val="center"/>
           </w:tcPr>
           <w:p>
             <w:pPr>
-              <w:spacing w:after="0" w:line="240" w:lineRule="auto"/>
+              <w:spacing w:after="0" w:line="240" w:lineRule="auto" w:before="0"/>
               <w:jc w:val="center"/>
             </w:pPr>
             <w:r>
               <w:rPr>
                 <w:rFonts w:ascii="Times New Roman" w:hAnsi="Times New Roman"/>
                 <w:b w:val="0"/>
-                <w:sz w:val="16"/>
+                <w:sz w:val="14"/>
               </w:rPr>
               <w:t>√</w:t>
             </w:r>
@@ -13590,19 +13623,19 @@
         </w:tc>
         <w:tc>
           <w:tcPr>
-            <w:tcW w:type="dxa" w:w="459"/>
+            <w:tcW w:type="dxa" w:w="595"/>
             <w:vAlign w:val="center"/>
           </w:tcPr>
           <w:p>
             <w:pPr>
-              <w:spacing w:after="0" w:line="240" w:lineRule="auto"/>
+              <w:spacing w:after="0" w:line="240" w:lineRule="auto" w:before="0"/>
               <w:jc w:val="center"/>
             </w:pPr>
             <w:r>
               <w:rPr>
                 <w:rFonts w:ascii="Times New Roman" w:hAnsi="Times New Roman"/>
                 <w:b w:val="0"/>
-                <w:sz w:val="16"/>
+                <w:sz w:val="14"/>
               </w:rPr>
               <w:t>√</w:t>
             </w:r>
@@ -13610,211 +13643,214 @@
         </w:tc>
         <w:tc>
           <w:tcPr>
-            <w:tcW w:type="dxa" w:w="459"/>
+            <w:tcW w:type="dxa" w:w="595"/>
             <w:vAlign w:val="center"/>
           </w:tcPr>
           <w:p>
             <w:pPr>
-              <w:spacing w:after="0" w:line="240" w:lineRule="auto"/>
+              <w:spacing w:after="0" w:line="240" w:lineRule="auto" w:before="0"/>
               <w:jc w:val="center"/>
             </w:pPr>
             <w:r>
               <w:rPr>
                 <w:rFonts w:ascii="Times New Roman" w:hAnsi="Times New Roman"/>
                 <w:b w:val="0"/>
-                <w:sz w:val="16"/>
-              </w:rPr>
-            </w:r>
-          </w:p>
-        </w:tc>
-        <w:tc>
-          <w:tcPr>
-            <w:tcW w:type="dxa" w:w="459"/>
+                <w:sz w:val="14"/>
+              </w:rPr>
+            </w:r>
+          </w:p>
+        </w:tc>
+        <w:tc>
+          <w:tcPr>
+            <w:tcW w:type="dxa" w:w="595"/>
             <w:vAlign w:val="center"/>
           </w:tcPr>
           <w:p>
             <w:pPr>
-              <w:spacing w:after="0" w:line="240" w:lineRule="auto"/>
+              <w:spacing w:after="0" w:line="240" w:lineRule="auto" w:before="0"/>
               <w:jc w:val="center"/>
             </w:pPr>
             <w:r>
               <w:rPr>
                 <w:rFonts w:ascii="Times New Roman" w:hAnsi="Times New Roman"/>
                 <w:b w:val="0"/>
-                <w:sz w:val="16"/>
-              </w:rPr>
-            </w:r>
-          </w:p>
-        </w:tc>
-        <w:tc>
-          <w:tcPr>
-            <w:tcW w:type="dxa" w:w="459"/>
+                <w:sz w:val="14"/>
+              </w:rPr>
+            </w:r>
+          </w:p>
+        </w:tc>
+        <w:tc>
+          <w:tcPr>
+            <w:tcW w:type="dxa" w:w="595"/>
             <w:vAlign w:val="center"/>
           </w:tcPr>
           <w:p>
             <w:pPr>
-              <w:spacing w:after="0" w:line="240" w:lineRule="auto"/>
+              <w:spacing w:after="0" w:line="240" w:lineRule="auto" w:before="0"/>
               <w:jc w:val="center"/>
             </w:pPr>
             <w:r>
               <w:rPr>
                 <w:rFonts w:ascii="Times New Roman" w:hAnsi="Times New Roman"/>
                 <w:b w:val="0"/>
-                <w:sz w:val="16"/>
-              </w:rPr>
-            </w:r>
-          </w:p>
-        </w:tc>
-        <w:tc>
-          <w:tcPr>
-            <w:tcW w:type="dxa" w:w="459"/>
+                <w:sz w:val="14"/>
+              </w:rPr>
+            </w:r>
+          </w:p>
+        </w:tc>
+        <w:tc>
+          <w:tcPr>
+            <w:tcW w:type="dxa" w:w="595"/>
             <w:vAlign w:val="center"/>
           </w:tcPr>
           <w:p>
             <w:pPr>
-              <w:spacing w:after="0" w:line="240" w:lineRule="auto"/>
+              <w:spacing w:after="0" w:line="240" w:lineRule="auto" w:before="0"/>
               <w:jc w:val="center"/>
             </w:pPr>
             <w:r>
               <w:rPr>
                 <w:rFonts w:ascii="Times New Roman" w:hAnsi="Times New Roman"/>
                 <w:b w:val="0"/>
-                <w:sz w:val="16"/>
-              </w:rPr>
-            </w:r>
-          </w:p>
-        </w:tc>
-        <w:tc>
-          <w:tcPr>
-            <w:tcW w:type="dxa" w:w="459"/>
+                <w:sz w:val="14"/>
+              </w:rPr>
+            </w:r>
+          </w:p>
+        </w:tc>
+        <w:tc>
+          <w:tcPr>
+            <w:tcW w:type="dxa" w:w="595"/>
             <w:vAlign w:val="center"/>
           </w:tcPr>
           <w:p>
             <w:pPr>
-              <w:spacing w:after="0" w:line="240" w:lineRule="auto"/>
+              <w:spacing w:after="0" w:line="240" w:lineRule="auto" w:before="0"/>
               <w:jc w:val="center"/>
             </w:pPr>
             <w:r>
               <w:rPr>
                 <w:rFonts w:ascii="Times New Roman" w:hAnsi="Times New Roman"/>
                 <w:b w:val="0"/>
-                <w:sz w:val="16"/>
-              </w:rPr>
-            </w:r>
-          </w:p>
-        </w:tc>
-        <w:tc>
-          <w:tcPr>
-            <w:tcW w:type="dxa" w:w="459"/>
+                <w:sz w:val="14"/>
+              </w:rPr>
+            </w:r>
+          </w:p>
+        </w:tc>
+        <w:tc>
+          <w:tcPr>
+            <w:tcW w:type="dxa" w:w="595"/>
             <w:vAlign w:val="center"/>
           </w:tcPr>
           <w:p>
             <w:pPr>
-              <w:spacing w:after="0" w:line="240" w:lineRule="auto"/>
+              <w:spacing w:after="0" w:line="240" w:lineRule="auto" w:before="0"/>
               <w:jc w:val="center"/>
             </w:pPr>
             <w:r>
               <w:rPr>
                 <w:rFonts w:ascii="Times New Roman" w:hAnsi="Times New Roman"/>
                 <w:b w:val="0"/>
-                <w:sz w:val="16"/>
-              </w:rPr>
-            </w:r>
-          </w:p>
-        </w:tc>
-        <w:tc>
-          <w:tcPr>
-            <w:tcW w:type="dxa" w:w="459"/>
+                <w:sz w:val="14"/>
+              </w:rPr>
+            </w:r>
+          </w:p>
+        </w:tc>
+        <w:tc>
+          <w:tcPr>
+            <w:tcW w:type="dxa" w:w="595"/>
             <w:vAlign w:val="center"/>
           </w:tcPr>
           <w:p>
             <w:pPr>
-              <w:spacing w:after="0" w:line="240" w:lineRule="auto"/>
+              <w:spacing w:after="0" w:line="240" w:lineRule="auto" w:before="0"/>
               <w:jc w:val="center"/>
             </w:pPr>
             <w:r>
               <w:rPr>
                 <w:rFonts w:ascii="Times New Roman" w:hAnsi="Times New Roman"/>
                 <w:b w:val="0"/>
-                <w:sz w:val="16"/>
-              </w:rPr>
-            </w:r>
-          </w:p>
-        </w:tc>
-        <w:tc>
-          <w:tcPr>
-            <w:tcW w:type="dxa" w:w="459"/>
+                <w:sz w:val="14"/>
+              </w:rPr>
+            </w:r>
+          </w:p>
+        </w:tc>
+        <w:tc>
+          <w:tcPr>
+            <w:tcW w:type="dxa" w:w="595"/>
             <w:vAlign w:val="center"/>
           </w:tcPr>
           <w:p>
             <w:pPr>
-              <w:spacing w:after="0" w:line="240" w:lineRule="auto"/>
+              <w:spacing w:after="0" w:line="240" w:lineRule="auto" w:before="0"/>
               <w:jc w:val="center"/>
             </w:pPr>
             <w:r>
               <w:rPr>
                 <w:rFonts w:ascii="Times New Roman" w:hAnsi="Times New Roman"/>
                 <w:b w:val="0"/>
-                <w:sz w:val="16"/>
-              </w:rPr>
-            </w:r>
-          </w:p>
-        </w:tc>
-        <w:tc>
-          <w:tcPr>
-            <w:tcW w:type="dxa" w:w="459"/>
+                <w:sz w:val="14"/>
+              </w:rPr>
+            </w:r>
+          </w:p>
+        </w:tc>
+        <w:tc>
+          <w:tcPr>
+            <w:tcW w:type="dxa" w:w="595"/>
             <w:vAlign w:val="center"/>
           </w:tcPr>
           <w:p>
             <w:pPr>
-              <w:spacing w:after="0" w:line="240" w:lineRule="auto"/>
+              <w:spacing w:after="0" w:line="240" w:lineRule="auto" w:before="0"/>
               <w:jc w:val="center"/>
             </w:pPr>
             <w:r>
               <w:rPr>
                 <w:rFonts w:ascii="Times New Roman" w:hAnsi="Times New Roman"/>
                 <w:b w:val="0"/>
-                <w:sz w:val="16"/>
-              </w:rPr>
-            </w:r>
-          </w:p>
-        </w:tc>
-        <w:tc>
-          <w:tcPr>
-            <w:tcW w:type="dxa" w:w="459"/>
+                <w:sz w:val="14"/>
+              </w:rPr>
+            </w:r>
+          </w:p>
+        </w:tc>
+        <w:tc>
+          <w:tcPr>
+            <w:tcW w:type="dxa" w:w="595"/>
             <w:vAlign w:val="center"/>
           </w:tcPr>
           <w:p>
             <w:pPr>
-              <w:spacing w:after="0" w:line="240" w:lineRule="auto"/>
+              <w:spacing w:after="0" w:line="240" w:lineRule="auto" w:before="0"/>
               <w:jc w:val="center"/>
             </w:pPr>
             <w:r>
               <w:rPr>
                 <w:rFonts w:ascii="Times New Roman" w:hAnsi="Times New Roman"/>
                 <w:b w:val="0"/>
-                <w:sz w:val="16"/>
+                <w:sz w:val="14"/>
               </w:rPr>
             </w:r>
           </w:p>
         </w:tc>
       </w:tr>
       <w:tr>
-        <w:tc>
-          <w:tcPr>
-            <w:tcW w:type="dxa" w:w="459"/>
+        <w:trPr>
+          <w:cantSplit/>
+        </w:trPr>
+        <w:tc>
+          <w:tcPr>
+            <w:tcW w:type="dxa" w:w="520"/>
             <w:vAlign w:val="center"/>
           </w:tcPr>
           <w:p>
             <w:pPr>
-              <w:spacing w:after="0" w:line="240" w:lineRule="auto"/>
+              <w:spacing w:after="0" w:line="240" w:lineRule="auto" w:before="0"/>
               <w:jc w:val="center"/>
             </w:pPr>
             <w:r>
               <w:rPr>
                 <w:rFonts w:ascii="Times New Roman" w:hAnsi="Times New Roman"/>
                 <w:b w:val="0"/>
-                <w:sz w:val="16"/>
+                <w:sz w:val="14"/>
               </w:rPr>
               <w:t>3.</w:t>
             </w:r>
@@ -13822,19 +13858,19 @@
         </w:tc>
         <w:tc>
           <w:tcPr>
-            <w:tcW w:type="dxa" w:w="459"/>
+            <w:tcW w:type="dxa" w:w="1850"/>
             <w:vAlign w:val="center"/>
           </w:tcPr>
           <w:p>
             <w:pPr>
-              <w:spacing w:after="0" w:line="240" w:lineRule="auto"/>
-              <w:jc w:val="left"/>
+              <w:spacing w:after="0" w:line="240" w:lineRule="auto" w:before="0"/>
+              <w:jc w:val="center"/>
             </w:pPr>
             <w:r>
               <w:rPr>
                 <w:rFonts w:ascii="Times New Roman" w:hAnsi="Times New Roman"/>
                 <w:b w:val="0"/>
-                <w:sz w:val="16"/>
+                <w:sz w:val="14"/>
               </w:rPr>
               <w:t>Analisis Kebutuhan Sistem</w:t>
             </w:r>
@@ -13842,95 +13878,95 @@
         </w:tc>
         <w:tc>
           <w:tcPr>
-            <w:tcW w:type="dxa" w:w="459"/>
+            <w:tcW w:type="dxa" w:w="595"/>
             <w:vAlign w:val="center"/>
           </w:tcPr>
           <w:p>
             <w:pPr>
-              <w:spacing w:after="0" w:line="240" w:lineRule="auto"/>
+              <w:spacing w:after="0" w:line="240" w:lineRule="auto" w:before="0"/>
               <w:jc w:val="center"/>
             </w:pPr>
             <w:r>
               <w:rPr>
                 <w:rFonts w:ascii="Times New Roman" w:hAnsi="Times New Roman"/>
                 <w:b w:val="0"/>
-                <w:sz w:val="16"/>
-              </w:rPr>
-            </w:r>
-          </w:p>
-        </w:tc>
-        <w:tc>
-          <w:tcPr>
-            <w:tcW w:type="dxa" w:w="459"/>
+                <w:sz w:val="14"/>
+              </w:rPr>
+            </w:r>
+          </w:p>
+        </w:tc>
+        <w:tc>
+          <w:tcPr>
+            <w:tcW w:type="dxa" w:w="595"/>
             <w:vAlign w:val="center"/>
           </w:tcPr>
           <w:p>
             <w:pPr>
-              <w:spacing w:after="0" w:line="240" w:lineRule="auto"/>
+              <w:spacing w:after="0" w:line="240" w:lineRule="auto" w:before="0"/>
               <w:jc w:val="center"/>
             </w:pPr>
             <w:r>
               <w:rPr>
                 <w:rFonts w:ascii="Times New Roman" w:hAnsi="Times New Roman"/>
                 <w:b w:val="0"/>
-                <w:sz w:val="16"/>
-              </w:rPr>
-            </w:r>
-          </w:p>
-        </w:tc>
-        <w:tc>
-          <w:tcPr>
-            <w:tcW w:type="dxa" w:w="459"/>
+                <w:sz w:val="14"/>
+              </w:rPr>
+            </w:r>
+          </w:p>
+        </w:tc>
+        <w:tc>
+          <w:tcPr>
+            <w:tcW w:type="dxa" w:w="595"/>
             <w:vAlign w:val="center"/>
           </w:tcPr>
           <w:p>
             <w:pPr>
-              <w:spacing w:after="0" w:line="240" w:lineRule="auto"/>
+              <w:spacing w:after="0" w:line="240" w:lineRule="auto" w:before="0"/>
               <w:jc w:val="center"/>
             </w:pPr>
             <w:r>
               <w:rPr>
                 <w:rFonts w:ascii="Times New Roman" w:hAnsi="Times New Roman"/>
                 <w:b w:val="0"/>
-                <w:sz w:val="16"/>
-              </w:rPr>
-            </w:r>
-          </w:p>
-        </w:tc>
-        <w:tc>
-          <w:tcPr>
-            <w:tcW w:type="dxa" w:w="459"/>
+                <w:sz w:val="14"/>
+              </w:rPr>
+            </w:r>
+          </w:p>
+        </w:tc>
+        <w:tc>
+          <w:tcPr>
+            <w:tcW w:type="dxa" w:w="595"/>
             <w:vAlign w:val="center"/>
           </w:tcPr>
           <w:p>
             <w:pPr>
-              <w:spacing w:after="0" w:line="240" w:lineRule="auto"/>
+              <w:spacing w:after="0" w:line="240" w:lineRule="auto" w:before="0"/>
               <w:jc w:val="center"/>
             </w:pPr>
             <w:r>
               <w:rPr>
                 <w:rFonts w:ascii="Times New Roman" w:hAnsi="Times New Roman"/>
                 <w:b w:val="0"/>
-                <w:sz w:val="16"/>
-              </w:rPr>
-            </w:r>
-          </w:p>
-        </w:tc>
-        <w:tc>
-          <w:tcPr>
-            <w:tcW w:type="dxa" w:w="459"/>
+                <w:sz w:val="14"/>
+              </w:rPr>
+            </w:r>
+          </w:p>
+        </w:tc>
+        <w:tc>
+          <w:tcPr>
+            <w:tcW w:type="dxa" w:w="595"/>
             <w:vAlign w:val="center"/>
           </w:tcPr>
           <w:p>
             <w:pPr>
-              <w:spacing w:after="0" w:line="240" w:lineRule="auto"/>
+              <w:spacing w:after="0" w:line="240" w:lineRule="auto" w:before="0"/>
               <w:jc w:val="center"/>
             </w:pPr>
             <w:r>
               <w:rPr>
                 <w:rFonts w:ascii="Times New Roman" w:hAnsi="Times New Roman"/>
                 <w:b w:val="0"/>
-                <w:sz w:val="16"/>
+                <w:sz w:val="14"/>
               </w:rPr>
               <w:t>√</w:t>
             </w:r>
@@ -13938,19 +13974,19 @@
         </w:tc>
         <w:tc>
           <w:tcPr>
-            <w:tcW w:type="dxa" w:w="459"/>
+            <w:tcW w:type="dxa" w:w="595"/>
             <w:vAlign w:val="center"/>
           </w:tcPr>
           <w:p>
             <w:pPr>
-              <w:spacing w:after="0" w:line="240" w:lineRule="auto"/>
+              <w:spacing w:after="0" w:line="240" w:lineRule="auto" w:before="0"/>
               <w:jc w:val="center"/>
             </w:pPr>
             <w:r>
               <w:rPr>
                 <w:rFonts w:ascii="Times New Roman" w:hAnsi="Times New Roman"/>
                 <w:b w:val="0"/>
-                <w:sz w:val="16"/>
+                <w:sz w:val="14"/>
               </w:rPr>
               <w:t>√</w:t>
             </w:r>
@@ -13958,19 +13994,19 @@
         </w:tc>
         <w:tc>
           <w:tcPr>
-            <w:tcW w:type="dxa" w:w="459"/>
+            <w:tcW w:type="dxa" w:w="595"/>
             <w:vAlign w:val="center"/>
           </w:tcPr>
           <w:p>
             <w:pPr>
-              <w:spacing w:after="0" w:line="240" w:lineRule="auto"/>
+              <w:spacing w:after="0" w:line="240" w:lineRule="auto" w:before="0"/>
               <w:jc w:val="center"/>
             </w:pPr>
             <w:r>
               <w:rPr>
                 <w:rFonts w:ascii="Times New Roman" w:hAnsi="Times New Roman"/>
                 <w:b w:val="0"/>
-                <w:sz w:val="16"/>
+                <w:sz w:val="14"/>
               </w:rPr>
               <w:t>√</w:t>
             </w:r>
@@ -13978,192 +14014,195 @@
         </w:tc>
         <w:tc>
           <w:tcPr>
-            <w:tcW w:type="dxa" w:w="459"/>
+            <w:tcW w:type="dxa" w:w="595"/>
             <w:vAlign w:val="center"/>
           </w:tcPr>
           <w:p>
             <w:pPr>
-              <w:spacing w:after="0" w:line="240" w:lineRule="auto"/>
+              <w:spacing w:after="0" w:line="240" w:lineRule="auto" w:before="0"/>
               <w:jc w:val="center"/>
             </w:pPr>
             <w:r>
               <w:rPr>
                 <w:rFonts w:ascii="Times New Roman" w:hAnsi="Times New Roman"/>
                 <w:b w:val="0"/>
-                <w:sz w:val="16"/>
-              </w:rPr>
-            </w:r>
-          </w:p>
-        </w:tc>
-        <w:tc>
-          <w:tcPr>
-            <w:tcW w:type="dxa" w:w="459"/>
+                <w:sz w:val="14"/>
+              </w:rPr>
+            </w:r>
+          </w:p>
+        </w:tc>
+        <w:tc>
+          <w:tcPr>
+            <w:tcW w:type="dxa" w:w="595"/>
             <w:vAlign w:val="center"/>
           </w:tcPr>
           <w:p>
             <w:pPr>
-              <w:spacing w:after="0" w:line="240" w:lineRule="auto"/>
+              <w:spacing w:after="0" w:line="240" w:lineRule="auto" w:before="0"/>
               <w:jc w:val="center"/>
             </w:pPr>
             <w:r>
               <w:rPr>
                 <w:rFonts w:ascii="Times New Roman" w:hAnsi="Times New Roman"/>
                 <w:b w:val="0"/>
-                <w:sz w:val="16"/>
-              </w:rPr>
-            </w:r>
-          </w:p>
-        </w:tc>
-        <w:tc>
-          <w:tcPr>
-            <w:tcW w:type="dxa" w:w="459"/>
+                <w:sz w:val="14"/>
+              </w:rPr>
+            </w:r>
+          </w:p>
+        </w:tc>
+        <w:tc>
+          <w:tcPr>
+            <w:tcW w:type="dxa" w:w="595"/>
             <w:vAlign w:val="center"/>
           </w:tcPr>
           <w:p>
             <w:pPr>
-              <w:spacing w:after="0" w:line="240" w:lineRule="auto"/>
+              <w:spacing w:after="0" w:line="240" w:lineRule="auto" w:before="0"/>
               <w:jc w:val="center"/>
             </w:pPr>
             <w:r>
               <w:rPr>
                 <w:rFonts w:ascii="Times New Roman" w:hAnsi="Times New Roman"/>
                 <w:b w:val="0"/>
-                <w:sz w:val="16"/>
-              </w:rPr>
-            </w:r>
-          </w:p>
-        </w:tc>
-        <w:tc>
-          <w:tcPr>
-            <w:tcW w:type="dxa" w:w="459"/>
+                <w:sz w:val="14"/>
+              </w:rPr>
+            </w:r>
+          </w:p>
+        </w:tc>
+        <w:tc>
+          <w:tcPr>
+            <w:tcW w:type="dxa" w:w="595"/>
             <w:vAlign w:val="center"/>
           </w:tcPr>
           <w:p>
             <w:pPr>
-              <w:spacing w:after="0" w:line="240" w:lineRule="auto"/>
+              <w:spacing w:after="0" w:line="240" w:lineRule="auto" w:before="0"/>
               <w:jc w:val="center"/>
             </w:pPr>
             <w:r>
               <w:rPr>
                 <w:rFonts w:ascii="Times New Roman" w:hAnsi="Times New Roman"/>
                 <w:b w:val="0"/>
-                <w:sz w:val="16"/>
-              </w:rPr>
-            </w:r>
-          </w:p>
-        </w:tc>
-        <w:tc>
-          <w:tcPr>
-            <w:tcW w:type="dxa" w:w="459"/>
+                <w:sz w:val="14"/>
+              </w:rPr>
+            </w:r>
+          </w:p>
+        </w:tc>
+        <w:tc>
+          <w:tcPr>
+            <w:tcW w:type="dxa" w:w="595"/>
             <w:vAlign w:val="center"/>
           </w:tcPr>
           <w:p>
             <w:pPr>
-              <w:spacing w:after="0" w:line="240" w:lineRule="auto"/>
+              <w:spacing w:after="0" w:line="240" w:lineRule="auto" w:before="0"/>
               <w:jc w:val="center"/>
             </w:pPr>
             <w:r>
               <w:rPr>
                 <w:rFonts w:ascii="Times New Roman" w:hAnsi="Times New Roman"/>
                 <w:b w:val="0"/>
-                <w:sz w:val="16"/>
-              </w:rPr>
-            </w:r>
-          </w:p>
-        </w:tc>
-        <w:tc>
-          <w:tcPr>
-            <w:tcW w:type="dxa" w:w="459"/>
+                <w:sz w:val="14"/>
+              </w:rPr>
+            </w:r>
+          </w:p>
+        </w:tc>
+        <w:tc>
+          <w:tcPr>
+            <w:tcW w:type="dxa" w:w="595"/>
             <w:vAlign w:val="center"/>
           </w:tcPr>
           <w:p>
             <w:pPr>
-              <w:spacing w:after="0" w:line="240" w:lineRule="auto"/>
+              <w:spacing w:after="0" w:line="240" w:lineRule="auto" w:before="0"/>
               <w:jc w:val="center"/>
             </w:pPr>
             <w:r>
               <w:rPr>
                 <w:rFonts w:ascii="Times New Roman" w:hAnsi="Times New Roman"/>
                 <w:b w:val="0"/>
-                <w:sz w:val="16"/>
-              </w:rPr>
-            </w:r>
-          </w:p>
-        </w:tc>
-        <w:tc>
-          <w:tcPr>
-            <w:tcW w:type="dxa" w:w="459"/>
+                <w:sz w:val="14"/>
+              </w:rPr>
+            </w:r>
+          </w:p>
+        </w:tc>
+        <w:tc>
+          <w:tcPr>
+            <w:tcW w:type="dxa" w:w="595"/>
             <w:vAlign w:val="center"/>
           </w:tcPr>
           <w:p>
             <w:pPr>
-              <w:spacing w:after="0" w:line="240" w:lineRule="auto"/>
+              <w:spacing w:after="0" w:line="240" w:lineRule="auto" w:before="0"/>
               <w:jc w:val="center"/>
             </w:pPr>
             <w:r>
               <w:rPr>
                 <w:rFonts w:ascii="Times New Roman" w:hAnsi="Times New Roman"/>
                 <w:b w:val="0"/>
-                <w:sz w:val="16"/>
-              </w:rPr>
-            </w:r>
-          </w:p>
-        </w:tc>
-        <w:tc>
-          <w:tcPr>
-            <w:tcW w:type="dxa" w:w="459"/>
+                <w:sz w:val="14"/>
+              </w:rPr>
+            </w:r>
+          </w:p>
+        </w:tc>
+        <w:tc>
+          <w:tcPr>
+            <w:tcW w:type="dxa" w:w="595"/>
             <w:vAlign w:val="center"/>
           </w:tcPr>
           <w:p>
             <w:pPr>
-              <w:spacing w:after="0" w:line="240" w:lineRule="auto"/>
+              <w:spacing w:after="0" w:line="240" w:lineRule="auto" w:before="0"/>
               <w:jc w:val="center"/>
             </w:pPr>
             <w:r>
               <w:rPr>
                 <w:rFonts w:ascii="Times New Roman" w:hAnsi="Times New Roman"/>
                 <w:b w:val="0"/>
-                <w:sz w:val="16"/>
-              </w:rPr>
-            </w:r>
-          </w:p>
-        </w:tc>
-        <w:tc>
-          <w:tcPr>
-            <w:tcW w:type="dxa" w:w="459"/>
+                <w:sz w:val="14"/>
+              </w:rPr>
+            </w:r>
+          </w:p>
+        </w:tc>
+        <w:tc>
+          <w:tcPr>
+            <w:tcW w:type="dxa" w:w="595"/>
             <w:vAlign w:val="center"/>
           </w:tcPr>
           <w:p>
             <w:pPr>
-              <w:spacing w:after="0" w:line="240" w:lineRule="auto"/>
+              <w:spacing w:after="0" w:line="240" w:lineRule="auto" w:before="0"/>
               <w:jc w:val="center"/>
             </w:pPr>
             <w:r>
               <w:rPr>
                 <w:rFonts w:ascii="Times New Roman" w:hAnsi="Times New Roman"/>
                 <w:b w:val="0"/>
-                <w:sz w:val="16"/>
+                <w:sz w:val="14"/>
               </w:rPr>
             </w:r>
           </w:p>
         </w:tc>
       </w:tr>
       <w:tr>
-        <w:tc>
-          <w:tcPr>
-            <w:tcW w:type="dxa" w:w="459"/>
+        <w:trPr>
+          <w:cantSplit/>
+        </w:trPr>
+        <w:tc>
+          <w:tcPr>
+            <w:tcW w:type="dxa" w:w="520"/>
             <w:vAlign w:val="center"/>
           </w:tcPr>
           <w:p>
             <w:pPr>
-              <w:spacing w:after="0" w:line="240" w:lineRule="auto"/>
+              <w:spacing w:after="0" w:line="240" w:lineRule="auto" w:before="0"/>
               <w:jc w:val="center"/>
             </w:pPr>
             <w:r>
               <w:rPr>
                 <w:rFonts w:ascii="Times New Roman" w:hAnsi="Times New Roman"/>
                 <w:b w:val="0"/>
-                <w:sz w:val="16"/>
+                <w:sz w:val="14"/>
               </w:rPr>
               <w:t>4.</w:t>
             </w:r>
@@ -14171,19 +14210,19 @@
         </w:tc>
         <w:tc>
           <w:tcPr>
-            <w:tcW w:type="dxa" w:w="459"/>
+            <w:tcW w:type="dxa" w:w="1850"/>
             <w:vAlign w:val="center"/>
           </w:tcPr>
           <w:p>
             <w:pPr>
-              <w:spacing w:after="0" w:line="240" w:lineRule="auto"/>
-              <w:jc w:val="left"/>
+              <w:spacing w:after="0" w:line="240" w:lineRule="auto" w:before="0"/>
+              <w:jc w:val="center"/>
             </w:pPr>
             <w:r>
               <w:rPr>
                 <w:rFonts w:ascii="Times New Roman" w:hAnsi="Times New Roman"/>
                 <w:b w:val="0"/>
-                <w:sz w:val="16"/>
+                <w:sz w:val="14"/>
               </w:rPr>
               <w:t>Perancangan Sistem</w:t>
             </w:r>
@@ -14191,133 +14230,133 @@
         </w:tc>
         <w:tc>
           <w:tcPr>
-            <w:tcW w:type="dxa" w:w="459"/>
+            <w:tcW w:type="dxa" w:w="595"/>
             <w:vAlign w:val="center"/>
           </w:tcPr>
           <w:p>
             <w:pPr>
-              <w:spacing w:after="0" w:line="240" w:lineRule="auto"/>
+              <w:spacing w:after="0" w:line="240" w:lineRule="auto" w:before="0"/>
               <w:jc w:val="center"/>
             </w:pPr>
             <w:r>
               <w:rPr>
                 <w:rFonts w:ascii="Times New Roman" w:hAnsi="Times New Roman"/>
                 <w:b w:val="0"/>
-                <w:sz w:val="16"/>
-              </w:rPr>
-            </w:r>
-          </w:p>
-        </w:tc>
-        <w:tc>
-          <w:tcPr>
-            <w:tcW w:type="dxa" w:w="459"/>
+                <w:sz w:val="14"/>
+              </w:rPr>
+            </w:r>
+          </w:p>
+        </w:tc>
+        <w:tc>
+          <w:tcPr>
+            <w:tcW w:type="dxa" w:w="595"/>
             <w:vAlign w:val="center"/>
           </w:tcPr>
           <w:p>
             <w:pPr>
-              <w:spacing w:after="0" w:line="240" w:lineRule="auto"/>
+              <w:spacing w:after="0" w:line="240" w:lineRule="auto" w:before="0"/>
               <w:jc w:val="center"/>
             </w:pPr>
             <w:r>
               <w:rPr>
                 <w:rFonts w:ascii="Times New Roman" w:hAnsi="Times New Roman"/>
                 <w:b w:val="0"/>
-                <w:sz w:val="16"/>
-              </w:rPr>
-            </w:r>
-          </w:p>
-        </w:tc>
-        <w:tc>
-          <w:tcPr>
-            <w:tcW w:type="dxa" w:w="459"/>
+                <w:sz w:val="14"/>
+              </w:rPr>
+            </w:r>
+          </w:p>
+        </w:tc>
+        <w:tc>
+          <w:tcPr>
+            <w:tcW w:type="dxa" w:w="595"/>
             <w:vAlign w:val="center"/>
           </w:tcPr>
           <w:p>
             <w:pPr>
-              <w:spacing w:after="0" w:line="240" w:lineRule="auto"/>
+              <w:spacing w:after="0" w:line="240" w:lineRule="auto" w:before="0"/>
               <w:jc w:val="center"/>
             </w:pPr>
             <w:r>
               <w:rPr>
                 <w:rFonts w:ascii="Times New Roman" w:hAnsi="Times New Roman"/>
                 <w:b w:val="0"/>
-                <w:sz w:val="16"/>
-              </w:rPr>
-            </w:r>
-          </w:p>
-        </w:tc>
-        <w:tc>
-          <w:tcPr>
-            <w:tcW w:type="dxa" w:w="459"/>
+                <w:sz w:val="14"/>
+              </w:rPr>
+            </w:r>
+          </w:p>
+        </w:tc>
+        <w:tc>
+          <w:tcPr>
+            <w:tcW w:type="dxa" w:w="595"/>
             <w:vAlign w:val="center"/>
           </w:tcPr>
           <w:p>
             <w:pPr>
-              <w:spacing w:after="0" w:line="240" w:lineRule="auto"/>
+              <w:spacing w:after="0" w:line="240" w:lineRule="auto" w:before="0"/>
               <w:jc w:val="center"/>
             </w:pPr>
             <w:r>
               <w:rPr>
                 <w:rFonts w:ascii="Times New Roman" w:hAnsi="Times New Roman"/>
                 <w:b w:val="0"/>
-                <w:sz w:val="16"/>
-              </w:rPr>
-            </w:r>
-          </w:p>
-        </w:tc>
-        <w:tc>
-          <w:tcPr>
-            <w:tcW w:type="dxa" w:w="459"/>
+                <w:sz w:val="14"/>
+              </w:rPr>
+            </w:r>
+          </w:p>
+        </w:tc>
+        <w:tc>
+          <w:tcPr>
+            <w:tcW w:type="dxa" w:w="595"/>
             <w:vAlign w:val="center"/>
           </w:tcPr>
           <w:p>
             <w:pPr>
-              <w:spacing w:after="0" w:line="240" w:lineRule="auto"/>
+              <w:spacing w:after="0" w:line="240" w:lineRule="auto" w:before="0"/>
               <w:jc w:val="center"/>
             </w:pPr>
             <w:r>
               <w:rPr>
                 <w:rFonts w:ascii="Times New Roman" w:hAnsi="Times New Roman"/>
                 <w:b w:val="0"/>
-                <w:sz w:val="16"/>
-              </w:rPr>
-            </w:r>
-          </w:p>
-        </w:tc>
-        <w:tc>
-          <w:tcPr>
-            <w:tcW w:type="dxa" w:w="459"/>
+                <w:sz w:val="14"/>
+              </w:rPr>
+            </w:r>
+          </w:p>
+        </w:tc>
+        <w:tc>
+          <w:tcPr>
+            <w:tcW w:type="dxa" w:w="595"/>
             <w:vAlign w:val="center"/>
           </w:tcPr>
           <w:p>
             <w:pPr>
-              <w:spacing w:after="0" w:line="240" w:lineRule="auto"/>
+              <w:spacing w:after="0" w:line="240" w:lineRule="auto" w:before="0"/>
               <w:jc w:val="center"/>
             </w:pPr>
             <w:r>
               <w:rPr>
                 <w:rFonts w:ascii="Times New Roman" w:hAnsi="Times New Roman"/>
                 <w:b w:val="0"/>
-                <w:sz w:val="16"/>
-              </w:rPr>
-            </w:r>
-          </w:p>
-        </w:tc>
-        <w:tc>
-          <w:tcPr>
-            <w:tcW w:type="dxa" w:w="459"/>
+                <w:sz w:val="14"/>
+              </w:rPr>
+            </w:r>
+          </w:p>
+        </w:tc>
+        <w:tc>
+          <w:tcPr>
+            <w:tcW w:type="dxa" w:w="595"/>
             <w:vAlign w:val="center"/>
           </w:tcPr>
           <w:p>
             <w:pPr>
-              <w:spacing w:after="0" w:line="240" w:lineRule="auto"/>
+              <w:spacing w:after="0" w:line="240" w:lineRule="auto" w:before="0"/>
               <w:jc w:val="center"/>
             </w:pPr>
             <w:r>
               <w:rPr>
                 <w:rFonts w:ascii="Times New Roman" w:hAnsi="Times New Roman"/>
                 <w:b w:val="0"/>
-                <w:sz w:val="16"/>
+                <w:sz w:val="14"/>
               </w:rPr>
               <w:t>√</w:t>
             </w:r>
@@ -14325,19 +14364,19 @@
         </w:tc>
         <w:tc>
           <w:tcPr>
-            <w:tcW w:type="dxa" w:w="459"/>
+            <w:tcW w:type="dxa" w:w="595"/>
             <w:vAlign w:val="center"/>
           </w:tcPr>
           <w:p>
             <w:pPr>
-              <w:spacing w:after="0" w:line="240" w:lineRule="auto"/>
+              <w:spacing w:after="0" w:line="240" w:lineRule="auto" w:before="0"/>
               <w:jc w:val="center"/>
             </w:pPr>
             <w:r>
               <w:rPr>
                 <w:rFonts w:ascii="Times New Roman" w:hAnsi="Times New Roman"/>
                 <w:b w:val="0"/>
-                <w:sz w:val="16"/>
+                <w:sz w:val="14"/>
               </w:rPr>
               <w:t>√</w:t>
             </w:r>
@@ -14345,19 +14384,19 @@
         </w:tc>
         <w:tc>
           <w:tcPr>
-            <w:tcW w:type="dxa" w:w="459"/>
+            <w:tcW w:type="dxa" w:w="595"/>
             <w:vAlign w:val="center"/>
           </w:tcPr>
           <w:p>
             <w:pPr>
-              <w:spacing w:after="0" w:line="240" w:lineRule="auto"/>
+              <w:spacing w:after="0" w:line="240" w:lineRule="auto" w:before="0"/>
               <w:jc w:val="center"/>
             </w:pPr>
             <w:r>
               <w:rPr>
                 <w:rFonts w:ascii="Times New Roman" w:hAnsi="Times New Roman"/>
                 <w:b w:val="0"/>
-                <w:sz w:val="16"/>
+                <w:sz w:val="14"/>
               </w:rPr>
               <w:t>√</w:t>
             </w:r>
@@ -14365,154 +14404,157 @@
         </w:tc>
         <w:tc>
           <w:tcPr>
-            <w:tcW w:type="dxa" w:w="459"/>
+            <w:tcW w:type="dxa" w:w="595"/>
             <w:vAlign w:val="center"/>
           </w:tcPr>
           <w:p>
             <w:pPr>
-              <w:spacing w:after="0" w:line="240" w:lineRule="auto"/>
+              <w:spacing w:after="0" w:line="240" w:lineRule="auto" w:before="0"/>
               <w:jc w:val="center"/>
             </w:pPr>
             <w:r>
               <w:rPr>
                 <w:rFonts w:ascii="Times New Roman" w:hAnsi="Times New Roman"/>
                 <w:b w:val="0"/>
-                <w:sz w:val="16"/>
-              </w:rPr>
-            </w:r>
-          </w:p>
-        </w:tc>
-        <w:tc>
-          <w:tcPr>
-            <w:tcW w:type="dxa" w:w="459"/>
+                <w:sz w:val="14"/>
+              </w:rPr>
+            </w:r>
+          </w:p>
+        </w:tc>
+        <w:tc>
+          <w:tcPr>
+            <w:tcW w:type="dxa" w:w="595"/>
             <w:vAlign w:val="center"/>
           </w:tcPr>
           <w:p>
             <w:pPr>
-              <w:spacing w:after="0" w:line="240" w:lineRule="auto"/>
+              <w:spacing w:after="0" w:line="240" w:lineRule="auto" w:before="0"/>
               <w:jc w:val="center"/>
             </w:pPr>
             <w:r>
               <w:rPr>
                 <w:rFonts w:ascii="Times New Roman" w:hAnsi="Times New Roman"/>
                 <w:b w:val="0"/>
-                <w:sz w:val="16"/>
-              </w:rPr>
-            </w:r>
-          </w:p>
-        </w:tc>
-        <w:tc>
-          <w:tcPr>
-            <w:tcW w:type="dxa" w:w="459"/>
+                <w:sz w:val="14"/>
+              </w:rPr>
+            </w:r>
+          </w:p>
+        </w:tc>
+        <w:tc>
+          <w:tcPr>
+            <w:tcW w:type="dxa" w:w="595"/>
             <w:vAlign w:val="center"/>
           </w:tcPr>
           <w:p>
             <w:pPr>
-              <w:spacing w:after="0" w:line="240" w:lineRule="auto"/>
+              <w:spacing w:after="0" w:line="240" w:lineRule="auto" w:before="0"/>
               <w:jc w:val="center"/>
             </w:pPr>
             <w:r>
               <w:rPr>
                 <w:rFonts w:ascii="Times New Roman" w:hAnsi="Times New Roman"/>
                 <w:b w:val="0"/>
-                <w:sz w:val="16"/>
-              </w:rPr>
-            </w:r>
-          </w:p>
-        </w:tc>
-        <w:tc>
-          <w:tcPr>
-            <w:tcW w:type="dxa" w:w="459"/>
+                <w:sz w:val="14"/>
+              </w:rPr>
+            </w:r>
+          </w:p>
+        </w:tc>
+        <w:tc>
+          <w:tcPr>
+            <w:tcW w:type="dxa" w:w="595"/>
             <w:vAlign w:val="center"/>
           </w:tcPr>
           <w:p>
             <w:pPr>
-              <w:spacing w:after="0" w:line="240" w:lineRule="auto"/>
+              <w:spacing w:after="0" w:line="240" w:lineRule="auto" w:before="0"/>
               <w:jc w:val="center"/>
             </w:pPr>
             <w:r>
               <w:rPr>
                 <w:rFonts w:ascii="Times New Roman" w:hAnsi="Times New Roman"/>
                 <w:b w:val="0"/>
-                <w:sz w:val="16"/>
-              </w:rPr>
-            </w:r>
-          </w:p>
-        </w:tc>
-        <w:tc>
-          <w:tcPr>
-            <w:tcW w:type="dxa" w:w="459"/>
+                <w:sz w:val="14"/>
+              </w:rPr>
+            </w:r>
+          </w:p>
+        </w:tc>
+        <w:tc>
+          <w:tcPr>
+            <w:tcW w:type="dxa" w:w="595"/>
             <w:vAlign w:val="center"/>
           </w:tcPr>
           <w:p>
             <w:pPr>
-              <w:spacing w:after="0" w:line="240" w:lineRule="auto"/>
+              <w:spacing w:after="0" w:line="240" w:lineRule="auto" w:before="0"/>
               <w:jc w:val="center"/>
             </w:pPr>
             <w:r>
               <w:rPr>
                 <w:rFonts w:ascii="Times New Roman" w:hAnsi="Times New Roman"/>
                 <w:b w:val="0"/>
-                <w:sz w:val="16"/>
-              </w:rPr>
-            </w:r>
-          </w:p>
-        </w:tc>
-        <w:tc>
-          <w:tcPr>
-            <w:tcW w:type="dxa" w:w="459"/>
+                <w:sz w:val="14"/>
+              </w:rPr>
+            </w:r>
+          </w:p>
+        </w:tc>
+        <w:tc>
+          <w:tcPr>
+            <w:tcW w:type="dxa" w:w="595"/>
             <w:vAlign w:val="center"/>
           </w:tcPr>
           <w:p>
             <w:pPr>
-              <w:spacing w:after="0" w:line="240" w:lineRule="auto"/>
+              <w:spacing w:after="0" w:line="240" w:lineRule="auto" w:before="0"/>
               <w:jc w:val="center"/>
             </w:pPr>
             <w:r>
               <w:rPr>
                 <w:rFonts w:ascii="Times New Roman" w:hAnsi="Times New Roman"/>
                 <w:b w:val="0"/>
-                <w:sz w:val="16"/>
-              </w:rPr>
-            </w:r>
-          </w:p>
-        </w:tc>
-        <w:tc>
-          <w:tcPr>
-            <w:tcW w:type="dxa" w:w="459"/>
+                <w:sz w:val="14"/>
+              </w:rPr>
+            </w:r>
+          </w:p>
+        </w:tc>
+        <w:tc>
+          <w:tcPr>
+            <w:tcW w:type="dxa" w:w="595"/>
             <w:vAlign w:val="center"/>
           </w:tcPr>
           <w:p>
             <w:pPr>
-              <w:spacing w:after="0" w:line="240" w:lineRule="auto"/>
+              <w:spacing w:after="0" w:line="240" w:lineRule="auto" w:before="0"/>
               <w:jc w:val="center"/>
             </w:pPr>
             <w:r>
               <w:rPr>
                 <w:rFonts w:ascii="Times New Roman" w:hAnsi="Times New Roman"/>
                 <w:b w:val="0"/>
-                <w:sz w:val="16"/>
+                <w:sz w:val="14"/>
               </w:rPr>
             </w:r>
           </w:p>
         </w:tc>
       </w:tr>
       <w:tr>
-        <w:tc>
-          <w:tcPr>
-            <w:tcW w:type="dxa" w:w="459"/>
+        <w:trPr>
+          <w:cantSplit/>
+        </w:trPr>
+        <w:tc>
+          <w:tcPr>
+            <w:tcW w:type="dxa" w:w="520"/>
             <w:vAlign w:val="center"/>
           </w:tcPr>
           <w:p>
             <w:pPr>
-              <w:spacing w:after="0" w:line="240" w:lineRule="auto"/>
+              <w:spacing w:after="0" w:line="240" w:lineRule="auto" w:before="0"/>
               <w:jc w:val="center"/>
             </w:pPr>
             <w:r>
               <w:rPr>
                 <w:rFonts w:ascii="Times New Roman" w:hAnsi="Times New Roman"/>
                 <w:b w:val="0"/>
-                <w:sz w:val="16"/>
+                <w:sz w:val="14"/>
               </w:rPr>
               <w:t>5.</w:t>
             </w:r>
@@ -14520,19 +14562,19 @@
         </w:tc>
         <w:tc>
           <w:tcPr>
-            <w:tcW w:type="dxa" w:w="459"/>
+            <w:tcW w:type="dxa" w:w="1850"/>
             <w:vAlign w:val="center"/>
           </w:tcPr>
           <w:p>
             <w:pPr>
-              <w:spacing w:after="0" w:line="240" w:lineRule="auto"/>
-              <w:jc w:val="left"/>
+              <w:spacing w:after="0" w:line="240" w:lineRule="auto" w:before="0"/>
+              <w:jc w:val="center"/>
             </w:pPr>
             <w:r>
               <w:rPr>
                 <w:rFonts w:ascii="Times New Roman" w:hAnsi="Times New Roman"/>
                 <w:b w:val="0"/>
-                <w:sz w:val="16"/>
+                <w:sz w:val="14"/>
               </w:rPr>
               <w:t>Pengembangan Sistem</w:t>
             </w:r>
@@ -14540,171 +14582,171 @@
         </w:tc>
         <w:tc>
           <w:tcPr>
-            <w:tcW w:type="dxa" w:w="459"/>
+            <w:tcW w:type="dxa" w:w="595"/>
             <w:vAlign w:val="center"/>
           </w:tcPr>
           <w:p>
             <w:pPr>
-              <w:spacing w:after="0" w:line="240" w:lineRule="auto"/>
+              <w:spacing w:after="0" w:line="240" w:lineRule="auto" w:before="0"/>
               <w:jc w:val="center"/>
             </w:pPr>
             <w:r>
               <w:rPr>
                 <w:rFonts w:ascii="Times New Roman" w:hAnsi="Times New Roman"/>
                 <w:b w:val="0"/>
-                <w:sz w:val="16"/>
-              </w:rPr>
-            </w:r>
-          </w:p>
-        </w:tc>
-        <w:tc>
-          <w:tcPr>
-            <w:tcW w:type="dxa" w:w="459"/>
+                <w:sz w:val="14"/>
+              </w:rPr>
+            </w:r>
+          </w:p>
+        </w:tc>
+        <w:tc>
+          <w:tcPr>
+            <w:tcW w:type="dxa" w:w="595"/>
             <w:vAlign w:val="center"/>
           </w:tcPr>
           <w:p>
             <w:pPr>
-              <w:spacing w:after="0" w:line="240" w:lineRule="auto"/>
+              <w:spacing w:after="0" w:line="240" w:lineRule="auto" w:before="0"/>
               <w:jc w:val="center"/>
             </w:pPr>
             <w:r>
               <w:rPr>
                 <w:rFonts w:ascii="Times New Roman" w:hAnsi="Times New Roman"/>
                 <w:b w:val="0"/>
-                <w:sz w:val="16"/>
-              </w:rPr>
-            </w:r>
-          </w:p>
-        </w:tc>
-        <w:tc>
-          <w:tcPr>
-            <w:tcW w:type="dxa" w:w="459"/>
+                <w:sz w:val="14"/>
+              </w:rPr>
+            </w:r>
+          </w:p>
+        </w:tc>
+        <w:tc>
+          <w:tcPr>
+            <w:tcW w:type="dxa" w:w="595"/>
             <w:vAlign w:val="center"/>
           </w:tcPr>
           <w:p>
             <w:pPr>
-              <w:spacing w:after="0" w:line="240" w:lineRule="auto"/>
+              <w:spacing w:after="0" w:line="240" w:lineRule="auto" w:before="0"/>
               <w:jc w:val="center"/>
             </w:pPr>
             <w:r>
               <w:rPr>
                 <w:rFonts w:ascii="Times New Roman" w:hAnsi="Times New Roman"/>
                 <w:b w:val="0"/>
-                <w:sz w:val="16"/>
-              </w:rPr>
-            </w:r>
-          </w:p>
-        </w:tc>
-        <w:tc>
-          <w:tcPr>
-            <w:tcW w:type="dxa" w:w="459"/>
+                <w:sz w:val="14"/>
+              </w:rPr>
+            </w:r>
+          </w:p>
+        </w:tc>
+        <w:tc>
+          <w:tcPr>
+            <w:tcW w:type="dxa" w:w="595"/>
             <w:vAlign w:val="center"/>
           </w:tcPr>
           <w:p>
             <w:pPr>
-              <w:spacing w:after="0" w:line="240" w:lineRule="auto"/>
+              <w:spacing w:after="0" w:line="240" w:lineRule="auto" w:before="0"/>
               <w:jc w:val="center"/>
             </w:pPr>
             <w:r>
               <w:rPr>
                 <w:rFonts w:ascii="Times New Roman" w:hAnsi="Times New Roman"/>
                 <w:b w:val="0"/>
-                <w:sz w:val="16"/>
-              </w:rPr>
-            </w:r>
-          </w:p>
-        </w:tc>
-        <w:tc>
-          <w:tcPr>
-            <w:tcW w:type="dxa" w:w="459"/>
+                <w:sz w:val="14"/>
+              </w:rPr>
+            </w:r>
+          </w:p>
+        </w:tc>
+        <w:tc>
+          <w:tcPr>
+            <w:tcW w:type="dxa" w:w="595"/>
             <w:vAlign w:val="center"/>
           </w:tcPr>
           <w:p>
             <w:pPr>
-              <w:spacing w:after="0" w:line="240" w:lineRule="auto"/>
+              <w:spacing w:after="0" w:line="240" w:lineRule="auto" w:before="0"/>
               <w:jc w:val="center"/>
             </w:pPr>
             <w:r>
               <w:rPr>
                 <w:rFonts w:ascii="Times New Roman" w:hAnsi="Times New Roman"/>
                 <w:b w:val="0"/>
-                <w:sz w:val="16"/>
-              </w:rPr>
-            </w:r>
-          </w:p>
-        </w:tc>
-        <w:tc>
-          <w:tcPr>
-            <w:tcW w:type="dxa" w:w="459"/>
+                <w:sz w:val="14"/>
+              </w:rPr>
+            </w:r>
+          </w:p>
+        </w:tc>
+        <w:tc>
+          <w:tcPr>
+            <w:tcW w:type="dxa" w:w="595"/>
             <w:vAlign w:val="center"/>
           </w:tcPr>
           <w:p>
             <w:pPr>
-              <w:spacing w:after="0" w:line="240" w:lineRule="auto"/>
+              <w:spacing w:after="0" w:line="240" w:lineRule="auto" w:before="0"/>
               <w:jc w:val="center"/>
             </w:pPr>
             <w:r>
               <w:rPr>
                 <w:rFonts w:ascii="Times New Roman" w:hAnsi="Times New Roman"/>
                 <w:b w:val="0"/>
-                <w:sz w:val="16"/>
-              </w:rPr>
-            </w:r>
-          </w:p>
-        </w:tc>
-        <w:tc>
-          <w:tcPr>
-            <w:tcW w:type="dxa" w:w="459"/>
+                <w:sz w:val="14"/>
+              </w:rPr>
+            </w:r>
+          </w:p>
+        </w:tc>
+        <w:tc>
+          <w:tcPr>
+            <w:tcW w:type="dxa" w:w="595"/>
             <w:vAlign w:val="center"/>
           </w:tcPr>
           <w:p>
             <w:pPr>
-              <w:spacing w:after="0" w:line="240" w:lineRule="auto"/>
+              <w:spacing w:after="0" w:line="240" w:lineRule="auto" w:before="0"/>
               <w:jc w:val="center"/>
             </w:pPr>
             <w:r>
               <w:rPr>
                 <w:rFonts w:ascii="Times New Roman" w:hAnsi="Times New Roman"/>
                 <w:b w:val="0"/>
-                <w:sz w:val="16"/>
-              </w:rPr>
-            </w:r>
-          </w:p>
-        </w:tc>
-        <w:tc>
-          <w:tcPr>
-            <w:tcW w:type="dxa" w:w="459"/>
+                <w:sz w:val="14"/>
+              </w:rPr>
+            </w:r>
+          </w:p>
+        </w:tc>
+        <w:tc>
+          <w:tcPr>
+            <w:tcW w:type="dxa" w:w="595"/>
             <w:vAlign w:val="center"/>
           </w:tcPr>
           <w:p>
             <w:pPr>
-              <w:spacing w:after="0" w:line="240" w:lineRule="auto"/>
+              <w:spacing w:after="0" w:line="240" w:lineRule="auto" w:before="0"/>
               <w:jc w:val="center"/>
             </w:pPr>
             <w:r>
               <w:rPr>
                 <w:rFonts w:ascii="Times New Roman" w:hAnsi="Times New Roman"/>
                 <w:b w:val="0"/>
-                <w:sz w:val="16"/>
-              </w:rPr>
-            </w:r>
-          </w:p>
-        </w:tc>
-        <w:tc>
-          <w:tcPr>
-            <w:tcW w:type="dxa" w:w="459"/>
+                <w:sz w:val="14"/>
+              </w:rPr>
+            </w:r>
+          </w:p>
+        </w:tc>
+        <w:tc>
+          <w:tcPr>
+            <w:tcW w:type="dxa" w:w="595"/>
             <w:vAlign w:val="center"/>
           </w:tcPr>
           <w:p>
             <w:pPr>
-              <w:spacing w:after="0" w:line="240" w:lineRule="auto"/>
+              <w:spacing w:after="0" w:line="240" w:lineRule="auto" w:before="0"/>
               <w:jc w:val="center"/>
             </w:pPr>
             <w:r>
               <w:rPr>
                 <w:rFonts w:ascii="Times New Roman" w:hAnsi="Times New Roman"/>
                 <w:b w:val="0"/>
-                <w:sz w:val="16"/>
+                <w:sz w:val="14"/>
               </w:rPr>
               <w:t>√</w:t>
             </w:r>
@@ -14712,19 +14754,19 @@
         </w:tc>
         <w:tc>
           <w:tcPr>
-            <w:tcW w:type="dxa" w:w="459"/>
+            <w:tcW w:type="dxa" w:w="595"/>
             <w:vAlign w:val="center"/>
           </w:tcPr>
           <w:p>
             <w:pPr>
-              <w:spacing w:after="0" w:line="240" w:lineRule="auto"/>
+              <w:spacing w:after="0" w:line="240" w:lineRule="auto" w:before="0"/>
               <w:jc w:val="center"/>
             </w:pPr>
             <w:r>
               <w:rPr>
                 <w:rFonts w:ascii="Times New Roman" w:hAnsi="Times New Roman"/>
                 <w:b w:val="0"/>
-                <w:sz w:val="16"/>
+                <w:sz w:val="14"/>
               </w:rPr>
               <w:t>√</w:t>
             </w:r>
@@ -14732,19 +14774,19 @@
         </w:tc>
         <w:tc>
           <w:tcPr>
-            <w:tcW w:type="dxa" w:w="459"/>
+            <w:tcW w:type="dxa" w:w="595"/>
             <w:vAlign w:val="center"/>
           </w:tcPr>
           <w:p>
             <w:pPr>
-              <w:spacing w:after="0" w:line="240" w:lineRule="auto"/>
+              <w:spacing w:after="0" w:line="240" w:lineRule="auto" w:before="0"/>
               <w:jc w:val="center"/>
             </w:pPr>
             <w:r>
               <w:rPr>
                 <w:rFonts w:ascii="Times New Roman" w:hAnsi="Times New Roman"/>
                 <w:b w:val="0"/>
-                <w:sz w:val="16"/>
+                <w:sz w:val="14"/>
               </w:rPr>
               <w:t>√</w:t>
             </w:r>
@@ -14752,19 +14794,19 @@
         </w:tc>
         <w:tc>
           <w:tcPr>
-            <w:tcW w:type="dxa" w:w="459"/>
+            <w:tcW w:type="dxa" w:w="595"/>
             <w:vAlign w:val="center"/>
           </w:tcPr>
           <w:p>
             <w:pPr>
-              <w:spacing w:after="0" w:line="240" w:lineRule="auto"/>
+              <w:spacing w:after="0" w:line="240" w:lineRule="auto" w:before="0"/>
               <w:jc w:val="center"/>
             </w:pPr>
             <w:r>
               <w:rPr>
                 <w:rFonts w:ascii="Times New Roman" w:hAnsi="Times New Roman"/>
                 <w:b w:val="0"/>
-                <w:sz w:val="16"/>
+                <w:sz w:val="14"/>
               </w:rPr>
               <w:t>√</w:t>
             </w:r>
@@ -14772,97 +14814,100 @@
         </w:tc>
         <w:tc>
           <w:tcPr>
-            <w:tcW w:type="dxa" w:w="459"/>
+            <w:tcW w:type="dxa" w:w="595"/>
             <w:vAlign w:val="center"/>
           </w:tcPr>
           <w:p>
             <w:pPr>
-              <w:spacing w:after="0" w:line="240" w:lineRule="auto"/>
+              <w:spacing w:after="0" w:line="240" w:lineRule="auto" w:before="0"/>
               <w:jc w:val="center"/>
             </w:pPr>
             <w:r>
               <w:rPr>
                 <w:rFonts w:ascii="Times New Roman" w:hAnsi="Times New Roman"/>
                 <w:b w:val="0"/>
-                <w:sz w:val="16"/>
-              </w:rPr>
-            </w:r>
-          </w:p>
-        </w:tc>
-        <w:tc>
-          <w:tcPr>
-            <w:tcW w:type="dxa" w:w="459"/>
+                <w:sz w:val="14"/>
+              </w:rPr>
+            </w:r>
+          </w:p>
+        </w:tc>
+        <w:tc>
+          <w:tcPr>
+            <w:tcW w:type="dxa" w:w="595"/>
             <w:vAlign w:val="center"/>
           </w:tcPr>
           <w:p>
             <w:pPr>
-              <w:spacing w:after="0" w:line="240" w:lineRule="auto"/>
+              <w:spacing w:after="0" w:line="240" w:lineRule="auto" w:before="0"/>
               <w:jc w:val="center"/>
             </w:pPr>
             <w:r>
               <w:rPr>
                 <w:rFonts w:ascii="Times New Roman" w:hAnsi="Times New Roman"/>
                 <w:b w:val="0"/>
-                <w:sz w:val="16"/>
-              </w:rPr>
-            </w:r>
-          </w:p>
-        </w:tc>
-        <w:tc>
-          <w:tcPr>
-            <w:tcW w:type="dxa" w:w="459"/>
+                <w:sz w:val="14"/>
+              </w:rPr>
+            </w:r>
+          </w:p>
+        </w:tc>
+        <w:tc>
+          <w:tcPr>
+            <w:tcW w:type="dxa" w:w="595"/>
             <w:vAlign w:val="center"/>
           </w:tcPr>
           <w:p>
             <w:pPr>
-              <w:spacing w:after="0" w:line="240" w:lineRule="auto"/>
+              <w:spacing w:after="0" w:line="240" w:lineRule="auto" w:before="0"/>
               <w:jc w:val="center"/>
             </w:pPr>
             <w:r>
               <w:rPr>
                 <w:rFonts w:ascii="Times New Roman" w:hAnsi="Times New Roman"/>
                 <w:b w:val="0"/>
-                <w:sz w:val="16"/>
-              </w:rPr>
-            </w:r>
-          </w:p>
-        </w:tc>
-        <w:tc>
-          <w:tcPr>
-            <w:tcW w:type="dxa" w:w="459"/>
+                <w:sz w:val="14"/>
+              </w:rPr>
+            </w:r>
+          </w:p>
+        </w:tc>
+        <w:tc>
+          <w:tcPr>
+            <w:tcW w:type="dxa" w:w="595"/>
             <w:vAlign w:val="center"/>
           </w:tcPr>
           <w:p>
             <w:pPr>
-              <w:spacing w:after="0" w:line="240" w:lineRule="auto"/>
+              <w:spacing w:after="0" w:line="240" w:lineRule="auto" w:before="0"/>
               <w:jc w:val="center"/>
             </w:pPr>
             <w:r>
               <w:rPr>
                 <w:rFonts w:ascii="Times New Roman" w:hAnsi="Times New Roman"/>
                 <w:b w:val="0"/>
-                <w:sz w:val="16"/>
+                <w:sz w:val="14"/>
               </w:rPr>
             </w:r>
           </w:p>
         </w:tc>
       </w:tr>
       <w:tr>
-        <w:tc>
-          <w:tcPr>
-            <w:tcW w:type="dxa" w:w="459"/>
+        <w:trPr>
+          <w:cantSplit/>
+        </w:trPr>
+        <w:tc>
+          <w:tcPr>
+            <w:tcW w:type="dxa" w:w="520"/>
             <w:vAlign w:val="center"/>
           </w:tcPr>
           <w:p>
             <w:pPr>
-              <w:spacing w:after="0" w:line="240" w:lineRule="auto"/>
+              <w:spacing w:after="0" w:line="240" w:lineRule="auto" w:before="0"/>
               <w:jc w:val="center"/>
             </w:pPr>
             <w:r>
               <w:rPr>
                 <w:rFonts w:ascii="Times New Roman" w:hAnsi="Times New Roman"/>
                 <w:b w:val="0"/>
-                <w:sz w:val="16"/>
+                <w:sz w:val="14"/>
               </w:rPr>
               <w:t>6.</w:t>
             </w:r>
@@ -14870,19 +14915,19 @@
         </w:tc>
         <w:tc>
           <w:tcPr>
-            <w:tcW w:type="dxa" w:w="459"/>
+            <w:tcW w:type="dxa" w:w="1850"/>
             <w:vAlign w:val="center"/>
           </w:tcPr>
           <w:p>
             <w:pPr>
-              <w:spacing w:after="0" w:line="240" w:lineRule="auto"/>
-              <w:jc w:val="left"/>
+              <w:spacing w:after="0" w:line="240" w:lineRule="auto" w:before="0"/>
+              <w:jc w:val="center"/>
             </w:pPr>
             <w:r>
               <w:rPr>
                 <w:rFonts w:ascii="Times New Roman" w:hAnsi="Times New Roman"/>
                 <w:b w:val="0"/>
-                <w:sz w:val="16"/>
+                <w:sz w:val="14"/>
               </w:rPr>
               <w:t xml:space="preserve">Pengujian Sistem </w:t>
             </w:r>
@@ -14891,7 +14936,7 @@
                 <w:rFonts w:ascii="Times New Roman" w:hAnsi="Times New Roman"/>
                 <w:b w:val="0"/>
                 <w:i/>
-                <w:sz w:val="16"/>
+                <w:sz w:val="14"/>
               </w:rPr>
               <w:t>Black Box Testing</w:t>
             </w:r>
@@ -14899,228 +14944,228 @@
         </w:tc>
         <w:tc>
           <w:tcPr>
-            <w:tcW w:type="dxa" w:w="459"/>
+            <w:tcW w:type="dxa" w:w="595"/>
             <w:vAlign w:val="center"/>
           </w:tcPr>
           <w:p>
             <w:pPr>
-              <w:spacing w:after="0" w:line="240" w:lineRule="auto"/>
+              <w:spacing w:after="0" w:line="240" w:lineRule="auto" w:before="0"/>
               <w:jc w:val="center"/>
             </w:pPr>
             <w:r>
               <w:rPr>
                 <w:rFonts w:ascii="Times New Roman" w:hAnsi="Times New Roman"/>
                 <w:b w:val="0"/>
-                <w:sz w:val="16"/>
-              </w:rPr>
-            </w:r>
-          </w:p>
-        </w:tc>
-        <w:tc>
-          <w:tcPr>
-            <w:tcW w:type="dxa" w:w="459"/>
+                <w:sz w:val="14"/>
+              </w:rPr>
+            </w:r>
+          </w:p>
+        </w:tc>
+        <w:tc>
+          <w:tcPr>
+            <w:tcW w:type="dxa" w:w="595"/>
             <w:vAlign w:val="center"/>
           </w:tcPr>
           <w:p>
             <w:pPr>
-              <w:spacing w:after="0" w:line="240" w:lineRule="auto"/>
+              <w:spacing w:after="0" w:line="240" w:lineRule="auto" w:before="0"/>
               <w:jc w:val="center"/>
             </w:pPr>
             <w:r>
               <w:rPr>
                 <w:rFonts w:ascii="Times New Roman" w:hAnsi="Times New Roman"/>
                 <w:b w:val="0"/>
-                <w:sz w:val="16"/>
-              </w:rPr>
-            </w:r>
-          </w:p>
-        </w:tc>
-        <w:tc>
-          <w:tcPr>
-            <w:tcW w:type="dxa" w:w="459"/>
+                <w:sz w:val="14"/>
+              </w:rPr>
+            </w:r>
+          </w:p>
+        </w:tc>
+        <w:tc>
+          <w:tcPr>
+            <w:tcW w:type="dxa" w:w="595"/>
             <w:vAlign w:val="center"/>
           </w:tcPr>
           <w:p>
             <w:pPr>
-              <w:spacing w:after="0" w:line="240" w:lineRule="auto"/>
+              <w:spacing w:after="0" w:line="240" w:lineRule="auto" w:before="0"/>
               <w:jc w:val="center"/>
             </w:pPr>
             <w:r>
               <w:rPr>
                 <w:rFonts w:ascii="Times New Roman" w:hAnsi="Times New Roman"/>
                 <w:b w:val="0"/>
-                <w:sz w:val="16"/>
-              </w:rPr>
-            </w:r>
-          </w:p>
-        </w:tc>
-        <w:tc>
-          <w:tcPr>
-            <w:tcW w:type="dxa" w:w="459"/>
+                <w:sz w:val="14"/>
+              </w:rPr>
+            </w:r>
+          </w:p>
+        </w:tc>
+        <w:tc>
+          <w:tcPr>
+            <w:tcW w:type="dxa" w:w="595"/>
             <w:vAlign w:val="center"/>
           </w:tcPr>
           <w:p>
             <w:pPr>
-              <w:spacing w:after="0" w:line="240" w:lineRule="auto"/>
+              <w:spacing w:after="0" w:line="240" w:lineRule="auto" w:before="0"/>
               <w:jc w:val="center"/>
             </w:pPr>
             <w:r>
               <w:rPr>
                 <w:rFonts w:ascii="Times New Roman" w:hAnsi="Times New Roman"/>
                 <w:b w:val="0"/>
-                <w:sz w:val="16"/>
-              </w:rPr>
-            </w:r>
-          </w:p>
-        </w:tc>
-        <w:tc>
-          <w:tcPr>
-            <w:tcW w:type="dxa" w:w="459"/>
+                <w:sz w:val="14"/>
+              </w:rPr>
+            </w:r>
+          </w:p>
+        </w:tc>
+        <w:tc>
+          <w:tcPr>
+            <w:tcW w:type="dxa" w:w="595"/>
             <w:vAlign w:val="center"/>
           </w:tcPr>
           <w:p>
             <w:pPr>
-              <w:spacing w:after="0" w:line="240" w:lineRule="auto"/>
+              <w:spacing w:after="0" w:line="240" w:lineRule="auto" w:before="0"/>
               <w:jc w:val="center"/>
             </w:pPr>
             <w:r>
               <w:rPr>
                 <w:rFonts w:ascii="Times New Roman" w:hAnsi="Times New Roman"/>
                 <w:b w:val="0"/>
-                <w:sz w:val="16"/>
-              </w:rPr>
-            </w:r>
-          </w:p>
-        </w:tc>
-        <w:tc>
-          <w:tcPr>
-            <w:tcW w:type="dxa" w:w="459"/>
+                <w:sz w:val="14"/>
+              </w:rPr>
+            </w:r>
+          </w:p>
+        </w:tc>
+        <w:tc>
+          <w:tcPr>
+            <w:tcW w:type="dxa" w:w="595"/>
             <w:vAlign w:val="center"/>
           </w:tcPr>
           <w:p>
             <w:pPr>
-              <w:spacing w:after="0" w:line="240" w:lineRule="auto"/>
+              <w:spacing w:after="0" w:line="240" w:lineRule="auto" w:before="0"/>
               <w:jc w:val="center"/>
             </w:pPr>
             <w:r>
               <w:rPr>
                 <w:rFonts w:ascii="Times New Roman" w:hAnsi="Times New Roman"/>
                 <w:b w:val="0"/>
-                <w:sz w:val="16"/>
-              </w:rPr>
-            </w:r>
-          </w:p>
-        </w:tc>
-        <w:tc>
-          <w:tcPr>
-            <w:tcW w:type="dxa" w:w="459"/>
+                <w:sz w:val="14"/>
+              </w:rPr>
+            </w:r>
+          </w:p>
+        </w:tc>
+        <w:tc>
+          <w:tcPr>
+            <w:tcW w:type="dxa" w:w="595"/>
             <w:vAlign w:val="center"/>
           </w:tcPr>
           <w:p>
             <w:pPr>
-              <w:spacing w:after="0" w:line="240" w:lineRule="auto"/>
+              <w:spacing w:after="0" w:line="240" w:lineRule="auto" w:before="0"/>
               <w:jc w:val="center"/>
             </w:pPr>
             <w:r>
               <w:rPr>
                 <w:rFonts w:ascii="Times New Roman" w:hAnsi="Times New Roman"/>
                 <w:b w:val="0"/>
-                <w:sz w:val="16"/>
-              </w:rPr>
-            </w:r>
-          </w:p>
-        </w:tc>
-        <w:tc>
-          <w:tcPr>
-            <w:tcW w:type="dxa" w:w="459"/>
+                <w:sz w:val="14"/>
+              </w:rPr>
+            </w:r>
+          </w:p>
+        </w:tc>
+        <w:tc>
+          <w:tcPr>
+            <w:tcW w:type="dxa" w:w="595"/>
             <w:vAlign w:val="center"/>
           </w:tcPr>
           <w:p>
             <w:pPr>
-              <w:spacing w:after="0" w:line="240" w:lineRule="auto"/>
+              <w:spacing w:after="0" w:line="240" w:lineRule="auto" w:before="0"/>
               <w:jc w:val="center"/>
             </w:pPr>
             <w:r>
               <w:rPr>
                 <w:rFonts w:ascii="Times New Roman" w:hAnsi="Times New Roman"/>
                 <w:b w:val="0"/>
-                <w:sz w:val="16"/>
-              </w:rPr>
-            </w:r>
-          </w:p>
-        </w:tc>
-        <w:tc>
-          <w:tcPr>
-            <w:tcW w:type="dxa" w:w="459"/>
+                <w:sz w:val="14"/>
+              </w:rPr>
+            </w:r>
+          </w:p>
+        </w:tc>
+        <w:tc>
+          <w:tcPr>
+            <w:tcW w:type="dxa" w:w="595"/>
             <w:vAlign w:val="center"/>
           </w:tcPr>
           <w:p>
             <w:pPr>
-              <w:spacing w:after="0" w:line="240" w:lineRule="auto"/>
+              <w:spacing w:after="0" w:line="240" w:lineRule="auto" w:before="0"/>
               <w:jc w:val="center"/>
             </w:pPr>
             <w:r>
               <w:rPr>
                 <w:rFonts w:ascii="Times New Roman" w:hAnsi="Times New Roman"/>
                 <w:b w:val="0"/>
-                <w:sz w:val="16"/>
-              </w:rPr>
-            </w:r>
-          </w:p>
-        </w:tc>
-        <w:tc>
-          <w:tcPr>
-            <w:tcW w:type="dxa" w:w="459"/>
+                <w:sz w:val="14"/>
+              </w:rPr>
+            </w:r>
+          </w:p>
+        </w:tc>
+        <w:tc>
+          <w:tcPr>
+            <w:tcW w:type="dxa" w:w="595"/>
             <w:vAlign w:val="center"/>
           </w:tcPr>
           <w:p>
             <w:pPr>
-              <w:spacing w:after="0" w:line="240" w:lineRule="auto"/>
+              <w:spacing w:after="0" w:line="240" w:lineRule="auto" w:before="0"/>
               <w:jc w:val="center"/>
             </w:pPr>
             <w:r>
               <w:rPr>
                 <w:rFonts w:ascii="Times New Roman" w:hAnsi="Times New Roman"/>
                 <w:b w:val="0"/>
-                <w:sz w:val="16"/>
-              </w:rPr>
-            </w:r>
-          </w:p>
-        </w:tc>
-        <w:tc>
-          <w:tcPr>
-            <w:tcW w:type="dxa" w:w="459"/>
+                <w:sz w:val="14"/>
+              </w:rPr>
+            </w:r>
+          </w:p>
+        </w:tc>
+        <w:tc>
+          <w:tcPr>
+            <w:tcW w:type="dxa" w:w="595"/>
             <w:vAlign w:val="center"/>
           </w:tcPr>
           <w:p>
             <w:pPr>
-              <w:spacing w:after="0" w:line="240" w:lineRule="auto"/>
+              <w:spacing w:after="0" w:line="240" w:lineRule="auto" w:before="0"/>
               <w:jc w:val="center"/>
             </w:pPr>
             <w:r>
               <w:rPr>
                 <w:rFonts w:ascii="Times New Roman" w:hAnsi="Times New Roman"/>
                 <w:b w:val="0"/>
-                <w:sz w:val="16"/>
-              </w:rPr>
-            </w:r>
-          </w:p>
-        </w:tc>
-        <w:tc>
-          <w:tcPr>
-            <w:tcW w:type="dxa" w:w="459"/>
+                <w:sz w:val="14"/>
+              </w:rPr>
+            </w:r>
+          </w:p>
+        </w:tc>
+        <w:tc>
+          <w:tcPr>
+            <w:tcW w:type="dxa" w:w="595"/>
             <w:vAlign w:val="center"/>
           </w:tcPr>
           <w:p>
             <w:pPr>
-              <w:spacing w:after="0" w:line="240" w:lineRule="auto"/>
+              <w:spacing w:after="0" w:line="240" w:lineRule="auto" w:before="0"/>
               <w:jc w:val="center"/>
             </w:pPr>
             <w:r>
               <w:rPr>
                 <w:rFonts w:ascii="Times New Roman" w:hAnsi="Times New Roman"/>
                 <w:b w:val="0"/>
-                <w:sz w:val="16"/>
+                <w:sz w:val="14"/>
               </w:rPr>
               <w:t>√</w:t>
             </w:r>
@@ -15128,19 +15173,19 @@
         </w:tc>
         <w:tc>
           <w:tcPr>
-            <w:tcW w:type="dxa" w:w="459"/>
+            <w:tcW w:type="dxa" w:w="595"/>
             <w:vAlign w:val="center"/>
           </w:tcPr>
           <w:p>
             <w:pPr>
-              <w:spacing w:after="0" w:line="240" w:lineRule="auto"/>
+              <w:spacing w:after="0" w:line="240" w:lineRule="auto" w:before="0"/>
               <w:jc w:val="center"/>
             </w:pPr>
             <w:r>
               <w:rPr>
                 <w:rFonts w:ascii="Times New Roman" w:hAnsi="Times New Roman"/>
                 <w:b w:val="0"/>
-                <w:sz w:val="16"/>
+                <w:sz w:val="14"/>
               </w:rPr>
               <w:t>√</w:t>
             </w:r>
@@ -15148,78 +15193,81 @@
         </w:tc>
         <w:tc>
           <w:tcPr>
-            <w:tcW w:type="dxa" w:w="459"/>
+            <w:tcW w:type="dxa" w:w="595"/>
             <w:vAlign w:val="center"/>
           </w:tcPr>
           <w:p>
             <w:pPr>
-              <w:spacing w:after="0" w:line="240" w:lineRule="auto"/>
+              <w:spacing w:after="0" w:line="240" w:lineRule="auto" w:before="0"/>
               <w:jc w:val="center"/>
             </w:pPr>
             <w:r>
               <w:rPr>
                 <w:rFonts w:ascii="Times New Roman" w:hAnsi="Times New Roman"/>
                 <w:b w:val="0"/>
-                <w:sz w:val="16"/>
-              </w:rPr>
-            </w:r>
-          </w:p>
-        </w:tc>
-        <w:tc>
-          <w:tcPr>
-            <w:tcW w:type="dxa" w:w="459"/>
+                <w:sz w:val="14"/>
+              </w:rPr>
+            </w:r>
+          </w:p>
+        </w:tc>
+        <w:tc>
+          <w:tcPr>
+            <w:tcW w:type="dxa" w:w="595"/>
             <w:vAlign w:val="center"/>
           </w:tcPr>
           <w:p>
             <w:pPr>
-              <w:spacing w:after="0" w:line="240" w:lineRule="auto"/>
+              <w:spacing w:after="0" w:line="240" w:lineRule="auto" w:before="0"/>
               <w:jc w:val="center"/>
             </w:pPr>
             <w:r>
               <w:rPr>
                 <w:rFonts w:ascii="Times New Roman" w:hAnsi="Times New Roman"/>
                 <w:b w:val="0"/>
-                <w:sz w:val="16"/>
-              </w:rPr>
-            </w:r>
-          </w:p>
-        </w:tc>
-        <w:tc>
-          <w:tcPr>
-            <w:tcW w:type="dxa" w:w="459"/>
+                <w:sz w:val="14"/>
+              </w:rPr>
+            </w:r>
+          </w:p>
+        </w:tc>
+        <w:tc>
+          <w:tcPr>
+            <w:tcW w:type="dxa" w:w="595"/>
             <w:vAlign w:val="center"/>
           </w:tcPr>
           <w:p>
             <w:pPr>
-              <w:spacing w:after="0" w:line="240" w:lineRule="auto"/>
+              <w:spacing w:after="0" w:line="240" w:lineRule="auto" w:before="0"/>
               <w:jc w:val="center"/>
             </w:pPr>
             <w:r>
               <w:rPr>
                 <w:rFonts w:ascii="Times New Roman" w:hAnsi="Times New Roman"/>
                 <w:b w:val="0"/>
-                <w:sz w:val="16"/>
+                <w:sz w:val="14"/>
               </w:rPr>
             </w:r>
           </w:p>
         </w:tc>
       </w:tr>
       <w:tr>
-        <w:tc>
-          <w:tcPr>
-            <w:tcW w:type="dxa" w:w="459"/>
+        <w:trPr>
+          <w:cantSplit/>
+        </w:trPr>
+        <w:tc>
+          <w:tcPr>
+            <w:tcW w:type="dxa" w:w="520"/>
             <w:vAlign w:val="center"/>
           </w:tcPr>
           <w:p>
             <w:pPr>
-              <w:spacing w:after="0" w:line="240" w:lineRule="auto"/>
+              <w:spacing w:after="0" w:line="240" w:lineRule="auto" w:before="0"/>
               <w:jc w:val="center"/>
             </w:pPr>
             <w:r>
               <w:rPr>
                 <w:rFonts w:ascii="Times New Roman" w:hAnsi="Times New Roman"/>
                 <w:b w:val="0"/>
-                <w:sz w:val="16"/>
+                <w:sz w:val="14"/>
               </w:rPr>
               <w:t>7.</w:t>
             </w:r>
@@ -15227,19 +15275,19 @@
         </w:tc>
         <w:tc>
           <w:tcPr>
-            <w:tcW w:type="dxa" w:w="459"/>
+            <w:tcW w:type="dxa" w:w="1850"/>
             <w:vAlign w:val="center"/>
           </w:tcPr>
           <w:p>
             <w:pPr>
-              <w:spacing w:after="0" w:line="240" w:lineRule="auto"/>
-              <w:jc w:val="left"/>
+              <w:spacing w:after="0" w:line="240" w:lineRule="auto" w:before="0"/>
+              <w:jc w:val="center"/>
             </w:pPr>
             <w:r>
               <w:rPr>
                 <w:rFonts w:ascii="Times New Roman" w:hAnsi="Times New Roman"/>
                 <w:b w:val="0"/>
-                <w:sz w:val="16"/>
+                <w:sz w:val="14"/>
               </w:rPr>
               <w:t>Evaluasi Sistem</w:t>
             </w:r>
@@ -15247,247 +15295,247 @@
         </w:tc>
         <w:tc>
           <w:tcPr>
-            <w:tcW w:type="dxa" w:w="459"/>
+            <w:tcW w:type="dxa" w:w="595"/>
             <w:vAlign w:val="center"/>
           </w:tcPr>
           <w:p>
             <w:pPr>
-              <w:spacing w:after="0" w:line="240" w:lineRule="auto"/>
+              <w:spacing w:after="0" w:line="240" w:lineRule="auto" w:before="0"/>
               <w:jc w:val="center"/>
             </w:pPr>
             <w:r>
               <w:rPr>
                 <w:rFonts w:ascii="Times New Roman" w:hAnsi="Times New Roman"/>
                 <w:b w:val="0"/>
-                <w:sz w:val="16"/>
-              </w:rPr>
-            </w:r>
-          </w:p>
-        </w:tc>
-        <w:tc>
-          <w:tcPr>
-            <w:tcW w:type="dxa" w:w="459"/>
+                <w:sz w:val="14"/>
+              </w:rPr>
+            </w:r>
+          </w:p>
+        </w:tc>
+        <w:tc>
+          <w:tcPr>
+            <w:tcW w:type="dxa" w:w="595"/>
             <w:vAlign w:val="center"/>
           </w:tcPr>
           <w:p>
             <w:pPr>
-              <w:spacing w:after="0" w:line="240" w:lineRule="auto"/>
+              <w:spacing w:after="0" w:line="240" w:lineRule="auto" w:before="0"/>
               <w:jc w:val="center"/>
             </w:pPr>
             <w:r>
               <w:rPr>
                 <w:rFonts w:ascii="Times New Roman" w:hAnsi="Times New Roman"/>
                 <w:b w:val="0"/>
-                <w:sz w:val="16"/>
-              </w:rPr>
-            </w:r>
-          </w:p>
-        </w:tc>
-        <w:tc>
-          <w:tcPr>
-            <w:tcW w:type="dxa" w:w="459"/>
+                <w:sz w:val="14"/>
+              </w:rPr>
+            </w:r>
+          </w:p>
+        </w:tc>
+        <w:tc>
+          <w:tcPr>
+            <w:tcW w:type="dxa" w:w="595"/>
             <w:vAlign w:val="center"/>
           </w:tcPr>
           <w:p>
             <w:pPr>
-              <w:spacing w:after="0" w:line="240" w:lineRule="auto"/>
+              <w:spacing w:after="0" w:line="240" w:lineRule="auto" w:before="0"/>
               <w:jc w:val="center"/>
             </w:pPr>
             <w:r>
               <w:rPr>
                 <w:rFonts w:ascii="Times New Roman" w:hAnsi="Times New Roman"/>
                 <w:b w:val="0"/>
-                <w:sz w:val="16"/>
-              </w:rPr>
-            </w:r>
-          </w:p>
-        </w:tc>
-        <w:tc>
-          <w:tcPr>
-            <w:tcW w:type="dxa" w:w="459"/>
+                <w:sz w:val="14"/>
+              </w:rPr>
+            </w:r>
+          </w:p>
+        </w:tc>
+        <w:tc>
+          <w:tcPr>
+            <w:tcW w:type="dxa" w:w="595"/>
             <w:vAlign w:val="center"/>
           </w:tcPr>
           <w:p>
             <w:pPr>
-              <w:spacing w:after="0" w:line="240" w:lineRule="auto"/>
+              <w:spacing w:after="0" w:line="240" w:lineRule="auto" w:before="0"/>
               <w:jc w:val="center"/>
             </w:pPr>
             <w:r>
               <w:rPr>
                 <w:rFonts w:ascii="Times New Roman" w:hAnsi="Times New Roman"/>
                 <w:b w:val="0"/>
-                <w:sz w:val="16"/>
-              </w:rPr>
-            </w:r>
-          </w:p>
-        </w:tc>
-        <w:tc>
-          <w:tcPr>
-            <w:tcW w:type="dxa" w:w="459"/>
+                <w:sz w:val="14"/>
+              </w:rPr>
+            </w:r>
+          </w:p>
+        </w:tc>
+        <w:tc>
+          <w:tcPr>
+            <w:tcW w:type="dxa" w:w="595"/>
             <w:vAlign w:val="center"/>
           </w:tcPr>
           <w:p>
             <w:pPr>
-              <w:spacing w:after="0" w:line="240" w:lineRule="auto"/>
+              <w:spacing w:after="0" w:line="240" w:lineRule="auto" w:before="0"/>
               <w:jc w:val="center"/>
             </w:pPr>
             <w:r>
               <w:rPr>
                 <w:rFonts w:ascii="Times New Roman" w:hAnsi="Times New Roman"/>
                 <w:b w:val="0"/>
-                <w:sz w:val="16"/>
-              </w:rPr>
-            </w:r>
-          </w:p>
-        </w:tc>
-        <w:tc>
-          <w:tcPr>
-            <w:tcW w:type="dxa" w:w="459"/>
+                <w:sz w:val="14"/>
+              </w:rPr>
+            </w:r>
+          </w:p>
+        </w:tc>
+        <w:tc>
+          <w:tcPr>
+            <w:tcW w:type="dxa" w:w="595"/>
             <w:vAlign w:val="center"/>
           </w:tcPr>
           <w:p>
             <w:pPr>
-              <w:spacing w:after="0" w:line="240" w:lineRule="auto"/>
+              <w:spacing w:after="0" w:line="240" w:lineRule="auto" w:before="0"/>
               <w:jc w:val="center"/>
             </w:pPr>
             <w:r>
               <w:rPr>
                 <w:rFonts w:ascii="Times New Roman" w:hAnsi="Times New Roman"/>
                 <w:b w:val="0"/>
-                <w:sz w:val="16"/>
-              </w:rPr>
-            </w:r>
-          </w:p>
-        </w:tc>
-        <w:tc>
-          <w:tcPr>
-            <w:tcW w:type="dxa" w:w="459"/>
+                <w:sz w:val="14"/>
+              </w:rPr>
+            </w:r>
+          </w:p>
+        </w:tc>
+        <w:tc>
+          <w:tcPr>
+            <w:tcW w:type="dxa" w:w="595"/>
             <w:vAlign w:val="center"/>
           </w:tcPr>
           <w:p>
             <w:pPr>
-              <w:spacing w:after="0" w:line="240" w:lineRule="auto"/>
+              <w:spacing w:after="0" w:line="240" w:lineRule="auto" w:before="0"/>
               <w:jc w:val="center"/>
             </w:pPr>
             <w:r>
               <w:rPr>
                 <w:rFonts w:ascii="Times New Roman" w:hAnsi="Times New Roman"/>
                 <w:b w:val="0"/>
-                <w:sz w:val="16"/>
-              </w:rPr>
-            </w:r>
-          </w:p>
-        </w:tc>
-        <w:tc>
-          <w:tcPr>
-            <w:tcW w:type="dxa" w:w="459"/>
+                <w:sz w:val="14"/>
+              </w:rPr>
+            </w:r>
+          </w:p>
+        </w:tc>
+        <w:tc>
+          <w:tcPr>
+            <w:tcW w:type="dxa" w:w="595"/>
             <w:vAlign w:val="center"/>
           </w:tcPr>
           <w:p>
             <w:pPr>
-              <w:spacing w:after="0" w:line="240" w:lineRule="auto"/>
+              <w:spacing w:after="0" w:line="240" w:lineRule="auto" w:before="0"/>
               <w:jc w:val="center"/>
             </w:pPr>
             <w:r>
               <w:rPr>
                 <w:rFonts w:ascii="Times New Roman" w:hAnsi="Times New Roman"/>
                 <w:b w:val="0"/>
-                <w:sz w:val="16"/>
-              </w:rPr>
-            </w:r>
-          </w:p>
-        </w:tc>
-        <w:tc>
-          <w:tcPr>
-            <w:tcW w:type="dxa" w:w="459"/>
+                <w:sz w:val="14"/>
+              </w:rPr>
+            </w:r>
+          </w:p>
+        </w:tc>
+        <w:tc>
+          <w:tcPr>
+            <w:tcW w:type="dxa" w:w="595"/>
             <w:vAlign w:val="center"/>
           </w:tcPr>
           <w:p>
             <w:pPr>
-              <w:spacing w:after="0" w:line="240" w:lineRule="auto"/>
+              <w:spacing w:after="0" w:line="240" w:lineRule="auto" w:before="0"/>
               <w:jc w:val="center"/>
             </w:pPr>
             <w:r>
               <w:rPr>
                 <w:rFonts w:ascii="Times New Roman" w:hAnsi="Times New Roman"/>
                 <w:b w:val="0"/>
-                <w:sz w:val="16"/>
-              </w:rPr>
-            </w:r>
-          </w:p>
-        </w:tc>
-        <w:tc>
-          <w:tcPr>
-            <w:tcW w:type="dxa" w:w="459"/>
+                <w:sz w:val="14"/>
+              </w:rPr>
+            </w:r>
+          </w:p>
+        </w:tc>
+        <w:tc>
+          <w:tcPr>
+            <w:tcW w:type="dxa" w:w="595"/>
             <w:vAlign w:val="center"/>
           </w:tcPr>
           <w:p>
             <w:pPr>
-              <w:spacing w:after="0" w:line="240" w:lineRule="auto"/>
+              <w:spacing w:after="0" w:line="240" w:lineRule="auto" w:before="0"/>
               <w:jc w:val="center"/>
             </w:pPr>
             <w:r>
               <w:rPr>
                 <w:rFonts w:ascii="Times New Roman" w:hAnsi="Times New Roman"/>
                 <w:b w:val="0"/>
-                <w:sz w:val="16"/>
-              </w:rPr>
-            </w:r>
-          </w:p>
-        </w:tc>
-        <w:tc>
-          <w:tcPr>
-            <w:tcW w:type="dxa" w:w="459"/>
+                <w:sz w:val="14"/>
+              </w:rPr>
+            </w:r>
+          </w:p>
+        </w:tc>
+        <w:tc>
+          <w:tcPr>
+            <w:tcW w:type="dxa" w:w="595"/>
             <w:vAlign w:val="center"/>
           </w:tcPr>
           <w:p>
             <w:pPr>
-              <w:spacing w:after="0" w:line="240" w:lineRule="auto"/>
+              <w:spacing w:after="0" w:line="240" w:lineRule="auto" w:before="0"/>
               <w:jc w:val="center"/>
             </w:pPr>
             <w:r>
               <w:rPr>
                 <w:rFonts w:ascii="Times New Roman" w:hAnsi="Times New Roman"/>
                 <w:b w:val="0"/>
-                <w:sz w:val="16"/>
-              </w:rPr>
-            </w:r>
-          </w:p>
-        </w:tc>
-        <w:tc>
-          <w:tcPr>
-            <w:tcW w:type="dxa" w:w="459"/>
+                <w:sz w:val="14"/>
+              </w:rPr>
+            </w:r>
+          </w:p>
+        </w:tc>
+        <w:tc>
+          <w:tcPr>
+            <w:tcW w:type="dxa" w:w="595"/>
             <w:vAlign w:val="center"/>
           </w:tcPr>
           <w:p>
             <w:pPr>
-              <w:spacing w:after="0" w:line="240" w:lineRule="auto"/>
+              <w:spacing w:after="0" w:line="240" w:lineRule="auto" w:before="0"/>
               <w:jc w:val="center"/>
             </w:pPr>
             <w:r>
               <w:rPr>
                 <w:rFonts w:ascii="Times New Roman" w:hAnsi="Times New Roman"/>
                 <w:b w:val="0"/>
-                <w:sz w:val="16"/>
-              </w:rPr>
-            </w:r>
-          </w:p>
-        </w:tc>
-        <w:tc>
-          <w:tcPr>
-            <w:tcW w:type="dxa" w:w="459"/>
+                <w:sz w:val="14"/>
+              </w:rPr>
+            </w:r>
+          </w:p>
+        </w:tc>
+        <w:tc>
+          <w:tcPr>
+            <w:tcW w:type="dxa" w:w="595"/>
             <w:vAlign w:val="center"/>
           </w:tcPr>
           <w:p>
             <w:pPr>
-              <w:spacing w:after="0" w:line="240" w:lineRule="auto"/>
+              <w:spacing w:after="0" w:line="240" w:lineRule="auto" w:before="0"/>
               <w:jc w:val="center"/>
             </w:pPr>
             <w:r>
               <w:rPr>
                 <w:rFonts w:ascii="Times New Roman" w:hAnsi="Times New Roman"/>
                 <w:b w:val="0"/>
-                <w:sz w:val="16"/>
+                <w:sz w:val="14"/>
               </w:rPr>
               <w:t>√</w:t>
             </w:r>
@@ -15495,19 +15543,19 @@
         </w:tc>
         <w:tc>
           <w:tcPr>
-            <w:tcW w:type="dxa" w:w="459"/>
+            <w:tcW w:type="dxa" w:w="595"/>
             <w:vAlign w:val="center"/>
           </w:tcPr>
           <w:p>
             <w:pPr>
-              <w:spacing w:after="0" w:line="240" w:lineRule="auto"/>
+              <w:spacing w:after="0" w:line="240" w:lineRule="auto" w:before="0"/>
               <w:jc w:val="center"/>
             </w:pPr>
             <w:r>
               <w:rPr>
                 <w:rFonts w:ascii="Times New Roman" w:hAnsi="Times New Roman"/>
                 <w:b w:val="0"/>
-                <w:sz w:val="16"/>
+                <w:sz w:val="14"/>
               </w:rPr>
               <w:t>√</w:t>
             </w:r>
@@ -15515,59 +15563,62 @@
         </w:tc>
         <w:tc>
           <w:tcPr>
-            <w:tcW w:type="dxa" w:w="459"/>
+            <w:tcW w:type="dxa" w:w="595"/>
             <w:vAlign w:val="center"/>
           </w:tcPr>
           <w:p>
             <w:pPr>
-              <w:spacing w:after="0" w:line="240" w:lineRule="auto"/>
+              <w:spacing w:after="0" w:line="240" w:lineRule="auto" w:before="0"/>
               <w:jc w:val="center"/>
             </w:pPr>
             <w:r>
               <w:rPr>
                 <w:rFonts w:ascii="Times New Roman" w:hAnsi="Times New Roman"/>
                 <w:b w:val="0"/>
-                <w:sz w:val="16"/>
-              </w:rPr>
-            </w:r>
-          </w:p>
-        </w:tc>
-        <w:tc>
-          <w:tcPr>
-            <w:tcW w:type="dxa" w:w="459"/>
+                <w:sz w:val="14"/>
+              </w:rPr>
+            </w:r>
+          </w:p>
+        </w:tc>
+        <w:tc>
+          <w:tcPr>
+            <w:tcW w:type="dxa" w:w="595"/>
             <w:vAlign w:val="center"/>
           </w:tcPr>
           <w:p>
             <w:pPr>
-              <w:spacing w:after="0" w:line="240" w:lineRule="auto"/>
+              <w:spacing w:after="0" w:line="240" w:lineRule="auto" w:before="0"/>
               <w:jc w:val="center"/>
             </w:pPr>
             <w:r>
               <w:rPr>
                 <w:rFonts w:ascii="Times New Roman" w:hAnsi="Times New Roman"/>
                 <w:b w:val="0"/>
-                <w:sz w:val="16"/>
+                <w:sz w:val="14"/>
               </w:rPr>
             </w:r>
           </w:p>
         </w:tc>
       </w:tr>
       <w:tr>
-        <w:tc>
-          <w:tcPr>
-            <w:tcW w:type="dxa" w:w="459"/>
+        <w:trPr>
+          <w:cantSplit/>
+        </w:trPr>
+        <w:tc>
+          <w:tcPr>
+            <w:tcW w:type="dxa" w:w="520"/>
             <w:vAlign w:val="center"/>
           </w:tcPr>
           <w:p>
             <w:pPr>
-              <w:spacing w:after="0" w:line="240" w:lineRule="auto"/>
+              <w:spacing w:after="0" w:line="240" w:lineRule="auto" w:before="0"/>
               <w:jc w:val="center"/>
             </w:pPr>
             <w:r>
               <w:rPr>
                 <w:rFonts w:ascii="Times New Roman" w:hAnsi="Times New Roman"/>
                 <w:b w:val="0"/>
-                <w:sz w:val="16"/>
+                <w:sz w:val="14"/>
               </w:rPr>
               <w:t>8.</w:t>
             </w:r>
@@ -15575,19 +15626,19 @@
         </w:tc>
         <w:tc>
           <w:tcPr>
-            <w:tcW w:type="dxa" w:w="459"/>
+            <w:tcW w:type="dxa" w:w="1850"/>
             <w:vAlign w:val="center"/>
           </w:tcPr>
           <w:p>
             <w:pPr>
-              <w:spacing w:after="0" w:line="240" w:lineRule="auto"/>
-              <w:jc w:val="left"/>
+              <w:spacing w:after="0" w:line="240" w:lineRule="auto" w:before="0"/>
+              <w:jc w:val="center"/>
             </w:pPr>
             <w:r>
               <w:rPr>
                 <w:rFonts w:ascii="Times New Roman" w:hAnsi="Times New Roman"/>
                 <w:b w:val="0"/>
-                <w:sz w:val="16"/>
+                <w:sz w:val="14"/>
               </w:rPr>
               <w:t>Pembuatan Laporan</w:t>
             </w:r>
@@ -15595,266 +15646,266 @@
         </w:tc>
         <w:tc>
           <w:tcPr>
-            <w:tcW w:type="dxa" w:w="459"/>
+            <w:tcW w:type="dxa" w:w="595"/>
             <w:vAlign w:val="center"/>
           </w:tcPr>
           <w:p>
             <w:pPr>
-              <w:spacing w:after="0" w:line="240" w:lineRule="auto"/>
+              <w:spacing w:after="0" w:line="240" w:lineRule="auto" w:before="0"/>
               <w:jc w:val="center"/>
             </w:pPr>
             <w:r>
               <w:rPr>
                 <w:rFonts w:ascii="Times New Roman" w:hAnsi="Times New Roman"/>
                 <w:b w:val="0"/>
-                <w:sz w:val="16"/>
-              </w:rPr>
-            </w:r>
-          </w:p>
-        </w:tc>
-        <w:tc>
-          <w:tcPr>
-            <w:tcW w:type="dxa" w:w="459"/>
+                <w:sz w:val="14"/>
+              </w:rPr>
+            </w:r>
+          </w:p>
+        </w:tc>
+        <w:tc>
+          <w:tcPr>
+            <w:tcW w:type="dxa" w:w="595"/>
             <w:vAlign w:val="center"/>
           </w:tcPr>
           <w:p>
             <w:pPr>
-              <w:spacing w:after="0" w:line="240" w:lineRule="auto"/>
+              <w:spacing w:after="0" w:line="240" w:lineRule="auto" w:before="0"/>
               <w:jc w:val="center"/>
             </w:pPr>
             <w:r>
               <w:rPr>
                 <w:rFonts w:ascii="Times New Roman" w:hAnsi="Times New Roman"/>
                 <w:b w:val="0"/>
-                <w:sz w:val="16"/>
-              </w:rPr>
-            </w:r>
-          </w:p>
-        </w:tc>
-        <w:tc>
-          <w:tcPr>
-            <w:tcW w:type="dxa" w:w="459"/>
+                <w:sz w:val="14"/>
+              </w:rPr>
+            </w:r>
+          </w:p>
+        </w:tc>
+        <w:tc>
+          <w:tcPr>
+            <w:tcW w:type="dxa" w:w="595"/>
             <w:vAlign w:val="center"/>
           </w:tcPr>
           <w:p>
             <w:pPr>
-              <w:spacing w:after="0" w:line="240" w:lineRule="auto"/>
+              <w:spacing w:after="0" w:line="240" w:lineRule="auto" w:before="0"/>
               <w:jc w:val="center"/>
             </w:pPr>
             <w:r>
               <w:rPr>
                 <w:rFonts w:ascii="Times New Roman" w:hAnsi="Times New Roman"/>
                 <w:b w:val="0"/>
-                <w:sz w:val="16"/>
-              </w:rPr>
-            </w:r>
-          </w:p>
-        </w:tc>
-        <w:tc>
-          <w:tcPr>
-            <w:tcW w:type="dxa" w:w="459"/>
+                <w:sz w:val="14"/>
+              </w:rPr>
+            </w:r>
+          </w:p>
+        </w:tc>
+        <w:tc>
+          <w:tcPr>
+            <w:tcW w:type="dxa" w:w="595"/>
             <w:vAlign w:val="center"/>
           </w:tcPr>
           <w:p>
             <w:pPr>
-              <w:spacing w:after="0" w:line="240" w:lineRule="auto"/>
+              <w:spacing w:after="0" w:line="240" w:lineRule="auto" w:before="0"/>
               <w:jc w:val="center"/>
             </w:pPr>
             <w:r>
               <w:rPr>
                 <w:rFonts w:ascii="Times New Roman" w:hAnsi="Times New Roman"/>
                 <w:b w:val="0"/>
-                <w:sz w:val="16"/>
-              </w:rPr>
-            </w:r>
-          </w:p>
-        </w:tc>
-        <w:tc>
-          <w:tcPr>
-            <w:tcW w:type="dxa" w:w="459"/>
+                <w:sz w:val="14"/>
+              </w:rPr>
+            </w:r>
+          </w:p>
+        </w:tc>
+        <w:tc>
+          <w:tcPr>
+            <w:tcW w:type="dxa" w:w="595"/>
             <w:vAlign w:val="center"/>
           </w:tcPr>
           <w:p>
             <w:pPr>
-              <w:spacing w:after="0" w:line="240" w:lineRule="auto"/>
+              <w:spacing w:after="0" w:line="240" w:lineRule="auto" w:before="0"/>
               <w:jc w:val="center"/>
             </w:pPr>
             <w:r>
               <w:rPr>
                 <w:rFonts w:ascii="Times New Roman" w:hAnsi="Times New Roman"/>
                 <w:b w:val="0"/>
-                <w:sz w:val="16"/>
-              </w:rPr>
-            </w:r>
-          </w:p>
-        </w:tc>
-        <w:tc>
-          <w:tcPr>
-            <w:tcW w:type="dxa" w:w="459"/>
+                <w:sz w:val="14"/>
+              </w:rPr>
+            </w:r>
+          </w:p>
+        </w:tc>
+        <w:tc>
+          <w:tcPr>
+            <w:tcW w:type="dxa" w:w="595"/>
             <w:vAlign w:val="center"/>
           </w:tcPr>
           <w:p>
             <w:pPr>
-              <w:spacing w:after="0" w:line="240" w:lineRule="auto"/>
+              <w:spacing w:after="0" w:line="240" w:lineRule="auto" w:before="0"/>
               <w:jc w:val="center"/>
             </w:pPr>
             <w:r>
               <w:rPr>
                 <w:rFonts w:ascii="Times New Roman" w:hAnsi="Times New Roman"/>
                 <w:b w:val="0"/>
-                <w:sz w:val="16"/>
-              </w:rPr>
-            </w:r>
-          </w:p>
-        </w:tc>
-        <w:tc>
-          <w:tcPr>
-            <w:tcW w:type="dxa" w:w="459"/>
+                <w:sz w:val="14"/>
+              </w:rPr>
+            </w:r>
+          </w:p>
+        </w:tc>
+        <w:tc>
+          <w:tcPr>
+            <w:tcW w:type="dxa" w:w="595"/>
             <w:vAlign w:val="center"/>
           </w:tcPr>
           <w:p>
             <w:pPr>
-              <w:spacing w:after="0" w:line="240" w:lineRule="auto"/>
+              <w:spacing w:after="0" w:line="240" w:lineRule="auto" w:before="0"/>
               <w:jc w:val="center"/>
             </w:pPr>
             <w:r>
               <w:rPr>
                 <w:rFonts w:ascii="Times New Roman" w:hAnsi="Times New Roman"/>
                 <w:b w:val="0"/>
-                <w:sz w:val="16"/>
-              </w:rPr>
-            </w:r>
-          </w:p>
-        </w:tc>
-        <w:tc>
-          <w:tcPr>
-            <w:tcW w:type="dxa" w:w="459"/>
+                <w:sz w:val="14"/>
+              </w:rPr>
+            </w:r>
+          </w:p>
+        </w:tc>
+        <w:tc>
+          <w:tcPr>
+            <w:tcW w:type="dxa" w:w="595"/>
             <w:vAlign w:val="center"/>
           </w:tcPr>
           <w:p>
             <w:pPr>
-              <w:spacing w:after="0" w:line="240" w:lineRule="auto"/>
+              <w:spacing w:after="0" w:line="240" w:lineRule="auto" w:before="0"/>
               <w:jc w:val="center"/>
             </w:pPr>
             <w:r>
               <w:rPr>
                 <w:rFonts w:ascii="Times New Roman" w:hAnsi="Times New Roman"/>
                 <w:b w:val="0"/>
-                <w:sz w:val="16"/>
-              </w:rPr>
-            </w:r>
-          </w:p>
-        </w:tc>
-        <w:tc>
-          <w:tcPr>
-            <w:tcW w:type="dxa" w:w="459"/>
+                <w:sz w:val="14"/>
+              </w:rPr>
+            </w:r>
+          </w:p>
+        </w:tc>
+        <w:tc>
+          <w:tcPr>
+            <w:tcW w:type="dxa" w:w="595"/>
             <w:vAlign w:val="center"/>
           </w:tcPr>
           <w:p>
             <w:pPr>
-              <w:spacing w:after="0" w:line="240" w:lineRule="auto"/>
+              <w:spacing w:after="0" w:line="240" w:lineRule="auto" w:before="0"/>
               <w:jc w:val="center"/>
             </w:pPr>
             <w:r>
               <w:rPr>
                 <w:rFonts w:ascii="Times New Roman" w:hAnsi="Times New Roman"/>
                 <w:b w:val="0"/>
-                <w:sz w:val="16"/>
-              </w:rPr>
-            </w:r>
-          </w:p>
-        </w:tc>
-        <w:tc>
-          <w:tcPr>
-            <w:tcW w:type="dxa" w:w="459"/>
+                <w:sz w:val="14"/>
+              </w:rPr>
+            </w:r>
+          </w:p>
+        </w:tc>
+        <w:tc>
+          <w:tcPr>
+            <w:tcW w:type="dxa" w:w="595"/>
             <w:vAlign w:val="center"/>
           </w:tcPr>
           <w:p>
             <w:pPr>
-              <w:spacing w:after="0" w:line="240" w:lineRule="auto"/>
+              <w:spacing w:after="0" w:line="240" w:lineRule="auto" w:before="0"/>
               <w:jc w:val="center"/>
             </w:pPr>
             <w:r>
               <w:rPr>
                 <w:rFonts w:ascii="Times New Roman" w:hAnsi="Times New Roman"/>
                 <w:b w:val="0"/>
-                <w:sz w:val="16"/>
-              </w:rPr>
-            </w:r>
-          </w:p>
-        </w:tc>
-        <w:tc>
-          <w:tcPr>
-            <w:tcW w:type="dxa" w:w="459"/>
+                <w:sz w:val="14"/>
+              </w:rPr>
+            </w:r>
+          </w:p>
+        </w:tc>
+        <w:tc>
+          <w:tcPr>
+            <w:tcW w:type="dxa" w:w="595"/>
             <w:vAlign w:val="center"/>
           </w:tcPr>
           <w:p>
             <w:pPr>
-              <w:spacing w:after="0" w:line="240" w:lineRule="auto"/>
+              <w:spacing w:after="0" w:line="240" w:lineRule="auto" w:before="0"/>
               <w:jc w:val="center"/>
             </w:pPr>
             <w:r>
               <w:rPr>
                 <w:rFonts w:ascii="Times New Roman" w:hAnsi="Times New Roman"/>
                 <w:b w:val="0"/>
-                <w:sz w:val="16"/>
-              </w:rPr>
-            </w:r>
-          </w:p>
-        </w:tc>
-        <w:tc>
-          <w:tcPr>
-            <w:tcW w:type="dxa" w:w="459"/>
+                <w:sz w:val="14"/>
+              </w:rPr>
+            </w:r>
+          </w:p>
+        </w:tc>
+        <w:tc>
+          <w:tcPr>
+            <w:tcW w:type="dxa" w:w="595"/>
             <w:vAlign w:val="center"/>
           </w:tcPr>
           <w:p>
             <w:pPr>
-              <w:spacing w:after="0" w:line="240" w:lineRule="auto"/>
+              <w:spacing w:after="0" w:line="240" w:lineRule="auto" w:before="0"/>
               <w:jc w:val="center"/>
             </w:pPr>
             <w:r>
               <w:rPr>
                 <w:rFonts w:ascii="Times New Roman" w:hAnsi="Times New Roman"/>
                 <w:b w:val="0"/>
-                <w:sz w:val="16"/>
-              </w:rPr>
-            </w:r>
-          </w:p>
-        </w:tc>
-        <w:tc>
-          <w:tcPr>
-            <w:tcW w:type="dxa" w:w="459"/>
+                <w:sz w:val="14"/>
+              </w:rPr>
+            </w:r>
+          </w:p>
+        </w:tc>
+        <w:tc>
+          <w:tcPr>
+            <w:tcW w:type="dxa" w:w="595"/>
             <w:vAlign w:val="center"/>
           </w:tcPr>
           <w:p>
             <w:pPr>
-              <w:spacing w:after="0" w:line="240" w:lineRule="auto"/>
+              <w:spacing w:after="0" w:line="240" w:lineRule="auto" w:before="0"/>
               <w:jc w:val="center"/>
             </w:pPr>
             <w:r>
               <w:rPr>
                 <w:rFonts w:ascii="Times New Roman" w:hAnsi="Times New Roman"/>
                 <w:b w:val="0"/>
-                <w:sz w:val="16"/>
-              </w:rPr>
-            </w:r>
-          </w:p>
-        </w:tc>
-        <w:tc>
-          <w:tcPr>
-            <w:tcW w:type="dxa" w:w="459"/>
+                <w:sz w:val="14"/>
+              </w:rPr>
+            </w:r>
+          </w:p>
+        </w:tc>
+        <w:tc>
+          <w:tcPr>
+            <w:tcW w:type="dxa" w:w="595"/>
             <w:vAlign w:val="center"/>
           </w:tcPr>
           <w:p>
             <w:pPr>
-              <w:spacing w:after="0" w:line="240" w:lineRule="auto"/>
+              <w:spacing w:after="0" w:line="240" w:lineRule="auto" w:before="0"/>
               <w:jc w:val="center"/>
             </w:pPr>
             <w:r>
               <w:rPr>
                 <w:rFonts w:ascii="Times New Roman" w:hAnsi="Times New Roman"/>
                 <w:b w:val="0"/>
-                <w:sz w:val="16"/>
+                <w:sz w:val="14"/>
               </w:rPr>
               <w:t>√</w:t>
             </w:r>
@@ -15862,19 +15913,19 @@
         </w:tc>
         <w:tc>
           <w:tcPr>
-            <w:tcW w:type="dxa" w:w="459"/>
+            <w:tcW w:type="dxa" w:w="595"/>
             <w:vAlign w:val="center"/>
           </w:tcPr>
           <w:p>
             <w:pPr>
-              <w:spacing w:after="0" w:line="240" w:lineRule="auto"/>
+              <w:spacing w:after="0" w:line="240" w:lineRule="auto" w:before="0"/>
               <w:jc w:val="center"/>
             </w:pPr>
             <w:r>
               <w:rPr>
                 <w:rFonts w:ascii="Times New Roman" w:hAnsi="Times New Roman"/>
                 <w:b w:val="0"/>
-                <w:sz w:val="16"/>
+                <w:sz w:val="14"/>
               </w:rPr>
               <w:t>√</w:t>
             </w:r>
@@ -15882,19 +15933,19 @@
         </w:tc>
         <w:tc>
           <w:tcPr>
-            <w:tcW w:type="dxa" w:w="459"/>
+            <w:tcW w:type="dxa" w:w="595"/>
             <w:vAlign w:val="center"/>
           </w:tcPr>
           <w:p>
             <w:pPr>
-              <w:spacing w:after="0" w:line="240" w:lineRule="auto"/>
+              <w:spacing w:after="0" w:line="240" w:lineRule="auto" w:before="0"/>
               <w:jc w:val="center"/>
             </w:pPr>
             <w:r>
               <w:rPr>
                 <w:rFonts w:ascii="Times New Roman" w:hAnsi="Times New Roman"/>
                 <w:b w:val="0"/>
-                <w:sz w:val="16"/>
+                <w:sz w:val="14"/>
               </w:rPr>
               <w:t>√</w:t>
             </w:r>
@@ -15902,6 +15953,17 @@
         </w:tc>
       </w:tr>
     </w:tbl>
+    <w:p>
+      <w:pPr>
+        <w:sectPr>
+          <w:type w:val="nextPage"/>
+          <w:pgSz w:w="15840" w:h="12240" w:orient="landscape"/>
+          <w:pgMar w:top="2268" w:right="1701" w:bottom="1701" w:left="2268" w:header="720" w:footer="720" w:gutter="0"/>
+          <w:cols w:space="720"/>
+          <w:docGrid w:linePitch="360"/>
+        </w:sectPr>
+      </w:pPr>
+    </w:p>
     <w:p>
       <w:pPr>
         <w:spacing w:line="360" w:lineRule="auto" w:after="0"/>

</xml_diff>